<commit_message>
feat: ajout du menu interactif avec boucle while et conditions (Partie 2)
</commit_message>
<xml_diff>
--- a/pratiquePython.docx
+++ b/pratiquePython.docx
@@ -4,16 +4,17 @@
   <w:body>
     <w:p>
       <w:pPr>
-        <w:spacing w:before="2000"/>
-        <w:rPr>
-          <w:rFonts w:ascii="Times New Roman" w:hAnsi="Times New Roman" w:cs="Times New Roman"/>
-          <w:sz w:val="24"/>
-          <w:szCs w:val="24"/>
-        </w:rPr>
-      </w:pPr>
-    </w:p>
-    <w:p>
-      <w:pPr>
+        <w:spacing w:before="2000" w:line="360" w:lineRule="auto"/>
+        <w:rPr>
+          <w:rFonts w:ascii="Times New Roman" w:hAnsi="Times New Roman" w:cs="Times New Roman"/>
+          <w:sz w:val="24"/>
+          <w:szCs w:val="24"/>
+        </w:rPr>
+      </w:pPr>
+    </w:p>
+    <w:p>
+      <w:pPr>
+        <w:spacing w:line="360" w:lineRule="auto"/>
         <w:jc w:val="center"/>
         <w:rPr>
           <w:rFonts w:ascii="Times New Roman" w:hAnsi="Times New Roman" w:cs="Times New Roman"/>
@@ -34,7 +35,7 @@
     </w:p>
     <w:p>
       <w:pPr>
-        <w:spacing w:before="150" w:after="500"/>
+        <w:spacing w:before="150" w:after="500" w:line="360" w:lineRule="auto"/>
         <w:jc w:val="center"/>
         <w:rPr>
           <w:rFonts w:ascii="Times New Roman" w:hAnsi="Times New Roman" w:cs="Times New Roman"/>
@@ -57,7 +58,7 @@
     </w:p>
     <w:p>
       <w:pPr>
-        <w:spacing w:before="1200"/>
+        <w:spacing w:before="1200" w:line="360" w:lineRule="auto"/>
         <w:jc w:val="center"/>
         <w:rPr>
           <w:rFonts w:ascii="Times New Roman" w:hAnsi="Times New Roman" w:cs="Times New Roman"/>
@@ -106,6 +107,7 @@
     </w:p>
     <w:p>
       <w:pPr>
+        <w:spacing w:line="360" w:lineRule="auto"/>
         <w:jc w:val="center"/>
         <w:rPr>
           <w:rFonts w:ascii="Times New Roman" w:hAnsi="Times New Roman" w:cs="Times New Roman"/>
@@ -124,7 +126,7 @@
     </w:p>
     <w:p>
       <w:pPr>
-        <w:spacing w:before="400"/>
+        <w:spacing w:before="400" w:line="360" w:lineRule="auto"/>
         <w:jc w:val="center"/>
         <w:rPr>
           <w:rFonts w:ascii="Times New Roman" w:hAnsi="Times New Roman" w:cs="Times New Roman"/>
@@ -144,6 +146,7 @@
     <w:p>
       <w:pPr>
         <w:pStyle w:val="Titre1"/>
+        <w:spacing w:line="360" w:lineRule="auto"/>
         <w:rPr>
           <w:rFonts w:ascii="Times New Roman" w:hAnsi="Times New Roman" w:cs="Times New Roman"/>
           <w:color w:val="auto"/>
@@ -165,7 +168,7 @@
     </w:p>
     <w:p>
       <w:pPr>
-        <w:spacing w:after="150"/>
+        <w:spacing w:after="150" w:line="360" w:lineRule="auto"/>
         <w:rPr>
           <w:rFonts w:ascii="Times New Roman" w:hAnsi="Times New Roman" w:cs="Times New Roman"/>
           <w:sz w:val="24"/>
@@ -201,7 +204,7 @@
     </w:p>
     <w:p>
       <w:pPr>
-        <w:spacing w:after="150"/>
+        <w:spacing w:after="150" w:line="360" w:lineRule="auto"/>
         <w:rPr>
           <w:rFonts w:ascii="Times New Roman" w:hAnsi="Times New Roman" w:cs="Times New Roman"/>
           <w:sz w:val="24"/>
@@ -246,6 +249,7 @@
     <w:p>
       <w:pPr>
         <w:pStyle w:val="Titre1"/>
+        <w:spacing w:line="360" w:lineRule="auto"/>
         <w:rPr>
           <w:rFonts w:ascii="Times New Roman" w:hAnsi="Times New Roman" w:cs="Times New Roman"/>
           <w:color w:val="auto"/>
@@ -309,6 +313,7 @@
           </w:tcPr>
           <w:p>
             <w:pPr>
+              <w:spacing w:line="360" w:lineRule="auto"/>
               <w:rPr>
                 <w:rFonts w:ascii="Times New Roman" w:hAnsi="Times New Roman" w:cs="Times New Roman"/>
                 <w:sz w:val="24"/>
@@ -383,7 +388,7 @@
     </w:tbl>
     <w:p>
       <w:pPr>
-        <w:spacing w:after="150"/>
+        <w:spacing w:after="150" w:line="360" w:lineRule="auto"/>
         <w:rPr>
           <w:rFonts w:ascii="Times New Roman" w:hAnsi="Times New Roman" w:cs="Times New Roman"/>
           <w:sz w:val="24"/>
@@ -427,19 +432,20 @@
     </w:p>
     <w:p>
       <w:pPr>
-        <w:spacing w:after="150"/>
-        <w:rPr>
-          <w:rFonts w:ascii="Times New Roman" w:hAnsi="Times New Roman" w:cs="Times New Roman"/>
-          <w:sz w:val="24"/>
-          <w:szCs w:val="24"/>
-        </w:rPr>
-      </w:pPr>
-      <w:r>
-        <w:rPr>
-          <w:rFonts w:ascii="Times New Roman" w:hAnsi="Times New Roman" w:cs="Times New Roman"/>
-          <w:sz w:val="24"/>
-          <w:szCs w:val="24"/>
-        </w:rPr>
+        <w:spacing w:after="150" w:line="360" w:lineRule="auto"/>
+        <w:rPr>
+          <w:rFonts w:ascii="Times New Roman" w:hAnsi="Times New Roman" w:cs="Times New Roman"/>
+          <w:sz w:val="24"/>
+          <w:szCs w:val="24"/>
+        </w:rPr>
+      </w:pPr>
+      <w:r>
+        <w:rPr>
+          <w:rFonts w:ascii="Times New Roman" w:hAnsi="Times New Roman" w:cs="Times New Roman"/>
+          <w:sz w:val="24"/>
+          <w:szCs w:val="24"/>
+        </w:rPr>
+        <w:lastRenderedPageBreak/>
         <w:drawing>
           <wp:inline distT="0" distB="0" distL="0" distR="0" wp14:anchorId="1B8E262D" wp14:editId="2FA391F3">
             <wp:extent cx="6400800" cy="1678940"/>
@@ -479,7 +485,7 @@
     </w:p>
     <w:p>
       <w:pPr>
-        <w:spacing w:after="150"/>
+        <w:spacing w:after="150" w:line="360" w:lineRule="auto"/>
         <w:rPr>
           <w:rFonts w:ascii="Times New Roman" w:hAnsi="Times New Roman" w:cs="Times New Roman"/>
           <w:sz w:val="24"/>
@@ -499,7 +505,6 @@
           <w:rFonts w:ascii="Times New Roman" w:hAnsi="Times New Roman" w:cs="Times New Roman"/>
           <w:b/>
           <w:bCs/>
-          <w:color w:val="FFC000" w:themeColor="accent4"/>
           <w:sz w:val="24"/>
           <w:szCs w:val="24"/>
         </w:rPr>
@@ -508,19 +513,10 @@
       <w:r>
         <w:rPr>
           <w:rFonts w:ascii="Times New Roman" w:hAnsi="Times New Roman" w:cs="Times New Roman"/>
-          <w:color w:val="FFC000" w:themeColor="accent4"/>
-          <w:sz w:val="24"/>
-          <w:szCs w:val="24"/>
-        </w:rPr>
-        <w:t xml:space="preserve"> </w:t>
-      </w:r>
-      <w:r>
-        <w:rPr>
-          <w:rFonts w:ascii="Times New Roman" w:hAnsi="Times New Roman" w:cs="Times New Roman"/>
-          <w:sz w:val="24"/>
-          <w:szCs w:val="24"/>
-        </w:rPr>
-        <w:t xml:space="preserve">montre l'arborescence du projet créée dans l'explorateur de fichiers, avec le fichier </w:t>
+          <w:sz w:val="24"/>
+          <w:szCs w:val="24"/>
+        </w:rPr>
+        <w:t xml:space="preserve"> montre l'arborescence du projet créée dans l'explorateur de fichiers, avec le fichier </w:t>
       </w:r>
       <w:r>
         <w:rPr>
@@ -543,6 +539,7 @@
     <w:p>
       <w:pPr>
         <w:pStyle w:val="lev1"/>
+        <w:spacing w:line="360" w:lineRule="auto"/>
         <w:rPr>
           <w:rFonts w:ascii="Times New Roman" w:hAnsi="Times New Roman" w:cs="Times New Roman"/>
           <w:sz w:val="24"/>
@@ -585,6 +582,7 @@
           </w:tcPr>
           <w:p>
             <w:pPr>
+              <w:spacing w:line="360" w:lineRule="auto"/>
               <w:rPr>
                 <w:rFonts w:ascii="Times New Roman" w:hAnsi="Times New Roman" w:cs="Times New Roman"/>
                 <w:sz w:val="24"/>
@@ -709,17 +707,17 @@
     </w:tbl>
     <w:p>
       <w:pPr>
-        <w:spacing w:after="150"/>
-        <w:rPr>
-          <w:rFonts w:ascii="Times New Roman" w:hAnsi="Times New Roman" w:cs="Times New Roman"/>
-          <w:sz w:val="24"/>
-          <w:szCs w:val="24"/>
-        </w:rPr>
-      </w:pPr>
-    </w:p>
-    <w:p>
-      <w:pPr>
-        <w:spacing w:before="150" w:after="80"/>
+        <w:spacing w:after="150" w:line="360" w:lineRule="auto"/>
+        <w:rPr>
+          <w:rFonts w:ascii="Times New Roman" w:hAnsi="Times New Roman" w:cs="Times New Roman"/>
+          <w:sz w:val="24"/>
+          <w:szCs w:val="24"/>
+        </w:rPr>
+      </w:pPr>
+    </w:p>
+    <w:p>
+      <w:pPr>
+        <w:spacing w:before="150" w:after="80" w:line="360" w:lineRule="auto"/>
         <w:rPr>
           <w:rFonts w:ascii="Times New Roman" w:eastAsia="Consolas" w:hAnsi="Times New Roman" w:cs="Times New Roman"/>
           <w:sz w:val="24"/>
@@ -757,7 +755,7 @@
     </w:p>
     <w:p>
       <w:pPr>
-        <w:spacing w:before="150" w:after="80"/>
+        <w:spacing w:before="150" w:after="80" w:line="360" w:lineRule="auto"/>
         <w:rPr>
           <w:rFonts w:ascii="Times New Roman" w:eastAsia="Consolas" w:hAnsi="Times New Roman" w:cs="Times New Roman"/>
           <w:sz w:val="24"/>
@@ -809,7 +807,7 @@
     </w:p>
     <w:p>
       <w:pPr>
-        <w:spacing w:before="150" w:after="80"/>
+        <w:spacing w:before="150" w:after="80" w:line="360" w:lineRule="auto"/>
         <w:rPr>
           <w:rFonts w:ascii="Times New Roman" w:eastAsia="Consolas" w:hAnsi="Times New Roman" w:cs="Times New Roman"/>
           <w:sz w:val="24"/>
@@ -830,7 +828,6 @@
           <w:rFonts w:ascii="Times New Roman" w:eastAsia="Calibri" w:hAnsi="Times New Roman" w:cs="Times New Roman"/>
           <w:b/>
           <w:bCs/>
-          <w:color w:val="000000" w:themeColor="text1"/>
           <w:sz w:val="24"/>
           <w:szCs w:val="24"/>
         </w:rPr>
@@ -842,7 +839,6 @@
           <w:rFonts w:ascii="Times New Roman" w:eastAsia="Calibri" w:hAnsi="Times New Roman" w:cs="Times New Roman"/>
           <w:b/>
           <w:bCs/>
-          <w:color w:val="000000" w:themeColor="text1"/>
           <w:sz w:val="24"/>
           <w:szCs w:val="24"/>
         </w:rPr>
@@ -936,7 +932,7 @@
     </w:p>
     <w:p>
       <w:pPr>
-        <w:spacing w:before="150" w:after="80"/>
+        <w:spacing w:before="150" w:after="80" w:line="360" w:lineRule="auto"/>
         <w:rPr>
           <w:rFonts w:ascii="Times New Roman" w:hAnsi="Times New Roman" w:cs="Times New Roman"/>
           <w:b/>
@@ -957,6 +953,7 @@
     <w:p>
       <w:pPr>
         <w:pStyle w:val="lev1"/>
+        <w:spacing w:line="360" w:lineRule="auto"/>
         <w:rPr>
           <w:rFonts w:ascii="Times New Roman" w:hAnsi="Times New Roman" w:cs="Times New Roman"/>
           <w:sz w:val="24"/>
@@ -999,6 +996,7 @@
           </w:tcPr>
           <w:p>
             <w:pPr>
+              <w:spacing w:line="360" w:lineRule="auto"/>
               <w:rPr>
                 <w:rFonts w:ascii="Times New Roman" w:hAnsi="Times New Roman" w:cs="Times New Roman"/>
                 <w:sz w:val="24"/>
@@ -1031,19 +1029,19 @@
     </w:tbl>
     <w:p>
       <w:pPr>
-        <w:spacing w:before="150" w:after="80"/>
-        <w:rPr>
-          <w:rFonts w:ascii="Times New Roman" w:hAnsi="Times New Roman" w:cs="Times New Roman"/>
-          <w:b/>
-          <w:bCs/>
-          <w:sz w:val="24"/>
-          <w:szCs w:val="24"/>
-        </w:rPr>
-      </w:pPr>
-    </w:p>
-    <w:p>
-      <w:pPr>
-        <w:spacing w:before="150" w:after="80"/>
+        <w:spacing w:before="150" w:after="80" w:line="360" w:lineRule="auto"/>
+        <w:rPr>
+          <w:rFonts w:ascii="Times New Roman" w:hAnsi="Times New Roman" w:cs="Times New Roman"/>
+          <w:b/>
+          <w:bCs/>
+          <w:sz w:val="24"/>
+          <w:szCs w:val="24"/>
+        </w:rPr>
+      </w:pPr>
+    </w:p>
+    <w:p>
+      <w:pPr>
+        <w:spacing w:before="150" w:after="80" w:line="360" w:lineRule="auto"/>
         <w:rPr>
           <w:rFonts w:ascii="Times New Roman" w:hAnsi="Times New Roman" w:cs="Times New Roman"/>
           <w:b/>
@@ -1065,23 +1063,24 @@
     </w:p>
     <w:p>
       <w:pPr>
-        <w:spacing w:before="150" w:after="80"/>
-        <w:rPr>
-          <w:rFonts w:ascii="Times New Roman" w:hAnsi="Times New Roman" w:cs="Times New Roman"/>
-          <w:b/>
-          <w:bCs/>
-          <w:sz w:val="24"/>
-          <w:szCs w:val="24"/>
-        </w:rPr>
-      </w:pPr>
-      <w:r>
-        <w:rPr>
-          <w:rFonts w:ascii="Times New Roman" w:hAnsi="Times New Roman" w:cs="Times New Roman"/>
-          <w:b/>
-          <w:bCs/>
-          <w:sz w:val="24"/>
-          <w:szCs w:val="24"/>
-        </w:rPr>
+        <w:spacing w:before="150" w:after="80" w:line="360" w:lineRule="auto"/>
+        <w:rPr>
+          <w:rFonts w:ascii="Times New Roman" w:hAnsi="Times New Roman" w:cs="Times New Roman"/>
+          <w:b/>
+          <w:bCs/>
+          <w:sz w:val="24"/>
+          <w:szCs w:val="24"/>
+        </w:rPr>
+      </w:pPr>
+      <w:r>
+        <w:rPr>
+          <w:rFonts w:ascii="Times New Roman" w:hAnsi="Times New Roman" w:cs="Times New Roman"/>
+          <w:b/>
+          <w:bCs/>
+          <w:sz w:val="24"/>
+          <w:szCs w:val="24"/>
+        </w:rPr>
+        <w:lastRenderedPageBreak/>
         <w:drawing>
           <wp:inline distT="0" distB="0" distL="0" distR="0" wp14:anchorId="60FA2DF1" wp14:editId="29C804D1">
             <wp:extent cx="6400800" cy="2420620"/>
@@ -1121,7 +1120,7 @@
     </w:p>
     <w:p>
       <w:pPr>
-        <w:spacing w:before="150" w:after="80"/>
+        <w:spacing w:before="150" w:after="80" w:line="360" w:lineRule="auto"/>
         <w:rPr>
           <w:rFonts w:ascii="Times New Roman" w:hAnsi="Times New Roman" w:cs="Times New Roman"/>
           <w:b/>
@@ -1194,7 +1193,7 @@
     </w:p>
     <w:p>
       <w:pPr>
-        <w:spacing w:before="150" w:after="80"/>
+        <w:spacing w:before="150" w:after="80" w:line="360" w:lineRule="auto"/>
         <w:rPr>
           <w:rFonts w:ascii="Times New Roman" w:hAnsi="Times New Roman" w:cs="Times New Roman"/>
           <w:b/>
@@ -1216,7 +1215,7 @@
     </w:p>
     <w:p>
       <w:pPr>
-        <w:spacing w:before="150" w:after="80"/>
+        <w:spacing w:before="150" w:after="80" w:line="360" w:lineRule="auto"/>
         <w:rPr>
           <w:rFonts w:ascii="Times New Roman" w:eastAsia="Consolas" w:hAnsi="Times New Roman" w:cs="Times New Roman"/>
           <w:sz w:val="24"/>
@@ -1244,20 +1243,19 @@
     </w:p>
     <w:p>
       <w:pPr>
-        <w:spacing w:before="150" w:after="80"/>
-        <w:rPr>
-          <w:rFonts w:ascii="Times New Roman" w:hAnsi="Times New Roman" w:cs="Times New Roman"/>
-          <w:sz w:val="24"/>
-          <w:szCs w:val="24"/>
-        </w:rPr>
-      </w:pPr>
-      <w:r>
-        <w:rPr>
-          <w:rFonts w:ascii="Times New Roman" w:hAnsi="Times New Roman" w:cs="Times New Roman"/>
-          <w:sz w:val="24"/>
-          <w:szCs w:val="24"/>
-        </w:rPr>
-        <w:lastRenderedPageBreak/>
+        <w:spacing w:before="150" w:after="80" w:line="360" w:lineRule="auto"/>
+        <w:rPr>
+          <w:rFonts w:ascii="Times New Roman" w:hAnsi="Times New Roman" w:cs="Times New Roman"/>
+          <w:sz w:val="24"/>
+          <w:szCs w:val="24"/>
+        </w:rPr>
+      </w:pPr>
+      <w:r>
+        <w:rPr>
+          <w:rFonts w:ascii="Times New Roman" w:hAnsi="Times New Roman" w:cs="Times New Roman"/>
+          <w:sz w:val="24"/>
+          <w:szCs w:val="24"/>
+        </w:rPr>
         <w:drawing>
           <wp:inline distT="0" distB="0" distL="0" distR="0" wp14:anchorId="4FB4D196" wp14:editId="38216E5F">
             <wp:extent cx="6400800" cy="2378710"/>
@@ -1297,7 +1295,7 @@
     </w:p>
     <w:p>
       <w:pPr>
-        <w:spacing w:before="150" w:after="80"/>
+        <w:spacing w:before="150" w:after="80" w:line="360" w:lineRule="auto"/>
         <w:rPr>
           <w:rFonts w:ascii="Times New Roman" w:hAnsi="Times New Roman" w:cs="Times New Roman"/>
           <w:sz w:val="24"/>
@@ -1331,6 +1329,1213 @@
         </w:rPr>
         <w:t>) suivie du résultat formaté confirmant le bon fonctionnement de l'application.</w:t>
       </w:r>
+      <w:r>
+        <w:rPr>
+          <w:rFonts w:ascii="Times New Roman" w:hAnsi="Times New Roman" w:cs="Times New Roman"/>
+          <w:sz w:val="24"/>
+          <w:szCs w:val="24"/>
+        </w:rPr>
+        <w:br/>
+      </w:r>
+    </w:p>
+    <w:p>
+      <w:pPr>
+        <w:spacing w:before="150" w:after="80" w:line="360" w:lineRule="auto"/>
+        <w:rPr>
+          <w:rFonts w:ascii="Times New Roman" w:hAnsi="Times New Roman" w:cs="Times New Roman"/>
+          <w:b/>
+          <w:bCs/>
+          <w:sz w:val="24"/>
+          <w:szCs w:val="24"/>
+        </w:rPr>
+      </w:pPr>
+      <w:r>
+        <w:rPr>
+          <w:rFonts w:ascii="Times New Roman" w:hAnsi="Times New Roman" w:cs="Times New Roman"/>
+          <w:b/>
+          <w:bCs/>
+          <w:sz w:val="24"/>
+          <w:szCs w:val="24"/>
+        </w:rPr>
+        <w:t>Résumé des fonctions et concepts utilisés (Partie 1)</w:t>
+      </w:r>
+    </w:p>
+    <w:p>
+      <w:pPr>
+        <w:pStyle w:val="NormalWeb"/>
+        <w:numPr>
+          <w:ilvl w:val="0"/>
+          <w:numId w:val="5"/>
+        </w:numPr>
+        <w:spacing w:before="0" w:beforeAutospacing="0" w:line="360" w:lineRule="auto"/>
+      </w:pPr>
+      <w:proofErr w:type="gramStart"/>
+      <w:r>
+        <w:rPr>
+          <w:rStyle w:val="CodeHTML"/>
+          <w:rFonts w:ascii="Times New Roman" w:hAnsi="Times New Roman" w:cs="Times New Roman"/>
+          <w:b/>
+          <w:bCs/>
+          <w:sz w:val="24"/>
+          <w:szCs w:val="24"/>
+        </w:rPr>
+        <w:t>input(</w:t>
+      </w:r>
+      <w:proofErr w:type="gramEnd"/>
+      <w:r>
+        <w:rPr>
+          <w:rStyle w:val="CodeHTML"/>
+          <w:rFonts w:ascii="Times New Roman" w:hAnsi="Times New Roman" w:cs="Times New Roman"/>
+          <w:b/>
+          <w:bCs/>
+          <w:sz w:val="24"/>
+          <w:szCs w:val="24"/>
+        </w:rPr>
+        <w:t>)</w:t>
+      </w:r>
+      <w:r>
+        <w:rPr>
+          <w:b/>
+          <w:bCs/>
+        </w:rPr>
+        <w:t xml:space="preserve"> :</w:t>
+      </w:r>
+      <w:r>
+        <w:t xml:space="preserve"> Interrompt l'exécution du programme pour demander à l'utilisateur de saisir une valeur au clavier (qui est toujours récupérée sous forme de chaîne de caractères </w:t>
+      </w:r>
+      <w:proofErr w:type="spellStart"/>
+      <w:r>
+        <w:rPr>
+          <w:rStyle w:val="CodeHTML"/>
+          <w:rFonts w:ascii="Times New Roman" w:hAnsi="Times New Roman" w:cs="Times New Roman"/>
+          <w:sz w:val="24"/>
+          <w:szCs w:val="24"/>
+        </w:rPr>
+        <w:t>str</w:t>
+      </w:r>
+      <w:proofErr w:type="spellEnd"/>
+      <w:r>
+        <w:t xml:space="preserve">). </w:t>
+      </w:r>
+    </w:p>
+    <w:p>
+      <w:pPr>
+        <w:pStyle w:val="NormalWeb"/>
+        <w:numPr>
+          <w:ilvl w:val="0"/>
+          <w:numId w:val="5"/>
+        </w:numPr>
+        <w:spacing w:before="0" w:beforeAutospacing="0" w:line="360" w:lineRule="auto"/>
+      </w:pPr>
+      <w:proofErr w:type="spellStart"/>
+      <w:proofErr w:type="gramStart"/>
+      <w:r>
+        <w:rPr>
+          <w:rStyle w:val="CodeHTML"/>
+          <w:rFonts w:ascii="Times New Roman" w:hAnsi="Times New Roman" w:cs="Times New Roman"/>
+          <w:b/>
+          <w:bCs/>
+          <w:sz w:val="24"/>
+          <w:szCs w:val="24"/>
+        </w:rPr>
+        <w:lastRenderedPageBreak/>
+        <w:t>int</w:t>
+      </w:r>
+      <w:proofErr w:type="spellEnd"/>
+      <w:r>
+        <w:rPr>
+          <w:rStyle w:val="CodeHTML"/>
+          <w:rFonts w:ascii="Times New Roman" w:hAnsi="Times New Roman" w:cs="Times New Roman"/>
+          <w:b/>
+          <w:bCs/>
+          <w:sz w:val="24"/>
+          <w:szCs w:val="24"/>
+        </w:rPr>
+        <w:t>(</w:t>
+      </w:r>
+      <w:proofErr w:type="gramEnd"/>
+      <w:r>
+        <w:rPr>
+          <w:rStyle w:val="CodeHTML"/>
+          <w:rFonts w:ascii="Times New Roman" w:hAnsi="Times New Roman" w:cs="Times New Roman"/>
+          <w:b/>
+          <w:bCs/>
+          <w:sz w:val="24"/>
+          <w:szCs w:val="24"/>
+        </w:rPr>
+        <w:t>)</w:t>
+      </w:r>
+      <w:r>
+        <w:rPr>
+          <w:b/>
+          <w:bCs/>
+        </w:rPr>
+        <w:t xml:space="preserve"> :</w:t>
+      </w:r>
+      <w:r>
+        <w:t xml:space="preserve"> Convertit la saisie utilisateur (ex: nombre de lignes ou colonnes) en un nombre entier pour pouvoir effectuer des calculs ultérieurement. </w:t>
+      </w:r>
+    </w:p>
+    <w:p>
+      <w:pPr>
+        <w:pStyle w:val="NormalWeb"/>
+        <w:numPr>
+          <w:ilvl w:val="0"/>
+          <w:numId w:val="5"/>
+        </w:numPr>
+        <w:spacing w:before="0" w:beforeAutospacing="0" w:line="360" w:lineRule="auto"/>
+      </w:pPr>
+      <w:proofErr w:type="spellStart"/>
+      <w:proofErr w:type="gramStart"/>
+      <w:r>
+        <w:rPr>
+          <w:rStyle w:val="CodeHTML"/>
+          <w:rFonts w:ascii="Times New Roman" w:hAnsi="Times New Roman" w:cs="Times New Roman"/>
+          <w:b/>
+          <w:bCs/>
+          <w:sz w:val="24"/>
+          <w:szCs w:val="24"/>
+        </w:rPr>
+        <w:t>float</w:t>
+      </w:r>
+      <w:proofErr w:type="spellEnd"/>
+      <w:r>
+        <w:rPr>
+          <w:rStyle w:val="CodeHTML"/>
+          <w:rFonts w:ascii="Times New Roman" w:hAnsi="Times New Roman" w:cs="Times New Roman"/>
+          <w:b/>
+          <w:bCs/>
+          <w:sz w:val="24"/>
+          <w:szCs w:val="24"/>
+        </w:rPr>
+        <w:t>(</w:t>
+      </w:r>
+      <w:proofErr w:type="gramEnd"/>
+      <w:r>
+        <w:rPr>
+          <w:rStyle w:val="CodeHTML"/>
+          <w:rFonts w:ascii="Times New Roman" w:hAnsi="Times New Roman" w:cs="Times New Roman"/>
+          <w:b/>
+          <w:bCs/>
+          <w:sz w:val="24"/>
+          <w:szCs w:val="24"/>
+        </w:rPr>
+        <w:t>)</w:t>
+      </w:r>
+      <w:r>
+        <w:rPr>
+          <w:b/>
+          <w:bCs/>
+        </w:rPr>
+        <w:t xml:space="preserve"> :</w:t>
+      </w:r>
+      <w:r>
+        <w:t xml:space="preserve"> Convertit la saisie utilisateur (ex: taille du </w:t>
+      </w:r>
+      <w:proofErr w:type="spellStart"/>
+      <w:r>
+        <w:t>dataset</w:t>
+      </w:r>
+      <w:proofErr w:type="spellEnd"/>
+      <w:r>
+        <w:t xml:space="preserve">) en un nombre à virgule flottante. </w:t>
+      </w:r>
+    </w:p>
+    <w:p>
+      <w:pPr>
+        <w:pStyle w:val="NormalWeb"/>
+        <w:numPr>
+          <w:ilvl w:val="0"/>
+          <w:numId w:val="5"/>
+        </w:numPr>
+        <w:spacing w:before="0" w:beforeAutospacing="0" w:line="360" w:lineRule="auto"/>
+      </w:pPr>
+      <w:proofErr w:type="spellStart"/>
+      <w:proofErr w:type="gramStart"/>
+      <w:r>
+        <w:rPr>
+          <w:rStyle w:val="CodeHTML"/>
+          <w:rFonts w:ascii="Times New Roman" w:hAnsi="Times New Roman" w:cs="Times New Roman"/>
+          <w:b/>
+          <w:bCs/>
+          <w:sz w:val="24"/>
+          <w:szCs w:val="24"/>
+        </w:rPr>
+        <w:t>print</w:t>
+      </w:r>
+      <w:proofErr w:type="spellEnd"/>
+      <w:r>
+        <w:rPr>
+          <w:rStyle w:val="CodeHTML"/>
+          <w:rFonts w:ascii="Times New Roman" w:hAnsi="Times New Roman" w:cs="Times New Roman"/>
+          <w:b/>
+          <w:bCs/>
+          <w:sz w:val="24"/>
+          <w:szCs w:val="24"/>
+        </w:rPr>
+        <w:t>(</w:t>
+      </w:r>
+      <w:proofErr w:type="gramEnd"/>
+      <w:r>
+        <w:rPr>
+          <w:rStyle w:val="CodeHTML"/>
+          <w:rFonts w:ascii="Times New Roman" w:hAnsi="Times New Roman" w:cs="Times New Roman"/>
+          <w:b/>
+          <w:bCs/>
+          <w:sz w:val="24"/>
+          <w:szCs w:val="24"/>
+        </w:rPr>
+        <w:t>)</w:t>
+      </w:r>
+      <w:r>
+        <w:rPr>
+          <w:b/>
+          <w:bCs/>
+        </w:rPr>
+        <w:t xml:space="preserve"> avec f-strings (</w:t>
+      </w:r>
+      <w:r>
+        <w:rPr>
+          <w:rStyle w:val="CodeHTML"/>
+          <w:rFonts w:ascii="Times New Roman" w:hAnsi="Times New Roman" w:cs="Times New Roman"/>
+          <w:b/>
+          <w:bCs/>
+          <w:sz w:val="24"/>
+          <w:szCs w:val="24"/>
+        </w:rPr>
+        <w:t>f"..."</w:t>
+      </w:r>
+      <w:r>
+        <w:rPr>
+          <w:b/>
+          <w:bCs/>
+        </w:rPr>
+        <w:t>) :</w:t>
+      </w:r>
+      <w:r>
+        <w:t xml:space="preserve"> Affiche le texte dans la console tout en insérant directement les valeurs des variables dans la chaîne pour présenter un résumé propre et formaté. </w:t>
+      </w:r>
+    </w:p>
+    <w:p>
+      <w:pPr>
+        <w:pStyle w:val="NormalWeb"/>
+        <w:spacing w:before="0" w:beforeAutospacing="0" w:line="360" w:lineRule="auto"/>
+      </w:pPr>
+    </w:p>
+    <w:p>
+      <w:pPr>
+        <w:pStyle w:val="Titre1"/>
+        <w:spacing w:line="360" w:lineRule="auto"/>
+        <w:rPr>
+          <w:rFonts w:ascii="Times New Roman" w:hAnsi="Times New Roman" w:cs="Times New Roman"/>
+          <w:color w:val="auto"/>
+          <w:sz w:val="24"/>
+          <w:szCs w:val="24"/>
+        </w:rPr>
+      </w:pPr>
+      <w:r>
+        <w:rPr>
+          <w:rFonts w:ascii="Times New Roman" w:hAnsi="Times New Roman" w:cs="Times New Roman"/>
+          <w:color w:val="auto"/>
+          <w:sz w:val="24"/>
+          <w:szCs w:val="24"/>
+        </w:rPr>
+        <w:t>Partie 2 — Structures de contrôle</w:t>
+      </w:r>
+    </w:p>
+    <w:p>
+      <w:r>
+        <w:t>Cette section introduit la logique de contrôle du flux d'exécution grâce à une boucle conditionnelle et des structures de décision pour rendre l'application interactive.</w:t>
+      </w:r>
+    </w:p>
+    <w:p/>
+    <w:tbl>
+      <w:tblPr>
+        <w:tblW w:w="5000" w:type="pct"/>
+        <w:tblBorders>
+          <w:top w:val="single" w:sz="4" w:space="0" w:color="2E5395"/>
+          <w:left w:val="single" w:sz="4" w:space="0" w:color="2E5395"/>
+          <w:bottom w:val="single" w:sz="4" w:space="0" w:color="2E5395"/>
+          <w:right w:val="single" w:sz="4" w:space="0" w:color="2E5395"/>
+          <w:insideH w:val="single" w:sz="4" w:space="0" w:color="auto"/>
+          <w:insideV w:val="single" w:sz="4" w:space="0" w:color="auto"/>
+        </w:tblBorders>
+        <w:tblCellMar>
+          <w:left w:w="10" w:type="dxa"/>
+          <w:right w:w="10" w:type="dxa"/>
+        </w:tblCellMar>
+        <w:tblLook w:val="04A0" w:firstRow="1" w:lastRow="0" w:firstColumn="1" w:lastColumn="0" w:noHBand="0" w:noVBand="1"/>
+      </w:tblPr>
+      <w:tblGrid>
+        <w:gridCol w:w="10070"/>
+      </w:tblGrid>
+      <w:tr>
+        <w:tc>
+          <w:tcPr>
+            <w:tcW w:w="0" w:type="auto"/>
+            <w:tcBorders>
+              <w:top w:val="single" w:sz="4" w:space="0" w:color="2E5395"/>
+              <w:left w:val="single" w:sz="4" w:space="0" w:color="2E5395"/>
+              <w:bottom w:val="single" w:sz="4" w:space="0" w:color="2E5395"/>
+              <w:right w:val="single" w:sz="4" w:space="0" w:color="2E5395"/>
+            </w:tcBorders>
+            <w:shd w:val="clear" w:color="auto" w:fill="FFC000" w:themeFill="accent4"/>
+            <w:tcMar>
+              <w:top w:w="150" w:type="dxa"/>
+              <w:left w:w="200" w:type="dxa"/>
+              <w:bottom w:w="150" w:type="dxa"/>
+              <w:right w:w="200" w:type="dxa"/>
+            </w:tcMar>
+            <w:hideMark/>
+          </w:tcPr>
+          <w:p>
+            <w:pPr>
+              <w:spacing w:line="360" w:lineRule="auto"/>
+              <w:rPr>
+                <w:rFonts w:ascii="Times New Roman" w:hAnsi="Times New Roman" w:cs="Times New Roman"/>
+                <w:sz w:val="24"/>
+                <w:szCs w:val="24"/>
+              </w:rPr>
+            </w:pPr>
+            <w:r>
+              <w:rPr>
+                <w:rFonts w:ascii="Times New Roman" w:hAnsi="Times New Roman" w:cs="Times New Roman"/>
+                <w:b/>
+                <w:bCs/>
+                <w:sz w:val="24"/>
+                <w:szCs w:val="24"/>
+              </w:rPr>
+              <w:t xml:space="preserve">Question 5 — </w:t>
+            </w:r>
+            <w:r>
+              <w:rPr>
+                <w:rFonts w:ascii="Times New Roman" w:hAnsi="Times New Roman" w:cs="Times New Roman"/>
+                <w:i/>
+                <w:iCs/>
+                <w:sz w:val="24"/>
+                <w:szCs w:val="24"/>
+              </w:rPr>
+              <w:t>Cré</w:t>
+            </w:r>
+            <w:r>
+              <w:rPr>
+                <w:rFonts w:ascii="Times New Roman" w:hAnsi="Times New Roman" w:cs="Times New Roman"/>
+                <w:i/>
+                <w:iCs/>
+                <w:sz w:val="24"/>
+                <w:szCs w:val="24"/>
+              </w:rPr>
+              <w:t>ation</w:t>
+            </w:r>
+            <w:r>
+              <w:rPr>
+                <w:rFonts w:ascii="Times New Roman" w:hAnsi="Times New Roman" w:cs="Times New Roman"/>
+                <w:i/>
+                <w:iCs/>
+                <w:sz w:val="24"/>
+                <w:szCs w:val="24"/>
+              </w:rPr>
+              <w:t xml:space="preserve"> </w:t>
+            </w:r>
+            <w:r>
+              <w:rPr>
+                <w:rFonts w:ascii="Times New Roman" w:hAnsi="Times New Roman" w:cs="Times New Roman"/>
+                <w:i/>
+                <w:iCs/>
+                <w:sz w:val="24"/>
+                <w:szCs w:val="24"/>
+              </w:rPr>
+              <w:t>d’</w:t>
+            </w:r>
+            <w:r>
+              <w:rPr>
+                <w:rFonts w:ascii="Times New Roman" w:hAnsi="Times New Roman" w:cs="Times New Roman"/>
+                <w:i/>
+                <w:iCs/>
+                <w:sz w:val="24"/>
+                <w:szCs w:val="24"/>
+              </w:rPr>
+              <w:t>un menu interactif (provisoire) qui reste actif jusqu'à ce que l'utilisateur choisisse Quitter.</w:t>
+            </w:r>
+          </w:p>
+        </w:tc>
+      </w:tr>
+    </w:tbl>
+    <w:p>
+      <w:pPr>
+        <w:spacing w:after="150" w:line="360" w:lineRule="auto"/>
+        <w:rPr>
+          <w:rFonts w:ascii="Times New Roman" w:hAnsi="Times New Roman" w:cs="Times New Roman"/>
+          <w:sz w:val="24"/>
+          <w:szCs w:val="24"/>
+        </w:rPr>
+      </w:pPr>
+      <w:r>
+        <w:rPr>
+          <w:rFonts w:ascii="Times New Roman" w:hAnsi="Times New Roman" w:cs="Times New Roman"/>
+          <w:sz w:val="24"/>
+          <w:szCs w:val="24"/>
+        </w:rPr>
+        <w:t xml:space="preserve"> </w:t>
+      </w:r>
+      <w:r>
+        <w:rPr>
+          <w:rFonts w:ascii="Times New Roman" w:hAnsi="Times New Roman" w:cs="Times New Roman"/>
+          <w:sz w:val="24"/>
+          <w:szCs w:val="24"/>
+        </w:rPr>
+        <w:t>Mise en place d'un menu principal dans une boucle pour permettre à l'utilisateur de choisir entre plusieurs actions (ajouter, afficher, rechercher ou quitter).</w:t>
+      </w:r>
+    </w:p>
+    <w:p>
+      <w:pPr>
+        <w:spacing w:before="150" w:after="80" w:line="360" w:lineRule="auto"/>
+        <w:rPr>
+          <w:rFonts w:ascii="Times New Roman" w:hAnsi="Times New Roman" w:cs="Times New Roman"/>
+          <w:b/>
+          <w:bCs/>
+          <w:sz w:val="24"/>
+          <w:szCs w:val="24"/>
+        </w:rPr>
+      </w:pPr>
+      <w:r>
+        <w:rPr>
+          <w:rFonts w:ascii="Times New Roman" w:hAnsi="Times New Roman" w:cs="Times New Roman"/>
+          <w:b/>
+          <w:bCs/>
+          <w:sz w:val="24"/>
+          <w:szCs w:val="24"/>
+        </w:rPr>
+        <w:t>Code (main.py) :</w:t>
+      </w:r>
+    </w:p>
+    <w:p>
+      <w:pPr>
+        <w:spacing w:before="150" w:after="80" w:line="360" w:lineRule="auto"/>
+        <w:rPr>
+          <w:rFonts w:ascii="Times New Roman" w:hAnsi="Times New Roman" w:cs="Times New Roman"/>
+          <w:b/>
+          <w:bCs/>
+          <w:sz w:val="24"/>
+          <w:szCs w:val="24"/>
+        </w:rPr>
+      </w:pPr>
+      <w:r>
+        <w:rPr>
+          <w:rFonts w:ascii="Times New Roman" w:hAnsi="Times New Roman" w:cs="Times New Roman"/>
+          <w:b/>
+          <w:bCs/>
+          <w:sz w:val="24"/>
+          <w:szCs w:val="24"/>
+        </w:rPr>
+        <w:drawing>
+          <wp:inline distT="0" distB="0" distL="0" distR="0" wp14:anchorId="3CD830E1" wp14:editId="0AF8C7E2">
+            <wp:extent cx="6400800" cy="2974975"/>
+            <wp:effectExtent l="0" t="0" r="0" b="0"/>
+            <wp:docPr id="1731331479" name="Image 5"/>
+            <wp:cNvGraphicFramePr>
+              <a:graphicFrameLocks xmlns:a="http://schemas.openxmlformats.org/drawingml/2006/main" noChangeAspect="1"/>
+            </wp:cNvGraphicFramePr>
+            <a:graphic xmlns:a="http://schemas.openxmlformats.org/drawingml/2006/main">
+              <a:graphicData uri="http://schemas.openxmlformats.org/drawingml/2006/picture">
+                <pic:pic xmlns:pic="http://schemas.openxmlformats.org/drawingml/2006/picture">
+                  <pic:nvPicPr>
+                    <pic:cNvPr id="1731331479" name=""/>
+                    <pic:cNvPicPr/>
+                  </pic:nvPicPr>
+                  <pic:blipFill>
+                    <a:blip r:embed="rId9"/>
+                    <a:stretch>
+                      <a:fillRect/>
+                    </a:stretch>
+                  </pic:blipFill>
+                  <pic:spPr>
+                    <a:xfrm>
+                      <a:off x="0" y="0"/>
+                      <a:ext cx="6400800" cy="2974975"/>
+                    </a:xfrm>
+                    <a:prstGeom prst="rect">
+                      <a:avLst/>
+                    </a:prstGeom>
+                  </pic:spPr>
+                </pic:pic>
+              </a:graphicData>
+            </a:graphic>
+          </wp:inline>
+        </w:drawing>
+      </w:r>
+    </w:p>
+    <w:p>
+      <w:pPr>
+        <w:spacing w:before="150" w:after="80" w:line="360" w:lineRule="auto"/>
+        <w:rPr>
+          <w:rFonts w:ascii="Times New Roman" w:hAnsi="Times New Roman" w:cs="Times New Roman"/>
+          <w:b/>
+          <w:bCs/>
+          <w:sz w:val="24"/>
+          <w:szCs w:val="24"/>
+        </w:rPr>
+      </w:pPr>
+      <w:r>
+        <w:rPr>
+          <w:rFonts w:ascii="Times New Roman" w:hAnsi="Times New Roman" w:cs="Times New Roman"/>
+          <w:b/>
+          <w:bCs/>
+          <w:sz w:val="24"/>
+          <w:szCs w:val="24"/>
+        </w:rPr>
+        <w:lastRenderedPageBreak/>
+        <w:drawing>
+          <wp:inline distT="0" distB="0" distL="0" distR="0" wp14:anchorId="132A1F7E" wp14:editId="04122872">
+            <wp:extent cx="6400800" cy="2971800"/>
+            <wp:effectExtent l="0" t="0" r="0" b="0"/>
+            <wp:docPr id="429682430" name="Image 6"/>
+            <wp:cNvGraphicFramePr>
+              <a:graphicFrameLocks xmlns:a="http://schemas.openxmlformats.org/drawingml/2006/main" noChangeAspect="1"/>
+            </wp:cNvGraphicFramePr>
+            <a:graphic xmlns:a="http://schemas.openxmlformats.org/drawingml/2006/main">
+              <a:graphicData uri="http://schemas.openxmlformats.org/drawingml/2006/picture">
+                <pic:pic xmlns:pic="http://schemas.openxmlformats.org/drawingml/2006/picture">
+                  <pic:nvPicPr>
+                    <pic:cNvPr id="429682430" name=""/>
+                    <pic:cNvPicPr/>
+                  </pic:nvPicPr>
+                  <pic:blipFill>
+                    <a:blip r:embed="rId10"/>
+                    <a:stretch>
+                      <a:fillRect/>
+                    </a:stretch>
+                  </pic:blipFill>
+                  <pic:spPr>
+                    <a:xfrm>
+                      <a:off x="0" y="0"/>
+                      <a:ext cx="6400800" cy="2971800"/>
+                    </a:xfrm>
+                    <a:prstGeom prst="rect">
+                      <a:avLst/>
+                    </a:prstGeom>
+                  </pic:spPr>
+                </pic:pic>
+              </a:graphicData>
+            </a:graphic>
+          </wp:inline>
+        </w:drawing>
+      </w:r>
+    </w:p>
+    <w:p>
+      <w:pPr>
+        <w:spacing w:before="150" w:after="80" w:line="360" w:lineRule="auto"/>
+        <w:rPr>
+          <w:rFonts w:ascii="Times New Roman" w:hAnsi="Times New Roman" w:cs="Times New Roman"/>
+          <w:sz w:val="24"/>
+          <w:szCs w:val="24"/>
+        </w:rPr>
+      </w:pPr>
+      <w:r>
+        <w:rPr>
+          <w:rFonts w:ascii="Times New Roman" w:hAnsi="Times New Roman" w:cs="Times New Roman"/>
+          <w:sz w:val="24"/>
+          <w:szCs w:val="24"/>
+        </w:rPr>
+        <w:t xml:space="preserve">L'extrait montre l'initialisation de la variable </w:t>
+      </w:r>
+      <w:r>
+        <w:rPr>
+          <w:rStyle w:val="CodeHTML"/>
+          <w:rFonts w:ascii="Times New Roman" w:eastAsia="Calibri" w:hAnsi="Times New Roman" w:cs="Times New Roman"/>
+          <w:sz w:val="24"/>
+          <w:szCs w:val="24"/>
+        </w:rPr>
+        <w:t xml:space="preserve">active = </w:t>
+      </w:r>
+      <w:proofErr w:type="spellStart"/>
+      <w:r>
+        <w:rPr>
+          <w:rStyle w:val="CodeHTML"/>
+          <w:rFonts w:ascii="Times New Roman" w:eastAsia="Calibri" w:hAnsi="Times New Roman" w:cs="Times New Roman"/>
+          <w:sz w:val="24"/>
+          <w:szCs w:val="24"/>
+        </w:rPr>
+        <w:t>True</w:t>
+      </w:r>
+      <w:proofErr w:type="spellEnd"/>
+      <w:r>
+        <w:rPr>
+          <w:rFonts w:ascii="Times New Roman" w:hAnsi="Times New Roman" w:cs="Times New Roman"/>
+          <w:sz w:val="24"/>
+          <w:szCs w:val="24"/>
+        </w:rPr>
+        <w:t xml:space="preserve"> et le début de la boucle </w:t>
+      </w:r>
+      <w:proofErr w:type="spellStart"/>
+      <w:r>
+        <w:rPr>
+          <w:rStyle w:val="CodeHTML"/>
+          <w:rFonts w:ascii="Times New Roman" w:eastAsia="Calibri" w:hAnsi="Times New Roman" w:cs="Times New Roman"/>
+          <w:sz w:val="24"/>
+          <w:szCs w:val="24"/>
+        </w:rPr>
+        <w:t>while</w:t>
+      </w:r>
+      <w:proofErr w:type="spellEnd"/>
+      <w:r>
+        <w:rPr>
+          <w:rFonts w:ascii="Times New Roman" w:hAnsi="Times New Roman" w:cs="Times New Roman"/>
+          <w:sz w:val="24"/>
+          <w:szCs w:val="24"/>
+        </w:rPr>
+        <w:t xml:space="preserve"> affichant les options du menu et la saisie de l'option 1.</w:t>
+      </w:r>
+      <w:r>
+        <w:rPr>
+          <w:rFonts w:ascii="Times New Roman" w:hAnsi="Times New Roman" w:cs="Times New Roman"/>
+          <w:sz w:val="24"/>
+          <w:szCs w:val="24"/>
+        </w:rPr>
+        <w:t xml:space="preserve"> C</w:t>
+      </w:r>
+      <w:r>
+        <w:rPr>
+          <w:rFonts w:ascii="Times New Roman" w:hAnsi="Times New Roman" w:cs="Times New Roman"/>
+          <w:sz w:val="24"/>
+          <w:szCs w:val="24"/>
+        </w:rPr>
+        <w:t xml:space="preserve">e code illustre la suite du bloc d'affichage de l'option 1, ainsi que les blocs </w:t>
+      </w:r>
+      <w:proofErr w:type="spellStart"/>
+      <w:r>
+        <w:rPr>
+          <w:rStyle w:val="CodeHTML"/>
+          <w:rFonts w:ascii="Times New Roman" w:eastAsia="Calibri" w:hAnsi="Times New Roman" w:cs="Times New Roman"/>
+          <w:sz w:val="24"/>
+          <w:szCs w:val="24"/>
+        </w:rPr>
+        <w:t>elif</w:t>
+      </w:r>
+      <w:proofErr w:type="spellEnd"/>
+      <w:r>
+        <w:rPr>
+          <w:rFonts w:ascii="Times New Roman" w:hAnsi="Times New Roman" w:cs="Times New Roman"/>
+          <w:sz w:val="24"/>
+          <w:szCs w:val="24"/>
+        </w:rPr>
+        <w:t xml:space="preserve"> pour les options 2, 3, 4 et la gestion des choix invalides avec </w:t>
+      </w:r>
+      <w:proofErr w:type="spellStart"/>
+      <w:r>
+        <w:rPr>
+          <w:rStyle w:val="CodeHTML"/>
+          <w:rFonts w:ascii="Times New Roman" w:eastAsia="Calibri" w:hAnsi="Times New Roman" w:cs="Times New Roman"/>
+          <w:sz w:val="24"/>
+          <w:szCs w:val="24"/>
+        </w:rPr>
+        <w:t>else</w:t>
+      </w:r>
+      <w:proofErr w:type="spellEnd"/>
+      <w:r>
+        <w:rPr>
+          <w:rFonts w:ascii="Times New Roman" w:hAnsi="Times New Roman" w:cs="Times New Roman"/>
+          <w:sz w:val="24"/>
+          <w:szCs w:val="24"/>
+        </w:rPr>
+        <w:t>.</w:t>
+      </w:r>
+    </w:p>
+    <w:p>
+      <w:pPr>
+        <w:spacing w:before="150" w:after="80" w:line="360" w:lineRule="auto"/>
+        <w:rPr>
+          <w:rFonts w:ascii="Times New Roman" w:hAnsi="Times New Roman" w:cs="Times New Roman"/>
+          <w:b/>
+          <w:bCs/>
+          <w:sz w:val="24"/>
+          <w:szCs w:val="24"/>
+        </w:rPr>
+      </w:pPr>
+    </w:p>
+    <w:p>
+      <w:pPr>
+        <w:spacing w:before="150" w:after="80" w:line="360" w:lineRule="auto"/>
+        <w:rPr>
+          <w:rFonts w:ascii="Times New Roman" w:hAnsi="Times New Roman" w:cs="Times New Roman"/>
+          <w:b/>
+          <w:bCs/>
+          <w:sz w:val="24"/>
+          <w:szCs w:val="24"/>
+        </w:rPr>
+      </w:pPr>
+      <w:r>
+        <w:rPr>
+          <w:rFonts w:ascii="Times New Roman" w:hAnsi="Times New Roman" w:cs="Times New Roman"/>
+          <w:sz w:val="24"/>
+          <w:szCs w:val="24"/>
+        </w:rPr>
+        <w:t xml:space="preserve"> </w:t>
+      </w:r>
+      <w:r>
+        <w:rPr>
+          <w:rFonts w:ascii="Times New Roman" w:hAnsi="Times New Roman" w:cs="Times New Roman"/>
+          <w:b/>
+          <w:bCs/>
+          <w:sz w:val="24"/>
+          <w:szCs w:val="24"/>
+        </w:rPr>
+        <w:t>Résultat à l'exécution :</w:t>
+      </w:r>
+    </w:p>
+    <w:p>
+      <w:pPr>
+        <w:spacing w:before="150" w:after="80" w:line="360" w:lineRule="auto"/>
+        <w:rPr>
+          <w:rFonts w:ascii="Times New Roman" w:hAnsi="Times New Roman" w:cs="Times New Roman"/>
+          <w:sz w:val="24"/>
+          <w:szCs w:val="24"/>
+        </w:rPr>
+      </w:pPr>
+      <w:r>
+        <w:rPr>
+          <w:rFonts w:ascii="Times New Roman" w:hAnsi="Times New Roman" w:cs="Times New Roman"/>
+          <w:sz w:val="24"/>
+          <w:szCs w:val="24"/>
+        </w:rPr>
+        <w:lastRenderedPageBreak/>
+        <w:drawing>
+          <wp:inline distT="0" distB="0" distL="0" distR="0" wp14:anchorId="69E4BEE3" wp14:editId="057F16AD">
+            <wp:extent cx="6400800" cy="4510405"/>
+            <wp:effectExtent l="0" t="0" r="0" b="4445"/>
+            <wp:docPr id="692814124" name="Image 7"/>
+            <wp:cNvGraphicFramePr>
+              <a:graphicFrameLocks xmlns:a="http://schemas.openxmlformats.org/drawingml/2006/main" noChangeAspect="1"/>
+            </wp:cNvGraphicFramePr>
+            <a:graphic xmlns:a="http://schemas.openxmlformats.org/drawingml/2006/main">
+              <a:graphicData uri="http://schemas.openxmlformats.org/drawingml/2006/picture">
+                <pic:pic xmlns:pic="http://schemas.openxmlformats.org/drawingml/2006/picture">
+                  <pic:nvPicPr>
+                    <pic:cNvPr id="692814124" name=""/>
+                    <pic:cNvPicPr/>
+                  </pic:nvPicPr>
+                  <pic:blipFill>
+                    <a:blip r:embed="rId11"/>
+                    <a:stretch>
+                      <a:fillRect/>
+                    </a:stretch>
+                  </pic:blipFill>
+                  <pic:spPr>
+                    <a:xfrm>
+                      <a:off x="0" y="0"/>
+                      <a:ext cx="6400800" cy="4510405"/>
+                    </a:xfrm>
+                    <a:prstGeom prst="rect">
+                      <a:avLst/>
+                    </a:prstGeom>
+                  </pic:spPr>
+                </pic:pic>
+              </a:graphicData>
+            </a:graphic>
+          </wp:inline>
+        </w:drawing>
+      </w:r>
+    </w:p>
+    <w:p>
+      <w:pPr>
+        <w:spacing w:before="150" w:after="80" w:line="360" w:lineRule="auto"/>
+        <w:rPr>
+          <w:rFonts w:ascii="Times New Roman" w:hAnsi="Times New Roman" w:cs="Times New Roman"/>
+          <w:sz w:val="24"/>
+          <w:szCs w:val="24"/>
+        </w:rPr>
+      </w:pPr>
+      <w:r>
+        <w:rPr>
+          <w:rFonts w:ascii="Times New Roman" w:hAnsi="Times New Roman" w:cs="Times New Roman"/>
+          <w:sz w:val="24"/>
+          <w:szCs w:val="24"/>
+        </w:rPr>
+        <w:t xml:space="preserve">Le terminal montre l'enchaînement des interactions : l'ajout d'un </w:t>
+      </w:r>
+      <w:proofErr w:type="spellStart"/>
+      <w:r>
+        <w:rPr>
+          <w:rFonts w:ascii="Times New Roman" w:hAnsi="Times New Roman" w:cs="Times New Roman"/>
+          <w:sz w:val="24"/>
+          <w:szCs w:val="24"/>
+        </w:rPr>
+        <w:t>dataset</w:t>
+      </w:r>
+      <w:proofErr w:type="spellEnd"/>
+      <w:r>
+        <w:rPr>
+          <w:rFonts w:ascii="Times New Roman" w:hAnsi="Times New Roman" w:cs="Times New Roman"/>
+          <w:sz w:val="24"/>
+          <w:szCs w:val="24"/>
+        </w:rPr>
+        <w:t xml:space="preserve"> (</w:t>
+      </w:r>
+      <w:r>
+        <w:rPr>
+          <w:rStyle w:val="CodeHTML"/>
+          <w:rFonts w:ascii="Times New Roman" w:eastAsia="Calibri" w:hAnsi="Times New Roman" w:cs="Times New Roman"/>
+          <w:sz w:val="24"/>
+          <w:szCs w:val="24"/>
+        </w:rPr>
+        <w:t>Titanic</w:t>
+      </w:r>
+      <w:r>
+        <w:rPr>
+          <w:rFonts w:ascii="Times New Roman" w:hAnsi="Times New Roman" w:cs="Times New Roman"/>
+          <w:sz w:val="24"/>
+          <w:szCs w:val="24"/>
+        </w:rPr>
+        <w:t>), le test de l'option 2 (affichage provisoire) et la fermeture propre du programme avec l'option 4.</w:t>
+      </w:r>
+    </w:p>
+    <w:p>
+      <w:pPr>
+        <w:spacing w:before="150" w:after="80" w:line="360" w:lineRule="auto"/>
+        <w:rPr>
+          <w:rFonts w:ascii="Times New Roman" w:hAnsi="Times New Roman" w:cs="Times New Roman"/>
+          <w:b/>
+          <w:bCs/>
+          <w:sz w:val="24"/>
+          <w:szCs w:val="24"/>
+        </w:rPr>
+      </w:pPr>
+      <w:r>
+        <w:rPr>
+          <w:rFonts w:ascii="Times New Roman" w:hAnsi="Times New Roman" w:cs="Times New Roman"/>
+          <w:b/>
+          <w:bCs/>
+          <w:sz w:val="24"/>
+          <w:szCs w:val="24"/>
+        </w:rPr>
+        <w:t>Résumé des fonctions et concepts utilisés (Partie 2)</w:t>
+      </w:r>
+    </w:p>
+    <w:p>
+      <w:pPr>
+        <w:pStyle w:val="NormalWeb"/>
+        <w:numPr>
+          <w:ilvl w:val="0"/>
+          <w:numId w:val="6"/>
+        </w:numPr>
+        <w:spacing w:before="0" w:beforeAutospacing="0" w:line="360" w:lineRule="auto"/>
+      </w:pPr>
+      <w:proofErr w:type="spellStart"/>
+      <w:proofErr w:type="gramStart"/>
+      <w:r>
+        <w:rPr>
+          <w:rStyle w:val="CodeHTML"/>
+          <w:rFonts w:ascii="Times New Roman" w:hAnsi="Times New Roman" w:cs="Times New Roman"/>
+          <w:b/>
+          <w:bCs/>
+          <w:sz w:val="24"/>
+          <w:szCs w:val="24"/>
+        </w:rPr>
+        <w:t>while</w:t>
+      </w:r>
+      <w:proofErr w:type="spellEnd"/>
+      <w:proofErr w:type="gramEnd"/>
+      <w:r>
+        <w:rPr>
+          <w:rStyle w:val="CodeHTML"/>
+          <w:rFonts w:ascii="Times New Roman" w:hAnsi="Times New Roman" w:cs="Times New Roman"/>
+          <w:b/>
+          <w:bCs/>
+          <w:sz w:val="24"/>
+          <w:szCs w:val="24"/>
+        </w:rPr>
+        <w:t xml:space="preserve"> active:</w:t>
+      </w:r>
+      <w:r>
+        <w:rPr>
+          <w:b/>
+          <w:bCs/>
+        </w:rPr>
+        <w:t xml:space="preserve"> :</w:t>
+      </w:r>
+      <w:r>
+        <w:t xml:space="preserve"> Une boucle conditionnelle qui répète l'affichage du menu et l'exécution des choix tant que la variable </w:t>
+      </w:r>
+      <w:r>
+        <w:rPr>
+          <w:rStyle w:val="CodeHTML"/>
+          <w:rFonts w:ascii="Times New Roman" w:hAnsi="Times New Roman" w:cs="Times New Roman"/>
+          <w:sz w:val="24"/>
+          <w:szCs w:val="24"/>
+        </w:rPr>
+        <w:t>active</w:t>
+      </w:r>
+      <w:r>
+        <w:t xml:space="preserve"> reste égale à </w:t>
+      </w:r>
+      <w:proofErr w:type="spellStart"/>
+      <w:r>
+        <w:rPr>
+          <w:rStyle w:val="CodeHTML"/>
+          <w:rFonts w:ascii="Times New Roman" w:hAnsi="Times New Roman" w:cs="Times New Roman"/>
+          <w:sz w:val="24"/>
+          <w:szCs w:val="24"/>
+        </w:rPr>
+        <w:t>True</w:t>
+      </w:r>
+      <w:proofErr w:type="spellEnd"/>
+      <w:r>
+        <w:t xml:space="preserve">. </w:t>
+      </w:r>
+    </w:p>
+    <w:p>
+      <w:pPr>
+        <w:pStyle w:val="NormalWeb"/>
+        <w:numPr>
+          <w:ilvl w:val="0"/>
+          <w:numId w:val="6"/>
+        </w:numPr>
+        <w:spacing w:before="0" w:beforeAutospacing="0" w:line="360" w:lineRule="auto"/>
+      </w:pPr>
+      <w:proofErr w:type="gramStart"/>
+      <w:r>
+        <w:rPr>
+          <w:rStyle w:val="CodeHTML"/>
+          <w:rFonts w:ascii="Times New Roman" w:hAnsi="Times New Roman" w:cs="Times New Roman"/>
+          <w:b/>
+          <w:bCs/>
+          <w:sz w:val="24"/>
+          <w:szCs w:val="24"/>
+        </w:rPr>
+        <w:t>if</w:t>
+      </w:r>
+      <w:proofErr w:type="gramEnd"/>
+      <w:r>
+        <w:rPr>
+          <w:rStyle w:val="CodeHTML"/>
+          <w:rFonts w:ascii="Times New Roman" w:hAnsi="Times New Roman" w:cs="Times New Roman"/>
+          <w:b/>
+          <w:bCs/>
+          <w:sz w:val="24"/>
+          <w:szCs w:val="24"/>
+        </w:rPr>
+        <w:t xml:space="preserve"> / </w:t>
+      </w:r>
+      <w:proofErr w:type="spellStart"/>
+      <w:r>
+        <w:rPr>
+          <w:rStyle w:val="CodeHTML"/>
+          <w:rFonts w:ascii="Times New Roman" w:hAnsi="Times New Roman" w:cs="Times New Roman"/>
+          <w:b/>
+          <w:bCs/>
+          <w:sz w:val="24"/>
+          <w:szCs w:val="24"/>
+        </w:rPr>
+        <w:t>elif</w:t>
+      </w:r>
+      <w:proofErr w:type="spellEnd"/>
+      <w:r>
+        <w:rPr>
+          <w:rStyle w:val="CodeHTML"/>
+          <w:rFonts w:ascii="Times New Roman" w:hAnsi="Times New Roman" w:cs="Times New Roman"/>
+          <w:b/>
+          <w:bCs/>
+          <w:sz w:val="24"/>
+          <w:szCs w:val="24"/>
+        </w:rPr>
+        <w:t xml:space="preserve"> / </w:t>
+      </w:r>
+      <w:proofErr w:type="spellStart"/>
+      <w:r>
+        <w:rPr>
+          <w:rStyle w:val="CodeHTML"/>
+          <w:rFonts w:ascii="Times New Roman" w:hAnsi="Times New Roman" w:cs="Times New Roman"/>
+          <w:b/>
+          <w:bCs/>
+          <w:sz w:val="24"/>
+          <w:szCs w:val="24"/>
+        </w:rPr>
+        <w:t>else</w:t>
+      </w:r>
+      <w:proofErr w:type="spellEnd"/>
+      <w:r>
+        <w:rPr>
+          <w:b/>
+          <w:bCs/>
+        </w:rPr>
+        <w:t xml:space="preserve"> :</w:t>
+      </w:r>
+      <w:r>
+        <w:t xml:space="preserve"> La structure conditionnelle permettant de tester le choix saisi par l'utilisateur et de diriger l'exécution vers le bloc de code correspondant. </w:t>
+      </w:r>
+    </w:p>
+    <w:p>
+      <w:pPr>
+        <w:pStyle w:val="NormalWeb"/>
+        <w:numPr>
+          <w:ilvl w:val="0"/>
+          <w:numId w:val="6"/>
+        </w:numPr>
+        <w:spacing w:before="0" w:beforeAutospacing="0" w:line="360" w:lineRule="auto"/>
+      </w:pPr>
+      <w:proofErr w:type="gramStart"/>
+      <w:r>
+        <w:rPr>
+          <w:rStyle w:val="CodeHTML"/>
+          <w:rFonts w:ascii="Times New Roman" w:hAnsi="Times New Roman" w:cs="Times New Roman"/>
+          <w:b/>
+          <w:bCs/>
+          <w:sz w:val="24"/>
+          <w:szCs w:val="24"/>
+        </w:rPr>
+        <w:t>active</w:t>
+      </w:r>
+      <w:proofErr w:type="gramEnd"/>
+      <w:r>
+        <w:rPr>
+          <w:rStyle w:val="CodeHTML"/>
+          <w:rFonts w:ascii="Times New Roman" w:hAnsi="Times New Roman" w:cs="Times New Roman"/>
+          <w:b/>
+          <w:bCs/>
+          <w:sz w:val="24"/>
+          <w:szCs w:val="24"/>
+        </w:rPr>
+        <w:t xml:space="preserve"> = False</w:t>
+      </w:r>
+      <w:r>
+        <w:rPr>
+          <w:b/>
+          <w:bCs/>
+        </w:rPr>
+        <w:t xml:space="preserve"> :</w:t>
+      </w:r>
+      <w:r>
+        <w:t xml:space="preserve"> La modification de la variable d'état qui permet de rompre la condition de la boucle </w:t>
+      </w:r>
+      <w:proofErr w:type="spellStart"/>
+      <w:r>
+        <w:rPr>
+          <w:rStyle w:val="CodeHTML"/>
+          <w:rFonts w:ascii="Times New Roman" w:hAnsi="Times New Roman" w:cs="Times New Roman"/>
+          <w:sz w:val="24"/>
+          <w:szCs w:val="24"/>
+        </w:rPr>
+        <w:t>while</w:t>
+      </w:r>
+      <w:proofErr w:type="spellEnd"/>
+      <w:r>
+        <w:t xml:space="preserve"> et de quitter proprement le programme. </w:t>
+      </w:r>
+    </w:p>
+    <w:p>
+      <w:pPr>
+        <w:pStyle w:val="NormalWeb"/>
+        <w:numPr>
+          <w:ilvl w:val="0"/>
+          <w:numId w:val="6"/>
+        </w:numPr>
+        <w:spacing w:before="0" w:beforeAutospacing="0" w:line="360" w:lineRule="auto"/>
+      </w:pPr>
+      <w:r>
+        <w:rPr>
+          <w:b/>
+          <w:bCs/>
+        </w:rPr>
+        <w:t>Comparaison d'égalité (</w:t>
+      </w:r>
+      <w:r>
+        <w:rPr>
+          <w:rStyle w:val="CodeHTML"/>
+          <w:rFonts w:ascii="Times New Roman" w:hAnsi="Times New Roman" w:cs="Times New Roman"/>
+          <w:b/>
+          <w:bCs/>
+          <w:sz w:val="24"/>
+          <w:szCs w:val="24"/>
+        </w:rPr>
+        <w:t>==</w:t>
+      </w:r>
+      <w:r>
+        <w:rPr>
+          <w:b/>
+          <w:bCs/>
+        </w:rPr>
+        <w:t>) :</w:t>
+      </w:r>
+      <w:r>
+        <w:t xml:space="preserve"> Opérateur logique utilisé pour vérifier si la chaîne saisie par l'utilisateur correspond aux options proposées (</w:t>
+      </w:r>
+      <w:proofErr w:type="gramStart"/>
+      <w:r>
+        <w:t>ex:</w:t>
+      </w:r>
+      <w:proofErr w:type="gramEnd"/>
+      <w:r>
+        <w:t xml:space="preserve"> </w:t>
+      </w:r>
+      <w:r>
+        <w:rPr>
+          <w:rStyle w:val="CodeHTML"/>
+          <w:rFonts w:ascii="Times New Roman" w:hAnsi="Times New Roman" w:cs="Times New Roman"/>
+          <w:sz w:val="24"/>
+          <w:szCs w:val="24"/>
+        </w:rPr>
+        <w:t>choix == "1"</w:t>
+      </w:r>
+      <w:r>
+        <w:t xml:space="preserve">). </w:t>
+      </w:r>
+    </w:p>
+    <w:p>
+      <w:pPr>
+        <w:spacing w:before="150" w:after="80" w:line="360" w:lineRule="auto"/>
+        <w:rPr>
+          <w:rFonts w:ascii="Times New Roman" w:hAnsi="Times New Roman" w:cs="Times New Roman"/>
+          <w:b/>
+          <w:bCs/>
+          <w:sz w:val="24"/>
+          <w:szCs w:val="24"/>
+        </w:rPr>
+      </w:pPr>
+      <w:r>
+        <w:rPr>
+          <w:rFonts w:ascii="Times New Roman" w:hAnsi="Times New Roman" w:cs="Times New Roman"/>
+          <w:b/>
+          <w:bCs/>
+          <w:sz w:val="24"/>
+          <w:szCs w:val="24"/>
+        </w:rPr>
+        <w:tab/>
+        <w:t xml:space="preserve"> </w:t>
+      </w:r>
+    </w:p>
+    <w:p>
+      <w:pPr>
+        <w:spacing w:line="360" w:lineRule="auto"/>
+        <w:rPr>
+          <w:rFonts w:ascii="Times New Roman" w:hAnsi="Times New Roman" w:cs="Times New Roman"/>
+          <w:b/>
+          <w:bCs/>
+          <w:sz w:val="24"/>
+          <w:szCs w:val="24"/>
+        </w:rPr>
+      </w:pPr>
+      <w:r>
+        <w:rPr>
+          <w:rFonts w:ascii="Times New Roman" w:hAnsi="Times New Roman" w:cs="Times New Roman"/>
+          <w:b/>
+          <w:bCs/>
+          <w:sz w:val="24"/>
+          <w:szCs w:val="24"/>
+        </w:rPr>
+        <w:br w:type="page"/>
+      </w:r>
+    </w:p>
+    <w:p>
+      <w:pPr>
+        <w:spacing w:before="150" w:after="80" w:line="360" w:lineRule="auto"/>
+        <w:rPr>
+          <w:rFonts w:ascii="Times New Roman" w:hAnsi="Times New Roman" w:cs="Times New Roman"/>
+          <w:b/>
+          <w:bCs/>
+          <w:sz w:val="24"/>
+          <w:szCs w:val="24"/>
+        </w:rPr>
+      </w:pPr>
     </w:p>
     <w:sectPr>
       <w:pgSz w:w="12240" w:h="15840"/>
@@ -1430,11 +2635,589 @@
       </w:pPr>
     </w:lvl>
   </w:abstractNum>
+  <w:abstractNum w:abstractNumId="1" w15:restartNumberingAfterBreak="0">
+    <w:nsid w:val="0F310CD7"/>
+    <w:multiLevelType w:val="hybridMultilevel"/>
+    <w:tmpl w:val="ADE8196E"/>
+    <w:lvl w:ilvl="0" w:tplc="040C0001">
+      <w:start w:val="1"/>
+      <w:numFmt w:val="bullet"/>
+      <w:lvlText w:val=""/>
+      <w:lvlJc w:val="left"/>
+      <w:pPr>
+        <w:ind w:left="720" w:hanging="360"/>
+      </w:pPr>
+      <w:rPr>
+        <w:rFonts w:ascii="Symbol" w:hAnsi="Symbol" w:hint="default"/>
+      </w:rPr>
+    </w:lvl>
+    <w:lvl w:ilvl="1" w:tplc="040C0003" w:tentative="1">
+      <w:start w:val="1"/>
+      <w:numFmt w:val="bullet"/>
+      <w:lvlText w:val="o"/>
+      <w:lvlJc w:val="left"/>
+      <w:pPr>
+        <w:ind w:left="1440" w:hanging="360"/>
+      </w:pPr>
+      <w:rPr>
+        <w:rFonts w:ascii="Courier New" w:hAnsi="Courier New" w:cs="Courier New" w:hint="default"/>
+      </w:rPr>
+    </w:lvl>
+    <w:lvl w:ilvl="2" w:tplc="040C0005" w:tentative="1">
+      <w:start w:val="1"/>
+      <w:numFmt w:val="bullet"/>
+      <w:lvlText w:val=""/>
+      <w:lvlJc w:val="left"/>
+      <w:pPr>
+        <w:ind w:left="2160" w:hanging="360"/>
+      </w:pPr>
+      <w:rPr>
+        <w:rFonts w:ascii="Wingdings" w:hAnsi="Wingdings" w:hint="default"/>
+      </w:rPr>
+    </w:lvl>
+    <w:lvl w:ilvl="3" w:tplc="040C0001" w:tentative="1">
+      <w:start w:val="1"/>
+      <w:numFmt w:val="bullet"/>
+      <w:lvlText w:val=""/>
+      <w:lvlJc w:val="left"/>
+      <w:pPr>
+        <w:ind w:left="2880" w:hanging="360"/>
+      </w:pPr>
+      <w:rPr>
+        <w:rFonts w:ascii="Symbol" w:hAnsi="Symbol" w:hint="default"/>
+      </w:rPr>
+    </w:lvl>
+    <w:lvl w:ilvl="4" w:tplc="040C0003" w:tentative="1">
+      <w:start w:val="1"/>
+      <w:numFmt w:val="bullet"/>
+      <w:lvlText w:val="o"/>
+      <w:lvlJc w:val="left"/>
+      <w:pPr>
+        <w:ind w:left="3600" w:hanging="360"/>
+      </w:pPr>
+      <w:rPr>
+        <w:rFonts w:ascii="Courier New" w:hAnsi="Courier New" w:cs="Courier New" w:hint="default"/>
+      </w:rPr>
+    </w:lvl>
+    <w:lvl w:ilvl="5" w:tplc="040C0005" w:tentative="1">
+      <w:start w:val="1"/>
+      <w:numFmt w:val="bullet"/>
+      <w:lvlText w:val=""/>
+      <w:lvlJc w:val="left"/>
+      <w:pPr>
+        <w:ind w:left="4320" w:hanging="360"/>
+      </w:pPr>
+      <w:rPr>
+        <w:rFonts w:ascii="Wingdings" w:hAnsi="Wingdings" w:hint="default"/>
+      </w:rPr>
+    </w:lvl>
+    <w:lvl w:ilvl="6" w:tplc="040C0001" w:tentative="1">
+      <w:start w:val="1"/>
+      <w:numFmt w:val="bullet"/>
+      <w:lvlText w:val=""/>
+      <w:lvlJc w:val="left"/>
+      <w:pPr>
+        <w:ind w:left="5040" w:hanging="360"/>
+      </w:pPr>
+      <w:rPr>
+        <w:rFonts w:ascii="Symbol" w:hAnsi="Symbol" w:hint="default"/>
+      </w:rPr>
+    </w:lvl>
+    <w:lvl w:ilvl="7" w:tplc="040C0003" w:tentative="1">
+      <w:start w:val="1"/>
+      <w:numFmt w:val="bullet"/>
+      <w:lvlText w:val="o"/>
+      <w:lvlJc w:val="left"/>
+      <w:pPr>
+        <w:ind w:left="5760" w:hanging="360"/>
+      </w:pPr>
+      <w:rPr>
+        <w:rFonts w:ascii="Courier New" w:hAnsi="Courier New" w:cs="Courier New" w:hint="default"/>
+      </w:rPr>
+    </w:lvl>
+    <w:lvl w:ilvl="8" w:tplc="040C0005" w:tentative="1">
+      <w:start w:val="1"/>
+      <w:numFmt w:val="bullet"/>
+      <w:lvlText w:val=""/>
+      <w:lvlJc w:val="left"/>
+      <w:pPr>
+        <w:ind w:left="6480" w:hanging="360"/>
+      </w:pPr>
+      <w:rPr>
+        <w:rFonts w:ascii="Wingdings" w:hAnsi="Wingdings" w:hint="default"/>
+      </w:rPr>
+    </w:lvl>
+  </w:abstractNum>
+  <w:abstractNum w:abstractNumId="2" w15:restartNumberingAfterBreak="0">
+    <w:nsid w:val="148C7C56"/>
+    <w:multiLevelType w:val="hybridMultilevel"/>
+    <w:tmpl w:val="A8F8BAE6"/>
+    <w:lvl w:ilvl="0" w:tplc="040C0001">
+      <w:start w:val="1"/>
+      <w:numFmt w:val="bullet"/>
+      <w:lvlText w:val=""/>
+      <w:lvlJc w:val="left"/>
+      <w:pPr>
+        <w:ind w:left="1080" w:hanging="360"/>
+      </w:pPr>
+      <w:rPr>
+        <w:rFonts w:ascii="Symbol" w:hAnsi="Symbol" w:hint="default"/>
+      </w:rPr>
+    </w:lvl>
+    <w:lvl w:ilvl="1" w:tplc="040C0003" w:tentative="1">
+      <w:start w:val="1"/>
+      <w:numFmt w:val="bullet"/>
+      <w:lvlText w:val="o"/>
+      <w:lvlJc w:val="left"/>
+      <w:pPr>
+        <w:ind w:left="1800" w:hanging="360"/>
+      </w:pPr>
+      <w:rPr>
+        <w:rFonts w:ascii="Courier New" w:hAnsi="Courier New" w:cs="Courier New" w:hint="default"/>
+      </w:rPr>
+    </w:lvl>
+    <w:lvl w:ilvl="2" w:tplc="040C0005" w:tentative="1">
+      <w:start w:val="1"/>
+      <w:numFmt w:val="bullet"/>
+      <w:lvlText w:val=""/>
+      <w:lvlJc w:val="left"/>
+      <w:pPr>
+        <w:ind w:left="2520" w:hanging="360"/>
+      </w:pPr>
+      <w:rPr>
+        <w:rFonts w:ascii="Wingdings" w:hAnsi="Wingdings" w:hint="default"/>
+      </w:rPr>
+    </w:lvl>
+    <w:lvl w:ilvl="3" w:tplc="040C0001" w:tentative="1">
+      <w:start w:val="1"/>
+      <w:numFmt w:val="bullet"/>
+      <w:lvlText w:val=""/>
+      <w:lvlJc w:val="left"/>
+      <w:pPr>
+        <w:ind w:left="3240" w:hanging="360"/>
+      </w:pPr>
+      <w:rPr>
+        <w:rFonts w:ascii="Symbol" w:hAnsi="Symbol" w:hint="default"/>
+      </w:rPr>
+    </w:lvl>
+    <w:lvl w:ilvl="4" w:tplc="040C0003" w:tentative="1">
+      <w:start w:val="1"/>
+      <w:numFmt w:val="bullet"/>
+      <w:lvlText w:val="o"/>
+      <w:lvlJc w:val="left"/>
+      <w:pPr>
+        <w:ind w:left="3960" w:hanging="360"/>
+      </w:pPr>
+      <w:rPr>
+        <w:rFonts w:ascii="Courier New" w:hAnsi="Courier New" w:cs="Courier New" w:hint="default"/>
+      </w:rPr>
+    </w:lvl>
+    <w:lvl w:ilvl="5" w:tplc="040C0005" w:tentative="1">
+      <w:start w:val="1"/>
+      <w:numFmt w:val="bullet"/>
+      <w:lvlText w:val=""/>
+      <w:lvlJc w:val="left"/>
+      <w:pPr>
+        <w:ind w:left="4680" w:hanging="360"/>
+      </w:pPr>
+      <w:rPr>
+        <w:rFonts w:ascii="Wingdings" w:hAnsi="Wingdings" w:hint="default"/>
+      </w:rPr>
+    </w:lvl>
+    <w:lvl w:ilvl="6" w:tplc="040C0001" w:tentative="1">
+      <w:start w:val="1"/>
+      <w:numFmt w:val="bullet"/>
+      <w:lvlText w:val=""/>
+      <w:lvlJc w:val="left"/>
+      <w:pPr>
+        <w:ind w:left="5400" w:hanging="360"/>
+      </w:pPr>
+      <w:rPr>
+        <w:rFonts w:ascii="Symbol" w:hAnsi="Symbol" w:hint="default"/>
+      </w:rPr>
+    </w:lvl>
+    <w:lvl w:ilvl="7" w:tplc="040C0003" w:tentative="1">
+      <w:start w:val="1"/>
+      <w:numFmt w:val="bullet"/>
+      <w:lvlText w:val="o"/>
+      <w:lvlJc w:val="left"/>
+      <w:pPr>
+        <w:ind w:left="6120" w:hanging="360"/>
+      </w:pPr>
+      <w:rPr>
+        <w:rFonts w:ascii="Courier New" w:hAnsi="Courier New" w:cs="Courier New" w:hint="default"/>
+      </w:rPr>
+    </w:lvl>
+    <w:lvl w:ilvl="8" w:tplc="040C0005" w:tentative="1">
+      <w:start w:val="1"/>
+      <w:numFmt w:val="bullet"/>
+      <w:lvlText w:val=""/>
+      <w:lvlJc w:val="left"/>
+      <w:pPr>
+        <w:ind w:left="6840" w:hanging="360"/>
+      </w:pPr>
+      <w:rPr>
+        <w:rFonts w:ascii="Wingdings" w:hAnsi="Wingdings" w:hint="default"/>
+      </w:rPr>
+    </w:lvl>
+  </w:abstractNum>
+  <w:abstractNum w:abstractNumId="3" w15:restartNumberingAfterBreak="0">
+    <w:nsid w:val="3DAC4309"/>
+    <w:multiLevelType w:val="hybridMultilevel"/>
+    <w:tmpl w:val="C91854D2"/>
+    <w:lvl w:ilvl="0" w:tplc="E876955E">
+      <w:numFmt w:val="bullet"/>
+      <w:lvlText w:val=""/>
+      <w:lvlJc w:val="left"/>
+      <w:pPr>
+        <w:ind w:left="1080" w:hanging="360"/>
+      </w:pPr>
+      <w:rPr>
+        <w:rFonts w:ascii="Times New Roman" w:eastAsia="Times New Roman" w:hAnsi="Times New Roman" w:cs="Times New Roman" w:hint="default"/>
+      </w:rPr>
+    </w:lvl>
+    <w:lvl w:ilvl="1" w:tplc="040C0003" w:tentative="1">
+      <w:start w:val="1"/>
+      <w:numFmt w:val="bullet"/>
+      <w:lvlText w:val="o"/>
+      <w:lvlJc w:val="left"/>
+      <w:pPr>
+        <w:ind w:left="1800" w:hanging="360"/>
+      </w:pPr>
+      <w:rPr>
+        <w:rFonts w:ascii="Courier New" w:hAnsi="Courier New" w:cs="Courier New" w:hint="default"/>
+      </w:rPr>
+    </w:lvl>
+    <w:lvl w:ilvl="2" w:tplc="040C0005" w:tentative="1">
+      <w:start w:val="1"/>
+      <w:numFmt w:val="bullet"/>
+      <w:lvlText w:val=""/>
+      <w:lvlJc w:val="left"/>
+      <w:pPr>
+        <w:ind w:left="2520" w:hanging="360"/>
+      </w:pPr>
+      <w:rPr>
+        <w:rFonts w:ascii="Wingdings" w:hAnsi="Wingdings" w:hint="default"/>
+      </w:rPr>
+    </w:lvl>
+    <w:lvl w:ilvl="3" w:tplc="040C0001" w:tentative="1">
+      <w:start w:val="1"/>
+      <w:numFmt w:val="bullet"/>
+      <w:lvlText w:val=""/>
+      <w:lvlJc w:val="left"/>
+      <w:pPr>
+        <w:ind w:left="3240" w:hanging="360"/>
+      </w:pPr>
+      <w:rPr>
+        <w:rFonts w:ascii="Symbol" w:hAnsi="Symbol" w:hint="default"/>
+      </w:rPr>
+    </w:lvl>
+    <w:lvl w:ilvl="4" w:tplc="040C0003" w:tentative="1">
+      <w:start w:val="1"/>
+      <w:numFmt w:val="bullet"/>
+      <w:lvlText w:val="o"/>
+      <w:lvlJc w:val="left"/>
+      <w:pPr>
+        <w:ind w:left="3960" w:hanging="360"/>
+      </w:pPr>
+      <w:rPr>
+        <w:rFonts w:ascii="Courier New" w:hAnsi="Courier New" w:cs="Courier New" w:hint="default"/>
+      </w:rPr>
+    </w:lvl>
+    <w:lvl w:ilvl="5" w:tplc="040C0005" w:tentative="1">
+      <w:start w:val="1"/>
+      <w:numFmt w:val="bullet"/>
+      <w:lvlText w:val=""/>
+      <w:lvlJc w:val="left"/>
+      <w:pPr>
+        <w:ind w:left="4680" w:hanging="360"/>
+      </w:pPr>
+      <w:rPr>
+        <w:rFonts w:ascii="Wingdings" w:hAnsi="Wingdings" w:hint="default"/>
+      </w:rPr>
+    </w:lvl>
+    <w:lvl w:ilvl="6" w:tplc="040C0001" w:tentative="1">
+      <w:start w:val="1"/>
+      <w:numFmt w:val="bullet"/>
+      <w:lvlText w:val=""/>
+      <w:lvlJc w:val="left"/>
+      <w:pPr>
+        <w:ind w:left="5400" w:hanging="360"/>
+      </w:pPr>
+      <w:rPr>
+        <w:rFonts w:ascii="Symbol" w:hAnsi="Symbol" w:hint="default"/>
+      </w:rPr>
+    </w:lvl>
+    <w:lvl w:ilvl="7" w:tplc="040C0003" w:tentative="1">
+      <w:start w:val="1"/>
+      <w:numFmt w:val="bullet"/>
+      <w:lvlText w:val="o"/>
+      <w:lvlJc w:val="left"/>
+      <w:pPr>
+        <w:ind w:left="6120" w:hanging="360"/>
+      </w:pPr>
+      <w:rPr>
+        <w:rFonts w:ascii="Courier New" w:hAnsi="Courier New" w:cs="Courier New" w:hint="default"/>
+      </w:rPr>
+    </w:lvl>
+    <w:lvl w:ilvl="8" w:tplc="040C0005" w:tentative="1">
+      <w:start w:val="1"/>
+      <w:numFmt w:val="bullet"/>
+      <w:lvlText w:val=""/>
+      <w:lvlJc w:val="left"/>
+      <w:pPr>
+        <w:ind w:left="6840" w:hanging="360"/>
+      </w:pPr>
+      <w:rPr>
+        <w:rFonts w:ascii="Wingdings" w:hAnsi="Wingdings" w:hint="default"/>
+      </w:rPr>
+    </w:lvl>
+  </w:abstractNum>
+  <w:abstractNum w:abstractNumId="4" w15:restartNumberingAfterBreak="0">
+    <w:nsid w:val="4B4C5930"/>
+    <w:multiLevelType w:val="hybridMultilevel"/>
+    <w:tmpl w:val="AF7A8ADC"/>
+    <w:lvl w:ilvl="0" w:tplc="040C0001">
+      <w:start w:val="1"/>
+      <w:numFmt w:val="bullet"/>
+      <w:lvlText w:val=""/>
+      <w:lvlJc w:val="left"/>
+      <w:pPr>
+        <w:ind w:left="720" w:hanging="360"/>
+      </w:pPr>
+      <w:rPr>
+        <w:rFonts w:ascii="Symbol" w:hAnsi="Symbol" w:hint="default"/>
+      </w:rPr>
+    </w:lvl>
+    <w:lvl w:ilvl="1" w:tplc="040C0003" w:tentative="1">
+      <w:start w:val="1"/>
+      <w:numFmt w:val="bullet"/>
+      <w:lvlText w:val="o"/>
+      <w:lvlJc w:val="left"/>
+      <w:pPr>
+        <w:ind w:left="1440" w:hanging="360"/>
+      </w:pPr>
+      <w:rPr>
+        <w:rFonts w:ascii="Courier New" w:hAnsi="Courier New" w:cs="Courier New" w:hint="default"/>
+      </w:rPr>
+    </w:lvl>
+    <w:lvl w:ilvl="2" w:tplc="040C0005" w:tentative="1">
+      <w:start w:val="1"/>
+      <w:numFmt w:val="bullet"/>
+      <w:lvlText w:val=""/>
+      <w:lvlJc w:val="left"/>
+      <w:pPr>
+        <w:ind w:left="2160" w:hanging="360"/>
+      </w:pPr>
+      <w:rPr>
+        <w:rFonts w:ascii="Wingdings" w:hAnsi="Wingdings" w:hint="default"/>
+      </w:rPr>
+    </w:lvl>
+    <w:lvl w:ilvl="3" w:tplc="040C0001" w:tentative="1">
+      <w:start w:val="1"/>
+      <w:numFmt w:val="bullet"/>
+      <w:lvlText w:val=""/>
+      <w:lvlJc w:val="left"/>
+      <w:pPr>
+        <w:ind w:left="2880" w:hanging="360"/>
+      </w:pPr>
+      <w:rPr>
+        <w:rFonts w:ascii="Symbol" w:hAnsi="Symbol" w:hint="default"/>
+      </w:rPr>
+    </w:lvl>
+    <w:lvl w:ilvl="4" w:tplc="040C0003" w:tentative="1">
+      <w:start w:val="1"/>
+      <w:numFmt w:val="bullet"/>
+      <w:lvlText w:val="o"/>
+      <w:lvlJc w:val="left"/>
+      <w:pPr>
+        <w:ind w:left="3600" w:hanging="360"/>
+      </w:pPr>
+      <w:rPr>
+        <w:rFonts w:ascii="Courier New" w:hAnsi="Courier New" w:cs="Courier New" w:hint="default"/>
+      </w:rPr>
+    </w:lvl>
+    <w:lvl w:ilvl="5" w:tplc="040C0005" w:tentative="1">
+      <w:start w:val="1"/>
+      <w:numFmt w:val="bullet"/>
+      <w:lvlText w:val=""/>
+      <w:lvlJc w:val="left"/>
+      <w:pPr>
+        <w:ind w:left="4320" w:hanging="360"/>
+      </w:pPr>
+      <w:rPr>
+        <w:rFonts w:ascii="Wingdings" w:hAnsi="Wingdings" w:hint="default"/>
+      </w:rPr>
+    </w:lvl>
+    <w:lvl w:ilvl="6" w:tplc="040C0001" w:tentative="1">
+      <w:start w:val="1"/>
+      <w:numFmt w:val="bullet"/>
+      <w:lvlText w:val=""/>
+      <w:lvlJc w:val="left"/>
+      <w:pPr>
+        <w:ind w:left="5040" w:hanging="360"/>
+      </w:pPr>
+      <w:rPr>
+        <w:rFonts w:ascii="Symbol" w:hAnsi="Symbol" w:hint="default"/>
+      </w:rPr>
+    </w:lvl>
+    <w:lvl w:ilvl="7" w:tplc="040C0003" w:tentative="1">
+      <w:start w:val="1"/>
+      <w:numFmt w:val="bullet"/>
+      <w:lvlText w:val="o"/>
+      <w:lvlJc w:val="left"/>
+      <w:pPr>
+        <w:ind w:left="5760" w:hanging="360"/>
+      </w:pPr>
+      <w:rPr>
+        <w:rFonts w:ascii="Courier New" w:hAnsi="Courier New" w:cs="Courier New" w:hint="default"/>
+      </w:rPr>
+    </w:lvl>
+    <w:lvl w:ilvl="8" w:tplc="040C0005" w:tentative="1">
+      <w:start w:val="1"/>
+      <w:numFmt w:val="bullet"/>
+      <w:lvlText w:val=""/>
+      <w:lvlJc w:val="left"/>
+      <w:pPr>
+        <w:ind w:left="6480" w:hanging="360"/>
+      </w:pPr>
+      <w:rPr>
+        <w:rFonts w:ascii="Wingdings" w:hAnsi="Wingdings" w:hint="default"/>
+      </w:rPr>
+    </w:lvl>
+  </w:abstractNum>
+  <w:abstractNum w:abstractNumId="5" w15:restartNumberingAfterBreak="0">
+    <w:nsid w:val="76A84B46"/>
+    <w:multiLevelType w:val="hybridMultilevel"/>
+    <w:tmpl w:val="C6A6513A"/>
+    <w:lvl w:ilvl="0" w:tplc="E876955E">
+      <w:numFmt w:val="bullet"/>
+      <w:lvlText w:val=""/>
+      <w:lvlJc w:val="left"/>
+      <w:pPr>
+        <w:ind w:left="720" w:hanging="360"/>
+      </w:pPr>
+      <w:rPr>
+        <w:rFonts w:ascii="Times New Roman" w:eastAsia="Times New Roman" w:hAnsi="Times New Roman" w:cs="Times New Roman" w:hint="default"/>
+      </w:rPr>
+    </w:lvl>
+    <w:lvl w:ilvl="1" w:tplc="040C0003" w:tentative="1">
+      <w:start w:val="1"/>
+      <w:numFmt w:val="bullet"/>
+      <w:lvlText w:val="o"/>
+      <w:lvlJc w:val="left"/>
+      <w:pPr>
+        <w:ind w:left="1440" w:hanging="360"/>
+      </w:pPr>
+      <w:rPr>
+        <w:rFonts w:ascii="Courier New" w:hAnsi="Courier New" w:cs="Courier New" w:hint="default"/>
+      </w:rPr>
+    </w:lvl>
+    <w:lvl w:ilvl="2" w:tplc="040C0005" w:tentative="1">
+      <w:start w:val="1"/>
+      <w:numFmt w:val="bullet"/>
+      <w:lvlText w:val=""/>
+      <w:lvlJc w:val="left"/>
+      <w:pPr>
+        <w:ind w:left="2160" w:hanging="360"/>
+      </w:pPr>
+      <w:rPr>
+        <w:rFonts w:ascii="Wingdings" w:hAnsi="Wingdings" w:hint="default"/>
+      </w:rPr>
+    </w:lvl>
+    <w:lvl w:ilvl="3" w:tplc="040C0001" w:tentative="1">
+      <w:start w:val="1"/>
+      <w:numFmt w:val="bullet"/>
+      <w:lvlText w:val=""/>
+      <w:lvlJc w:val="left"/>
+      <w:pPr>
+        <w:ind w:left="2880" w:hanging="360"/>
+      </w:pPr>
+      <w:rPr>
+        <w:rFonts w:ascii="Symbol" w:hAnsi="Symbol" w:hint="default"/>
+      </w:rPr>
+    </w:lvl>
+    <w:lvl w:ilvl="4" w:tplc="040C0003" w:tentative="1">
+      <w:start w:val="1"/>
+      <w:numFmt w:val="bullet"/>
+      <w:lvlText w:val="o"/>
+      <w:lvlJc w:val="left"/>
+      <w:pPr>
+        <w:ind w:left="3600" w:hanging="360"/>
+      </w:pPr>
+      <w:rPr>
+        <w:rFonts w:ascii="Courier New" w:hAnsi="Courier New" w:cs="Courier New" w:hint="default"/>
+      </w:rPr>
+    </w:lvl>
+    <w:lvl w:ilvl="5" w:tplc="040C0005" w:tentative="1">
+      <w:start w:val="1"/>
+      <w:numFmt w:val="bullet"/>
+      <w:lvlText w:val=""/>
+      <w:lvlJc w:val="left"/>
+      <w:pPr>
+        <w:ind w:left="4320" w:hanging="360"/>
+      </w:pPr>
+      <w:rPr>
+        <w:rFonts w:ascii="Wingdings" w:hAnsi="Wingdings" w:hint="default"/>
+      </w:rPr>
+    </w:lvl>
+    <w:lvl w:ilvl="6" w:tplc="040C0001" w:tentative="1">
+      <w:start w:val="1"/>
+      <w:numFmt w:val="bullet"/>
+      <w:lvlText w:val=""/>
+      <w:lvlJc w:val="left"/>
+      <w:pPr>
+        <w:ind w:left="5040" w:hanging="360"/>
+      </w:pPr>
+      <w:rPr>
+        <w:rFonts w:ascii="Symbol" w:hAnsi="Symbol" w:hint="default"/>
+      </w:rPr>
+    </w:lvl>
+    <w:lvl w:ilvl="7" w:tplc="040C0003" w:tentative="1">
+      <w:start w:val="1"/>
+      <w:numFmt w:val="bullet"/>
+      <w:lvlText w:val="o"/>
+      <w:lvlJc w:val="left"/>
+      <w:pPr>
+        <w:ind w:left="5760" w:hanging="360"/>
+      </w:pPr>
+      <w:rPr>
+        <w:rFonts w:ascii="Courier New" w:hAnsi="Courier New" w:cs="Courier New" w:hint="default"/>
+      </w:rPr>
+    </w:lvl>
+    <w:lvl w:ilvl="8" w:tplc="040C0005" w:tentative="1">
+      <w:start w:val="1"/>
+      <w:numFmt w:val="bullet"/>
+      <w:lvlText w:val=""/>
+      <w:lvlJc w:val="left"/>
+      <w:pPr>
+        <w:ind w:left="6480" w:hanging="360"/>
+      </w:pPr>
+      <w:rPr>
+        <w:rFonts w:ascii="Wingdings" w:hAnsi="Wingdings" w:hint="default"/>
+      </w:rPr>
+    </w:lvl>
+  </w:abstractNum>
   <w:num w:numId="1" w16cid:durableId="1616332497">
     <w:abstractNumId w:val="0"/>
     <w:lvlOverride w:ilvl="0">
       <w:startOverride w:val="1"/>
     </w:lvlOverride>
+  </w:num>
+  <w:num w:numId="2" w16cid:durableId="930044323">
+    <w:abstractNumId w:val="1"/>
+  </w:num>
+  <w:num w:numId="3" w16cid:durableId="832062217">
+    <w:abstractNumId w:val="5"/>
+  </w:num>
+  <w:num w:numId="4" w16cid:durableId="1215237999">
+    <w:abstractNumId w:val="3"/>
+  </w:num>
+  <w:num w:numId="5" w16cid:durableId="952397004">
+    <w:abstractNumId w:val="2"/>
+  </w:num>
+  <w:num w:numId="6" w16cid:durableId="1734310147">
+    <w:abstractNumId w:val="4"/>
   </w:num>
 </w:numbering>
 </file>
@@ -2068,6 +3851,22 @@
       <w:szCs w:val="20"/>
     </w:rPr>
   </w:style>
+  <w:style w:type="paragraph" w:styleId="NormalWeb">
+    <w:name w:val="Normal (Web)"/>
+    <w:basedOn w:val="Normal"/>
+    <w:uiPriority w:val="99"/>
+    <w:semiHidden/>
+    <w:unhideWhenUsed/>
+    <w:rsid w:val="005D456D"/>
+    <w:pPr>
+      <w:spacing w:before="100" w:beforeAutospacing="1" w:after="100" w:afterAutospacing="1"/>
+    </w:pPr>
+    <w:rPr>
+      <w:rFonts w:ascii="Times New Roman" w:eastAsia="Times New Roman" w:hAnsi="Times New Roman" w:cs="Times New Roman"/>
+      <w:sz w:val="24"/>
+      <w:szCs w:val="24"/>
+    </w:rPr>
+  </w:style>
 </w:styles>
 </file>
 

</xml_diff>

<commit_message>
feat: structuration des métadonnées du dataset sous forme de dictionnaire (Partie 3)
</commit_message>
<xml_diff>
--- a/pratiquePython.docx
+++ b/pratiquePython.docx
@@ -1644,11 +1644,33 @@
       </w:r>
     </w:p>
     <w:p>
-      <w:r>
+      <w:pPr>
+        <w:spacing w:line="360" w:lineRule="auto"/>
+        <w:rPr>
+          <w:rFonts w:ascii="Times New Roman" w:hAnsi="Times New Roman" w:cs="Times New Roman"/>
+          <w:sz w:val="24"/>
+          <w:szCs w:val="24"/>
+        </w:rPr>
+      </w:pPr>
+      <w:r>
+        <w:rPr>
+          <w:rFonts w:ascii="Times New Roman" w:hAnsi="Times New Roman" w:cs="Times New Roman"/>
+          <w:sz w:val="24"/>
+          <w:szCs w:val="24"/>
+        </w:rPr>
         <w:t>Cette section introduit la logique de contrôle du flux d'exécution grâce à une boucle conditionnelle et des structures de décision pour rendre l'application interactive.</w:t>
       </w:r>
     </w:p>
-    <w:p/>
+    <w:p>
+      <w:pPr>
+        <w:spacing w:line="360" w:lineRule="auto"/>
+        <w:rPr>
+          <w:rFonts w:ascii="Times New Roman" w:hAnsi="Times New Roman" w:cs="Times New Roman"/>
+          <w:sz w:val="24"/>
+          <w:szCs w:val="24"/>
+        </w:rPr>
+      </w:pPr>
+    </w:p>
     <w:tbl>
       <w:tblPr>
         <w:tblW w:w="5000" w:type="pct"/>
@@ -2482,6 +2504,723 @@
     </w:p>
     <w:p>
       <w:pPr>
+        <w:pStyle w:val="NormalWeb"/>
+        <w:spacing w:before="0" w:beforeAutospacing="0" w:line="360" w:lineRule="auto"/>
+      </w:pPr>
+    </w:p>
+    <w:p>
+      <w:pPr>
+        <w:pStyle w:val="Titre1"/>
+        <w:spacing w:line="360" w:lineRule="auto"/>
+        <w:rPr>
+          <w:rFonts w:ascii="Times New Roman" w:hAnsi="Times New Roman" w:cs="Times New Roman"/>
+          <w:color w:val="auto"/>
+          <w:sz w:val="24"/>
+          <w:szCs w:val="24"/>
+        </w:rPr>
+      </w:pPr>
+      <w:r>
+        <w:rPr>
+          <w:rFonts w:ascii="Times New Roman" w:hAnsi="Times New Roman" w:cs="Times New Roman"/>
+          <w:color w:val="auto"/>
+          <w:sz w:val="24"/>
+          <w:szCs w:val="24"/>
+        </w:rPr>
+        <w:t>Partie 3 — Dictionnaires</w:t>
+      </w:r>
+    </w:p>
+    <w:p>
+      <w:pPr>
+        <w:spacing w:line="360" w:lineRule="auto"/>
+        <w:rPr>
+          <w:rFonts w:ascii="Times New Roman" w:eastAsia="Times New Roman" w:hAnsi="Times New Roman" w:cs="Times New Roman"/>
+          <w:sz w:val="24"/>
+          <w:szCs w:val="24"/>
+        </w:rPr>
+      </w:pPr>
+      <w:r>
+        <w:rPr>
+          <w:rFonts w:ascii="Times New Roman" w:eastAsia="Times New Roman" w:hAnsi="Times New Roman" w:cs="Times New Roman"/>
+          <w:sz w:val="24"/>
+          <w:szCs w:val="24"/>
+        </w:rPr>
+        <w:lastRenderedPageBreak/>
+        <w:t xml:space="preserve">Cette section introduit l'utilisation des dictionnaires Python pour regrouper les métadonnées d'un </w:t>
+      </w:r>
+      <w:proofErr w:type="spellStart"/>
+      <w:r>
+        <w:rPr>
+          <w:rFonts w:ascii="Times New Roman" w:eastAsia="Times New Roman" w:hAnsi="Times New Roman" w:cs="Times New Roman"/>
+          <w:sz w:val="24"/>
+          <w:szCs w:val="24"/>
+        </w:rPr>
+        <w:t>dataset</w:t>
+      </w:r>
+      <w:proofErr w:type="spellEnd"/>
+      <w:r>
+        <w:rPr>
+          <w:rFonts w:ascii="Times New Roman" w:eastAsia="Times New Roman" w:hAnsi="Times New Roman" w:cs="Times New Roman"/>
+          <w:sz w:val="24"/>
+          <w:szCs w:val="24"/>
+        </w:rPr>
+        <w:t xml:space="preserve"> sous forme de couples clé-valeur structurés. </w:t>
+      </w:r>
+    </w:p>
+    <w:tbl>
+      <w:tblPr>
+        <w:tblW w:w="5000" w:type="pct"/>
+        <w:tblBorders>
+          <w:top w:val="single" w:sz="4" w:space="0" w:color="2E5395"/>
+          <w:left w:val="single" w:sz="4" w:space="0" w:color="2E5395"/>
+          <w:bottom w:val="single" w:sz="4" w:space="0" w:color="2E5395"/>
+          <w:right w:val="single" w:sz="4" w:space="0" w:color="2E5395"/>
+          <w:insideH w:val="single" w:sz="4" w:space="0" w:color="auto"/>
+          <w:insideV w:val="single" w:sz="4" w:space="0" w:color="auto"/>
+        </w:tblBorders>
+        <w:shd w:val="clear" w:color="auto" w:fill="FFC000" w:themeFill="accent4"/>
+        <w:tblCellMar>
+          <w:left w:w="10" w:type="dxa"/>
+          <w:right w:w="10" w:type="dxa"/>
+        </w:tblCellMar>
+        <w:tblLook w:val="04A0" w:firstRow="1" w:lastRow="0" w:firstColumn="1" w:lastColumn="0" w:noHBand="0" w:noVBand="1"/>
+      </w:tblPr>
+      <w:tblGrid>
+        <w:gridCol w:w="10070"/>
+      </w:tblGrid>
+      <w:tr>
+        <w:tc>
+          <w:tcPr>
+            <w:tcW w:w="0" w:type="auto"/>
+            <w:tcBorders>
+              <w:top w:val="single" w:sz="4" w:space="0" w:color="2E5395"/>
+              <w:left w:val="single" w:sz="4" w:space="0" w:color="2E5395"/>
+              <w:bottom w:val="single" w:sz="4" w:space="0" w:color="2E5395"/>
+              <w:right w:val="single" w:sz="4" w:space="0" w:color="2E5395"/>
+            </w:tcBorders>
+            <w:shd w:val="clear" w:color="auto" w:fill="FFC000" w:themeFill="accent4"/>
+            <w:tcMar>
+              <w:top w:w="150" w:type="dxa"/>
+              <w:left w:w="200" w:type="dxa"/>
+              <w:bottom w:w="150" w:type="dxa"/>
+              <w:right w:w="200" w:type="dxa"/>
+            </w:tcMar>
+            <w:hideMark/>
+          </w:tcPr>
+          <w:p>
+            <w:pPr>
+              <w:spacing w:line="360" w:lineRule="auto"/>
+              <w:rPr>
+                <w:rFonts w:ascii="Times New Roman" w:hAnsi="Times New Roman" w:cs="Times New Roman"/>
+                <w:sz w:val="24"/>
+                <w:szCs w:val="24"/>
+              </w:rPr>
+            </w:pPr>
+            <w:r>
+              <w:rPr>
+                <w:rFonts w:ascii="Times New Roman" w:hAnsi="Times New Roman" w:cs="Times New Roman"/>
+                <w:b/>
+                <w:bCs/>
+                <w:sz w:val="24"/>
+                <w:szCs w:val="24"/>
+              </w:rPr>
+              <w:t xml:space="preserve">Question 6 — </w:t>
+            </w:r>
+            <w:r>
+              <w:rPr>
+                <w:rFonts w:ascii="Times New Roman" w:hAnsi="Times New Roman" w:cs="Times New Roman"/>
+                <w:i/>
+                <w:iCs/>
+                <w:sz w:val="24"/>
+                <w:szCs w:val="24"/>
+              </w:rPr>
+              <w:t>Cré</w:t>
+            </w:r>
+            <w:r>
+              <w:rPr>
+                <w:rFonts w:ascii="Times New Roman" w:hAnsi="Times New Roman" w:cs="Times New Roman"/>
+                <w:i/>
+                <w:iCs/>
+                <w:sz w:val="24"/>
+                <w:szCs w:val="24"/>
+              </w:rPr>
+              <w:t>ation</w:t>
+            </w:r>
+            <w:r>
+              <w:rPr>
+                <w:rFonts w:ascii="Times New Roman" w:hAnsi="Times New Roman" w:cs="Times New Roman"/>
+                <w:i/>
+                <w:iCs/>
+                <w:sz w:val="24"/>
+                <w:szCs w:val="24"/>
+              </w:rPr>
+              <w:t xml:space="preserve"> un dictionnaire pour stocker les métadonnées de chaque </w:t>
+            </w:r>
+            <w:proofErr w:type="spellStart"/>
+            <w:r>
+              <w:rPr>
+                <w:rFonts w:ascii="Times New Roman" w:hAnsi="Times New Roman" w:cs="Times New Roman"/>
+                <w:i/>
+                <w:iCs/>
+                <w:sz w:val="24"/>
+                <w:szCs w:val="24"/>
+              </w:rPr>
+              <w:t>dataset</w:t>
+            </w:r>
+            <w:proofErr w:type="spellEnd"/>
+            <w:r>
+              <w:rPr>
+                <w:rFonts w:ascii="Times New Roman" w:hAnsi="Times New Roman" w:cs="Times New Roman"/>
+                <w:i/>
+                <w:iCs/>
+                <w:sz w:val="24"/>
+                <w:szCs w:val="24"/>
+              </w:rPr>
+              <w:t>.</w:t>
+            </w:r>
+          </w:p>
+        </w:tc>
+      </w:tr>
+    </w:tbl>
+    <w:p>
+      <w:pPr>
+        <w:spacing w:after="150" w:line="360" w:lineRule="auto"/>
+        <w:rPr>
+          <w:rFonts w:ascii="Times New Roman" w:hAnsi="Times New Roman" w:cs="Times New Roman"/>
+          <w:sz w:val="24"/>
+          <w:szCs w:val="24"/>
+        </w:rPr>
+      </w:pPr>
+      <w:r>
+        <w:rPr>
+          <w:rFonts w:ascii="Times New Roman" w:hAnsi="Times New Roman" w:cs="Times New Roman"/>
+          <w:sz w:val="24"/>
+          <w:szCs w:val="24"/>
+        </w:rPr>
+        <w:t xml:space="preserve"> </w:t>
+      </w:r>
+      <w:r>
+        <w:rPr>
+          <w:rFonts w:ascii="Times New Roman" w:hAnsi="Times New Roman" w:cs="Times New Roman"/>
+          <w:sz w:val="24"/>
+          <w:szCs w:val="24"/>
+        </w:rPr>
+        <w:t xml:space="preserve">Refactorisation de l'option 1 du menu pour enregistrer les données de l'utilisateur dans une structure </w:t>
+      </w:r>
+      <w:r>
+        <w:rPr>
+          <w:rStyle w:val="CodeHTML"/>
+          <w:rFonts w:ascii="Times New Roman" w:eastAsia="Calibri" w:hAnsi="Times New Roman" w:cs="Times New Roman"/>
+          <w:sz w:val="24"/>
+          <w:szCs w:val="24"/>
+        </w:rPr>
+        <w:t>dict</w:t>
+      </w:r>
+      <w:r>
+        <w:rPr>
+          <w:rFonts w:ascii="Times New Roman" w:hAnsi="Times New Roman" w:cs="Times New Roman"/>
+          <w:sz w:val="24"/>
+          <w:szCs w:val="24"/>
+        </w:rPr>
+        <w:t xml:space="preserve"> et lire ces clés lors de l'affichage du résumé.</w:t>
+      </w:r>
+    </w:p>
+    <w:p>
+      <w:pPr>
+        <w:spacing w:before="150" w:after="80" w:line="360" w:lineRule="auto"/>
+        <w:rPr>
+          <w:rFonts w:ascii="Times New Roman" w:eastAsia="Consolas" w:hAnsi="Times New Roman" w:cs="Times New Roman"/>
+          <w:sz w:val="24"/>
+          <w:szCs w:val="24"/>
+        </w:rPr>
+      </w:pPr>
+      <w:r>
+        <w:rPr>
+          <w:rFonts w:ascii="Times New Roman" w:hAnsi="Times New Roman" w:cs="Times New Roman"/>
+          <w:b/>
+          <w:bCs/>
+          <w:sz w:val="24"/>
+          <w:szCs w:val="24"/>
+        </w:rPr>
+        <w:t>Code (main.py, option 1 du menu) :</w:t>
+      </w:r>
+      <w:r>
+        <w:rPr>
+          <w:rFonts w:ascii="Times New Roman" w:eastAsia="Consolas" w:hAnsi="Times New Roman" w:cs="Times New Roman"/>
+          <w:sz w:val="24"/>
+          <w:szCs w:val="24"/>
+        </w:rPr>
+        <w:t xml:space="preserve"> </w:t>
+      </w:r>
+    </w:p>
+    <w:p>
+      <w:pPr>
+        <w:spacing w:before="150" w:after="80" w:line="360" w:lineRule="auto"/>
+        <w:rPr>
+          <w:rFonts w:ascii="Times New Roman" w:eastAsia="Consolas" w:hAnsi="Times New Roman" w:cs="Times New Roman"/>
+          <w:sz w:val="24"/>
+          <w:szCs w:val="24"/>
+        </w:rPr>
+      </w:pPr>
+      <w:r>
+        <w:rPr>
+          <w:rFonts w:ascii="Times New Roman" w:eastAsia="Consolas" w:hAnsi="Times New Roman" w:cs="Times New Roman"/>
+          <w:sz w:val="24"/>
+          <w:szCs w:val="24"/>
+        </w:rPr>
+        <w:drawing>
+          <wp:inline distT="0" distB="0" distL="0" distR="0" wp14:anchorId="4DE672C1" wp14:editId="2FBA33DD">
+            <wp:extent cx="6400800" cy="4648835"/>
+            <wp:effectExtent l="0" t="0" r="0" b="0"/>
+            <wp:docPr id="820502453" name="Image 8"/>
+            <wp:cNvGraphicFramePr>
+              <a:graphicFrameLocks xmlns:a="http://schemas.openxmlformats.org/drawingml/2006/main" noChangeAspect="1"/>
+            </wp:cNvGraphicFramePr>
+            <a:graphic xmlns:a="http://schemas.openxmlformats.org/drawingml/2006/main">
+              <a:graphicData uri="http://schemas.openxmlformats.org/drawingml/2006/picture">
+                <pic:pic xmlns:pic="http://schemas.openxmlformats.org/drawingml/2006/picture">
+                  <pic:nvPicPr>
+                    <pic:cNvPr id="820502453" name=""/>
+                    <pic:cNvPicPr/>
+                  </pic:nvPicPr>
+                  <pic:blipFill>
+                    <a:blip r:embed="rId12"/>
+                    <a:stretch>
+                      <a:fillRect/>
+                    </a:stretch>
+                  </pic:blipFill>
+                  <pic:spPr>
+                    <a:xfrm>
+                      <a:off x="0" y="0"/>
+                      <a:ext cx="6400800" cy="4648835"/>
+                    </a:xfrm>
+                    <a:prstGeom prst="rect">
+                      <a:avLst/>
+                    </a:prstGeom>
+                  </pic:spPr>
+                </pic:pic>
+              </a:graphicData>
+            </a:graphic>
+          </wp:inline>
+        </w:drawing>
+      </w:r>
+    </w:p>
+    <w:p>
+      <w:pPr>
+        <w:pStyle w:val="NormalWeb"/>
+        <w:spacing w:line="360" w:lineRule="auto"/>
+      </w:pPr>
+      <w:r>
+        <w:t xml:space="preserve">L'extrait montre la déclaration du dictionnaire </w:t>
+      </w:r>
+      <w:proofErr w:type="spellStart"/>
+      <w:r>
+        <w:rPr>
+          <w:rStyle w:val="CodeHTML"/>
+          <w:rFonts w:ascii="Times New Roman" w:hAnsi="Times New Roman" w:cs="Times New Roman"/>
+          <w:sz w:val="24"/>
+          <w:szCs w:val="24"/>
+        </w:rPr>
+        <w:t>dataset</w:t>
+      </w:r>
+      <w:proofErr w:type="spellEnd"/>
+      <w:r>
+        <w:t xml:space="preserve"> associant chaque clé à sa variable, suivie de l'accès aux données via la syntaxe </w:t>
+      </w:r>
+      <w:proofErr w:type="spellStart"/>
+      <w:r>
+        <w:rPr>
+          <w:rStyle w:val="CodeHTML"/>
+          <w:rFonts w:ascii="Times New Roman" w:hAnsi="Times New Roman" w:cs="Times New Roman"/>
+          <w:sz w:val="24"/>
+          <w:szCs w:val="24"/>
+        </w:rPr>
+        <w:t>dataset</w:t>
+      </w:r>
+      <w:proofErr w:type="spellEnd"/>
+      <w:r>
+        <w:rPr>
+          <w:rStyle w:val="CodeHTML"/>
+          <w:rFonts w:ascii="Times New Roman" w:hAnsi="Times New Roman" w:cs="Times New Roman"/>
+          <w:sz w:val="24"/>
+          <w:szCs w:val="24"/>
+        </w:rPr>
+        <w:t>['clé']</w:t>
+      </w:r>
+      <w:r>
+        <w:t xml:space="preserve"> dans les f-strings.</w:t>
+      </w:r>
+    </w:p>
+    <w:p>
+      <w:pPr>
+        <w:spacing w:before="150" w:after="80" w:line="360" w:lineRule="auto"/>
+        <w:rPr>
+          <w:rFonts w:ascii="Times New Roman" w:eastAsia="Consolas" w:hAnsi="Times New Roman" w:cs="Times New Roman"/>
+          <w:sz w:val="24"/>
+          <w:szCs w:val="24"/>
+        </w:rPr>
+      </w:pPr>
+    </w:p>
+    <w:p>
+      <w:pPr>
+        <w:spacing w:before="150" w:after="80" w:line="360" w:lineRule="auto"/>
+        <w:rPr>
+          <w:rFonts w:ascii="Times New Roman" w:hAnsi="Times New Roman" w:cs="Times New Roman"/>
+          <w:b/>
+          <w:bCs/>
+          <w:sz w:val="24"/>
+          <w:szCs w:val="24"/>
+        </w:rPr>
+      </w:pPr>
+      <w:r>
+        <w:rPr>
+          <w:rFonts w:ascii="Times New Roman" w:hAnsi="Times New Roman" w:cs="Times New Roman"/>
+          <w:b/>
+          <w:bCs/>
+          <w:sz w:val="24"/>
+          <w:szCs w:val="24"/>
+        </w:rPr>
+        <w:t>Résultat à l'exécution : identique à la Partie 1, mais les données proviennent maintenant d'un dictionnaire.</w:t>
+      </w:r>
+    </w:p>
+    <w:p>
+      <w:pPr>
+        <w:spacing w:before="150" w:after="80" w:line="360" w:lineRule="auto"/>
+        <w:rPr>
+          <w:rFonts w:ascii="Times New Roman" w:hAnsi="Times New Roman" w:cs="Times New Roman"/>
+          <w:sz w:val="24"/>
+          <w:szCs w:val="24"/>
+        </w:rPr>
+      </w:pPr>
+      <w:r>
+        <w:rPr>
+          <w:rFonts w:ascii="Times New Roman" w:hAnsi="Times New Roman" w:cs="Times New Roman"/>
+          <w:sz w:val="24"/>
+          <w:szCs w:val="24"/>
+        </w:rPr>
+        <w:lastRenderedPageBreak/>
+        <w:drawing>
+          <wp:inline distT="0" distB="0" distL="0" distR="0" wp14:anchorId="7E3A9C1D" wp14:editId="0E10414F">
+            <wp:extent cx="6400800" cy="4358640"/>
+            <wp:effectExtent l="0" t="0" r="0" b="3810"/>
+            <wp:docPr id="417591112" name="Image 9"/>
+            <wp:cNvGraphicFramePr>
+              <a:graphicFrameLocks xmlns:a="http://schemas.openxmlformats.org/drawingml/2006/main" noChangeAspect="1"/>
+            </wp:cNvGraphicFramePr>
+            <a:graphic xmlns:a="http://schemas.openxmlformats.org/drawingml/2006/main">
+              <a:graphicData uri="http://schemas.openxmlformats.org/drawingml/2006/picture">
+                <pic:pic xmlns:pic="http://schemas.openxmlformats.org/drawingml/2006/picture">
+                  <pic:nvPicPr>
+                    <pic:cNvPr id="417591112" name=""/>
+                    <pic:cNvPicPr/>
+                  </pic:nvPicPr>
+                  <pic:blipFill>
+                    <a:blip r:embed="rId13"/>
+                    <a:stretch>
+                      <a:fillRect/>
+                    </a:stretch>
+                  </pic:blipFill>
+                  <pic:spPr>
+                    <a:xfrm>
+                      <a:off x="0" y="0"/>
+                      <a:ext cx="6400800" cy="4358640"/>
+                    </a:xfrm>
+                    <a:prstGeom prst="rect">
+                      <a:avLst/>
+                    </a:prstGeom>
+                  </pic:spPr>
+                </pic:pic>
+              </a:graphicData>
+            </a:graphic>
+          </wp:inline>
+        </w:drawing>
+      </w:r>
+      <w:r>
+        <w:rPr>
+          <w:rFonts w:ascii="Times New Roman" w:hAnsi="Times New Roman" w:cs="Times New Roman"/>
+          <w:sz w:val="24"/>
+          <w:szCs w:val="24"/>
+        </w:rPr>
+        <w:t xml:space="preserve"> </w:t>
+      </w:r>
+    </w:p>
+    <w:p>
+      <w:pPr>
+        <w:spacing w:line="360" w:lineRule="auto"/>
+        <w:rPr>
+          <w:rFonts w:ascii="Times New Roman" w:eastAsia="Times New Roman" w:hAnsi="Times New Roman" w:cs="Times New Roman"/>
+          <w:sz w:val="24"/>
+          <w:szCs w:val="24"/>
+        </w:rPr>
+      </w:pPr>
+      <w:r>
+        <w:rPr>
+          <w:rFonts w:ascii="Times New Roman" w:eastAsia="Times New Roman" w:hAnsi="Times New Roman" w:cs="Times New Roman"/>
+          <w:sz w:val="24"/>
+          <w:szCs w:val="24"/>
+        </w:rPr>
+        <w:t>C</w:t>
+      </w:r>
+      <w:r>
+        <w:rPr>
+          <w:rFonts w:ascii="Times New Roman" w:eastAsia="Times New Roman" w:hAnsi="Times New Roman" w:cs="Times New Roman"/>
+          <w:sz w:val="24"/>
+          <w:szCs w:val="24"/>
+        </w:rPr>
+        <w:t xml:space="preserve">e terminal affiche la saisie d'un nouveau </w:t>
+      </w:r>
+      <w:proofErr w:type="spellStart"/>
+      <w:r>
+        <w:rPr>
+          <w:rFonts w:ascii="Times New Roman" w:eastAsia="Times New Roman" w:hAnsi="Times New Roman" w:cs="Times New Roman"/>
+          <w:sz w:val="24"/>
+          <w:szCs w:val="24"/>
+        </w:rPr>
+        <w:t>dataset</w:t>
+      </w:r>
+      <w:proofErr w:type="spellEnd"/>
+      <w:r>
+        <w:rPr>
+          <w:rFonts w:ascii="Times New Roman" w:eastAsia="Times New Roman" w:hAnsi="Times New Roman" w:cs="Times New Roman"/>
+          <w:sz w:val="24"/>
+          <w:szCs w:val="24"/>
+        </w:rPr>
+        <w:t xml:space="preserve"> (</w:t>
+      </w:r>
+      <w:proofErr w:type="spellStart"/>
+      <w:r>
+        <w:rPr>
+          <w:rFonts w:ascii="Times New Roman" w:eastAsia="Times New Roman" w:hAnsi="Times New Roman" w:cs="Times New Roman"/>
+          <w:sz w:val="24"/>
+          <w:szCs w:val="24"/>
+        </w:rPr>
+        <w:t>NTCom</w:t>
+      </w:r>
+      <w:proofErr w:type="spellEnd"/>
+      <w:r>
+        <w:rPr>
+          <w:rFonts w:ascii="Times New Roman" w:eastAsia="Times New Roman" w:hAnsi="Times New Roman" w:cs="Times New Roman"/>
+          <w:sz w:val="24"/>
+          <w:szCs w:val="24"/>
+        </w:rPr>
+        <w:t xml:space="preserve">), confirmant que la restitution des métadonnées fonctionne à l'identique tout en s'appuyant sur le dictionnaire. </w:t>
+      </w:r>
+    </w:p>
+    <w:p>
+      <w:pPr>
+        <w:spacing w:line="360" w:lineRule="auto"/>
+        <w:rPr>
+          <w:rFonts w:ascii="Times New Roman" w:eastAsia="Times New Roman" w:hAnsi="Times New Roman" w:cs="Times New Roman"/>
+          <w:sz w:val="24"/>
+          <w:szCs w:val="24"/>
+        </w:rPr>
+      </w:pPr>
+    </w:p>
+    <w:p>
+      <w:pPr>
+        <w:spacing w:line="360" w:lineRule="auto"/>
+        <w:rPr>
+          <w:rFonts w:ascii="Times New Roman" w:hAnsi="Times New Roman" w:cs="Times New Roman"/>
+          <w:b/>
+          <w:bCs/>
+          <w:sz w:val="24"/>
+          <w:szCs w:val="24"/>
+        </w:rPr>
+      </w:pPr>
+      <w:r>
+        <w:rPr>
+          <w:rFonts w:ascii="Times New Roman" w:hAnsi="Times New Roman" w:cs="Times New Roman"/>
+          <w:b/>
+          <w:bCs/>
+          <w:sz w:val="24"/>
+          <w:szCs w:val="24"/>
+        </w:rPr>
+        <w:t>Résumé des fonctions et concepts utilisés (Partie 3)</w:t>
+      </w:r>
+    </w:p>
+    <w:p>
+      <w:pPr>
+        <w:pStyle w:val="NormalWeb"/>
+        <w:numPr>
+          <w:ilvl w:val="0"/>
+          <w:numId w:val="7"/>
+        </w:numPr>
+        <w:spacing w:before="0" w:beforeAutospacing="0" w:line="360" w:lineRule="auto"/>
+      </w:pPr>
+      <w:r>
+        <w:rPr>
+          <w:b/>
+          <w:bCs/>
+        </w:rPr>
+        <w:t>Déclaration de dictionnaire (</w:t>
+      </w:r>
+      <w:r>
+        <w:rPr>
+          <w:rStyle w:val="CodeHTML"/>
+          <w:rFonts w:ascii="Times New Roman" w:hAnsi="Times New Roman" w:cs="Times New Roman"/>
+          <w:b/>
+          <w:bCs/>
+          <w:sz w:val="24"/>
+          <w:szCs w:val="24"/>
+        </w:rPr>
+        <w:t>{...}</w:t>
+      </w:r>
+      <w:r>
+        <w:rPr>
+          <w:b/>
+          <w:bCs/>
+        </w:rPr>
+        <w:t>) :</w:t>
+      </w:r>
+      <w:r>
+        <w:t xml:space="preserve"> Permet de regrouper plusieurs informations associées à une même entité sous forme de paires </w:t>
+      </w:r>
+      <w:proofErr w:type="gramStart"/>
+      <w:r>
+        <w:rPr>
+          <w:b/>
+          <w:bCs/>
+        </w:rPr>
+        <w:t>clé:</w:t>
+      </w:r>
+      <w:proofErr w:type="gramEnd"/>
+      <w:r>
+        <w:rPr>
+          <w:b/>
+          <w:bCs/>
+        </w:rPr>
+        <w:t xml:space="preserve"> valeur</w:t>
+      </w:r>
+      <w:r>
+        <w:t xml:space="preserve"> (ex: </w:t>
+      </w:r>
+      <w:r>
+        <w:rPr>
+          <w:rStyle w:val="CodeHTML"/>
+          <w:rFonts w:ascii="Times New Roman" w:hAnsi="Times New Roman" w:cs="Times New Roman"/>
+          <w:sz w:val="24"/>
+          <w:szCs w:val="24"/>
+        </w:rPr>
+        <w:t>"nom": nom</w:t>
+      </w:r>
+      <w:r>
+        <w:t xml:space="preserve">). </w:t>
+      </w:r>
+    </w:p>
+    <w:p>
+      <w:pPr>
+        <w:pStyle w:val="NormalWeb"/>
+        <w:numPr>
+          <w:ilvl w:val="0"/>
+          <w:numId w:val="7"/>
+        </w:numPr>
+        <w:spacing w:before="0" w:beforeAutospacing="0" w:line="360" w:lineRule="auto"/>
+      </w:pPr>
+      <w:r>
+        <w:rPr>
+          <w:b/>
+          <w:bCs/>
+        </w:rPr>
+        <w:t>Accès par clé (</w:t>
+      </w:r>
+      <w:proofErr w:type="spellStart"/>
+      <w:r>
+        <w:rPr>
+          <w:rStyle w:val="CodeHTML"/>
+          <w:rFonts w:ascii="Times New Roman" w:hAnsi="Times New Roman" w:cs="Times New Roman"/>
+          <w:b/>
+          <w:bCs/>
+          <w:sz w:val="24"/>
+          <w:szCs w:val="24"/>
+        </w:rPr>
+        <w:t>dataset</w:t>
+      </w:r>
+      <w:proofErr w:type="spellEnd"/>
+      <w:r>
+        <w:rPr>
+          <w:rStyle w:val="CodeHTML"/>
+          <w:rFonts w:ascii="Times New Roman" w:hAnsi="Times New Roman" w:cs="Times New Roman"/>
+          <w:b/>
+          <w:bCs/>
+          <w:sz w:val="24"/>
+          <w:szCs w:val="24"/>
+        </w:rPr>
+        <w:t>['clé']</w:t>
+      </w:r>
+      <w:r>
+        <w:rPr>
+          <w:b/>
+          <w:bCs/>
+        </w:rPr>
+        <w:t>) :</w:t>
+      </w:r>
+      <w:r>
+        <w:t xml:space="preserve"> Permet de récupérer la valeur associée à une clé spécifique du dictionnaire pour l'utiliser ou l'afficher. </w:t>
+      </w:r>
+    </w:p>
+    <w:p>
+      <w:pPr>
+        <w:pStyle w:val="NormalWeb"/>
+        <w:numPr>
+          <w:ilvl w:val="0"/>
+          <w:numId w:val="7"/>
+        </w:numPr>
+        <w:spacing w:before="0" w:beforeAutospacing="0" w:line="360" w:lineRule="auto"/>
+      </w:pPr>
+      <w:r>
+        <w:rPr>
+          <w:b/>
+          <w:bCs/>
+        </w:rPr>
+        <w:t>Encapsulation de données :</w:t>
+      </w:r>
+      <w:r>
+        <w:t xml:space="preserve"> Concept consistant à regrouper toutes les variables éparpillées d'un </w:t>
+      </w:r>
+      <w:proofErr w:type="spellStart"/>
+      <w:r>
+        <w:t>dataset</w:t>
+      </w:r>
+      <w:proofErr w:type="spellEnd"/>
+      <w:r>
+        <w:t xml:space="preserve"> au sein d'un seul objet structuré (</w:t>
+      </w:r>
+      <w:proofErr w:type="spellStart"/>
+      <w:r>
+        <w:rPr>
+          <w:rStyle w:val="CodeHTML"/>
+          <w:rFonts w:ascii="Times New Roman" w:hAnsi="Times New Roman" w:cs="Times New Roman"/>
+          <w:sz w:val="24"/>
+          <w:szCs w:val="24"/>
+        </w:rPr>
+        <w:t>dataset</w:t>
+      </w:r>
+      <w:proofErr w:type="spellEnd"/>
+      <w:r>
+        <w:t xml:space="preserve">). </w:t>
+      </w:r>
+    </w:p>
+    <w:p>
+      <w:pPr>
+        <w:spacing w:line="360" w:lineRule="auto"/>
+        <w:rPr>
+          <w:rFonts w:ascii="Times New Roman" w:eastAsia="Times New Roman" w:hAnsi="Times New Roman" w:cs="Times New Roman"/>
+          <w:sz w:val="24"/>
+          <w:szCs w:val="24"/>
+        </w:rPr>
+      </w:pPr>
+    </w:p>
+    <w:p>
+      <w:pPr>
+        <w:spacing w:before="150" w:after="80" w:line="360" w:lineRule="auto"/>
+        <w:rPr>
+          <w:rFonts w:ascii="Times New Roman" w:hAnsi="Times New Roman" w:cs="Times New Roman"/>
+          <w:sz w:val="24"/>
+          <w:szCs w:val="24"/>
+        </w:rPr>
+      </w:pPr>
+    </w:p>
+    <w:p>
+      <w:pPr>
         <w:spacing w:before="150" w:after="80" w:line="360" w:lineRule="auto"/>
         <w:rPr>
           <w:rFonts w:ascii="Times New Roman" w:hAnsi="Times New Roman" w:cs="Times New Roman"/>
@@ -3087,6 +3826,155 @@
     </w:lvl>
   </w:abstractNum>
   <w:abstractNum w:abstractNumId="5" w15:restartNumberingAfterBreak="0">
+    <w:nsid w:val="69FC276B"/>
+    <w:multiLevelType w:val="multilevel"/>
+    <w:tmpl w:val="C2E0AD14"/>
+    <w:lvl w:ilvl="0">
+      <w:start w:val="1"/>
+      <w:numFmt w:val="bullet"/>
+      <w:lvlText w:val=""/>
+      <w:lvlJc w:val="left"/>
+      <w:pPr>
+        <w:tabs>
+          <w:tab w:val="num" w:pos="720"/>
+        </w:tabs>
+        <w:ind w:left="720" w:hanging="360"/>
+      </w:pPr>
+      <w:rPr>
+        <w:rFonts w:ascii="Symbol" w:hAnsi="Symbol" w:hint="default"/>
+        <w:sz w:val="20"/>
+      </w:rPr>
+    </w:lvl>
+    <w:lvl w:ilvl="1" w:tentative="1">
+      <w:start w:val="1"/>
+      <w:numFmt w:val="bullet"/>
+      <w:lvlText w:val="o"/>
+      <w:lvlJc w:val="left"/>
+      <w:pPr>
+        <w:tabs>
+          <w:tab w:val="num" w:pos="1440"/>
+        </w:tabs>
+        <w:ind w:left="1440" w:hanging="360"/>
+      </w:pPr>
+      <w:rPr>
+        <w:rFonts w:ascii="Courier New" w:hAnsi="Courier New" w:hint="default"/>
+        <w:sz w:val="20"/>
+      </w:rPr>
+    </w:lvl>
+    <w:lvl w:ilvl="2" w:tentative="1">
+      <w:start w:val="1"/>
+      <w:numFmt w:val="bullet"/>
+      <w:lvlText w:val=""/>
+      <w:lvlJc w:val="left"/>
+      <w:pPr>
+        <w:tabs>
+          <w:tab w:val="num" w:pos="2160"/>
+        </w:tabs>
+        <w:ind w:left="2160" w:hanging="360"/>
+      </w:pPr>
+      <w:rPr>
+        <w:rFonts w:ascii="Wingdings" w:hAnsi="Wingdings" w:hint="default"/>
+        <w:sz w:val="20"/>
+      </w:rPr>
+    </w:lvl>
+    <w:lvl w:ilvl="3" w:tentative="1">
+      <w:start w:val="1"/>
+      <w:numFmt w:val="bullet"/>
+      <w:lvlText w:val=""/>
+      <w:lvlJc w:val="left"/>
+      <w:pPr>
+        <w:tabs>
+          <w:tab w:val="num" w:pos="2880"/>
+        </w:tabs>
+        <w:ind w:left="2880" w:hanging="360"/>
+      </w:pPr>
+      <w:rPr>
+        <w:rFonts w:ascii="Wingdings" w:hAnsi="Wingdings" w:hint="default"/>
+        <w:sz w:val="20"/>
+      </w:rPr>
+    </w:lvl>
+    <w:lvl w:ilvl="4" w:tentative="1">
+      <w:start w:val="1"/>
+      <w:numFmt w:val="bullet"/>
+      <w:lvlText w:val=""/>
+      <w:lvlJc w:val="left"/>
+      <w:pPr>
+        <w:tabs>
+          <w:tab w:val="num" w:pos="3600"/>
+        </w:tabs>
+        <w:ind w:left="3600" w:hanging="360"/>
+      </w:pPr>
+      <w:rPr>
+        <w:rFonts w:ascii="Wingdings" w:hAnsi="Wingdings" w:hint="default"/>
+        <w:sz w:val="20"/>
+      </w:rPr>
+    </w:lvl>
+    <w:lvl w:ilvl="5" w:tentative="1">
+      <w:start w:val="1"/>
+      <w:numFmt w:val="bullet"/>
+      <w:lvlText w:val=""/>
+      <w:lvlJc w:val="left"/>
+      <w:pPr>
+        <w:tabs>
+          <w:tab w:val="num" w:pos="4320"/>
+        </w:tabs>
+        <w:ind w:left="4320" w:hanging="360"/>
+      </w:pPr>
+      <w:rPr>
+        <w:rFonts w:ascii="Wingdings" w:hAnsi="Wingdings" w:hint="default"/>
+        <w:sz w:val="20"/>
+      </w:rPr>
+    </w:lvl>
+    <w:lvl w:ilvl="6" w:tentative="1">
+      <w:start w:val="1"/>
+      <w:numFmt w:val="bullet"/>
+      <w:lvlText w:val=""/>
+      <w:lvlJc w:val="left"/>
+      <w:pPr>
+        <w:tabs>
+          <w:tab w:val="num" w:pos="5040"/>
+        </w:tabs>
+        <w:ind w:left="5040" w:hanging="360"/>
+      </w:pPr>
+      <w:rPr>
+        <w:rFonts w:ascii="Wingdings" w:hAnsi="Wingdings" w:hint="default"/>
+        <w:sz w:val="20"/>
+      </w:rPr>
+    </w:lvl>
+    <w:lvl w:ilvl="7" w:tentative="1">
+      <w:start w:val="1"/>
+      <w:numFmt w:val="bullet"/>
+      <w:lvlText w:val=""/>
+      <w:lvlJc w:val="left"/>
+      <w:pPr>
+        <w:tabs>
+          <w:tab w:val="num" w:pos="5760"/>
+        </w:tabs>
+        <w:ind w:left="5760" w:hanging="360"/>
+      </w:pPr>
+      <w:rPr>
+        <w:rFonts w:ascii="Wingdings" w:hAnsi="Wingdings" w:hint="default"/>
+        <w:sz w:val="20"/>
+      </w:rPr>
+    </w:lvl>
+    <w:lvl w:ilvl="8" w:tentative="1">
+      <w:start w:val="1"/>
+      <w:numFmt w:val="bullet"/>
+      <w:lvlText w:val=""/>
+      <w:lvlJc w:val="left"/>
+      <w:pPr>
+        <w:tabs>
+          <w:tab w:val="num" w:pos="6480"/>
+        </w:tabs>
+        <w:ind w:left="6480" w:hanging="360"/>
+      </w:pPr>
+      <w:rPr>
+        <w:rFonts w:ascii="Wingdings" w:hAnsi="Wingdings" w:hint="default"/>
+        <w:sz w:val="20"/>
+      </w:rPr>
+    </w:lvl>
+  </w:abstractNum>
+  <w:abstractNum w:abstractNumId="6" w15:restartNumberingAfterBreak="0">
     <w:nsid w:val="76A84B46"/>
     <w:multiLevelType w:val="hybridMultilevel"/>
     <w:tmpl w:val="C6A6513A"/>
@@ -3208,7 +4096,7 @@
     <w:abstractNumId w:val="1"/>
   </w:num>
   <w:num w:numId="3" w16cid:durableId="832062217">
-    <w:abstractNumId w:val="5"/>
+    <w:abstractNumId w:val="6"/>
   </w:num>
   <w:num w:numId="4" w16cid:durableId="1215237999">
     <w:abstractNumId w:val="3"/>
@@ -3218,6 +4106,9 @@
   </w:num>
   <w:num w:numId="6" w16cid:durableId="1734310147">
     <w:abstractNumId w:val="4"/>
+  </w:num>
+  <w:num w:numId="7" w16cid:durableId="655379516">
+    <w:abstractNumId w:val="5"/>
   </w:num>
 </w:numbering>
 </file>

</xml_diff>

<commit_message>
feat: contrôle du domaine de dataset par tuple de valeurs autorisées (Partie 4)
</commit_message>
<xml_diff>
--- a/pratiquePython.docx
+++ b/pratiquePython.docx
@@ -43,7 +43,6 @@
           <w:szCs w:val="24"/>
         </w:rPr>
       </w:pPr>
-      <w:proofErr w:type="spellStart"/>
       <w:r>
         <w:rPr>
           <w:rFonts w:ascii="Times New Roman" w:hAnsi="Times New Roman" w:cs="Times New Roman"/>
@@ -54,7 +53,6 @@
         </w:rPr>
         <w:t>DatasetManager</w:t>
       </w:r>
-      <w:proofErr w:type="spellEnd"/>
     </w:p>
     <w:p>
       <w:pPr>
@@ -181,25 +179,7 @@
           <w:sz w:val="24"/>
           <w:szCs w:val="24"/>
         </w:rPr>
-        <w:t xml:space="preserve">Une entreprise spécialisée en Intelligence Artificielle souhaite disposer d'une application console permettant à ses Data Scientists de gérer un catalogue de </w:t>
-      </w:r>
-      <w:proofErr w:type="spellStart"/>
-      <w:r>
-        <w:rPr>
-          <w:rFonts w:ascii="Times New Roman" w:hAnsi="Times New Roman" w:cs="Times New Roman"/>
-          <w:sz w:val="24"/>
-          <w:szCs w:val="24"/>
-        </w:rPr>
-        <w:t>datasets</w:t>
-      </w:r>
-      <w:proofErr w:type="spellEnd"/>
-      <w:r>
-        <w:rPr>
-          <w:rFonts w:ascii="Times New Roman" w:hAnsi="Times New Roman" w:cs="Times New Roman"/>
-          <w:sz w:val="24"/>
-          <w:szCs w:val="24"/>
-        </w:rPr>
-        <w:t xml:space="preserve"> (CSV et JSON) avant leur traitement avec Pandas : enregistrement des caractéristiques, recherche, statistiques, sauvegarde, rechargement automatique et gestion des erreurs.</w:t>
+        <w:t>Une entreprise spécialisée en Intelligence Artificielle souhaite disposer d'une application console permettant à ses Data Scientists de gérer un catalogue de datasets (CSV et JSON) avant leur traitement avec Pandas : enregistrement des caractéristiques, recherche, statistiques, sauvegarde, rechargement automatique et gestion des erreurs.</w:t>
       </w:r>
     </w:p>
     <w:p>
@@ -217,25 +197,7 @@
           <w:sz w:val="24"/>
           <w:szCs w:val="24"/>
         </w:rPr>
-        <w:t xml:space="preserve">Ce document présente la réalisation de l'application </w:t>
-      </w:r>
-      <w:proofErr w:type="spellStart"/>
-      <w:r>
-        <w:rPr>
-          <w:rFonts w:ascii="Times New Roman" w:hAnsi="Times New Roman" w:cs="Times New Roman"/>
-          <w:sz w:val="24"/>
-          <w:szCs w:val="24"/>
-        </w:rPr>
-        <w:t>DatasetManager</w:t>
-      </w:r>
-      <w:proofErr w:type="spellEnd"/>
-      <w:r>
-        <w:rPr>
-          <w:rFonts w:ascii="Times New Roman" w:hAnsi="Times New Roman" w:cs="Times New Roman"/>
-          <w:sz w:val="24"/>
-          <w:szCs w:val="24"/>
-        </w:rPr>
-        <w:t xml:space="preserve">, </w:t>
+        <w:t xml:space="preserve">Ce document présente la réalisation de l'application DatasetManager, </w:t>
       </w:r>
       <w:r>
         <w:rPr>
@@ -358,29 +320,7 @@
                 <w:sz w:val="24"/>
                 <w:szCs w:val="24"/>
               </w:rPr>
-              <w:t xml:space="preserve"> </w:t>
-            </w:r>
-            <w:proofErr w:type="spellStart"/>
-            <w:r>
-              <w:rPr>
-                <w:rFonts w:ascii="Times New Roman" w:hAnsi="Times New Roman" w:cs="Times New Roman"/>
-                <w:i/>
-                <w:iCs/>
-                <w:sz w:val="24"/>
-                <w:szCs w:val="24"/>
-              </w:rPr>
-              <w:t>datasetManager</w:t>
-            </w:r>
-            <w:proofErr w:type="spellEnd"/>
-            <w:r>
-              <w:rPr>
-                <w:rFonts w:ascii="Times New Roman" w:hAnsi="Times New Roman" w:cs="Times New Roman"/>
-                <w:i/>
-                <w:iCs/>
-                <w:sz w:val="24"/>
-                <w:szCs w:val="24"/>
-              </w:rPr>
-              <w:t>, le dossier racine de l'application, et le fichier main.py, point d'entrée de l'application.</w:t>
+              <w:t xml:space="preserve"> datasetManager, le dossier racine de l'application, et le fichier main.py, point d'entrée de l'application.</w:t>
             </w:r>
           </w:p>
         </w:tc>
@@ -401,25 +341,7 @@
           <w:sz w:val="24"/>
           <w:szCs w:val="24"/>
         </w:rPr>
-        <w:t xml:space="preserve">Le dossier racine </w:t>
-      </w:r>
-      <w:proofErr w:type="spellStart"/>
-      <w:r>
-        <w:rPr>
-          <w:rFonts w:ascii="Times New Roman" w:hAnsi="Times New Roman" w:cs="Times New Roman"/>
-          <w:sz w:val="24"/>
-          <w:szCs w:val="24"/>
-        </w:rPr>
-        <w:t>datasetManager</w:t>
-      </w:r>
-      <w:proofErr w:type="spellEnd"/>
-      <w:r>
-        <w:rPr>
-          <w:rFonts w:ascii="Times New Roman" w:hAnsi="Times New Roman" w:cs="Times New Roman"/>
-          <w:sz w:val="24"/>
-          <w:szCs w:val="24"/>
-        </w:rPr>
-        <w:t xml:space="preserve"> a été créé avec, à sa racine, le fichier main.py qui sert de point d'entrée unique à l'application</w:t>
+        <w:t>Le dossier racine datasetManager a été créé avec, à sa racine, le fichier main.py qui sert de point d'entrée unique à l'application</w:t>
       </w:r>
       <w:r>
         <w:rPr>
@@ -633,73 +555,7 @@
                 <w:sz w:val="24"/>
                 <w:szCs w:val="24"/>
               </w:rPr>
-              <w:t xml:space="preserve">emande à l'utilisateur de saisir les métadonnées d'un </w:t>
-            </w:r>
-            <w:proofErr w:type="spellStart"/>
-            <w:r>
-              <w:rPr>
-                <w:rFonts w:ascii="Times New Roman" w:hAnsi="Times New Roman" w:cs="Times New Roman"/>
-                <w:i/>
-                <w:iCs/>
-                <w:sz w:val="24"/>
-                <w:szCs w:val="24"/>
-              </w:rPr>
-              <w:t>dataset</w:t>
-            </w:r>
-            <w:proofErr w:type="spellEnd"/>
-            <w:r>
-              <w:rPr>
-                <w:rFonts w:ascii="Times New Roman" w:hAnsi="Times New Roman" w:cs="Times New Roman"/>
-                <w:i/>
-                <w:iCs/>
-                <w:sz w:val="24"/>
-                <w:szCs w:val="24"/>
-              </w:rPr>
-              <w:t xml:space="preserve"> : nom, domaine, nombre de lignes, nombre de colonnes, taille en Mo, format (csv ou </w:t>
-            </w:r>
-            <w:proofErr w:type="spellStart"/>
-            <w:r>
-              <w:rPr>
-                <w:rFonts w:ascii="Times New Roman" w:hAnsi="Times New Roman" w:cs="Times New Roman"/>
-                <w:i/>
-                <w:iCs/>
-                <w:sz w:val="24"/>
-                <w:szCs w:val="24"/>
-              </w:rPr>
-              <w:t>json</w:t>
-            </w:r>
-            <w:proofErr w:type="spellEnd"/>
-            <w:r>
-              <w:rPr>
-                <w:rFonts w:ascii="Times New Roman" w:hAnsi="Times New Roman" w:cs="Times New Roman"/>
-                <w:i/>
-                <w:iCs/>
-                <w:sz w:val="24"/>
-                <w:szCs w:val="24"/>
-              </w:rPr>
-              <w:t>), public (</w:t>
-            </w:r>
-            <w:proofErr w:type="spellStart"/>
-            <w:r>
-              <w:rPr>
-                <w:rFonts w:ascii="Times New Roman" w:hAnsi="Times New Roman" w:cs="Times New Roman"/>
-                <w:i/>
-                <w:iCs/>
-                <w:sz w:val="24"/>
-                <w:szCs w:val="24"/>
-              </w:rPr>
-              <w:t>true</w:t>
-            </w:r>
-            <w:proofErr w:type="spellEnd"/>
-            <w:r>
-              <w:rPr>
-                <w:rFonts w:ascii="Times New Roman" w:hAnsi="Times New Roman" w:cs="Times New Roman"/>
-                <w:i/>
-                <w:iCs/>
-                <w:sz w:val="24"/>
-                <w:szCs w:val="24"/>
-              </w:rPr>
-              <w:t xml:space="preserve"> ou false).</w:t>
+              <w:t>emande à l'utilisateur de saisir les métadonnées d'un dataset : nom, domaine, nombre de lignes, nombre de colonnes, taille en Mo, format (csv ou json), public (true ou false).</w:t>
             </w:r>
           </w:p>
         </w:tc>
@@ -852,8 +708,6 @@
         </w:rPr>
         <w:t xml:space="preserve">, </w:t>
       </w:r>
-      <w:proofErr w:type="spellStart"/>
-      <w:proofErr w:type="gramStart"/>
       <w:r>
         <w:rPr>
           <w:rStyle w:val="CodeHTML"/>
@@ -863,9 +717,16 @@
           <w:sz w:val="24"/>
           <w:szCs w:val="24"/>
         </w:rPr>
-        <w:t>int</w:t>
-      </w:r>
-      <w:proofErr w:type="spellEnd"/>
+        <w:t>int()</w:t>
+      </w:r>
+      <w:r>
+        <w:rPr>
+          <w:rFonts w:ascii="Times New Roman" w:hAnsi="Times New Roman" w:cs="Times New Roman"/>
+          <w:sz w:val="24"/>
+          <w:szCs w:val="24"/>
+        </w:rPr>
+        <w:t xml:space="preserve"> et </w:t>
+      </w:r>
       <w:r>
         <w:rPr>
           <w:rStyle w:val="CodeHTML"/>
@@ -875,51 +736,7 @@
           <w:sz w:val="24"/>
           <w:szCs w:val="24"/>
         </w:rPr>
-        <w:t>(</w:t>
-      </w:r>
-      <w:proofErr w:type="gramEnd"/>
-      <w:r>
-        <w:rPr>
-          <w:rStyle w:val="CodeHTML"/>
-          <w:rFonts w:ascii="Times New Roman" w:eastAsia="Calibri" w:hAnsi="Times New Roman" w:cs="Times New Roman"/>
-          <w:b/>
-          <w:bCs/>
-          <w:sz w:val="24"/>
-          <w:szCs w:val="24"/>
-        </w:rPr>
-        <w:t>)</w:t>
-      </w:r>
-      <w:r>
-        <w:rPr>
-          <w:rFonts w:ascii="Times New Roman" w:hAnsi="Times New Roman" w:cs="Times New Roman"/>
-          <w:sz w:val="24"/>
-          <w:szCs w:val="24"/>
-        </w:rPr>
-        <w:t xml:space="preserve"> et </w:t>
-      </w:r>
-      <w:proofErr w:type="spellStart"/>
-      <w:r>
-        <w:rPr>
-          <w:rStyle w:val="CodeHTML"/>
-          <w:rFonts w:ascii="Times New Roman" w:eastAsia="Calibri" w:hAnsi="Times New Roman" w:cs="Times New Roman"/>
-          <w:b/>
-          <w:bCs/>
-          <w:sz w:val="24"/>
-          <w:szCs w:val="24"/>
-        </w:rPr>
-        <w:t>float</w:t>
-      </w:r>
-      <w:proofErr w:type="spellEnd"/>
-      <w:r>
-        <w:rPr>
-          <w:rStyle w:val="CodeHTML"/>
-          <w:rFonts w:ascii="Times New Roman" w:eastAsia="Calibri" w:hAnsi="Times New Roman" w:cs="Times New Roman"/>
-          <w:b/>
-          <w:bCs/>
-          <w:sz w:val="24"/>
-          <w:szCs w:val="24"/>
-        </w:rPr>
-        <w:t>()</w:t>
+        <w:t>float()</w:t>
       </w:r>
       <w:r>
         <w:rPr>
@@ -1145,8 +962,6 @@
         </w:rPr>
         <w:t xml:space="preserve">e code montre une série d'instructions </w:t>
       </w:r>
-      <w:proofErr w:type="spellStart"/>
-      <w:proofErr w:type="gramStart"/>
       <w:r>
         <w:rPr>
           <w:rStyle w:val="CodeHTML"/>
@@ -1156,31 +971,7 @@
           <w:sz w:val="24"/>
           <w:szCs w:val="24"/>
         </w:rPr>
-        <w:t>print</w:t>
-      </w:r>
-      <w:proofErr w:type="spellEnd"/>
-      <w:r>
-        <w:rPr>
-          <w:rStyle w:val="CodeHTML"/>
-          <w:rFonts w:ascii="Times New Roman" w:eastAsia="Calibri" w:hAnsi="Times New Roman" w:cs="Times New Roman"/>
-          <w:b/>
-          <w:bCs/>
-          <w:sz w:val="24"/>
-          <w:szCs w:val="24"/>
-        </w:rPr>
-        <w:t>(</w:t>
-      </w:r>
-      <w:proofErr w:type="gramEnd"/>
-      <w:r>
-        <w:rPr>
-          <w:rStyle w:val="CodeHTML"/>
-          <w:rFonts w:ascii="Times New Roman" w:eastAsia="Calibri" w:hAnsi="Times New Roman" w:cs="Times New Roman"/>
-          <w:b/>
-          <w:bCs/>
-          <w:sz w:val="24"/>
-          <w:szCs w:val="24"/>
-        </w:rPr>
-        <w:t>)</w:t>
+        <w:t>print()</w:t>
       </w:r>
       <w:r>
         <w:rPr>
@@ -1310,7 +1101,6 @@
         </w:rPr>
         <w:t>Le terminal affiche la saisie dynamique des métadonnées d'un exemple (</w:t>
       </w:r>
-      <w:proofErr w:type="spellStart"/>
       <w:r>
         <w:rPr>
           <w:rStyle w:val="CodeHTML"/>
@@ -1320,7 +1110,6 @@
         </w:rPr>
         <w:t>droneTrans</w:t>
       </w:r>
-      <w:proofErr w:type="spellEnd"/>
       <w:r>
         <w:rPr>
           <w:rFonts w:ascii="Times New Roman" w:hAnsi="Times New Roman" w:cs="Times New Roman"/>
@@ -1369,7 +1158,6 @@
         </w:numPr>
         <w:spacing w:before="0" w:beforeAutospacing="0" w:line="360" w:lineRule="auto"/>
       </w:pPr>
-      <w:proofErr w:type="gramStart"/>
       <w:r>
         <w:rPr>
           <w:rStyle w:val="CodeHTML"/>
@@ -1379,41 +1167,27 @@
           <w:sz w:val="24"/>
           <w:szCs w:val="24"/>
         </w:rPr>
-        <w:t>input(</w:t>
-      </w:r>
-      <w:proofErr w:type="gramEnd"/>
+        <w:t>input()</w:t>
+      </w:r>
+      <w:r>
+        <w:rPr>
+          <w:b/>
+          <w:bCs/>
+        </w:rPr>
+        <w:t xml:space="preserve"> :</w:t>
+      </w:r>
+      <w:r>
+        <w:t xml:space="preserve"> Interrompt l'exécution du programme pour demander à l'utilisateur de saisir une valeur au clavier (qui est toujours récupérée sous forme de chaîne de caractères </w:t>
+      </w:r>
       <w:r>
         <w:rPr>
           <w:rStyle w:val="CodeHTML"/>
           <w:rFonts w:ascii="Times New Roman" w:hAnsi="Times New Roman" w:cs="Times New Roman"/>
-          <w:b/>
-          <w:bCs/>
-          <w:sz w:val="24"/>
-          <w:szCs w:val="24"/>
-        </w:rPr>
-        <w:t>)</w:t>
-      </w:r>
-      <w:r>
-        <w:rPr>
-          <w:b/>
-          <w:bCs/>
-        </w:rPr>
-        <w:t xml:space="preserve"> :</w:t>
-      </w:r>
-      <w:r>
-        <w:t xml:space="preserve"> Interrompt l'exécution du programme pour demander à l'utilisateur de saisir une valeur au clavier (qui est toujours récupérée sous forme de chaîne de caractères </w:t>
-      </w:r>
-      <w:proofErr w:type="spellStart"/>
-      <w:r>
-        <w:rPr>
-          <w:rStyle w:val="CodeHTML"/>
-          <w:rFonts w:ascii="Times New Roman" w:hAnsi="Times New Roman" w:cs="Times New Roman"/>
           <w:sz w:val="24"/>
           <w:szCs w:val="24"/>
         </w:rPr>
         <w:t>str</w:t>
       </w:r>
-      <w:proofErr w:type="spellEnd"/>
       <w:r>
         <w:t xml:space="preserve">). </w:t>
       </w:r>
@@ -1427,8 +1201,6 @@
         </w:numPr>
         <w:spacing w:before="0" w:beforeAutospacing="0" w:line="360" w:lineRule="auto"/>
       </w:pPr>
-      <w:proofErr w:type="spellStart"/>
-      <w:proofErr w:type="gramStart"/>
       <w:r>
         <w:rPr>
           <w:rStyle w:val="CodeHTML"/>
@@ -1439,31 +1211,7 @@
           <w:szCs w:val="24"/>
         </w:rPr>
         <w:lastRenderedPageBreak/>
-        <w:t>int</w:t>
-      </w:r>
-      <w:proofErr w:type="spellEnd"/>
-      <w:r>
-        <w:rPr>
-          <w:rStyle w:val="CodeHTML"/>
-          <w:rFonts w:ascii="Times New Roman" w:hAnsi="Times New Roman" w:cs="Times New Roman"/>
-          <w:b/>
-          <w:bCs/>
-          <w:sz w:val="24"/>
-          <w:szCs w:val="24"/>
-        </w:rPr>
-        <w:t>(</w:t>
-      </w:r>
-      <w:proofErr w:type="gramEnd"/>
-      <w:r>
-        <w:rPr>
-          <w:rStyle w:val="CodeHTML"/>
-          <w:rFonts w:ascii="Times New Roman" w:hAnsi="Times New Roman" w:cs="Times New Roman"/>
-          <w:b/>
-          <w:bCs/>
-          <w:sz w:val="24"/>
-          <w:szCs w:val="24"/>
-        </w:rPr>
-        <w:t>)</w:t>
+        <w:t>int()</w:t>
       </w:r>
       <w:r>
         <w:rPr>
@@ -1485,8 +1233,6 @@
         </w:numPr>
         <w:spacing w:before="0" w:beforeAutospacing="0" w:line="360" w:lineRule="auto"/>
       </w:pPr>
-      <w:proofErr w:type="spellStart"/>
-      <w:proofErr w:type="gramStart"/>
       <w:r>
         <w:rPr>
           <w:rStyle w:val="CodeHTML"/>
@@ -1496,31 +1242,7 @@
           <w:sz w:val="24"/>
           <w:szCs w:val="24"/>
         </w:rPr>
-        <w:t>float</w:t>
-      </w:r>
-      <w:proofErr w:type="spellEnd"/>
-      <w:r>
-        <w:rPr>
-          <w:rStyle w:val="CodeHTML"/>
-          <w:rFonts w:ascii="Times New Roman" w:hAnsi="Times New Roman" w:cs="Times New Roman"/>
-          <w:b/>
-          <w:bCs/>
-          <w:sz w:val="24"/>
-          <w:szCs w:val="24"/>
-        </w:rPr>
-        <w:t>(</w:t>
-      </w:r>
-      <w:proofErr w:type="gramEnd"/>
-      <w:r>
-        <w:rPr>
-          <w:rStyle w:val="CodeHTML"/>
-          <w:rFonts w:ascii="Times New Roman" w:hAnsi="Times New Roman" w:cs="Times New Roman"/>
-          <w:b/>
-          <w:bCs/>
-          <w:sz w:val="24"/>
-          <w:szCs w:val="24"/>
-        </w:rPr>
-        <w:t>)</w:t>
+        <w:t>float()</w:t>
       </w:r>
       <w:r>
         <w:rPr>
@@ -1530,15 +1252,7 @@
         <w:t xml:space="preserve"> :</w:t>
       </w:r>
       <w:r>
-        <w:t xml:space="preserve"> Convertit la saisie utilisateur (ex: taille du </w:t>
-      </w:r>
-      <w:proofErr w:type="spellStart"/>
-      <w:r>
-        <w:t>dataset</w:t>
-      </w:r>
-      <w:proofErr w:type="spellEnd"/>
-      <w:r>
-        <w:t xml:space="preserve">) en un nombre à virgule flottante. </w:t>
+        <w:t xml:space="preserve"> Convertit la saisie utilisateur (ex: taille du dataset) en un nombre à virgule flottante. </w:t>
       </w:r>
     </w:p>
     <w:p>
@@ -1550,8 +1264,6 @@
         </w:numPr>
         <w:spacing w:before="0" w:beforeAutospacing="0" w:line="360" w:lineRule="auto"/>
       </w:pPr>
-      <w:proofErr w:type="spellStart"/>
-      <w:proofErr w:type="gramStart"/>
       <w:r>
         <w:rPr>
           <w:rStyle w:val="CodeHTML"/>
@@ -1561,31 +1273,7 @@
           <w:sz w:val="24"/>
           <w:szCs w:val="24"/>
         </w:rPr>
-        <w:t>print</w:t>
-      </w:r>
-      <w:proofErr w:type="spellEnd"/>
-      <w:r>
-        <w:rPr>
-          <w:rStyle w:val="CodeHTML"/>
-          <w:rFonts w:ascii="Times New Roman" w:hAnsi="Times New Roman" w:cs="Times New Roman"/>
-          <w:b/>
-          <w:bCs/>
-          <w:sz w:val="24"/>
-          <w:szCs w:val="24"/>
-        </w:rPr>
-        <w:t>(</w:t>
-      </w:r>
-      <w:proofErr w:type="gramEnd"/>
-      <w:r>
-        <w:rPr>
-          <w:rStyle w:val="CodeHTML"/>
-          <w:rFonts w:ascii="Times New Roman" w:hAnsi="Times New Roman" w:cs="Times New Roman"/>
-          <w:b/>
-          <w:bCs/>
-          <w:sz w:val="24"/>
-          <w:szCs w:val="24"/>
-        </w:rPr>
-        <w:t>)</w:t>
+        <w:t>print()</w:t>
       </w:r>
       <w:r>
         <w:rPr>
@@ -1968,9 +1656,16 @@
           <w:sz w:val="24"/>
           <w:szCs w:val="24"/>
         </w:rPr>
-        <w:t xml:space="preserve">active = </w:t>
-      </w:r>
-      <w:proofErr w:type="spellStart"/>
+        <w:t>active = True</w:t>
+      </w:r>
+      <w:r>
+        <w:rPr>
+          <w:rFonts w:ascii="Times New Roman" w:hAnsi="Times New Roman" w:cs="Times New Roman"/>
+          <w:sz w:val="24"/>
+          <w:szCs w:val="24"/>
+        </w:rPr>
+        <w:t xml:space="preserve"> et le début de la boucle </w:t>
+      </w:r>
       <w:r>
         <w:rPr>
           <w:rStyle w:val="CodeHTML"/>
@@ -1978,18 +1673,32 @@
           <w:sz w:val="24"/>
           <w:szCs w:val="24"/>
         </w:rPr>
-        <w:t>True</w:t>
-      </w:r>
-      <w:proofErr w:type="spellEnd"/>
-      <w:r>
-        <w:rPr>
-          <w:rFonts w:ascii="Times New Roman" w:hAnsi="Times New Roman" w:cs="Times New Roman"/>
-          <w:sz w:val="24"/>
-          <w:szCs w:val="24"/>
-        </w:rPr>
-        <w:t xml:space="preserve"> et le début de la boucle </w:t>
-      </w:r>
-      <w:proofErr w:type="spellStart"/>
+        <w:t>while</w:t>
+      </w:r>
+      <w:r>
+        <w:rPr>
+          <w:rFonts w:ascii="Times New Roman" w:hAnsi="Times New Roman" w:cs="Times New Roman"/>
+          <w:sz w:val="24"/>
+          <w:szCs w:val="24"/>
+        </w:rPr>
+        <w:t xml:space="preserve"> affichant les options du menu et la saisie de l'option 1.</w:t>
+      </w:r>
+      <w:r>
+        <w:rPr>
+          <w:rFonts w:ascii="Times New Roman" w:hAnsi="Times New Roman" w:cs="Times New Roman"/>
+          <w:sz w:val="24"/>
+          <w:szCs w:val="24"/>
+        </w:rPr>
+        <w:t xml:space="preserve"> C</w:t>
+      </w:r>
+      <w:r>
+        <w:rPr>
+          <w:rFonts w:ascii="Times New Roman" w:hAnsi="Times New Roman" w:cs="Times New Roman"/>
+          <w:sz w:val="24"/>
+          <w:szCs w:val="24"/>
+        </w:rPr>
+        <w:t xml:space="preserve">e code illustre la suite du bloc d'affichage de l'option 1, ainsi que les blocs </w:t>
+      </w:r>
       <w:r>
         <w:rPr>
           <w:rStyle w:val="CodeHTML"/>
@@ -1997,34 +1706,16 @@
           <w:sz w:val="24"/>
           <w:szCs w:val="24"/>
         </w:rPr>
-        <w:t>while</w:t>
-      </w:r>
-      <w:proofErr w:type="spellEnd"/>
-      <w:r>
-        <w:rPr>
-          <w:rFonts w:ascii="Times New Roman" w:hAnsi="Times New Roman" w:cs="Times New Roman"/>
-          <w:sz w:val="24"/>
-          <w:szCs w:val="24"/>
-        </w:rPr>
-        <w:t xml:space="preserve"> affichant les options du menu et la saisie de l'option 1.</w:t>
-      </w:r>
-      <w:r>
-        <w:rPr>
-          <w:rFonts w:ascii="Times New Roman" w:hAnsi="Times New Roman" w:cs="Times New Roman"/>
-          <w:sz w:val="24"/>
-          <w:szCs w:val="24"/>
-        </w:rPr>
-        <w:t xml:space="preserve"> C</w:t>
-      </w:r>
-      <w:r>
-        <w:rPr>
-          <w:rFonts w:ascii="Times New Roman" w:hAnsi="Times New Roman" w:cs="Times New Roman"/>
-          <w:sz w:val="24"/>
-          <w:szCs w:val="24"/>
-        </w:rPr>
-        <w:t xml:space="preserve">e code illustre la suite du bloc d'affichage de l'option 1, ainsi que les blocs </w:t>
-      </w:r>
-      <w:proofErr w:type="spellStart"/>
+        <w:t>elif</w:t>
+      </w:r>
+      <w:r>
+        <w:rPr>
+          <w:rFonts w:ascii="Times New Roman" w:hAnsi="Times New Roman" w:cs="Times New Roman"/>
+          <w:sz w:val="24"/>
+          <w:szCs w:val="24"/>
+        </w:rPr>
+        <w:t xml:space="preserve"> pour les options 2, 3, 4 et la gestion des choix invalides avec </w:t>
+      </w:r>
       <w:r>
         <w:rPr>
           <w:rStyle w:val="CodeHTML"/>
@@ -2032,28 +1723,8 @@
           <w:sz w:val="24"/>
           <w:szCs w:val="24"/>
         </w:rPr>
-        <w:t>elif</w:t>
-      </w:r>
-      <w:proofErr w:type="spellEnd"/>
-      <w:r>
-        <w:rPr>
-          <w:rFonts w:ascii="Times New Roman" w:hAnsi="Times New Roman" w:cs="Times New Roman"/>
-          <w:sz w:val="24"/>
-          <w:szCs w:val="24"/>
-        </w:rPr>
-        <w:t xml:space="preserve"> pour les options 2, 3, 4 et la gestion des choix invalides avec </w:t>
-      </w:r>
-      <w:proofErr w:type="spellStart"/>
-      <w:r>
-        <w:rPr>
-          <w:rStyle w:val="CodeHTML"/>
-          <w:rFonts w:ascii="Times New Roman" w:eastAsia="Calibri" w:hAnsi="Times New Roman" w:cs="Times New Roman"/>
-          <w:sz w:val="24"/>
-          <w:szCs w:val="24"/>
-        </w:rPr>
         <w:t>else</w:t>
       </w:r>
-      <w:proofErr w:type="spellEnd"/>
       <w:r>
         <w:rPr>
           <w:rFonts w:ascii="Times New Roman" w:hAnsi="Times New Roman" w:cs="Times New Roman"/>
@@ -2173,25 +1844,7 @@
           <w:sz w:val="24"/>
           <w:szCs w:val="24"/>
         </w:rPr>
-        <w:t xml:space="preserve">Le terminal montre l'enchaînement des interactions : l'ajout d'un </w:t>
-      </w:r>
-      <w:proofErr w:type="spellStart"/>
-      <w:r>
-        <w:rPr>
-          <w:rFonts w:ascii="Times New Roman" w:hAnsi="Times New Roman" w:cs="Times New Roman"/>
-          <w:sz w:val="24"/>
-          <w:szCs w:val="24"/>
-        </w:rPr>
-        <w:t>dataset</w:t>
-      </w:r>
-      <w:proofErr w:type="spellEnd"/>
-      <w:r>
-        <w:rPr>
-          <w:rFonts w:ascii="Times New Roman" w:hAnsi="Times New Roman" w:cs="Times New Roman"/>
-          <w:sz w:val="24"/>
-          <w:szCs w:val="24"/>
-        </w:rPr>
-        <w:t xml:space="preserve"> (</w:t>
+        <w:t>Le terminal montre l'enchaînement des interactions : l'ajout d'un dataset (</w:t>
       </w:r>
       <w:r>
         <w:rPr>
@@ -2242,8 +1895,6 @@
         </w:numPr>
         <w:spacing w:before="0" w:beforeAutospacing="0" w:line="360" w:lineRule="auto"/>
       </w:pPr>
-      <w:proofErr w:type="spellStart"/>
-      <w:proofErr w:type="gramStart"/>
       <w:r>
         <w:rPr>
           <w:rStyle w:val="CodeHTML"/>
@@ -2253,30 +1904,29 @@
           <w:sz w:val="24"/>
           <w:szCs w:val="24"/>
         </w:rPr>
-        <w:t>while</w:t>
-      </w:r>
-      <w:proofErr w:type="spellEnd"/>
-      <w:proofErr w:type="gramEnd"/>
+        <w:t>while active:</w:t>
+      </w:r>
+      <w:r>
+        <w:rPr>
+          <w:b/>
+          <w:bCs/>
+        </w:rPr>
+        <w:t xml:space="preserve"> :</w:t>
+      </w:r>
+      <w:r>
+        <w:t xml:space="preserve"> Une boucle conditionnelle qui répète l'affichage du menu et l'exécution des choix tant que la variable </w:t>
+      </w:r>
       <w:r>
         <w:rPr>
           <w:rStyle w:val="CodeHTML"/>
           <w:rFonts w:ascii="Times New Roman" w:hAnsi="Times New Roman" w:cs="Times New Roman"/>
-          <w:b/>
-          <w:bCs/>
-          <w:sz w:val="24"/>
-          <w:szCs w:val="24"/>
-        </w:rPr>
-        <w:t xml:space="preserve"> active:</w:t>
-      </w:r>
-      <w:r>
-        <w:rPr>
-          <w:b/>
-          <w:bCs/>
-        </w:rPr>
-        <w:t xml:space="preserve"> :</w:t>
-      </w:r>
-      <w:r>
-        <w:t xml:space="preserve"> Une boucle conditionnelle qui répète l'affichage du menu et l'exécution des choix tant que la variable </w:t>
+          <w:sz w:val="24"/>
+          <w:szCs w:val="24"/>
+        </w:rPr>
+        <w:t>active</w:t>
+      </w:r>
+      <w:r>
+        <w:t xml:space="preserve"> reste égale à </w:t>
       </w:r>
       <w:r>
         <w:rPr>
@@ -2285,22 +1935,8 @@
           <w:sz w:val="24"/>
           <w:szCs w:val="24"/>
         </w:rPr>
-        <w:t>active</w:t>
-      </w:r>
-      <w:r>
-        <w:t xml:space="preserve"> reste égale à </w:t>
-      </w:r>
-      <w:proofErr w:type="spellStart"/>
-      <w:r>
-        <w:rPr>
-          <w:rStyle w:val="CodeHTML"/>
-          <w:rFonts w:ascii="Times New Roman" w:hAnsi="Times New Roman" w:cs="Times New Roman"/>
-          <w:sz w:val="24"/>
-          <w:szCs w:val="24"/>
-        </w:rPr>
         <w:t>True</w:t>
       </w:r>
-      <w:proofErr w:type="spellEnd"/>
       <w:r>
         <w:t xml:space="preserve">. </w:t>
       </w:r>
@@ -2314,7 +1950,6 @@
         </w:numPr>
         <w:spacing w:before="0" w:beforeAutospacing="0" w:line="360" w:lineRule="auto"/>
       </w:pPr>
-      <w:proofErr w:type="gramStart"/>
       <w:r>
         <w:rPr>
           <w:rStyle w:val="CodeHTML"/>
@@ -2324,57 +1959,8 @@
           <w:sz w:val="24"/>
           <w:szCs w:val="24"/>
         </w:rPr>
-        <w:t>if</w:t>
-      </w:r>
-      <w:proofErr w:type="gramEnd"/>
-      <w:r>
-        <w:rPr>
-          <w:rStyle w:val="CodeHTML"/>
-          <w:rFonts w:ascii="Times New Roman" w:hAnsi="Times New Roman" w:cs="Times New Roman"/>
-          <w:b/>
-          <w:bCs/>
-          <w:sz w:val="24"/>
-          <w:szCs w:val="24"/>
-        </w:rPr>
-        <w:t xml:space="preserve"> / </w:t>
-      </w:r>
-      <w:proofErr w:type="spellStart"/>
-      <w:r>
-        <w:rPr>
-          <w:rStyle w:val="CodeHTML"/>
-          <w:rFonts w:ascii="Times New Roman" w:hAnsi="Times New Roman" w:cs="Times New Roman"/>
-          <w:b/>
-          <w:bCs/>
-          <w:sz w:val="24"/>
-          <w:szCs w:val="24"/>
-        </w:rPr>
-        <w:t>elif</w:t>
-      </w:r>
-      <w:proofErr w:type="spellEnd"/>
-      <w:r>
-        <w:rPr>
-          <w:rStyle w:val="CodeHTML"/>
-          <w:rFonts w:ascii="Times New Roman" w:hAnsi="Times New Roman" w:cs="Times New Roman"/>
-          <w:b/>
-          <w:bCs/>
-          <w:sz w:val="24"/>
-          <w:szCs w:val="24"/>
-        </w:rPr>
-        <w:t xml:space="preserve"> / </w:t>
-      </w:r>
-      <w:proofErr w:type="spellStart"/>
-      <w:r>
-        <w:rPr>
-          <w:rStyle w:val="CodeHTML"/>
-          <w:rFonts w:ascii="Times New Roman" w:hAnsi="Times New Roman" w:cs="Times New Roman"/>
-          <w:b/>
-          <w:bCs/>
-          <w:sz w:val="24"/>
-          <w:szCs w:val="24"/>
-        </w:rPr>
-        <w:t>else</w:t>
-      </w:r>
-      <w:proofErr w:type="spellEnd"/>
+        <w:t>if / elif / else</w:t>
+      </w:r>
       <w:r>
         <w:rPr>
           <w:b/>
@@ -2395,7 +1981,6 @@
         </w:numPr>
         <w:spacing w:before="0" w:beforeAutospacing="0" w:line="360" w:lineRule="auto"/>
       </w:pPr>
-      <w:proofErr w:type="gramStart"/>
       <w:r>
         <w:rPr>
           <w:rStyle w:val="CodeHTML"/>
@@ -2405,41 +1990,27 @@
           <w:sz w:val="24"/>
           <w:szCs w:val="24"/>
         </w:rPr>
-        <w:t>active</w:t>
-      </w:r>
-      <w:proofErr w:type="gramEnd"/>
+        <w:t>active = False</w:t>
+      </w:r>
+      <w:r>
+        <w:rPr>
+          <w:b/>
+          <w:bCs/>
+        </w:rPr>
+        <w:t xml:space="preserve"> :</w:t>
+      </w:r>
+      <w:r>
+        <w:t xml:space="preserve"> La modification de la variable d'état qui permet de rompre la condition de la boucle </w:t>
+      </w:r>
       <w:r>
         <w:rPr>
           <w:rStyle w:val="CodeHTML"/>
           <w:rFonts w:ascii="Times New Roman" w:hAnsi="Times New Roman" w:cs="Times New Roman"/>
-          <w:b/>
-          <w:bCs/>
-          <w:sz w:val="24"/>
-          <w:szCs w:val="24"/>
-        </w:rPr>
-        <w:t xml:space="preserve"> = False</w:t>
-      </w:r>
-      <w:r>
-        <w:rPr>
-          <w:b/>
-          <w:bCs/>
-        </w:rPr>
-        <w:t xml:space="preserve"> :</w:t>
-      </w:r>
-      <w:r>
-        <w:t xml:space="preserve"> La modification de la variable d'état qui permet de rompre la condition de la boucle </w:t>
-      </w:r>
-      <w:proofErr w:type="spellStart"/>
-      <w:r>
-        <w:rPr>
-          <w:rStyle w:val="CodeHTML"/>
-          <w:rFonts w:ascii="Times New Roman" w:hAnsi="Times New Roman" w:cs="Times New Roman"/>
           <w:sz w:val="24"/>
           <w:szCs w:val="24"/>
         </w:rPr>
         <w:t>while</w:t>
       </w:r>
-      <w:proofErr w:type="spellEnd"/>
       <w:r>
         <w:t xml:space="preserve"> et de quitter proprement le programme. </w:t>
       </w:r>
@@ -2479,15 +2050,7 @@
         <w:t>) :</w:t>
       </w:r>
       <w:r>
-        <w:t xml:space="preserve"> Opérateur logique utilisé pour vérifier si la chaîne saisie par l'utilisateur correspond aux options proposées (</w:t>
-      </w:r>
-      <w:proofErr w:type="gramStart"/>
-      <w:r>
-        <w:t>ex:</w:t>
-      </w:r>
-      <w:proofErr w:type="gramEnd"/>
-      <w:r>
-        <w:t xml:space="preserve"> </w:t>
+        <w:t xml:space="preserve"> Opérateur logique utilisé pour vérifier si la chaîne saisie par l'utilisateur correspond aux options proposées (ex: </w:t>
       </w:r>
       <w:r>
         <w:rPr>
@@ -2545,25 +2108,7 @@
           <w:szCs w:val="24"/>
         </w:rPr>
         <w:lastRenderedPageBreak/>
-        <w:t xml:space="preserve">Cette section introduit l'utilisation des dictionnaires Python pour regrouper les métadonnées d'un </w:t>
-      </w:r>
-      <w:proofErr w:type="spellStart"/>
-      <w:r>
-        <w:rPr>
-          <w:rFonts w:ascii="Times New Roman" w:eastAsia="Times New Roman" w:hAnsi="Times New Roman" w:cs="Times New Roman"/>
-          <w:sz w:val="24"/>
-          <w:szCs w:val="24"/>
-        </w:rPr>
-        <w:t>dataset</w:t>
-      </w:r>
-      <w:proofErr w:type="spellEnd"/>
-      <w:r>
-        <w:rPr>
-          <w:rFonts w:ascii="Times New Roman" w:eastAsia="Times New Roman" w:hAnsi="Times New Roman" w:cs="Times New Roman"/>
-          <w:sz w:val="24"/>
-          <w:szCs w:val="24"/>
-        </w:rPr>
-        <w:t xml:space="preserve"> sous forme de couples clé-valeur structurés. </w:t>
+        <w:t xml:space="preserve">Cette section introduit l'utilisation des dictionnaires Python pour regrouper les métadonnées d'un dataset sous forme de couples clé-valeur structurés. </w:t>
       </w:r>
     </w:p>
     <w:tbl>
@@ -2653,29 +2198,7 @@
                 <w:sz w:val="24"/>
                 <w:szCs w:val="24"/>
               </w:rPr>
-              <w:t xml:space="preserve"> un dictionnaire pour stocker les métadonnées de chaque </w:t>
-            </w:r>
-            <w:proofErr w:type="spellStart"/>
-            <w:r>
-              <w:rPr>
-                <w:rFonts w:ascii="Times New Roman" w:hAnsi="Times New Roman" w:cs="Times New Roman"/>
-                <w:i/>
-                <w:iCs/>
-                <w:sz w:val="24"/>
-                <w:szCs w:val="24"/>
-              </w:rPr>
-              <w:t>dataset</w:t>
-            </w:r>
-            <w:proofErr w:type="spellEnd"/>
-            <w:r>
-              <w:rPr>
-                <w:rFonts w:ascii="Times New Roman" w:hAnsi="Times New Roman" w:cs="Times New Roman"/>
-                <w:i/>
-                <w:iCs/>
-                <w:sz w:val="24"/>
-                <w:szCs w:val="24"/>
-              </w:rPr>
-              <w:t>.</w:t>
+              <w:t xml:space="preserve"> un dictionnaire pour stocker les métadonnées de chaque dataset.</w:t>
             </w:r>
           </w:p>
         </w:tc>
@@ -2812,7 +2335,6 @@
       <w:r>
         <w:t xml:space="preserve">L'extrait montre la déclaration du dictionnaire </w:t>
       </w:r>
-      <w:proofErr w:type="spellStart"/>
       <w:r>
         <w:rPr>
           <w:rStyle w:val="CodeHTML"/>
@@ -2822,11 +2344,9 @@
         </w:rPr>
         <w:t>dataset</w:t>
       </w:r>
-      <w:proofErr w:type="spellEnd"/>
       <w:r>
         <w:t xml:space="preserve"> associant chaque clé à sa variable, suivie de l'accès aux données via la syntaxe </w:t>
       </w:r>
-      <w:proofErr w:type="spellStart"/>
       <w:r>
         <w:rPr>
           <w:rStyle w:val="CodeHTML"/>
@@ -2834,17 +2354,7 @@
           <w:sz w:val="24"/>
           <w:szCs w:val="24"/>
         </w:rPr>
-        <w:t>dataset</w:t>
-      </w:r>
-      <w:proofErr w:type="spellEnd"/>
-      <w:r>
-        <w:rPr>
-          <w:rStyle w:val="CodeHTML"/>
-          <w:rFonts w:ascii="Times New Roman" w:hAnsi="Times New Roman" w:cs="Times New Roman"/>
-          <w:sz w:val="24"/>
-          <w:szCs w:val="24"/>
-        </w:rPr>
-        <w:t>['clé']</w:t>
+        <w:t>dataset['clé']</w:t>
       </w:r>
       <w:r>
         <w:t xml:space="preserve"> dans les f-strings.</w:t>
@@ -2966,43 +2476,7 @@
           <w:sz w:val="24"/>
           <w:szCs w:val="24"/>
         </w:rPr>
-        <w:t xml:space="preserve">e terminal affiche la saisie d'un nouveau </w:t>
-      </w:r>
-      <w:proofErr w:type="spellStart"/>
-      <w:r>
-        <w:rPr>
-          <w:rFonts w:ascii="Times New Roman" w:eastAsia="Times New Roman" w:hAnsi="Times New Roman" w:cs="Times New Roman"/>
-          <w:sz w:val="24"/>
-          <w:szCs w:val="24"/>
-        </w:rPr>
-        <w:t>dataset</w:t>
-      </w:r>
-      <w:proofErr w:type="spellEnd"/>
-      <w:r>
-        <w:rPr>
-          <w:rFonts w:ascii="Times New Roman" w:eastAsia="Times New Roman" w:hAnsi="Times New Roman" w:cs="Times New Roman"/>
-          <w:sz w:val="24"/>
-          <w:szCs w:val="24"/>
-        </w:rPr>
-        <w:t xml:space="preserve"> (</w:t>
-      </w:r>
-      <w:proofErr w:type="spellStart"/>
-      <w:r>
-        <w:rPr>
-          <w:rFonts w:ascii="Times New Roman" w:eastAsia="Times New Roman" w:hAnsi="Times New Roman" w:cs="Times New Roman"/>
-          <w:sz w:val="24"/>
-          <w:szCs w:val="24"/>
-        </w:rPr>
-        <w:t>NTCom</w:t>
-      </w:r>
-      <w:proofErr w:type="spellEnd"/>
-      <w:r>
-        <w:rPr>
-          <w:rFonts w:ascii="Times New Roman" w:eastAsia="Times New Roman" w:hAnsi="Times New Roman" w:cs="Times New Roman"/>
-          <w:sz w:val="24"/>
-          <w:szCs w:val="24"/>
-        </w:rPr>
-        <w:t xml:space="preserve">), confirmant que la restitution des métadonnées fonctionne à l'identique tout en s'appuyant sur le dictionnaire. </w:t>
+        <w:t xml:space="preserve">e terminal affiche la saisie d'un nouveau dataset (NTCom), confirmant que la restitution des métadonnées fonctionne à l'identique tout en s'appuyant sur le dictionnaire. </w:t>
       </w:r>
     </w:p>
     <w:p>
@@ -3074,21 +2548,12 @@
       <w:r>
         <w:t xml:space="preserve"> Permet de regrouper plusieurs informations associées à une même entité sous forme de paires </w:t>
       </w:r>
-      <w:proofErr w:type="gramStart"/>
-      <w:r>
-        <w:rPr>
-          <w:b/>
-          <w:bCs/>
-        </w:rPr>
-        <w:t>clé:</w:t>
-      </w:r>
-      <w:proofErr w:type="gramEnd"/>
-      <w:r>
-        <w:rPr>
-          <w:b/>
-          <w:bCs/>
-        </w:rPr>
-        <w:t xml:space="preserve"> valeur</w:t>
+      <w:r>
+        <w:rPr>
+          <w:b/>
+          <w:bCs/>
+        </w:rPr>
+        <w:t>clé: valeur</w:t>
       </w:r>
       <w:r>
         <w:t xml:space="preserve"> (ex: </w:t>
@@ -3122,7 +2587,6 @@
         </w:rPr>
         <w:t>Accès par clé (</w:t>
       </w:r>
-      <w:proofErr w:type="spellStart"/>
       <w:r>
         <w:rPr>
           <w:rStyle w:val="CodeHTML"/>
@@ -3132,19 +2596,7 @@
           <w:sz w:val="24"/>
           <w:szCs w:val="24"/>
         </w:rPr>
-        <w:t>dataset</w:t>
-      </w:r>
-      <w:proofErr w:type="spellEnd"/>
-      <w:r>
-        <w:rPr>
-          <w:rStyle w:val="CodeHTML"/>
-          <w:rFonts w:ascii="Times New Roman" w:hAnsi="Times New Roman" w:cs="Times New Roman"/>
-          <w:b/>
-          <w:bCs/>
-          <w:sz w:val="24"/>
-          <w:szCs w:val="24"/>
-        </w:rPr>
-        <w:t>['clé']</w:t>
+        <w:t>dataset['clé']</w:t>
       </w:r>
       <w:r>
         <w:rPr>
@@ -3174,29 +2626,463 @@
         <w:t>Encapsulation de données :</w:t>
       </w:r>
       <w:r>
-        <w:t xml:space="preserve"> Concept consistant à regrouper toutes les variables éparpillées d'un </w:t>
-      </w:r>
-      <w:proofErr w:type="spellStart"/>
-      <w:r>
+        <w:t xml:space="preserve"> Concept consistant à regrouper toutes les variables éparpillées d'un dataset au sein d'un seul objet structuré (</w:t>
+      </w:r>
+      <w:r>
+        <w:rPr>
+          <w:rStyle w:val="CodeHTML"/>
+          <w:rFonts w:ascii="Times New Roman" w:hAnsi="Times New Roman" w:cs="Times New Roman"/>
+          <w:sz w:val="24"/>
+          <w:szCs w:val="24"/>
+        </w:rPr>
         <w:t>dataset</w:t>
       </w:r>
-      <w:proofErr w:type="spellEnd"/>
-      <w:r>
-        <w:t xml:space="preserve"> au sein d'un seul objet structuré (</w:t>
-      </w:r>
-      <w:proofErr w:type="spellStart"/>
-      <w:r>
-        <w:rPr>
-          <w:rStyle w:val="CodeHTML"/>
-          <w:rFonts w:ascii="Times New Roman" w:hAnsi="Times New Roman" w:cs="Times New Roman"/>
-          <w:sz w:val="24"/>
-          <w:szCs w:val="24"/>
-        </w:rPr>
-        <w:t>dataset</w:t>
-      </w:r>
-      <w:proofErr w:type="spellEnd"/>
       <w:r>
         <w:t xml:space="preserve">). </w:t>
+      </w:r>
+    </w:p>
+    <w:p>
+      <w:pPr>
+        <w:pStyle w:val="NormalWeb"/>
+        <w:spacing w:before="0" w:beforeAutospacing="0" w:line="360" w:lineRule="auto"/>
+      </w:pPr>
+    </w:p>
+    <w:p>
+      <w:pPr>
+        <w:pStyle w:val="Titre1"/>
+      </w:pPr>
+      <w:r>
+        <w:t>Partie 4 — Tuples</w:t>
+      </w:r>
+    </w:p>
+    <w:p>
+      <w:pPr>
+        <w:pStyle w:val="lev1"/>
+      </w:pPr>
+    </w:p>
+    <w:tbl>
+      <w:tblPr>
+        <w:tblW w:w="5000" w:type="pct"/>
+        <w:tblBorders>
+          <w:top w:val="single" w:sz="4" w:space="0" w:color="2E5395"/>
+          <w:left w:val="single" w:sz="4" w:space="0" w:color="2E5395"/>
+          <w:bottom w:val="single" w:sz="4" w:space="0" w:color="2E5395"/>
+          <w:right w:val="single" w:sz="4" w:space="0" w:color="2E5395"/>
+          <w:insideH w:val="single" w:sz="4" w:space="0" w:color="auto"/>
+          <w:insideV w:val="single" w:sz="4" w:space="0" w:color="auto"/>
+        </w:tblBorders>
+        <w:tblCellMar>
+          <w:left w:w="10" w:type="dxa"/>
+          <w:right w:w="10" w:type="dxa"/>
+        </w:tblCellMar>
+        <w:tblLook w:val="04A0" w:firstRow="1" w:lastRow="0" w:firstColumn="1" w:lastColumn="0" w:noHBand="0" w:noVBand="1"/>
+      </w:tblPr>
+      <w:tblGrid>
+        <w:gridCol w:w="10070"/>
+      </w:tblGrid>
+      <w:tr>
+        <w:tc>
+          <w:tcPr>
+            <w:tcW w:w="0" w:type="auto"/>
+            <w:tcBorders>
+              <w:top w:val="single" w:sz="4" w:space="0" w:color="2E5395"/>
+              <w:left w:val="single" w:sz="4" w:space="0" w:color="2E5395"/>
+              <w:bottom w:val="single" w:sz="4" w:space="0" w:color="2E5395"/>
+              <w:right w:val="single" w:sz="4" w:space="0" w:color="2E5395"/>
+            </w:tcBorders>
+            <w:shd w:val="clear" w:color="auto" w:fill="FFC000" w:themeFill="accent4"/>
+            <w:tcMar>
+              <w:top w:w="150" w:type="dxa"/>
+              <w:left w:w="200" w:type="dxa"/>
+              <w:bottom w:w="150" w:type="dxa"/>
+              <w:right w:w="200" w:type="dxa"/>
+            </w:tcMar>
+            <w:hideMark/>
+          </w:tcPr>
+          <w:p>
+            <w:r>
+              <w:rPr>
+                <w:b/>
+                <w:bCs/>
+                <w:color w:val="2E5395"/>
+              </w:rPr>
+              <w:lastRenderedPageBreak/>
+              <w:t xml:space="preserve">Question 7 — </w:t>
+            </w:r>
+            <w:r>
+              <w:rPr>
+                <w:i/>
+                <w:iCs/>
+              </w:rPr>
+              <w:t>Cré</w:t>
+            </w:r>
+            <w:r>
+              <w:rPr>
+                <w:i/>
+                <w:iCs/>
+              </w:rPr>
+              <w:t>ation</w:t>
+            </w:r>
+            <w:r>
+              <w:rPr>
+                <w:i/>
+                <w:iCs/>
+              </w:rPr>
+              <w:t xml:space="preserve"> </w:t>
+            </w:r>
+            <w:r>
+              <w:rPr>
+                <w:i/>
+                <w:iCs/>
+              </w:rPr>
+              <w:t>d’</w:t>
+            </w:r>
+            <w:r>
+              <w:rPr>
+                <w:i/>
+                <w:iCs/>
+              </w:rPr>
+              <w:t>un tuple contenant les domaines autorisés : ("Santé","Finance","Agriculture","Transport","Education").</w:t>
+            </w:r>
+          </w:p>
+        </w:tc>
+      </w:tr>
+    </w:tbl>
+    <w:p>
+      <w:pPr>
+        <w:spacing w:before="150" w:after="80"/>
+        <w:rPr>
+          <w:b/>
+          <w:bCs/>
+          <w:color w:val="1F3864"/>
+          <w:sz w:val="21"/>
+          <w:szCs w:val="21"/>
+        </w:rPr>
+      </w:pPr>
+      <w:r>
+        <w:rPr>
+          <w:b/>
+          <w:bCs/>
+          <w:color w:val="1F3864"/>
+          <w:sz w:val="21"/>
+          <w:szCs w:val="21"/>
+        </w:rPr>
+        <w:t>Code (main.py, en tête de fichier) :</w:t>
+      </w:r>
+    </w:p>
+    <w:p>
+      <w:pPr>
+        <w:spacing w:before="150" w:after="80"/>
+        <w:rPr>
+          <w:b/>
+          <w:bCs/>
+          <w:color w:val="1F3864"/>
+          <w:sz w:val="21"/>
+          <w:szCs w:val="21"/>
+        </w:rPr>
+      </w:pPr>
+      <w:r>
+        <w:rPr>
+          <w:b/>
+          <w:bCs/>
+          <w:color w:val="1F3864"/>
+          <w:sz w:val="21"/>
+          <w:szCs w:val="21"/>
+        </w:rPr>
+        <w:drawing>
+          <wp:inline distT="0" distB="0" distL="0" distR="0" wp14:anchorId="4467F630" wp14:editId="54E13EB4">
+            <wp:extent cx="6400800" cy="1046480"/>
+            <wp:effectExtent l="0" t="0" r="0" b="1270"/>
+            <wp:docPr id="1383063334" name="Image 10"/>
+            <wp:cNvGraphicFramePr>
+              <a:graphicFrameLocks xmlns:a="http://schemas.openxmlformats.org/drawingml/2006/main" noChangeAspect="1"/>
+            </wp:cNvGraphicFramePr>
+            <a:graphic xmlns:a="http://schemas.openxmlformats.org/drawingml/2006/main">
+              <a:graphicData uri="http://schemas.openxmlformats.org/drawingml/2006/picture">
+                <pic:pic xmlns:pic="http://schemas.openxmlformats.org/drawingml/2006/picture">
+                  <pic:nvPicPr>
+                    <pic:cNvPr id="1383063334" name=""/>
+                    <pic:cNvPicPr/>
+                  </pic:nvPicPr>
+                  <pic:blipFill>
+                    <a:blip r:embed="rId14"/>
+                    <a:stretch>
+                      <a:fillRect/>
+                    </a:stretch>
+                  </pic:blipFill>
+                  <pic:spPr>
+                    <a:xfrm>
+                      <a:off x="0" y="0"/>
+                      <a:ext cx="6400800" cy="1046480"/>
+                    </a:xfrm>
+                    <a:prstGeom prst="rect">
+                      <a:avLst/>
+                    </a:prstGeom>
+                  </pic:spPr>
+                </pic:pic>
+              </a:graphicData>
+            </a:graphic>
+          </wp:inline>
+        </w:drawing>
+      </w:r>
+    </w:p>
+    <w:p>
+      <w:pPr>
+        <w:pStyle w:val="lev1"/>
+      </w:pPr>
+    </w:p>
+    <w:tbl>
+      <w:tblPr>
+        <w:tblW w:w="5000" w:type="pct"/>
+        <w:tblBorders>
+          <w:top w:val="single" w:sz="4" w:space="0" w:color="2E5395"/>
+          <w:left w:val="single" w:sz="4" w:space="0" w:color="2E5395"/>
+          <w:bottom w:val="single" w:sz="4" w:space="0" w:color="2E5395"/>
+          <w:right w:val="single" w:sz="4" w:space="0" w:color="2E5395"/>
+          <w:insideH w:val="single" w:sz="4" w:space="0" w:color="auto"/>
+          <w:insideV w:val="single" w:sz="4" w:space="0" w:color="auto"/>
+        </w:tblBorders>
+        <w:tblCellMar>
+          <w:left w:w="10" w:type="dxa"/>
+          <w:right w:w="10" w:type="dxa"/>
+        </w:tblCellMar>
+        <w:tblLook w:val="04A0" w:firstRow="1" w:lastRow="0" w:firstColumn="1" w:lastColumn="0" w:noHBand="0" w:noVBand="1"/>
+      </w:tblPr>
+      <w:tblGrid>
+        <w:gridCol w:w="10070"/>
+      </w:tblGrid>
+      <w:tr>
+        <w:tc>
+          <w:tcPr>
+            <w:tcW w:w="0" w:type="auto"/>
+            <w:tcBorders>
+              <w:top w:val="single" w:sz="4" w:space="0" w:color="2E5395"/>
+              <w:left w:val="single" w:sz="4" w:space="0" w:color="2E5395"/>
+              <w:bottom w:val="single" w:sz="4" w:space="0" w:color="2E5395"/>
+              <w:right w:val="single" w:sz="4" w:space="0" w:color="2E5395"/>
+            </w:tcBorders>
+            <w:shd w:val="clear" w:color="auto" w:fill="FFC000" w:themeFill="accent4"/>
+            <w:tcMar>
+              <w:top w:w="150" w:type="dxa"/>
+              <w:left w:w="200" w:type="dxa"/>
+              <w:bottom w:w="150" w:type="dxa"/>
+              <w:right w:w="200" w:type="dxa"/>
+            </w:tcMar>
+            <w:hideMark/>
+          </w:tcPr>
+          <w:p>
+            <w:r>
+              <w:rPr>
+                <w:b/>
+                <w:bCs/>
+                <w:color w:val="2E5395"/>
+              </w:rPr>
+              <w:t xml:space="preserve">Question 8 — </w:t>
+            </w:r>
+            <w:r>
+              <w:rPr>
+                <w:i/>
+                <w:iCs/>
+              </w:rPr>
+              <w:t>Vérifi</w:t>
+            </w:r>
+            <w:r>
+              <w:rPr>
+                <w:i/>
+                <w:iCs/>
+              </w:rPr>
+              <w:t>cation</w:t>
+            </w:r>
+            <w:r>
+              <w:rPr>
+                <w:i/>
+                <w:iCs/>
+              </w:rPr>
+              <w:t xml:space="preserve"> que le domaine saisi, à la question 3, appartient au tuple.</w:t>
+            </w:r>
+          </w:p>
+        </w:tc>
+      </w:tr>
+    </w:tbl>
+    <w:p>
+      <w:pPr>
+        <w:spacing w:after="150"/>
+      </w:pPr>
+    </w:p>
+    <w:p>
+      <w:pPr>
+        <w:spacing w:after="150"/>
+      </w:pPr>
+      <w:r>
+        <w:t>La saisie du domaine (dans l'option 1 du menu) est modifiée pour boucler tant que la valeur saisie n'appartient pas au tuple DOMAINES_AUTORISES.</w:t>
+      </w:r>
+    </w:p>
+    <w:p>
+      <w:pPr>
+        <w:spacing w:before="150" w:after="80"/>
+        <w:rPr>
+          <w:rFonts w:ascii="Consolas" w:eastAsia="Consolas" w:hAnsi="Consolas" w:cs="Consolas"/>
+          <w:color w:val="D4D4D4"/>
+          <w:sz w:val="18"/>
+          <w:szCs w:val="18"/>
+        </w:rPr>
+      </w:pPr>
+      <w:r>
+        <w:rPr>
+          <w:b/>
+          <w:bCs/>
+          <w:color w:val="1F3864"/>
+          <w:sz w:val="21"/>
+          <w:szCs w:val="21"/>
+        </w:rPr>
+        <w:t>Code (main.py, option 1 du menu) :</w:t>
+      </w:r>
+      <w:r>
+        <w:rPr>
+          <w:rFonts w:ascii="Consolas" w:eastAsia="Consolas" w:hAnsi="Consolas" w:cs="Consolas"/>
+          <w:color w:val="D4D4D4"/>
+          <w:sz w:val="18"/>
+          <w:szCs w:val="18"/>
+        </w:rPr>
+        <w:t xml:space="preserve"> </w:t>
+      </w:r>
+    </w:p>
+    <w:p>
+      <w:pPr>
+        <w:spacing w:before="150" w:after="80"/>
+        <w:rPr>
+          <w:rFonts w:ascii="Consolas" w:eastAsia="Consolas" w:hAnsi="Consolas" w:cs="Consolas"/>
+          <w:color w:val="D4D4D4"/>
+          <w:sz w:val="18"/>
+          <w:szCs w:val="18"/>
+        </w:rPr>
+      </w:pPr>
+      <w:r>
+        <w:rPr>
+          <w:rFonts w:ascii="Consolas" w:eastAsia="Consolas" w:hAnsi="Consolas" w:cs="Consolas"/>
+          <w:color w:val="D4D4D4"/>
+          <w:sz w:val="18"/>
+          <w:szCs w:val="18"/>
+        </w:rPr>
+        <w:drawing>
+          <wp:inline distT="0" distB="0" distL="0" distR="0" wp14:anchorId="51656E5E" wp14:editId="373982D1">
+            <wp:extent cx="6400800" cy="1505585"/>
+            <wp:effectExtent l="0" t="0" r="0" b="0"/>
+            <wp:docPr id="148459621" name="Image 11"/>
+            <wp:cNvGraphicFramePr>
+              <a:graphicFrameLocks xmlns:a="http://schemas.openxmlformats.org/drawingml/2006/main" noChangeAspect="1"/>
+            </wp:cNvGraphicFramePr>
+            <a:graphic xmlns:a="http://schemas.openxmlformats.org/drawingml/2006/main">
+              <a:graphicData uri="http://schemas.openxmlformats.org/drawingml/2006/picture">
+                <pic:pic xmlns:pic="http://schemas.openxmlformats.org/drawingml/2006/picture">
+                  <pic:nvPicPr>
+                    <pic:cNvPr id="148459621" name=""/>
+                    <pic:cNvPicPr/>
+                  </pic:nvPicPr>
+                  <pic:blipFill>
+                    <a:blip r:embed="rId15"/>
+                    <a:stretch>
+                      <a:fillRect/>
+                    </a:stretch>
+                  </pic:blipFill>
+                  <pic:spPr>
+                    <a:xfrm>
+                      <a:off x="0" y="0"/>
+                      <a:ext cx="6400800" cy="1505585"/>
+                    </a:xfrm>
+                    <a:prstGeom prst="rect">
+                      <a:avLst/>
+                    </a:prstGeom>
+                  </pic:spPr>
+                </pic:pic>
+              </a:graphicData>
+            </a:graphic>
+          </wp:inline>
+        </w:drawing>
+      </w:r>
+    </w:p>
+    <w:p>
+      <w:pPr>
+        <w:spacing w:before="150" w:after="80"/>
+        <w:rPr>
+          <w:rFonts w:ascii="Consolas" w:eastAsia="Consolas" w:hAnsi="Consolas" w:cs="Consolas"/>
+          <w:color w:val="D4D4D4"/>
+          <w:sz w:val="18"/>
+          <w:szCs w:val="18"/>
+        </w:rPr>
+      </w:pPr>
+    </w:p>
+    <w:p>
+      <w:pPr>
+        <w:spacing w:before="150" w:after="80"/>
+        <w:rPr>
+          <w:b/>
+          <w:bCs/>
+          <w:color w:val="1F3864"/>
+          <w:sz w:val="21"/>
+          <w:szCs w:val="21"/>
+        </w:rPr>
+      </w:pPr>
+      <w:r>
+        <w:rPr>
+          <w:b/>
+          <w:bCs/>
+          <w:color w:val="1F3864"/>
+          <w:sz w:val="21"/>
+          <w:szCs w:val="21"/>
+        </w:rPr>
+        <w:t>Résultat à l'exécution (domaine invalide puis valide) :</w:t>
+      </w:r>
+    </w:p>
+    <w:p>
+      <w:pPr>
+        <w:spacing w:before="150" w:after="80"/>
+        <w:rPr>
+          <w:rFonts w:ascii="Times New Roman" w:hAnsi="Times New Roman" w:cs="Times New Roman"/>
+          <w:sz w:val="24"/>
+          <w:szCs w:val="24"/>
+        </w:rPr>
+      </w:pPr>
+      <w:r>
+        <w:lastRenderedPageBreak/>
+        <w:drawing>
+          <wp:inline distT="0" distB="0" distL="0" distR="0" wp14:anchorId="0451A377" wp14:editId="265592BA">
+            <wp:extent cx="6400800" cy="3526155"/>
+            <wp:effectExtent l="0" t="0" r="0" b="0"/>
+            <wp:docPr id="590614134" name="Image 12"/>
+            <wp:cNvGraphicFramePr>
+              <a:graphicFrameLocks xmlns:a="http://schemas.openxmlformats.org/drawingml/2006/main" noChangeAspect="1"/>
+            </wp:cNvGraphicFramePr>
+            <a:graphic xmlns:a="http://schemas.openxmlformats.org/drawingml/2006/main">
+              <a:graphicData uri="http://schemas.openxmlformats.org/drawingml/2006/picture">
+                <pic:pic xmlns:pic="http://schemas.openxmlformats.org/drawingml/2006/picture">
+                  <pic:nvPicPr>
+                    <pic:cNvPr id="590614134" name=""/>
+                    <pic:cNvPicPr/>
+                  </pic:nvPicPr>
+                  <pic:blipFill>
+                    <a:blip r:embed="rId16"/>
+                    <a:stretch>
+                      <a:fillRect/>
+                    </a:stretch>
+                  </pic:blipFill>
+                  <pic:spPr>
+                    <a:xfrm>
+                      <a:off x="0" y="0"/>
+                      <a:ext cx="6400800" cy="3526155"/>
+                    </a:xfrm>
+                    <a:prstGeom prst="rect">
+                      <a:avLst/>
+                    </a:prstGeom>
+                  </pic:spPr>
+                </pic:pic>
+              </a:graphicData>
+            </a:graphic>
+          </wp:inline>
+        </w:drawing>
+      </w:r>
+      <w:r>
+        <w:t xml:space="preserve"> </w:t>
       </w:r>
     </w:p>
     <w:p>

</xml_diff>

<commit_message>
Partie 5 : Gestion des datasets via les listes (CRUD et tri)
</commit_message>
<xml_diff>
--- a/pratiquePython.docx
+++ b/pratiquePython.docx
@@ -2650,15 +2650,42 @@
     <w:p>
       <w:pPr>
         <w:pStyle w:val="Titre1"/>
-      </w:pPr>
-      <w:r>
+        <w:spacing w:line="360" w:lineRule="auto"/>
+        <w:rPr>
+          <w:rFonts w:ascii="Times New Roman" w:hAnsi="Times New Roman" w:cs="Times New Roman"/>
+          <w:color w:val="auto"/>
+          <w:sz w:val="24"/>
+          <w:szCs w:val="24"/>
+        </w:rPr>
+      </w:pPr>
+      <w:r>
+        <w:rPr>
+          <w:rFonts w:ascii="Times New Roman" w:hAnsi="Times New Roman" w:cs="Times New Roman"/>
+          <w:color w:val="auto"/>
+          <w:sz w:val="24"/>
+          <w:szCs w:val="24"/>
+        </w:rPr>
         <w:t>Partie 4 — Tuples</w:t>
       </w:r>
     </w:p>
     <w:p>
       <w:pPr>
         <w:pStyle w:val="lev1"/>
-      </w:pPr>
+        <w:spacing w:line="360" w:lineRule="auto"/>
+        <w:rPr>
+          <w:rFonts w:ascii="Times New Roman" w:hAnsi="Times New Roman" w:cs="Times New Roman"/>
+          <w:sz w:val="24"/>
+          <w:szCs w:val="24"/>
+        </w:rPr>
+      </w:pPr>
+      <w:r>
+        <w:rPr>
+          <w:rFonts w:ascii="Times New Roman" w:hAnsi="Times New Roman" w:cs="Times New Roman"/>
+          <w:sz w:val="24"/>
+          <w:szCs w:val="24"/>
+        </w:rPr>
+        <w:t>Cette section traite de l'utilisation d'une structure de données immuable (tuple) pour définir une liste restreinte de domaines autorisés et valider la saisie de l'utilisateur.</w:t>
+      </w:r>
     </w:p>
     <w:tbl>
       <w:tblPr>
@@ -2700,47 +2727,72 @@
             <w:hideMark/>
           </w:tcPr>
           <w:p>
+            <w:pPr>
+              <w:spacing w:line="360" w:lineRule="auto"/>
+              <w:rPr>
+                <w:rFonts w:ascii="Times New Roman" w:hAnsi="Times New Roman" w:cs="Times New Roman"/>
+                <w:sz w:val="24"/>
+                <w:szCs w:val="24"/>
+              </w:rPr>
+            </w:pPr>
             <w:r>
               <w:rPr>
+                <w:rFonts w:ascii="Times New Roman" w:hAnsi="Times New Roman" w:cs="Times New Roman"/>
                 <w:b/>
                 <w:bCs/>
-                <w:color w:val="2E5395"/>
+                <w:sz w:val="24"/>
+                <w:szCs w:val="24"/>
               </w:rPr>
               <w:lastRenderedPageBreak/>
               <w:t xml:space="preserve">Question 7 — </w:t>
             </w:r>
             <w:r>
               <w:rPr>
+                <w:rFonts w:ascii="Times New Roman" w:hAnsi="Times New Roman" w:cs="Times New Roman"/>
                 <w:i/>
                 <w:iCs/>
+                <w:sz w:val="24"/>
+                <w:szCs w:val="24"/>
               </w:rPr>
               <w:t>Cré</w:t>
             </w:r>
             <w:r>
               <w:rPr>
+                <w:rFonts w:ascii="Times New Roman" w:hAnsi="Times New Roman" w:cs="Times New Roman"/>
                 <w:i/>
                 <w:iCs/>
+                <w:sz w:val="24"/>
+                <w:szCs w:val="24"/>
               </w:rPr>
               <w:t>ation</w:t>
             </w:r>
             <w:r>
               <w:rPr>
+                <w:rFonts w:ascii="Times New Roman" w:hAnsi="Times New Roman" w:cs="Times New Roman"/>
                 <w:i/>
                 <w:iCs/>
+                <w:sz w:val="24"/>
+                <w:szCs w:val="24"/>
               </w:rPr>
               <w:t xml:space="preserve"> </w:t>
             </w:r>
             <w:r>
               <w:rPr>
+                <w:rFonts w:ascii="Times New Roman" w:hAnsi="Times New Roman" w:cs="Times New Roman"/>
                 <w:i/>
                 <w:iCs/>
+                <w:sz w:val="24"/>
+                <w:szCs w:val="24"/>
               </w:rPr>
               <w:t>d’</w:t>
             </w:r>
             <w:r>
               <w:rPr>
+                <w:rFonts w:ascii="Times New Roman" w:hAnsi="Times New Roman" w:cs="Times New Roman"/>
                 <w:i/>
                 <w:iCs/>
+                <w:sz w:val="24"/>
+                <w:szCs w:val="24"/>
               </w:rPr>
               <w:t>un tuple contenant les domaines autorisés : ("Santé","Finance","Agriculture","Transport","Education").</w:t>
             </w:r>
@@ -2750,44 +2802,64 @@
     </w:tbl>
     <w:p>
       <w:pPr>
-        <w:spacing w:before="150" w:after="80"/>
-        <w:rPr>
-          <w:b/>
-          <w:bCs/>
-          <w:color w:val="1F3864"/>
-          <w:sz w:val="21"/>
-          <w:szCs w:val="21"/>
-        </w:rPr>
-      </w:pPr>
-      <w:r>
-        <w:rPr>
-          <w:b/>
-          <w:bCs/>
-          <w:color w:val="1F3864"/>
-          <w:sz w:val="21"/>
-          <w:szCs w:val="21"/>
+        <w:spacing w:before="150" w:after="80" w:line="360" w:lineRule="auto"/>
+        <w:rPr>
+          <w:rFonts w:ascii="Times New Roman" w:hAnsi="Times New Roman" w:cs="Times New Roman"/>
+          <w:b/>
+          <w:bCs/>
+          <w:sz w:val="24"/>
+          <w:szCs w:val="24"/>
+        </w:rPr>
+      </w:pPr>
+      <w:r>
+        <w:rPr>
+          <w:rFonts w:ascii="Times New Roman" w:hAnsi="Times New Roman" w:cs="Times New Roman"/>
+          <w:sz w:val="24"/>
+          <w:szCs w:val="24"/>
+        </w:rPr>
+        <w:t>Déclaration en en-tête de fichier du tuple de référence contenant les domaines de prédéfinition</w:t>
+      </w:r>
+    </w:p>
+    <w:p>
+      <w:pPr>
+        <w:spacing w:before="150" w:after="80" w:line="360" w:lineRule="auto"/>
+        <w:rPr>
+          <w:rFonts w:ascii="Times New Roman" w:hAnsi="Times New Roman" w:cs="Times New Roman"/>
+          <w:b/>
+          <w:bCs/>
+          <w:sz w:val="24"/>
+          <w:szCs w:val="24"/>
+        </w:rPr>
+      </w:pPr>
+      <w:r>
+        <w:rPr>
+          <w:rFonts w:ascii="Times New Roman" w:hAnsi="Times New Roman" w:cs="Times New Roman"/>
+          <w:b/>
+          <w:bCs/>
+          <w:sz w:val="24"/>
+          <w:szCs w:val="24"/>
         </w:rPr>
         <w:t>Code (main.py, en tête de fichier) :</w:t>
       </w:r>
     </w:p>
     <w:p>
       <w:pPr>
-        <w:spacing w:before="150" w:after="80"/>
-        <w:rPr>
-          <w:b/>
-          <w:bCs/>
-          <w:color w:val="1F3864"/>
-          <w:sz w:val="21"/>
-          <w:szCs w:val="21"/>
-        </w:rPr>
-      </w:pPr>
-      <w:r>
-        <w:rPr>
-          <w:b/>
-          <w:bCs/>
-          <w:color w:val="1F3864"/>
-          <w:sz w:val="21"/>
-          <w:szCs w:val="21"/>
+        <w:spacing w:before="150" w:after="80" w:line="360" w:lineRule="auto"/>
+        <w:rPr>
+          <w:rFonts w:ascii="Times New Roman" w:hAnsi="Times New Roman" w:cs="Times New Roman"/>
+          <w:b/>
+          <w:bCs/>
+          <w:sz w:val="24"/>
+          <w:szCs w:val="24"/>
+        </w:rPr>
+      </w:pPr>
+      <w:r>
+        <w:rPr>
+          <w:rFonts w:ascii="Times New Roman" w:hAnsi="Times New Roman" w:cs="Times New Roman"/>
+          <w:b/>
+          <w:bCs/>
+          <w:sz w:val="24"/>
+          <w:szCs w:val="24"/>
         </w:rPr>
         <w:drawing>
           <wp:inline distT="0" distB="0" distL="0" distR="0" wp14:anchorId="4467F630" wp14:editId="54E13EB4">
@@ -2828,7 +2900,50 @@
     </w:p>
     <w:p>
       <w:pPr>
+        <w:spacing w:before="150" w:after="80" w:line="360" w:lineRule="auto"/>
+        <w:rPr>
+          <w:rFonts w:ascii="Times New Roman" w:hAnsi="Times New Roman" w:cs="Times New Roman"/>
+          <w:b/>
+          <w:bCs/>
+          <w:sz w:val="24"/>
+          <w:szCs w:val="24"/>
+        </w:rPr>
+      </w:pPr>
+      <w:r>
+        <w:rPr>
+          <w:rFonts w:ascii="Times New Roman" w:hAnsi="Times New Roman" w:cs="Times New Roman"/>
+          <w:sz w:val="24"/>
+          <w:szCs w:val="24"/>
+        </w:rPr>
+        <w:t xml:space="preserve">L'extrait montre l'initialisation de la variable </w:t>
+      </w:r>
+      <w:r>
+        <w:rPr>
+          <w:rStyle w:val="CodeHTML"/>
+          <w:rFonts w:ascii="Times New Roman" w:eastAsia="Calibri" w:hAnsi="Times New Roman" w:cs="Times New Roman"/>
+          <w:sz w:val="24"/>
+          <w:szCs w:val="24"/>
+        </w:rPr>
+        <w:t>domaine_auto</w:t>
+      </w:r>
+      <w:r>
+        <w:rPr>
+          <w:rFonts w:ascii="Times New Roman" w:hAnsi="Times New Roman" w:cs="Times New Roman"/>
+          <w:sz w:val="24"/>
+          <w:szCs w:val="24"/>
+        </w:rPr>
+        <w:t xml:space="preserve"> sous forme de tuple contenant les chaînes de caractères des domaines autorisés ("Santé", "Finance", etc.)</w:t>
+      </w:r>
+    </w:p>
+    <w:p>
+      <w:pPr>
         <w:pStyle w:val="lev1"/>
+        <w:spacing w:line="360" w:lineRule="auto"/>
+        <w:rPr>
+          <w:rFonts w:ascii="Times New Roman" w:hAnsi="Times New Roman" w:cs="Times New Roman"/>
+          <w:sz w:val="24"/>
+          <w:szCs w:val="24"/>
+        </w:rPr>
       </w:pPr>
     </w:p>
     <w:tbl>
@@ -2871,32 +2986,51 @@
             <w:hideMark/>
           </w:tcPr>
           <w:p>
+            <w:pPr>
+              <w:spacing w:line="360" w:lineRule="auto"/>
+              <w:rPr>
+                <w:rFonts w:ascii="Times New Roman" w:hAnsi="Times New Roman" w:cs="Times New Roman"/>
+                <w:sz w:val="24"/>
+                <w:szCs w:val="24"/>
+              </w:rPr>
+            </w:pPr>
             <w:r>
               <w:rPr>
+                <w:rFonts w:ascii="Times New Roman" w:hAnsi="Times New Roman" w:cs="Times New Roman"/>
                 <w:b/>
                 <w:bCs/>
-                <w:color w:val="2E5395"/>
+                <w:sz w:val="24"/>
+                <w:szCs w:val="24"/>
               </w:rPr>
               <w:t xml:space="preserve">Question 8 — </w:t>
             </w:r>
             <w:r>
               <w:rPr>
+                <w:rFonts w:ascii="Times New Roman" w:hAnsi="Times New Roman" w:cs="Times New Roman"/>
                 <w:i/>
                 <w:iCs/>
+                <w:sz w:val="24"/>
+                <w:szCs w:val="24"/>
               </w:rPr>
               <w:t>Vérifi</w:t>
             </w:r>
             <w:r>
               <w:rPr>
+                <w:rFonts w:ascii="Times New Roman" w:hAnsi="Times New Roman" w:cs="Times New Roman"/>
                 <w:i/>
                 <w:iCs/>
+                <w:sz w:val="24"/>
+                <w:szCs w:val="24"/>
               </w:rPr>
               <w:t>cation</w:t>
             </w:r>
             <w:r>
               <w:rPr>
+                <w:rFonts w:ascii="Times New Roman" w:hAnsi="Times New Roman" w:cs="Times New Roman"/>
                 <w:i/>
                 <w:iCs/>
+                <w:sz w:val="24"/>
+                <w:szCs w:val="24"/>
               </w:rPr>
               <w:t xml:space="preserve"> que le domaine saisi, à la question 3, appartient au tuple.</w:t>
             </w:r>
@@ -2906,63 +3040,64 @@
     </w:tbl>
     <w:p>
       <w:pPr>
-        <w:spacing w:after="150"/>
-      </w:pPr>
-    </w:p>
-    <w:p>
-      <w:pPr>
-        <w:spacing w:after="150"/>
-      </w:pPr>
-      <w:r>
-        <w:t>La saisie du domaine (dans l'option 1 du menu) est modifiée pour boucler tant que la valeur saisie n'appartient pas au tuple DOMAINES_AUTORISES.</w:t>
-      </w:r>
-    </w:p>
-    <w:p>
-      <w:pPr>
-        <w:spacing w:before="150" w:after="80"/>
-        <w:rPr>
-          <w:rFonts w:ascii="Consolas" w:eastAsia="Consolas" w:hAnsi="Consolas" w:cs="Consolas"/>
-          <w:color w:val="D4D4D4"/>
-          <w:sz w:val="18"/>
-          <w:szCs w:val="18"/>
-        </w:rPr>
-      </w:pPr>
-      <w:r>
-        <w:rPr>
-          <w:b/>
-          <w:bCs/>
-          <w:color w:val="1F3864"/>
-          <w:sz w:val="21"/>
-          <w:szCs w:val="21"/>
+        <w:spacing w:line="360" w:lineRule="auto"/>
+        <w:rPr>
+          <w:rFonts w:ascii="Times New Roman" w:eastAsia="Times New Roman" w:hAnsi="Times New Roman" w:cs="Times New Roman"/>
+          <w:sz w:val="24"/>
+          <w:szCs w:val="24"/>
+        </w:rPr>
+      </w:pPr>
+      <w:r>
+        <w:rPr>
+          <w:rFonts w:ascii="Times New Roman" w:eastAsia="Times New Roman" w:hAnsi="Times New Roman" w:cs="Times New Roman"/>
+          <w:sz w:val="24"/>
+          <w:szCs w:val="24"/>
+        </w:rPr>
+        <w:t xml:space="preserve">Ajout d'une boucle de contrôle lors de la saisie du domaine pour obliger l'utilisateur à entrer une valeur faisant partie du tuple. </w:t>
+      </w:r>
+    </w:p>
+    <w:p>
+      <w:pPr>
+        <w:spacing w:before="150" w:after="80" w:line="360" w:lineRule="auto"/>
+        <w:rPr>
+          <w:rFonts w:ascii="Times New Roman" w:eastAsia="Consolas" w:hAnsi="Times New Roman" w:cs="Times New Roman"/>
+          <w:sz w:val="24"/>
+          <w:szCs w:val="24"/>
+        </w:rPr>
+      </w:pPr>
+      <w:r>
+        <w:rPr>
+          <w:rFonts w:ascii="Times New Roman" w:hAnsi="Times New Roman" w:cs="Times New Roman"/>
+          <w:b/>
+          <w:bCs/>
+          <w:sz w:val="24"/>
+          <w:szCs w:val="24"/>
         </w:rPr>
         <w:t>Code (main.py, option 1 du menu) :</w:t>
       </w:r>
       <w:r>
         <w:rPr>
-          <w:rFonts w:ascii="Consolas" w:eastAsia="Consolas" w:hAnsi="Consolas" w:cs="Consolas"/>
-          <w:color w:val="D4D4D4"/>
-          <w:sz w:val="18"/>
-          <w:szCs w:val="18"/>
+          <w:rFonts w:ascii="Times New Roman" w:eastAsia="Consolas" w:hAnsi="Times New Roman" w:cs="Times New Roman"/>
+          <w:sz w:val="24"/>
+          <w:szCs w:val="24"/>
         </w:rPr>
         <w:t xml:space="preserve"> </w:t>
       </w:r>
     </w:p>
     <w:p>
       <w:pPr>
-        <w:spacing w:before="150" w:after="80"/>
-        <w:rPr>
-          <w:rFonts w:ascii="Consolas" w:eastAsia="Consolas" w:hAnsi="Consolas" w:cs="Consolas"/>
-          <w:color w:val="D4D4D4"/>
-          <w:sz w:val="18"/>
-          <w:szCs w:val="18"/>
-        </w:rPr>
-      </w:pPr>
-      <w:r>
-        <w:rPr>
-          <w:rFonts w:ascii="Consolas" w:eastAsia="Consolas" w:hAnsi="Consolas" w:cs="Consolas"/>
-          <w:color w:val="D4D4D4"/>
-          <w:sz w:val="18"/>
-          <w:szCs w:val="18"/>
+        <w:spacing w:before="150" w:after="80" w:line="360" w:lineRule="auto"/>
+        <w:rPr>
+          <w:rFonts w:ascii="Times New Roman" w:eastAsia="Consolas" w:hAnsi="Times New Roman" w:cs="Times New Roman"/>
+          <w:sz w:val="24"/>
+          <w:szCs w:val="24"/>
+        </w:rPr>
+      </w:pPr>
+      <w:r>
+        <w:rPr>
+          <w:rFonts w:ascii="Times New Roman" w:eastAsia="Consolas" w:hAnsi="Times New Roman" w:cs="Times New Roman"/>
+          <w:sz w:val="24"/>
+          <w:szCs w:val="24"/>
         </w:rPr>
         <w:drawing>
           <wp:inline distT="0" distB="0" distL="0" distR="0" wp14:anchorId="51656E5E" wp14:editId="373982D1">
@@ -3003,47 +3138,94 @@
     </w:p>
     <w:p>
       <w:pPr>
-        <w:spacing w:before="150" w:after="80"/>
-        <w:rPr>
-          <w:rFonts w:ascii="Consolas" w:eastAsia="Consolas" w:hAnsi="Consolas" w:cs="Consolas"/>
-          <w:color w:val="D4D4D4"/>
-          <w:sz w:val="18"/>
-          <w:szCs w:val="18"/>
-        </w:rPr>
-      </w:pPr>
-    </w:p>
-    <w:p>
-      <w:pPr>
-        <w:spacing w:before="150" w:after="80"/>
-        <w:rPr>
-          <w:b/>
-          <w:bCs/>
-          <w:color w:val="1F3864"/>
-          <w:sz w:val="21"/>
-          <w:szCs w:val="21"/>
-        </w:rPr>
-      </w:pPr>
-      <w:r>
-        <w:rPr>
-          <w:b/>
-          <w:bCs/>
-          <w:color w:val="1F3864"/>
-          <w:sz w:val="21"/>
-          <w:szCs w:val="21"/>
+        <w:spacing w:before="150" w:after="80" w:line="360" w:lineRule="auto"/>
+        <w:rPr>
+          <w:rFonts w:ascii="Times New Roman" w:eastAsia="Consolas" w:hAnsi="Times New Roman" w:cs="Times New Roman"/>
+          <w:sz w:val="24"/>
+          <w:szCs w:val="24"/>
+        </w:rPr>
+      </w:pPr>
+      <w:r>
+        <w:rPr>
+          <w:rFonts w:ascii="Times New Roman" w:hAnsi="Times New Roman" w:cs="Times New Roman"/>
+          <w:sz w:val="24"/>
+          <w:szCs w:val="24"/>
+        </w:rPr>
+        <w:t>C</w:t>
+      </w:r>
+      <w:r>
+        <w:rPr>
+          <w:rFonts w:ascii="Times New Roman" w:hAnsi="Times New Roman" w:cs="Times New Roman"/>
+          <w:sz w:val="24"/>
+          <w:szCs w:val="24"/>
+        </w:rPr>
+        <w:t xml:space="preserve">e code illustre une boucle </w:t>
+      </w:r>
+      <w:r>
+        <w:rPr>
+          <w:rStyle w:val="CodeHTML"/>
+          <w:rFonts w:ascii="Times New Roman" w:eastAsia="Calibri" w:hAnsi="Times New Roman" w:cs="Times New Roman"/>
+          <w:sz w:val="24"/>
+          <w:szCs w:val="24"/>
+        </w:rPr>
+        <w:t>while domaine not in domaine_auto:</w:t>
+      </w:r>
+      <w:r>
+        <w:rPr>
+          <w:rFonts w:ascii="Times New Roman" w:hAnsi="Times New Roman" w:cs="Times New Roman"/>
+          <w:sz w:val="24"/>
+          <w:szCs w:val="24"/>
+        </w:rPr>
+        <w:t xml:space="preserve"> reprenant la saisie avec un message d'erreur tant que la valeur entrée reste hors du tuple.</w:t>
+      </w:r>
+    </w:p>
+    <w:p>
+      <w:pPr>
+        <w:spacing w:before="150" w:after="80" w:line="360" w:lineRule="auto"/>
+        <w:rPr>
+          <w:rFonts w:ascii="Times New Roman" w:eastAsia="Consolas" w:hAnsi="Times New Roman" w:cs="Times New Roman"/>
+          <w:sz w:val="24"/>
+          <w:szCs w:val="24"/>
+        </w:rPr>
+      </w:pPr>
+    </w:p>
+    <w:p>
+      <w:pPr>
+        <w:spacing w:before="150" w:after="80" w:line="360" w:lineRule="auto"/>
+        <w:rPr>
+          <w:rFonts w:ascii="Times New Roman" w:hAnsi="Times New Roman" w:cs="Times New Roman"/>
+          <w:b/>
+          <w:bCs/>
+          <w:sz w:val="24"/>
+          <w:szCs w:val="24"/>
+        </w:rPr>
+      </w:pPr>
+      <w:r>
+        <w:rPr>
+          <w:rFonts w:ascii="Times New Roman" w:hAnsi="Times New Roman" w:cs="Times New Roman"/>
+          <w:b/>
+          <w:bCs/>
+          <w:sz w:val="24"/>
+          <w:szCs w:val="24"/>
         </w:rPr>
         <w:t>Résultat à l'exécution (domaine invalide puis valide) :</w:t>
       </w:r>
     </w:p>
     <w:p>
       <w:pPr>
-        <w:spacing w:before="150" w:after="80"/>
-        <w:rPr>
-          <w:rFonts w:ascii="Times New Roman" w:hAnsi="Times New Roman" w:cs="Times New Roman"/>
-          <w:sz w:val="24"/>
-          <w:szCs w:val="24"/>
-        </w:rPr>
-      </w:pPr>
-      <w:r>
+        <w:spacing w:before="150" w:after="80" w:line="360" w:lineRule="auto"/>
+        <w:rPr>
+          <w:rFonts w:ascii="Times New Roman" w:hAnsi="Times New Roman" w:cs="Times New Roman"/>
+          <w:sz w:val="24"/>
+          <w:szCs w:val="24"/>
+        </w:rPr>
+      </w:pPr>
+      <w:r>
+        <w:rPr>
+          <w:rFonts w:ascii="Times New Roman" w:hAnsi="Times New Roman" w:cs="Times New Roman"/>
+          <w:sz w:val="24"/>
+          <w:szCs w:val="24"/>
+        </w:rPr>
         <w:lastRenderedPageBreak/>
         <w:drawing>
           <wp:inline distT="0" distB="0" distL="0" distR="0" wp14:anchorId="0451A377" wp14:editId="265592BA">
@@ -3082,7 +3264,927 @@
         </w:drawing>
       </w:r>
       <w:r>
+        <w:rPr>
+          <w:rFonts w:ascii="Times New Roman" w:hAnsi="Times New Roman" w:cs="Times New Roman"/>
+          <w:sz w:val="24"/>
+          <w:szCs w:val="24"/>
+        </w:rPr>
         <w:t xml:space="preserve"> </w:t>
+      </w:r>
+    </w:p>
+    <w:p>
+      <w:pPr>
+        <w:spacing w:line="360" w:lineRule="auto"/>
+        <w:rPr>
+          <w:rFonts w:ascii="Times New Roman" w:eastAsia="Times New Roman" w:hAnsi="Times New Roman" w:cs="Times New Roman"/>
+          <w:sz w:val="24"/>
+          <w:szCs w:val="24"/>
+        </w:rPr>
+      </w:pPr>
+    </w:p>
+    <w:p>
+      <w:pPr>
+        <w:spacing w:line="360" w:lineRule="auto"/>
+        <w:rPr>
+          <w:rFonts w:ascii="Times New Roman" w:eastAsia="Times New Roman" w:hAnsi="Times New Roman" w:cs="Times New Roman"/>
+          <w:sz w:val="24"/>
+          <w:szCs w:val="24"/>
+        </w:rPr>
+      </w:pPr>
+      <w:r>
+        <w:rPr>
+          <w:rFonts w:ascii="Times New Roman" w:eastAsia="Times New Roman" w:hAnsi="Times New Roman" w:cs="Times New Roman"/>
+          <w:sz w:val="24"/>
+          <w:szCs w:val="24"/>
+        </w:rPr>
+        <w:t xml:space="preserve">Le terminal affiche le rejet d'une saisie non autorisée (Sport), suivi de la validation de la saisie conforme (Finance) et de l'enregistrement du dataset (Fifaworld). </w:t>
+      </w:r>
+    </w:p>
+    <w:p>
+      <w:pPr>
+        <w:spacing w:line="360" w:lineRule="auto"/>
+        <w:rPr>
+          <w:rFonts w:ascii="Times New Roman" w:eastAsia="Times New Roman" w:hAnsi="Times New Roman" w:cs="Times New Roman"/>
+          <w:sz w:val="24"/>
+          <w:szCs w:val="24"/>
+        </w:rPr>
+      </w:pPr>
+    </w:p>
+    <w:p>
+      <w:pPr>
+        <w:pStyle w:val="lev1"/>
+        <w:spacing w:line="360" w:lineRule="auto"/>
+        <w:rPr>
+          <w:rFonts w:ascii="Times New Roman" w:hAnsi="Times New Roman" w:cs="Times New Roman"/>
+          <w:sz w:val="24"/>
+          <w:szCs w:val="24"/>
+        </w:rPr>
+      </w:pPr>
+      <w:r>
+        <w:rPr>
+          <w:rFonts w:ascii="Times New Roman" w:hAnsi="Times New Roman" w:cs="Times New Roman"/>
+          <w:sz w:val="24"/>
+          <w:szCs w:val="24"/>
+        </w:rPr>
+        <w:t>Résumé des fonctions et concepts utilisés (Partie 4)</w:t>
+      </w:r>
+    </w:p>
+    <w:p>
+      <w:pPr>
+        <w:pStyle w:val="NormalWeb"/>
+        <w:numPr>
+          <w:ilvl w:val="0"/>
+          <w:numId w:val="8"/>
+        </w:numPr>
+        <w:spacing w:before="0" w:beforeAutospacing="0" w:line="360" w:lineRule="auto"/>
+      </w:pPr>
+      <w:r>
+        <w:rPr>
+          <w:b/>
+          <w:bCs/>
+        </w:rPr>
+        <w:t>Tuple (</w:t>
+      </w:r>
+      <w:r>
+        <w:rPr>
+          <w:rStyle w:val="CodeHTML"/>
+          <w:rFonts w:ascii="Times New Roman" w:hAnsi="Times New Roman" w:cs="Times New Roman"/>
+          <w:b/>
+          <w:bCs/>
+          <w:sz w:val="24"/>
+          <w:szCs w:val="24"/>
+        </w:rPr>
+        <w:t>(...)</w:t>
+      </w:r>
+      <w:r>
+        <w:rPr>
+          <w:b/>
+          <w:bCs/>
+        </w:rPr>
+        <w:t>) :</w:t>
+      </w:r>
+      <w:r>
+        <w:t xml:space="preserve"> Structure de données ordonnée et immuable (non modifiable après création), idéale pour définir des constantes ou des listes de référence fixes. </w:t>
+      </w:r>
+    </w:p>
+    <w:p>
+      <w:pPr>
+        <w:pStyle w:val="NormalWeb"/>
+        <w:numPr>
+          <w:ilvl w:val="0"/>
+          <w:numId w:val="8"/>
+        </w:numPr>
+        <w:spacing w:before="0" w:beforeAutospacing="0" w:line="360" w:lineRule="auto"/>
+      </w:pPr>
+      <w:r>
+        <w:rPr>
+          <w:b/>
+          <w:bCs/>
+        </w:rPr>
+        <w:t>Opérateur d'appartenance (</w:t>
+      </w:r>
+      <w:r>
+        <w:rPr>
+          <w:rStyle w:val="CodeHTML"/>
+          <w:rFonts w:ascii="Times New Roman" w:hAnsi="Times New Roman" w:cs="Times New Roman"/>
+          <w:b/>
+          <w:bCs/>
+          <w:sz w:val="24"/>
+          <w:szCs w:val="24"/>
+        </w:rPr>
+        <w:t>in</w:t>
+      </w:r>
+      <w:r>
+        <w:rPr>
+          <w:b/>
+          <w:bCs/>
+        </w:rPr>
+        <w:t xml:space="preserve"> / </w:t>
+      </w:r>
+      <w:r>
+        <w:rPr>
+          <w:rStyle w:val="CodeHTML"/>
+          <w:rFonts w:ascii="Times New Roman" w:hAnsi="Times New Roman" w:cs="Times New Roman"/>
+          <w:b/>
+          <w:bCs/>
+          <w:sz w:val="24"/>
+          <w:szCs w:val="24"/>
+        </w:rPr>
+        <w:t>not in</w:t>
+      </w:r>
+      <w:r>
+        <w:rPr>
+          <w:b/>
+          <w:bCs/>
+        </w:rPr>
+        <w:t>) :</w:t>
+      </w:r>
+      <w:r>
+        <w:t xml:space="preserve"> Permet de vérifier rapidement si une valeur existe (ou n'existe pas) au sein d'une collection comme un tuple. </w:t>
+      </w:r>
+    </w:p>
+    <w:p>
+      <w:pPr>
+        <w:pStyle w:val="NormalWeb"/>
+        <w:numPr>
+          <w:ilvl w:val="0"/>
+          <w:numId w:val="8"/>
+        </w:numPr>
+        <w:spacing w:before="0" w:beforeAutospacing="0" w:line="360" w:lineRule="auto"/>
+      </w:pPr>
+      <w:r>
+        <w:rPr>
+          <w:b/>
+          <w:bCs/>
+        </w:rPr>
+        <w:t>Boucle de validation (</w:t>
+      </w:r>
+      <w:r>
+        <w:rPr>
+          <w:rStyle w:val="CodeHTML"/>
+          <w:rFonts w:ascii="Times New Roman" w:hAnsi="Times New Roman" w:cs="Times New Roman"/>
+          <w:b/>
+          <w:bCs/>
+          <w:sz w:val="24"/>
+          <w:szCs w:val="24"/>
+        </w:rPr>
+        <w:t>while ... not in ...</w:t>
+      </w:r>
+      <w:r>
+        <w:rPr>
+          <w:b/>
+          <w:bCs/>
+        </w:rPr>
+        <w:t>) :</w:t>
+      </w:r>
+      <w:r>
+        <w:t xml:space="preserve"> Stratégie de contrôle de flux maintenant l'invite de saisie active jusqu'à l'obtention d'une valeur valide. </w:t>
+      </w:r>
+    </w:p>
+    <w:p>
+      <w:pPr>
+        <w:pStyle w:val="NormalWeb"/>
+        <w:spacing w:before="0" w:beforeAutospacing="0" w:line="360" w:lineRule="auto"/>
+      </w:pPr>
+    </w:p>
+    <w:p>
+      <w:pPr>
+        <w:pStyle w:val="Titre1"/>
+      </w:pPr>
+      <w:r>
+        <w:t>Partie 5 — Listes</w:t>
+      </w:r>
+    </w:p>
+    <w:tbl>
+      <w:tblPr>
+        <w:tblW w:w="5000" w:type="pct"/>
+        <w:tblBorders>
+          <w:top w:val="single" w:sz="4" w:space="0" w:color="2E5395"/>
+          <w:left w:val="single" w:sz="4" w:space="0" w:color="2E5395"/>
+          <w:bottom w:val="single" w:sz="4" w:space="0" w:color="2E5395"/>
+          <w:right w:val="single" w:sz="4" w:space="0" w:color="2E5395"/>
+          <w:insideH w:val="single" w:sz="4" w:space="0" w:color="auto"/>
+          <w:insideV w:val="single" w:sz="4" w:space="0" w:color="auto"/>
+        </w:tblBorders>
+        <w:shd w:val="clear" w:color="auto" w:fill="FFC000" w:themeFill="accent4"/>
+        <w:tblCellMar>
+          <w:left w:w="10" w:type="dxa"/>
+          <w:right w:w="10" w:type="dxa"/>
+        </w:tblCellMar>
+        <w:tblLook w:val="04A0" w:firstRow="1" w:lastRow="0" w:firstColumn="1" w:lastColumn="0" w:noHBand="0" w:noVBand="1"/>
+      </w:tblPr>
+      <w:tblGrid>
+        <w:gridCol w:w="10070"/>
+      </w:tblGrid>
+      <w:tr>
+        <w:tc>
+          <w:tcPr>
+            <w:tcW w:w="0" w:type="auto"/>
+            <w:tcBorders>
+              <w:top w:val="single" w:sz="4" w:space="0" w:color="2E5395"/>
+              <w:left w:val="single" w:sz="4" w:space="0" w:color="2E5395"/>
+              <w:bottom w:val="single" w:sz="4" w:space="0" w:color="2E5395"/>
+              <w:right w:val="single" w:sz="4" w:space="0" w:color="2E5395"/>
+            </w:tcBorders>
+            <w:shd w:val="clear" w:color="auto" w:fill="FFC000" w:themeFill="accent4"/>
+            <w:tcMar>
+              <w:top w:w="150" w:type="dxa"/>
+              <w:left w:w="200" w:type="dxa"/>
+              <w:bottom w:w="150" w:type="dxa"/>
+              <w:right w:w="200" w:type="dxa"/>
+            </w:tcMar>
+            <w:hideMark/>
+          </w:tcPr>
+          <w:p>
+            <w:r>
+              <w:rPr>
+                <w:b/>
+                <w:bCs/>
+                <w:color w:val="2E5395"/>
+              </w:rPr>
+              <w:t xml:space="preserve">Question 9 — </w:t>
+            </w:r>
+            <w:r>
+              <w:rPr>
+                <w:i/>
+                <w:iCs/>
+              </w:rPr>
+              <w:t>Crée</w:t>
+            </w:r>
+            <w:r>
+              <w:rPr>
+                <w:i/>
+                <w:iCs/>
+              </w:rPr>
+              <w:t>ation</w:t>
+            </w:r>
+            <w:r>
+              <w:rPr>
+                <w:i/>
+                <w:iCs/>
+              </w:rPr>
+              <w:t xml:space="preserve"> </w:t>
+            </w:r>
+            <w:r>
+              <w:rPr>
+                <w:i/>
+                <w:iCs/>
+              </w:rPr>
+              <w:t>d’</w:t>
+            </w:r>
+            <w:r>
+              <w:rPr>
+                <w:i/>
+                <w:iCs/>
+              </w:rPr>
+              <w:t>une liste contenant les datasets. Chaque ajout est enregistré dans la liste.</w:t>
+            </w:r>
+          </w:p>
+        </w:tc>
+      </w:tr>
+    </w:tbl>
+    <w:p>
+      <w:pPr>
+        <w:spacing w:after="150"/>
+      </w:pPr>
+    </w:p>
+    <w:p>
+      <w:pPr>
+        <w:spacing w:after="150"/>
+      </w:pPr>
+      <w:r>
+        <w:lastRenderedPageBreak/>
+        <w:drawing>
+          <wp:inline distT="0" distB="0" distL="0" distR="0" wp14:anchorId="433CAFB2" wp14:editId="4A88EADD">
+            <wp:extent cx="6400800" cy="1078865"/>
+            <wp:effectExtent l="0" t="0" r="0" b="6985"/>
+            <wp:docPr id="2039122150" name="Image 13"/>
+            <wp:cNvGraphicFramePr>
+              <a:graphicFrameLocks xmlns:a="http://schemas.openxmlformats.org/drawingml/2006/main" noChangeAspect="1"/>
+            </wp:cNvGraphicFramePr>
+            <a:graphic xmlns:a="http://schemas.openxmlformats.org/drawingml/2006/main">
+              <a:graphicData uri="http://schemas.openxmlformats.org/drawingml/2006/picture">
+                <pic:pic xmlns:pic="http://schemas.openxmlformats.org/drawingml/2006/picture">
+                  <pic:nvPicPr>
+                    <pic:cNvPr id="2039122150" name=""/>
+                    <pic:cNvPicPr/>
+                  </pic:nvPicPr>
+                  <pic:blipFill>
+                    <a:blip r:embed="rId17"/>
+                    <a:stretch>
+                      <a:fillRect/>
+                    </a:stretch>
+                  </pic:blipFill>
+                  <pic:spPr>
+                    <a:xfrm>
+                      <a:off x="0" y="0"/>
+                      <a:ext cx="6400800" cy="1078865"/>
+                    </a:xfrm>
+                    <a:prstGeom prst="rect">
+                      <a:avLst/>
+                    </a:prstGeom>
+                  </pic:spPr>
+                </pic:pic>
+              </a:graphicData>
+            </a:graphic>
+          </wp:inline>
+        </w:drawing>
+      </w:r>
+    </w:p>
+    <w:p>
+      <w:pPr>
+        <w:spacing w:after="150"/>
+      </w:pPr>
+    </w:p>
+    <w:tbl>
+      <w:tblPr>
+        <w:tblW w:w="5000" w:type="pct"/>
+        <w:tblBorders>
+          <w:top w:val="single" w:sz="4" w:space="0" w:color="2E5395"/>
+          <w:left w:val="single" w:sz="4" w:space="0" w:color="2E5395"/>
+          <w:bottom w:val="single" w:sz="4" w:space="0" w:color="2E5395"/>
+          <w:right w:val="single" w:sz="4" w:space="0" w:color="2E5395"/>
+          <w:insideH w:val="single" w:sz="4" w:space="0" w:color="auto"/>
+          <w:insideV w:val="single" w:sz="4" w:space="0" w:color="auto"/>
+        </w:tblBorders>
+        <w:shd w:val="clear" w:color="auto" w:fill="FFC000" w:themeFill="accent4"/>
+        <w:tblCellMar>
+          <w:left w:w="10" w:type="dxa"/>
+          <w:right w:w="10" w:type="dxa"/>
+        </w:tblCellMar>
+        <w:tblLook w:val="04A0" w:firstRow="1" w:lastRow="0" w:firstColumn="1" w:lastColumn="0" w:noHBand="0" w:noVBand="1"/>
+      </w:tblPr>
+      <w:tblGrid>
+        <w:gridCol w:w="10070"/>
+      </w:tblGrid>
+      <w:tr>
+        <w:tc>
+          <w:tcPr>
+            <w:tcW w:w="0" w:type="auto"/>
+            <w:tcBorders>
+              <w:top w:val="single" w:sz="4" w:space="0" w:color="2E5395"/>
+              <w:left w:val="single" w:sz="4" w:space="0" w:color="2E5395"/>
+              <w:bottom w:val="single" w:sz="4" w:space="0" w:color="2E5395"/>
+              <w:right w:val="single" w:sz="4" w:space="0" w:color="2E5395"/>
+            </w:tcBorders>
+            <w:shd w:val="clear" w:color="auto" w:fill="FFC000" w:themeFill="accent4"/>
+            <w:tcMar>
+              <w:top w:w="150" w:type="dxa"/>
+              <w:left w:w="200" w:type="dxa"/>
+              <w:bottom w:w="150" w:type="dxa"/>
+              <w:right w:w="200" w:type="dxa"/>
+            </w:tcMar>
+            <w:hideMark/>
+          </w:tcPr>
+          <w:p>
+            <w:r>
+              <w:rPr>
+                <w:b/>
+                <w:bCs/>
+                <w:color w:val="2E5395"/>
+              </w:rPr>
+              <w:t xml:space="preserve">Question 10 — </w:t>
+            </w:r>
+            <w:r>
+              <w:rPr>
+                <w:i/>
+                <w:iCs/>
+              </w:rPr>
+              <w:t xml:space="preserve">Ajoute </w:t>
+            </w:r>
+            <w:r>
+              <w:rPr>
+                <w:i/>
+                <w:iCs/>
+              </w:rPr>
+              <w:t>d</w:t>
+            </w:r>
+            <w:r>
+              <w:rPr>
+                <w:i/>
+                <w:iCs/>
+              </w:rPr>
+              <w:t>es fonctionnalités : ajouter, trier, rechercher, modifier, supprimer.</w:t>
+            </w:r>
+          </w:p>
+        </w:tc>
+      </w:tr>
+    </w:tbl>
+    <w:p>
+      <w:pPr>
+        <w:spacing w:after="150"/>
+      </w:pPr>
+    </w:p>
+    <w:p>
+      <w:pPr>
+        <w:spacing w:after="150"/>
+      </w:pPr>
+      <w:r>
+        <w:t>Le menu est complété avec 4 nouvelles options (Modifier, Supprimer, Trier), toujours sous forme de blocs if/elif directement dans la boucle principale — les fonctions ne sont pas encore utilisées à ce stade (voir Partie 9).</w:t>
+      </w:r>
+    </w:p>
+    <w:p>
+      <w:pPr>
+        <w:spacing w:before="150" w:after="80"/>
+        <w:rPr>
+          <w:rFonts w:ascii="Consolas" w:eastAsia="Consolas" w:hAnsi="Consolas" w:cs="Consolas"/>
+          <w:color w:val="D4D4D4"/>
+          <w:sz w:val="18"/>
+          <w:szCs w:val="18"/>
+        </w:rPr>
+      </w:pPr>
+      <w:r>
+        <w:rPr>
+          <w:b/>
+          <w:bCs/>
+          <w:color w:val="1F3864"/>
+          <w:sz w:val="21"/>
+          <w:szCs w:val="21"/>
+        </w:rPr>
+        <w:t>a) Rechercher :</w:t>
+      </w:r>
+      <w:r>
+        <w:rPr>
+          <w:rFonts w:ascii="Consolas" w:eastAsia="Consolas" w:hAnsi="Consolas" w:cs="Consolas"/>
+          <w:color w:val="D4D4D4"/>
+          <w:sz w:val="18"/>
+          <w:szCs w:val="18"/>
+        </w:rPr>
+        <w:t xml:space="preserve"> </w:t>
+      </w:r>
+    </w:p>
+    <w:p>
+      <w:pPr>
+        <w:spacing w:before="150" w:after="80"/>
+        <w:rPr>
+          <w:b/>
+          <w:bCs/>
+          <w:color w:val="1F3864"/>
+          <w:sz w:val="21"/>
+          <w:szCs w:val="21"/>
+        </w:rPr>
+      </w:pPr>
+      <w:r>
+        <w:rPr>
+          <w:b/>
+          <w:bCs/>
+          <w:color w:val="1F3864"/>
+          <w:sz w:val="21"/>
+          <w:szCs w:val="21"/>
+        </w:rPr>
+        <w:drawing>
+          <wp:inline distT="0" distB="0" distL="0" distR="0" wp14:anchorId="452497EC" wp14:editId="020FDC38">
+            <wp:extent cx="6400800" cy="2263775"/>
+            <wp:effectExtent l="0" t="0" r="0" b="3175"/>
+            <wp:docPr id="272020039" name="Image 14"/>
+            <wp:cNvGraphicFramePr>
+              <a:graphicFrameLocks xmlns:a="http://schemas.openxmlformats.org/drawingml/2006/main" noChangeAspect="1"/>
+            </wp:cNvGraphicFramePr>
+            <a:graphic xmlns:a="http://schemas.openxmlformats.org/drawingml/2006/main">
+              <a:graphicData uri="http://schemas.openxmlformats.org/drawingml/2006/picture">
+                <pic:pic xmlns:pic="http://schemas.openxmlformats.org/drawingml/2006/picture">
+                  <pic:nvPicPr>
+                    <pic:cNvPr id="272020039" name=""/>
+                    <pic:cNvPicPr/>
+                  </pic:nvPicPr>
+                  <pic:blipFill>
+                    <a:blip r:embed="rId18"/>
+                    <a:stretch>
+                      <a:fillRect/>
+                    </a:stretch>
+                  </pic:blipFill>
+                  <pic:spPr>
+                    <a:xfrm>
+                      <a:off x="0" y="0"/>
+                      <a:ext cx="6400800" cy="2263775"/>
+                    </a:xfrm>
+                    <a:prstGeom prst="rect">
+                      <a:avLst/>
+                    </a:prstGeom>
+                  </pic:spPr>
+                </pic:pic>
+              </a:graphicData>
+            </a:graphic>
+          </wp:inline>
+        </w:drawing>
+      </w:r>
+    </w:p>
+    <w:p>
+      <w:pPr>
+        <w:spacing w:before="150" w:after="80"/>
+        <w:rPr>
+          <w:b/>
+          <w:bCs/>
+          <w:color w:val="1F3864"/>
+          <w:sz w:val="21"/>
+          <w:szCs w:val="21"/>
+        </w:rPr>
+      </w:pPr>
+      <w:r>
+        <w:rPr>
+          <w:b/>
+          <w:bCs/>
+          <w:color w:val="1F3864"/>
+          <w:sz w:val="21"/>
+          <w:szCs w:val="21"/>
+        </w:rPr>
+        <w:t>b) Modifier :</w:t>
+      </w:r>
+    </w:p>
+    <w:p>
+      <w:pPr>
+        <w:spacing w:before="150" w:after="80"/>
+        <w:rPr>
+          <w:b/>
+          <w:bCs/>
+          <w:color w:val="1F3864"/>
+          <w:sz w:val="21"/>
+          <w:szCs w:val="21"/>
+        </w:rPr>
+      </w:pPr>
+      <w:r>
+        <w:rPr>
+          <w:b/>
+          <w:bCs/>
+          <w:color w:val="1F3864"/>
+          <w:sz w:val="21"/>
+          <w:szCs w:val="21"/>
+        </w:rPr>
+        <w:drawing>
+          <wp:inline distT="0" distB="0" distL="0" distR="0" wp14:anchorId="1C337E3E" wp14:editId="26606B70">
+            <wp:extent cx="6400800" cy="2947035"/>
+            <wp:effectExtent l="0" t="0" r="0" b="5715"/>
+            <wp:docPr id="1817982777" name="Image 15"/>
+            <wp:cNvGraphicFramePr>
+              <a:graphicFrameLocks xmlns:a="http://schemas.openxmlformats.org/drawingml/2006/main" noChangeAspect="1"/>
+            </wp:cNvGraphicFramePr>
+            <a:graphic xmlns:a="http://schemas.openxmlformats.org/drawingml/2006/main">
+              <a:graphicData uri="http://schemas.openxmlformats.org/drawingml/2006/picture">
+                <pic:pic xmlns:pic="http://schemas.openxmlformats.org/drawingml/2006/picture">
+                  <pic:nvPicPr>
+                    <pic:cNvPr id="1817982777" name=""/>
+                    <pic:cNvPicPr/>
+                  </pic:nvPicPr>
+                  <pic:blipFill>
+                    <a:blip r:embed="rId19"/>
+                    <a:stretch>
+                      <a:fillRect/>
+                    </a:stretch>
+                  </pic:blipFill>
+                  <pic:spPr>
+                    <a:xfrm>
+                      <a:off x="0" y="0"/>
+                      <a:ext cx="6400800" cy="2947035"/>
+                    </a:xfrm>
+                    <a:prstGeom prst="rect">
+                      <a:avLst/>
+                    </a:prstGeom>
+                  </pic:spPr>
+                </pic:pic>
+              </a:graphicData>
+            </a:graphic>
+          </wp:inline>
+        </w:drawing>
+      </w:r>
+    </w:p>
+    <w:p>
+      <w:pPr>
+        <w:spacing w:before="150" w:after="80"/>
+        <w:rPr>
+          <w:b/>
+          <w:bCs/>
+          <w:color w:val="1F3864"/>
+          <w:sz w:val="21"/>
+          <w:szCs w:val="21"/>
+        </w:rPr>
+      </w:pPr>
+    </w:p>
+    <w:p>
+      <w:pPr>
+        <w:spacing w:before="150" w:after="80"/>
+        <w:rPr>
+          <w:b/>
+          <w:bCs/>
+          <w:color w:val="1F3864"/>
+          <w:sz w:val="21"/>
+          <w:szCs w:val="21"/>
+        </w:rPr>
+      </w:pPr>
+      <w:r>
+        <w:rPr>
+          <w:b/>
+          <w:bCs/>
+          <w:color w:val="1F3864"/>
+          <w:sz w:val="21"/>
+          <w:szCs w:val="21"/>
+        </w:rPr>
+        <w:lastRenderedPageBreak/>
+        <w:t>c) Supprimer :</w:t>
+      </w:r>
+    </w:p>
+    <w:p>
+      <w:pPr>
+        <w:spacing w:before="150" w:after="80"/>
+        <w:rPr>
+          <w:b/>
+          <w:bCs/>
+          <w:color w:val="1F3864"/>
+          <w:sz w:val="21"/>
+          <w:szCs w:val="21"/>
+        </w:rPr>
+      </w:pPr>
+      <w:r>
+        <w:rPr>
+          <w:b/>
+          <w:bCs/>
+          <w:color w:val="1F3864"/>
+          <w:sz w:val="21"/>
+          <w:szCs w:val="21"/>
+        </w:rPr>
+        <w:drawing>
+          <wp:inline distT="0" distB="0" distL="0" distR="0" wp14:anchorId="3BAA85B6" wp14:editId="33322C97">
+            <wp:extent cx="6400800" cy="2363470"/>
+            <wp:effectExtent l="0" t="0" r="0" b="0"/>
+            <wp:docPr id="186187168" name="Image 16"/>
+            <wp:cNvGraphicFramePr>
+              <a:graphicFrameLocks xmlns:a="http://schemas.openxmlformats.org/drawingml/2006/main" noChangeAspect="1"/>
+            </wp:cNvGraphicFramePr>
+            <a:graphic xmlns:a="http://schemas.openxmlformats.org/drawingml/2006/main">
+              <a:graphicData uri="http://schemas.openxmlformats.org/drawingml/2006/picture">
+                <pic:pic xmlns:pic="http://schemas.openxmlformats.org/drawingml/2006/picture">
+                  <pic:nvPicPr>
+                    <pic:cNvPr id="186187168" name=""/>
+                    <pic:cNvPicPr/>
+                  </pic:nvPicPr>
+                  <pic:blipFill>
+                    <a:blip r:embed="rId20"/>
+                    <a:stretch>
+                      <a:fillRect/>
+                    </a:stretch>
+                  </pic:blipFill>
+                  <pic:spPr>
+                    <a:xfrm>
+                      <a:off x="0" y="0"/>
+                      <a:ext cx="6400800" cy="2363470"/>
+                    </a:xfrm>
+                    <a:prstGeom prst="rect">
+                      <a:avLst/>
+                    </a:prstGeom>
+                  </pic:spPr>
+                </pic:pic>
+              </a:graphicData>
+            </a:graphic>
+          </wp:inline>
+        </w:drawing>
+      </w:r>
+    </w:p>
+    <w:p>
+      <w:pPr>
+        <w:spacing w:before="150" w:after="80"/>
+        <w:rPr>
+          <w:b/>
+          <w:bCs/>
+          <w:color w:val="1F3864"/>
+          <w:sz w:val="21"/>
+          <w:szCs w:val="21"/>
+        </w:rPr>
+      </w:pPr>
+    </w:p>
+    <w:p>
+      <w:pPr>
+        <w:spacing w:before="150" w:after="80"/>
+        <w:rPr>
+          <w:rFonts w:ascii="Consolas" w:eastAsia="Consolas" w:hAnsi="Consolas" w:cs="Consolas"/>
+          <w:color w:val="D4D4D4"/>
+          <w:sz w:val="18"/>
+          <w:szCs w:val="18"/>
+        </w:rPr>
+      </w:pPr>
+      <w:r>
+        <w:rPr>
+          <w:b/>
+          <w:bCs/>
+          <w:color w:val="1F3864"/>
+          <w:sz w:val="21"/>
+          <w:szCs w:val="21"/>
+        </w:rPr>
+        <w:t>d) Trier :</w:t>
+      </w:r>
+      <w:r>
+        <w:rPr>
+          <w:rFonts w:ascii="Consolas" w:eastAsia="Consolas" w:hAnsi="Consolas" w:cs="Consolas"/>
+          <w:color w:val="D4D4D4"/>
+          <w:sz w:val="18"/>
+          <w:szCs w:val="18"/>
+        </w:rPr>
+        <w:t xml:space="preserve"> </w:t>
+      </w:r>
+    </w:p>
+    <w:p>
+      <w:pPr>
+        <w:spacing w:before="150" w:after="80"/>
+        <w:rPr>
+          <w:rFonts w:ascii="Consolas" w:eastAsia="Consolas" w:hAnsi="Consolas" w:cs="Consolas"/>
+          <w:color w:val="D4D4D4"/>
+          <w:sz w:val="18"/>
+          <w:szCs w:val="18"/>
+        </w:rPr>
+      </w:pPr>
+      <w:r>
+        <w:rPr>
+          <w:rFonts w:ascii="Consolas" w:eastAsia="Consolas" w:hAnsi="Consolas" w:cs="Consolas"/>
+          <w:color w:val="D4D4D4"/>
+          <w:sz w:val="18"/>
+          <w:szCs w:val="18"/>
+        </w:rPr>
+        <w:drawing>
+          <wp:inline distT="0" distB="0" distL="0" distR="0" wp14:anchorId="751C2E41" wp14:editId="427D616E">
+            <wp:extent cx="6400800" cy="1583690"/>
+            <wp:effectExtent l="0" t="0" r="0" b="0"/>
+            <wp:docPr id="1275422498" name="Image 17"/>
+            <wp:cNvGraphicFramePr>
+              <a:graphicFrameLocks xmlns:a="http://schemas.openxmlformats.org/drawingml/2006/main" noChangeAspect="1"/>
+            </wp:cNvGraphicFramePr>
+            <a:graphic xmlns:a="http://schemas.openxmlformats.org/drawingml/2006/main">
+              <a:graphicData uri="http://schemas.openxmlformats.org/drawingml/2006/picture">
+                <pic:pic xmlns:pic="http://schemas.openxmlformats.org/drawingml/2006/picture">
+                  <pic:nvPicPr>
+                    <pic:cNvPr id="1275422498" name=""/>
+                    <pic:cNvPicPr/>
+                  </pic:nvPicPr>
+                  <pic:blipFill>
+                    <a:blip r:embed="rId21"/>
+                    <a:stretch>
+                      <a:fillRect/>
+                    </a:stretch>
+                  </pic:blipFill>
+                  <pic:spPr>
+                    <a:xfrm>
+                      <a:off x="0" y="0"/>
+                      <a:ext cx="6400800" cy="1583690"/>
+                    </a:xfrm>
+                    <a:prstGeom prst="rect">
+                      <a:avLst/>
+                    </a:prstGeom>
+                  </pic:spPr>
+                </pic:pic>
+              </a:graphicData>
+            </a:graphic>
+          </wp:inline>
+        </w:drawing>
+      </w:r>
+    </w:p>
+    <w:p>
+      <w:pPr>
+        <w:spacing w:before="150" w:after="80"/>
+        <w:rPr>
+          <w:rFonts w:ascii="Consolas" w:eastAsia="Consolas" w:hAnsi="Consolas" w:cs="Consolas"/>
+          <w:color w:val="D4D4D4"/>
+          <w:sz w:val="18"/>
+          <w:szCs w:val="18"/>
+        </w:rPr>
+      </w:pPr>
+    </w:p>
+    <w:p>
+      <w:pPr>
+        <w:spacing w:before="150" w:after="80"/>
+      </w:pPr>
+      <w:r>
+        <w:rPr>
+          <w:b/>
+          <w:bCs/>
+          <w:color w:val="1F3864"/>
+          <w:sz w:val="21"/>
+          <w:szCs w:val="21"/>
+        </w:rPr>
+        <w:t>Résultat à l'exécution (ajout de 2 datasets, tri, recherche, modification, suppression) :</w:t>
+      </w:r>
+      <w:r>
+        <w:t xml:space="preserve"> </w:t>
+      </w:r>
+    </w:p>
+    <w:p>
+      <w:pPr>
+        <w:spacing w:before="150" w:after="80"/>
+        <w:rPr>
+          <w:rFonts w:ascii="Times New Roman" w:hAnsi="Times New Roman" w:cs="Times New Roman"/>
+          <w:sz w:val="24"/>
+          <w:szCs w:val="24"/>
+        </w:rPr>
+      </w:pPr>
+      <w:r>
+        <w:rPr>
+          <w:rFonts w:ascii="Times New Roman" w:hAnsi="Times New Roman" w:cs="Times New Roman"/>
+          <w:sz w:val="24"/>
+          <w:szCs w:val="24"/>
+        </w:rPr>
+        <w:lastRenderedPageBreak/>
+        <w:drawing>
+          <wp:inline distT="0" distB="0" distL="0" distR="0" wp14:anchorId="5DB1926C" wp14:editId="7C8F064B">
+            <wp:extent cx="6400800" cy="4485005"/>
+            <wp:effectExtent l="0" t="0" r="0" b="0"/>
+            <wp:docPr id="1817328737" name="Image 18"/>
+            <wp:cNvGraphicFramePr>
+              <a:graphicFrameLocks xmlns:a="http://schemas.openxmlformats.org/drawingml/2006/main" noChangeAspect="1"/>
+            </wp:cNvGraphicFramePr>
+            <a:graphic xmlns:a="http://schemas.openxmlformats.org/drawingml/2006/main">
+              <a:graphicData uri="http://schemas.openxmlformats.org/drawingml/2006/picture">
+                <pic:pic xmlns:pic="http://schemas.openxmlformats.org/drawingml/2006/picture">
+                  <pic:nvPicPr>
+                    <pic:cNvPr id="1817328737" name=""/>
+                    <pic:cNvPicPr/>
+                  </pic:nvPicPr>
+                  <pic:blipFill>
+                    <a:blip r:embed="rId22"/>
+                    <a:stretch>
+                      <a:fillRect/>
+                    </a:stretch>
+                  </pic:blipFill>
+                  <pic:spPr>
+                    <a:xfrm>
+                      <a:off x="0" y="0"/>
+                      <a:ext cx="6400800" cy="4485005"/>
+                    </a:xfrm>
+                    <a:prstGeom prst="rect">
+                      <a:avLst/>
+                    </a:prstGeom>
+                  </pic:spPr>
+                </pic:pic>
+              </a:graphicData>
+            </a:graphic>
+          </wp:inline>
+        </w:drawing>
+      </w:r>
+      <w:r>
+        <w:rPr>
+          <w:rFonts w:ascii="Times New Roman" w:hAnsi="Times New Roman" w:cs="Times New Roman"/>
+          <w:sz w:val="24"/>
+          <w:szCs w:val="24"/>
+        </w:rPr>
+        <w:br/>
+      </w:r>
+      <w:r>
+        <w:rPr>
+          <w:rFonts w:ascii="Times New Roman" w:hAnsi="Times New Roman" w:cs="Times New Roman"/>
+          <w:sz w:val="24"/>
+          <w:szCs w:val="24"/>
+        </w:rPr>
+        <w:lastRenderedPageBreak/>
+        <w:drawing>
+          <wp:inline distT="0" distB="0" distL="0" distR="0" wp14:anchorId="07668543" wp14:editId="62EE1559">
+            <wp:extent cx="6400800" cy="4341495"/>
+            <wp:effectExtent l="0" t="0" r="0" b="1905"/>
+            <wp:docPr id="1704221011" name="Image 19"/>
+            <wp:cNvGraphicFramePr>
+              <a:graphicFrameLocks xmlns:a="http://schemas.openxmlformats.org/drawingml/2006/main" noChangeAspect="1"/>
+            </wp:cNvGraphicFramePr>
+            <a:graphic xmlns:a="http://schemas.openxmlformats.org/drawingml/2006/main">
+              <a:graphicData uri="http://schemas.openxmlformats.org/drawingml/2006/picture">
+                <pic:pic xmlns:pic="http://schemas.openxmlformats.org/drawingml/2006/picture">
+                  <pic:nvPicPr>
+                    <pic:cNvPr id="1704221011" name=""/>
+                    <pic:cNvPicPr/>
+                  </pic:nvPicPr>
+                  <pic:blipFill>
+                    <a:blip r:embed="rId23"/>
+                    <a:stretch>
+                      <a:fillRect/>
+                    </a:stretch>
+                  </pic:blipFill>
+                  <pic:spPr>
+                    <a:xfrm>
+                      <a:off x="0" y="0"/>
+                      <a:ext cx="6400800" cy="4341495"/>
+                    </a:xfrm>
+                    <a:prstGeom prst="rect">
+                      <a:avLst/>
+                    </a:prstGeom>
+                  </pic:spPr>
+                </pic:pic>
+              </a:graphicData>
+            </a:graphic>
+          </wp:inline>
+        </w:drawing>
       </w:r>
     </w:p>
     <w:p>
@@ -3712,6 +4814,155 @@
     </w:lvl>
   </w:abstractNum>
   <w:abstractNum w:abstractNumId="5" w15:restartNumberingAfterBreak="0">
+    <w:nsid w:val="653C0C5E"/>
+    <w:multiLevelType w:val="multilevel"/>
+    <w:tmpl w:val="28D834A2"/>
+    <w:lvl w:ilvl="0">
+      <w:start w:val="1"/>
+      <w:numFmt w:val="bullet"/>
+      <w:lvlText w:val=""/>
+      <w:lvlJc w:val="left"/>
+      <w:pPr>
+        <w:tabs>
+          <w:tab w:val="num" w:pos="720"/>
+        </w:tabs>
+        <w:ind w:left="720" w:hanging="360"/>
+      </w:pPr>
+      <w:rPr>
+        <w:rFonts w:ascii="Symbol" w:hAnsi="Symbol" w:hint="default"/>
+        <w:sz w:val="20"/>
+      </w:rPr>
+    </w:lvl>
+    <w:lvl w:ilvl="1" w:tentative="1">
+      <w:start w:val="1"/>
+      <w:numFmt w:val="bullet"/>
+      <w:lvlText w:val="o"/>
+      <w:lvlJc w:val="left"/>
+      <w:pPr>
+        <w:tabs>
+          <w:tab w:val="num" w:pos="1440"/>
+        </w:tabs>
+        <w:ind w:left="1440" w:hanging="360"/>
+      </w:pPr>
+      <w:rPr>
+        <w:rFonts w:ascii="Courier New" w:hAnsi="Courier New" w:hint="default"/>
+        <w:sz w:val="20"/>
+      </w:rPr>
+    </w:lvl>
+    <w:lvl w:ilvl="2" w:tentative="1">
+      <w:start w:val="1"/>
+      <w:numFmt w:val="bullet"/>
+      <w:lvlText w:val=""/>
+      <w:lvlJc w:val="left"/>
+      <w:pPr>
+        <w:tabs>
+          <w:tab w:val="num" w:pos="2160"/>
+        </w:tabs>
+        <w:ind w:left="2160" w:hanging="360"/>
+      </w:pPr>
+      <w:rPr>
+        <w:rFonts w:ascii="Wingdings" w:hAnsi="Wingdings" w:hint="default"/>
+        <w:sz w:val="20"/>
+      </w:rPr>
+    </w:lvl>
+    <w:lvl w:ilvl="3" w:tentative="1">
+      <w:start w:val="1"/>
+      <w:numFmt w:val="bullet"/>
+      <w:lvlText w:val=""/>
+      <w:lvlJc w:val="left"/>
+      <w:pPr>
+        <w:tabs>
+          <w:tab w:val="num" w:pos="2880"/>
+        </w:tabs>
+        <w:ind w:left="2880" w:hanging="360"/>
+      </w:pPr>
+      <w:rPr>
+        <w:rFonts w:ascii="Wingdings" w:hAnsi="Wingdings" w:hint="default"/>
+        <w:sz w:val="20"/>
+      </w:rPr>
+    </w:lvl>
+    <w:lvl w:ilvl="4" w:tentative="1">
+      <w:start w:val="1"/>
+      <w:numFmt w:val="bullet"/>
+      <w:lvlText w:val=""/>
+      <w:lvlJc w:val="left"/>
+      <w:pPr>
+        <w:tabs>
+          <w:tab w:val="num" w:pos="3600"/>
+        </w:tabs>
+        <w:ind w:left="3600" w:hanging="360"/>
+      </w:pPr>
+      <w:rPr>
+        <w:rFonts w:ascii="Wingdings" w:hAnsi="Wingdings" w:hint="default"/>
+        <w:sz w:val="20"/>
+      </w:rPr>
+    </w:lvl>
+    <w:lvl w:ilvl="5" w:tentative="1">
+      <w:start w:val="1"/>
+      <w:numFmt w:val="bullet"/>
+      <w:lvlText w:val=""/>
+      <w:lvlJc w:val="left"/>
+      <w:pPr>
+        <w:tabs>
+          <w:tab w:val="num" w:pos="4320"/>
+        </w:tabs>
+        <w:ind w:left="4320" w:hanging="360"/>
+      </w:pPr>
+      <w:rPr>
+        <w:rFonts w:ascii="Wingdings" w:hAnsi="Wingdings" w:hint="default"/>
+        <w:sz w:val="20"/>
+      </w:rPr>
+    </w:lvl>
+    <w:lvl w:ilvl="6" w:tentative="1">
+      <w:start w:val="1"/>
+      <w:numFmt w:val="bullet"/>
+      <w:lvlText w:val=""/>
+      <w:lvlJc w:val="left"/>
+      <w:pPr>
+        <w:tabs>
+          <w:tab w:val="num" w:pos="5040"/>
+        </w:tabs>
+        <w:ind w:left="5040" w:hanging="360"/>
+      </w:pPr>
+      <w:rPr>
+        <w:rFonts w:ascii="Wingdings" w:hAnsi="Wingdings" w:hint="default"/>
+        <w:sz w:val="20"/>
+      </w:rPr>
+    </w:lvl>
+    <w:lvl w:ilvl="7" w:tentative="1">
+      <w:start w:val="1"/>
+      <w:numFmt w:val="bullet"/>
+      <w:lvlText w:val=""/>
+      <w:lvlJc w:val="left"/>
+      <w:pPr>
+        <w:tabs>
+          <w:tab w:val="num" w:pos="5760"/>
+        </w:tabs>
+        <w:ind w:left="5760" w:hanging="360"/>
+      </w:pPr>
+      <w:rPr>
+        <w:rFonts w:ascii="Wingdings" w:hAnsi="Wingdings" w:hint="default"/>
+        <w:sz w:val="20"/>
+      </w:rPr>
+    </w:lvl>
+    <w:lvl w:ilvl="8" w:tentative="1">
+      <w:start w:val="1"/>
+      <w:numFmt w:val="bullet"/>
+      <w:lvlText w:val=""/>
+      <w:lvlJc w:val="left"/>
+      <w:pPr>
+        <w:tabs>
+          <w:tab w:val="num" w:pos="6480"/>
+        </w:tabs>
+        <w:ind w:left="6480" w:hanging="360"/>
+      </w:pPr>
+      <w:rPr>
+        <w:rFonts w:ascii="Wingdings" w:hAnsi="Wingdings" w:hint="default"/>
+        <w:sz w:val="20"/>
+      </w:rPr>
+    </w:lvl>
+  </w:abstractNum>
+  <w:abstractNum w:abstractNumId="6" w15:restartNumberingAfterBreak="0">
     <w:nsid w:val="69FC276B"/>
     <w:multiLevelType w:val="multilevel"/>
     <w:tmpl w:val="C2E0AD14"/>
@@ -3860,7 +5111,7 @@
       </w:rPr>
     </w:lvl>
   </w:abstractNum>
-  <w:abstractNum w:abstractNumId="6" w15:restartNumberingAfterBreak="0">
+  <w:abstractNum w:abstractNumId="7" w15:restartNumberingAfterBreak="0">
     <w:nsid w:val="76A84B46"/>
     <w:multiLevelType w:val="hybridMultilevel"/>
     <w:tmpl w:val="C6A6513A"/>
@@ -3982,7 +5233,7 @@
     <w:abstractNumId w:val="1"/>
   </w:num>
   <w:num w:numId="3" w16cid:durableId="832062217">
-    <w:abstractNumId w:val="6"/>
+    <w:abstractNumId w:val="7"/>
   </w:num>
   <w:num w:numId="4" w16cid:durableId="1215237999">
     <w:abstractNumId w:val="3"/>
@@ -3994,6 +5245,9 @@
     <w:abstractNumId w:val="4"/>
   </w:num>
   <w:num w:numId="7" w16cid:durableId="655379516">
+    <w:abstractNumId w:val="6"/>
+  </w:num>
+  <w:num w:numId="8" w16cid:durableId="1980303912">
     <w:abstractNumId w:val="5"/>
   </w:num>
 </w:numbering>

</xml_diff>

<commit_message>
feat: affichage des statistiques du catalogue via compréhensions (Partie 6)
</commit_message>
<xml_diff>
--- a/pratiquePython.docx
+++ b/pratiquePython.docx
@@ -259,7 +259,7 @@
         <w:tblLook w:val="0000" w:firstRow="0" w:lastRow="0" w:firstColumn="0" w:lastColumn="0" w:noHBand="0" w:noVBand="0"/>
       </w:tblPr>
       <w:tblGrid>
-        <w:gridCol w:w="10070"/>
+        <w:gridCol w:w="10480"/>
       </w:tblGrid>
       <w:tr>
         <w:tc>
@@ -488,7 +488,7 @@
         <w:tblLook w:val="0000" w:firstRow="0" w:lastRow="0" w:firstColumn="0" w:lastColumn="0" w:noHBand="0" w:noVBand="0"/>
       </w:tblPr>
       <w:tblGrid>
-        <w:gridCol w:w="10070"/>
+        <w:gridCol w:w="10480"/>
       </w:tblGrid>
       <w:tr>
         <w:tc>
@@ -687,18 +687,7 @@
           <w:sz w:val="24"/>
           <w:szCs w:val="24"/>
         </w:rPr>
-        <w:t>input (</w:t>
-      </w:r>
-      <w:r>
-        <w:rPr>
-          <w:rStyle w:val="CodeHTML"/>
-          <w:rFonts w:ascii="Times New Roman" w:eastAsia="Calibri" w:hAnsi="Times New Roman" w:cs="Times New Roman"/>
-          <w:b/>
-          <w:bCs/>
-          <w:sz w:val="24"/>
-          <w:szCs w:val="24"/>
-        </w:rPr>
-        <w:t>)</w:t>
+        <w:t>input ()</w:t>
       </w:r>
       <w:r>
         <w:rPr>
@@ -797,7 +786,7 @@
         <w:tblLook w:val="0000" w:firstRow="0" w:lastRow="0" w:firstColumn="0" w:lastColumn="0" w:noHBand="0" w:noVBand="0"/>
       </w:tblPr>
       <w:tblGrid>
-        <w:gridCol w:w="10070"/>
+        <w:gridCol w:w="10480"/>
       </w:tblGrid>
       <w:tr>
         <w:tc>
@@ -952,15 +941,7 @@
           <w:sz w:val="24"/>
           <w:szCs w:val="24"/>
         </w:rPr>
-        <w:t>C</w:t>
-      </w:r>
-      <w:r>
-        <w:rPr>
-          <w:rFonts w:ascii="Times New Roman" w:hAnsi="Times New Roman" w:cs="Times New Roman"/>
-          <w:sz w:val="24"/>
-          <w:szCs w:val="24"/>
-        </w:rPr>
-        <w:t xml:space="preserve">e code montre une série d'instructions </w:t>
+        <w:t xml:space="preserve">Ce code montre une série d'instructions </w:t>
       </w:r>
       <w:r>
         <w:rPr>
@@ -1377,7 +1358,7 @@
         <w:tblLook w:val="04A0" w:firstRow="1" w:lastRow="0" w:firstColumn="1" w:lastColumn="0" w:noHBand="0" w:noVBand="1"/>
       </w:tblPr>
       <w:tblGrid>
-        <w:gridCol w:w="10070"/>
+        <w:gridCol w:w="10480"/>
       </w:tblGrid>
       <w:tr>
         <w:tc>
@@ -1486,15 +1467,7 @@
           <w:sz w:val="24"/>
           <w:szCs w:val="24"/>
         </w:rPr>
-        <w:t xml:space="preserve"> </w:t>
-      </w:r>
-      <w:r>
-        <w:rPr>
-          <w:rFonts w:ascii="Times New Roman" w:hAnsi="Times New Roman" w:cs="Times New Roman"/>
-          <w:sz w:val="24"/>
-          <w:szCs w:val="24"/>
-        </w:rPr>
-        <w:t>Mise en place d'un menu principal dans une boucle pour permettre à l'utilisateur de choisir entre plusieurs actions (ajouter, afficher, rechercher ou quitter).</w:t>
+        <w:t xml:space="preserve"> Mise en place d'un menu principal dans une boucle pour permettre à l'utilisateur de choisir entre plusieurs actions (ajouter, afficher, rechercher ou quitter).</w:t>
       </w:r>
     </w:p>
     <w:p>
@@ -1681,23 +1654,7 @@
           <w:sz w:val="24"/>
           <w:szCs w:val="24"/>
         </w:rPr>
-        <w:t xml:space="preserve"> affichant les options du menu et la saisie de l'option 1.</w:t>
-      </w:r>
-      <w:r>
-        <w:rPr>
-          <w:rFonts w:ascii="Times New Roman" w:hAnsi="Times New Roman" w:cs="Times New Roman"/>
-          <w:sz w:val="24"/>
-          <w:szCs w:val="24"/>
-        </w:rPr>
-        <w:t xml:space="preserve"> C</w:t>
-      </w:r>
-      <w:r>
-        <w:rPr>
-          <w:rFonts w:ascii="Times New Roman" w:hAnsi="Times New Roman" w:cs="Times New Roman"/>
-          <w:sz w:val="24"/>
-          <w:szCs w:val="24"/>
-        </w:rPr>
-        <w:t xml:space="preserve">e code illustre la suite du bloc d'affichage de l'option 1, ainsi que les blocs </w:t>
+        <w:t xml:space="preserve"> affichant les options du menu et la saisie de l'option 1. Ce code illustre la suite du bloc d'affichage de l'option 1, ainsi que les blocs </w:t>
       </w:r>
       <w:r>
         <w:rPr>
@@ -2130,7 +2087,7 @@
         <w:tblLook w:val="04A0" w:firstRow="1" w:lastRow="0" w:firstColumn="1" w:lastColumn="0" w:noHBand="0" w:noVBand="1"/>
       </w:tblPr>
       <w:tblGrid>
-        <w:gridCol w:w="10070"/>
+        <w:gridCol w:w="10480"/>
       </w:tblGrid>
       <w:tr>
         <w:tc>
@@ -2468,15 +2425,7 @@
           <w:sz w:val="24"/>
           <w:szCs w:val="24"/>
         </w:rPr>
-        <w:t>C</w:t>
-      </w:r>
-      <w:r>
-        <w:rPr>
-          <w:rFonts w:ascii="Times New Roman" w:eastAsia="Times New Roman" w:hAnsi="Times New Roman" w:cs="Times New Roman"/>
-          <w:sz w:val="24"/>
-          <w:szCs w:val="24"/>
-        </w:rPr>
-        <w:t xml:space="preserve">e terminal affiche la saisie d'un nouveau dataset (NTCom), confirmant que la restitution des métadonnées fonctionne à l'identique tout en s'appuyant sur le dictionnaire. </w:t>
+        <w:t xml:space="preserve">Ce terminal affiche la saisie d'un nouveau dataset (NTCom), confirmant que la restitution des métadonnées fonctionne à l'identique tout en s'appuyant sur le dictionnaire. </w:t>
       </w:r>
     </w:p>
     <w:p>
@@ -2705,7 +2654,7 @@
         <w:tblLook w:val="04A0" w:firstRow="1" w:lastRow="0" w:firstColumn="1" w:lastColumn="0" w:noHBand="0" w:noVBand="1"/>
       </w:tblPr>
       <w:tblGrid>
-        <w:gridCol w:w="10070"/>
+        <w:gridCol w:w="10480"/>
       </w:tblGrid>
       <w:tr>
         <w:tc>
@@ -2754,47 +2703,7 @@
                 <w:sz w:val="24"/>
                 <w:szCs w:val="24"/>
               </w:rPr>
-              <w:t>Cré</w:t>
-            </w:r>
-            <w:r>
-              <w:rPr>
-                <w:rFonts w:ascii="Times New Roman" w:hAnsi="Times New Roman" w:cs="Times New Roman"/>
-                <w:i/>
-                <w:iCs/>
-                <w:sz w:val="24"/>
-                <w:szCs w:val="24"/>
-              </w:rPr>
-              <w:t>ation</w:t>
-            </w:r>
-            <w:r>
-              <w:rPr>
-                <w:rFonts w:ascii="Times New Roman" w:hAnsi="Times New Roman" w:cs="Times New Roman"/>
-                <w:i/>
-                <w:iCs/>
-                <w:sz w:val="24"/>
-                <w:szCs w:val="24"/>
-              </w:rPr>
-              <w:t xml:space="preserve"> </w:t>
-            </w:r>
-            <w:r>
-              <w:rPr>
-                <w:rFonts w:ascii="Times New Roman" w:hAnsi="Times New Roman" w:cs="Times New Roman"/>
-                <w:i/>
-                <w:iCs/>
-                <w:sz w:val="24"/>
-                <w:szCs w:val="24"/>
-              </w:rPr>
-              <w:t>d’</w:t>
-            </w:r>
-            <w:r>
-              <w:rPr>
-                <w:rFonts w:ascii="Times New Roman" w:hAnsi="Times New Roman" w:cs="Times New Roman"/>
-                <w:i/>
-                <w:iCs/>
-                <w:sz w:val="24"/>
-                <w:szCs w:val="24"/>
-              </w:rPr>
-              <w:t>un tuple contenant les domaines autorisés : ("Santé","Finance","Agriculture","Transport","Education").</w:t>
+              <w:t>Création d’un tuple contenant les domaines autorisés : ("Santé","Finance","Agriculture","Transport","Education").</w:t>
             </w:r>
           </w:p>
         </w:tc>
@@ -2964,7 +2873,7 @@
         <w:tblLook w:val="04A0" w:firstRow="1" w:lastRow="0" w:firstColumn="1" w:lastColumn="0" w:noHBand="0" w:noVBand="1"/>
       </w:tblPr>
       <w:tblGrid>
-        <w:gridCol w:w="10070"/>
+        <w:gridCol w:w="10480"/>
       </w:tblGrid>
       <w:tr>
         <w:tc>
@@ -3012,27 +2921,7 @@
                 <w:sz w:val="24"/>
                 <w:szCs w:val="24"/>
               </w:rPr>
-              <w:t>Vérifi</w:t>
-            </w:r>
-            <w:r>
-              <w:rPr>
-                <w:rFonts w:ascii="Times New Roman" w:hAnsi="Times New Roman" w:cs="Times New Roman"/>
-                <w:i/>
-                <w:iCs/>
-                <w:sz w:val="24"/>
-                <w:szCs w:val="24"/>
-              </w:rPr>
-              <w:t>cation</w:t>
-            </w:r>
-            <w:r>
-              <w:rPr>
-                <w:rFonts w:ascii="Times New Roman" w:hAnsi="Times New Roman" w:cs="Times New Roman"/>
-                <w:i/>
-                <w:iCs/>
-                <w:sz w:val="24"/>
-                <w:szCs w:val="24"/>
-              </w:rPr>
-              <w:t xml:space="preserve"> que le domaine saisi, à la question 3, appartient au tuple.</w:t>
+              <w:t>Vérification que le domaine saisi, à la question 3, appartient au tuple.</w:t>
             </w:r>
           </w:p>
         </w:tc>
@@ -3151,15 +3040,7 @@
           <w:sz w:val="24"/>
           <w:szCs w:val="24"/>
         </w:rPr>
-        <w:t>C</w:t>
-      </w:r>
-      <w:r>
-        <w:rPr>
-          <w:rFonts w:ascii="Times New Roman" w:hAnsi="Times New Roman" w:cs="Times New Roman"/>
-          <w:sz w:val="24"/>
-          <w:szCs w:val="24"/>
-        </w:rPr>
-        <w:t xml:space="preserve">e code illustre une boucle </w:t>
+        <w:t xml:space="preserve">Ce code illustre une boucle </w:t>
       </w:r>
       <w:r>
         <w:rPr>
@@ -3470,9 +3351,59 @@
     <w:p>
       <w:pPr>
         <w:pStyle w:val="Titre1"/>
-      </w:pPr>
-      <w:r>
+        <w:spacing w:line="360" w:lineRule="auto"/>
+        <w:rPr>
+          <w:rFonts w:ascii="Times New Roman" w:hAnsi="Times New Roman" w:cs="Times New Roman"/>
+          <w:color w:val="auto"/>
+          <w:sz w:val="24"/>
+          <w:szCs w:val="24"/>
+        </w:rPr>
+      </w:pPr>
+      <w:r>
+        <w:rPr>
+          <w:rFonts w:ascii="Times New Roman" w:hAnsi="Times New Roman" w:cs="Times New Roman"/>
+          <w:color w:val="auto"/>
+          <w:sz w:val="24"/>
+          <w:szCs w:val="24"/>
+        </w:rPr>
         <w:t>Partie 5 — Listes</w:t>
+      </w:r>
+    </w:p>
+    <w:p>
+      <w:pPr>
+        <w:pStyle w:val="lev1"/>
+        <w:spacing w:line="360" w:lineRule="auto"/>
+        <w:rPr>
+          <w:rFonts w:ascii="Times New Roman" w:hAnsi="Times New Roman" w:cs="Times New Roman"/>
+          <w:sz w:val="24"/>
+          <w:szCs w:val="24"/>
+        </w:rPr>
+      </w:pPr>
+      <w:r>
+        <w:rPr>
+          <w:rFonts w:ascii="Times New Roman" w:hAnsi="Times New Roman" w:cs="Times New Roman"/>
+          <w:sz w:val="24"/>
+          <w:szCs w:val="24"/>
+        </w:rPr>
+        <w:t>Cette section aborde la gestion dynamique d'une collection de datasets à l'aide d'une liste Python. Elle permet de stocker l'ensemble des dictionnaires créés et d'effectuer des opérations CRUD (</w:t>
+      </w:r>
+      <w:r>
+        <w:rPr>
+          <w:rFonts w:ascii="Times New Roman" w:hAnsi="Times New Roman" w:cs="Times New Roman"/>
+          <w:i/>
+          <w:iCs/>
+          <w:sz w:val="24"/>
+          <w:szCs w:val="24"/>
+        </w:rPr>
+        <w:t>Create, Read, Update, Delete</w:t>
+      </w:r>
+      <w:r>
+        <w:rPr>
+          <w:rFonts w:ascii="Times New Roman" w:hAnsi="Times New Roman" w:cs="Times New Roman"/>
+          <w:sz w:val="24"/>
+          <w:szCs w:val="24"/>
+        </w:rPr>
+        <w:t>) ainsi que du tri directement au sein du catalogue.</w:t>
       </w:r>
     </w:p>
     <w:tbl>
@@ -3494,7 +3425,7 @@
         <w:tblLook w:val="04A0" w:firstRow="1" w:lastRow="0" w:firstColumn="1" w:lastColumn="0" w:noHBand="0" w:noVBand="1"/>
       </w:tblPr>
       <w:tblGrid>
-        <w:gridCol w:w="10070"/>
+        <w:gridCol w:w="10480"/>
       </w:tblGrid>
       <w:tr>
         <w:tc>
@@ -3516,46 +3447,72 @@
             <w:hideMark/>
           </w:tcPr>
           <w:p>
+            <w:pPr>
+              <w:spacing w:line="360" w:lineRule="auto"/>
+              <w:rPr>
+                <w:rFonts w:ascii="Times New Roman" w:hAnsi="Times New Roman" w:cs="Times New Roman"/>
+                <w:sz w:val="24"/>
+                <w:szCs w:val="24"/>
+              </w:rPr>
+            </w:pPr>
             <w:r>
               <w:rPr>
+                <w:rFonts w:ascii="Times New Roman" w:hAnsi="Times New Roman" w:cs="Times New Roman"/>
                 <w:b/>
                 <w:bCs/>
-                <w:color w:val="2E5395"/>
+                <w:sz w:val="24"/>
+                <w:szCs w:val="24"/>
               </w:rPr>
+              <w:lastRenderedPageBreak/>
               <w:t xml:space="preserve">Question 9 — </w:t>
             </w:r>
             <w:r>
               <w:rPr>
+                <w:rFonts w:ascii="Times New Roman" w:hAnsi="Times New Roman" w:cs="Times New Roman"/>
                 <w:i/>
                 <w:iCs/>
+                <w:sz w:val="24"/>
+                <w:szCs w:val="24"/>
               </w:rPr>
               <w:t>Crée</w:t>
             </w:r>
             <w:r>
               <w:rPr>
+                <w:rFonts w:ascii="Times New Roman" w:hAnsi="Times New Roman" w:cs="Times New Roman"/>
                 <w:i/>
                 <w:iCs/>
+                <w:sz w:val="24"/>
+                <w:szCs w:val="24"/>
               </w:rPr>
               <w:t>ation</w:t>
             </w:r>
             <w:r>
               <w:rPr>
+                <w:rFonts w:ascii="Times New Roman" w:hAnsi="Times New Roman" w:cs="Times New Roman"/>
                 <w:i/>
                 <w:iCs/>
+                <w:sz w:val="24"/>
+                <w:szCs w:val="24"/>
               </w:rPr>
               <w:t xml:space="preserve"> </w:t>
             </w:r>
             <w:r>
               <w:rPr>
+                <w:rFonts w:ascii="Times New Roman" w:hAnsi="Times New Roman" w:cs="Times New Roman"/>
                 <w:i/>
                 <w:iCs/>
+                <w:sz w:val="24"/>
+                <w:szCs w:val="24"/>
               </w:rPr>
               <w:t>d’</w:t>
             </w:r>
             <w:r>
               <w:rPr>
+                <w:rFonts w:ascii="Times New Roman" w:hAnsi="Times New Roman" w:cs="Times New Roman"/>
                 <w:i/>
                 <w:iCs/>
+                <w:sz w:val="24"/>
+                <w:szCs w:val="24"/>
               </w:rPr>
               <w:t>une liste contenant les datasets. Chaque ajout est enregistré dans la liste.</w:t>
             </w:r>
@@ -3565,15 +3522,54 @@
     </w:tbl>
     <w:p>
       <w:pPr>
-        <w:spacing w:after="150"/>
-      </w:pPr>
-    </w:p>
-    <w:p>
-      <w:pPr>
-        <w:spacing w:after="150"/>
-      </w:pPr>
-      <w:r>
-        <w:lastRenderedPageBreak/>
+        <w:spacing w:after="150" w:line="360" w:lineRule="auto"/>
+        <w:rPr>
+          <w:rFonts w:ascii="Times New Roman" w:hAnsi="Times New Roman" w:cs="Times New Roman"/>
+          <w:sz w:val="24"/>
+          <w:szCs w:val="24"/>
+        </w:rPr>
+      </w:pPr>
+      <w:r>
+        <w:rPr>
+          <w:rFonts w:ascii="Times New Roman" w:hAnsi="Times New Roman" w:cs="Times New Roman"/>
+          <w:sz w:val="24"/>
+          <w:szCs w:val="24"/>
+        </w:rPr>
+        <w:t xml:space="preserve">Création d'une liste vide </w:t>
+      </w:r>
+      <w:r>
+        <w:rPr>
+          <w:rStyle w:val="CodeHTML"/>
+          <w:rFonts w:ascii="Times New Roman" w:eastAsia="Calibri" w:hAnsi="Times New Roman" w:cs="Times New Roman"/>
+          <w:sz w:val="24"/>
+          <w:szCs w:val="24"/>
+        </w:rPr>
+        <w:t>catalogue_data</w:t>
+      </w:r>
+      <w:r>
+        <w:rPr>
+          <w:rFonts w:ascii="Times New Roman" w:hAnsi="Times New Roman" w:cs="Times New Roman"/>
+          <w:sz w:val="24"/>
+          <w:szCs w:val="24"/>
+        </w:rPr>
+        <w:t xml:space="preserve"> en en-tête de programme pour centraliser tous les datasets ajoutés par l'utilisateur.</w:t>
+      </w:r>
+    </w:p>
+    <w:p>
+      <w:pPr>
+        <w:spacing w:after="150" w:line="360" w:lineRule="auto"/>
+        <w:rPr>
+          <w:rFonts w:ascii="Times New Roman" w:hAnsi="Times New Roman" w:cs="Times New Roman"/>
+          <w:sz w:val="24"/>
+          <w:szCs w:val="24"/>
+        </w:rPr>
+      </w:pPr>
+      <w:r>
+        <w:rPr>
+          <w:rFonts w:ascii="Times New Roman" w:hAnsi="Times New Roman" w:cs="Times New Roman"/>
+          <w:sz w:val="24"/>
+          <w:szCs w:val="24"/>
+        </w:rPr>
         <w:drawing>
           <wp:inline distT="0" distB="0" distL="0" distR="0" wp14:anchorId="433CAFB2" wp14:editId="4A88EADD">
             <wp:extent cx="6400800" cy="1078865"/>
@@ -3613,7 +3609,39 @@
     </w:p>
     <w:p>
       <w:pPr>
-        <w:spacing w:after="150"/>
+        <w:spacing w:after="150" w:line="360" w:lineRule="auto"/>
+        <w:rPr>
+          <w:rFonts w:ascii="Times New Roman" w:hAnsi="Times New Roman" w:cs="Times New Roman"/>
+          <w:sz w:val="24"/>
+          <w:szCs w:val="24"/>
+        </w:rPr>
+      </w:pPr>
+      <w:r>
+        <w:rPr>
+          <w:rFonts w:ascii="Times New Roman" w:hAnsi="Times New Roman" w:cs="Times New Roman"/>
+          <w:sz w:val="24"/>
+          <w:szCs w:val="24"/>
+        </w:rPr>
+        <w:t xml:space="preserve">Chaque nouveau dataset saisi dans l'option 1 est ensuite inséré dans cette liste via l'instruction </w:t>
+      </w:r>
+      <w:r>
+        <w:rPr>
+          <w:rStyle w:val="CodeHTML"/>
+          <w:rFonts w:ascii="Times New Roman" w:eastAsia="Calibri" w:hAnsi="Times New Roman" w:cs="Times New Roman"/>
+          <w:sz w:val="24"/>
+          <w:szCs w:val="24"/>
+        </w:rPr>
+        <w:t>catalogue_data.append(dataset)</w:t>
+      </w:r>
+    </w:p>
+    <w:p>
+      <w:pPr>
+        <w:spacing w:after="150" w:line="360" w:lineRule="auto"/>
+        <w:rPr>
+          <w:rFonts w:ascii="Times New Roman" w:hAnsi="Times New Roman" w:cs="Times New Roman"/>
+          <w:sz w:val="24"/>
+          <w:szCs w:val="24"/>
+        </w:rPr>
       </w:pPr>
     </w:p>
     <w:tbl>
@@ -3635,7 +3663,7 @@
         <w:tblLook w:val="04A0" w:firstRow="1" w:lastRow="0" w:firstColumn="1" w:lastColumn="0" w:noHBand="0" w:noVBand="1"/>
       </w:tblPr>
       <w:tblGrid>
-        <w:gridCol w:w="10070"/>
+        <w:gridCol w:w="10480"/>
       </w:tblGrid>
       <w:tr>
         <w:tc>
@@ -3657,34 +3685,33 @@
             <w:hideMark/>
           </w:tcPr>
           <w:p>
+            <w:pPr>
+              <w:spacing w:line="360" w:lineRule="auto"/>
+              <w:rPr>
+                <w:rFonts w:ascii="Times New Roman" w:hAnsi="Times New Roman" w:cs="Times New Roman"/>
+                <w:sz w:val="24"/>
+                <w:szCs w:val="24"/>
+              </w:rPr>
+            </w:pPr>
             <w:r>
               <w:rPr>
+                <w:rFonts w:ascii="Times New Roman" w:hAnsi="Times New Roman" w:cs="Times New Roman"/>
                 <w:b/>
                 <w:bCs/>
-                <w:color w:val="2E5395"/>
+                <w:sz w:val="24"/>
+                <w:szCs w:val="24"/>
               </w:rPr>
               <w:t xml:space="preserve">Question 10 — </w:t>
             </w:r>
             <w:r>
               <w:rPr>
+                <w:rFonts w:ascii="Times New Roman" w:hAnsi="Times New Roman" w:cs="Times New Roman"/>
                 <w:i/>
                 <w:iCs/>
+                <w:sz w:val="24"/>
+                <w:szCs w:val="24"/>
               </w:rPr>
-              <w:t xml:space="preserve">Ajoute </w:t>
-            </w:r>
-            <w:r>
-              <w:rPr>
-                <w:i/>
-                <w:iCs/>
-              </w:rPr>
-              <w:t>d</w:t>
-            </w:r>
-            <w:r>
-              <w:rPr>
-                <w:i/>
-                <w:iCs/>
-              </w:rPr>
-              <w:t>es fonctionnalités : ajouter, trier, rechercher, modifier, supprimer.</w:t>
+              <w:t>Ajoute des fonctionnalités : ajouter, trier, rechercher, modifier, supprimer.</w:t>
             </w:r>
           </w:p>
         </w:tc>
@@ -3692,65 +3719,143 @@
     </w:tbl>
     <w:p>
       <w:pPr>
-        <w:spacing w:after="150"/>
-      </w:pPr>
-    </w:p>
-    <w:p>
-      <w:pPr>
-        <w:spacing w:after="150"/>
-      </w:pPr>
-      <w:r>
-        <w:t>Le menu est complété avec 4 nouvelles options (Modifier, Supprimer, Trier), toujours sous forme de blocs if/elif directement dans la boucle principale — les fonctions ne sont pas encore utilisées à ce stade (voir Partie 9).</w:t>
-      </w:r>
-    </w:p>
-    <w:p>
-      <w:pPr>
-        <w:spacing w:before="150" w:after="80"/>
-        <w:rPr>
-          <w:rFonts w:ascii="Consolas" w:eastAsia="Consolas" w:hAnsi="Consolas" w:cs="Consolas"/>
-          <w:color w:val="D4D4D4"/>
-          <w:sz w:val="18"/>
-          <w:szCs w:val="18"/>
-        </w:rPr>
-      </w:pPr>
-      <w:r>
-        <w:rPr>
-          <w:b/>
-          <w:bCs/>
-          <w:color w:val="1F3864"/>
-          <w:sz w:val="21"/>
-          <w:szCs w:val="21"/>
-        </w:rPr>
-        <w:t>a) Rechercher :</w:t>
-      </w:r>
-      <w:r>
-        <w:rPr>
-          <w:rFonts w:ascii="Consolas" w:eastAsia="Consolas" w:hAnsi="Consolas" w:cs="Consolas"/>
-          <w:color w:val="D4D4D4"/>
-          <w:sz w:val="18"/>
-          <w:szCs w:val="18"/>
+        <w:spacing w:after="150" w:line="360" w:lineRule="auto"/>
+        <w:rPr>
+          <w:rFonts w:ascii="Times New Roman" w:hAnsi="Times New Roman" w:cs="Times New Roman"/>
+          <w:sz w:val="24"/>
+          <w:szCs w:val="24"/>
+        </w:rPr>
+      </w:pPr>
+      <w:r>
+        <w:rPr>
+          <w:rFonts w:ascii="Times New Roman" w:hAnsi="Times New Roman" w:cs="Times New Roman"/>
+          <w:sz w:val="24"/>
+          <w:szCs w:val="24"/>
+        </w:rPr>
+        <w:t xml:space="preserve">Le menu principal est enrichi avec de nouvelles options interactives. À ce stade, la logique métier est intégrée directement sous forme de structures conditionnelles </w:t>
+      </w:r>
+      <w:r>
+        <w:rPr>
+          <w:rStyle w:val="CodeHTML"/>
+          <w:rFonts w:ascii="Times New Roman" w:eastAsia="Calibri" w:hAnsi="Times New Roman" w:cs="Times New Roman"/>
+          <w:sz w:val="24"/>
+          <w:szCs w:val="24"/>
+        </w:rPr>
+        <w:t>if / elif</w:t>
+      </w:r>
+      <w:r>
+        <w:rPr>
+          <w:rFonts w:ascii="Times New Roman" w:hAnsi="Times New Roman" w:cs="Times New Roman"/>
+          <w:sz w:val="24"/>
+          <w:szCs w:val="24"/>
+        </w:rPr>
+        <w:t xml:space="preserve"> dans la boucle principale (sans fonctions autonomes).</w:t>
+      </w:r>
+    </w:p>
+    <w:p>
+      <w:pPr>
+        <w:pStyle w:val="Paragraphedeliste"/>
+        <w:numPr>
+          <w:ilvl w:val="0"/>
+          <w:numId w:val="9"/>
+        </w:numPr>
+        <w:spacing w:before="150" w:after="80" w:line="360" w:lineRule="auto"/>
+        <w:rPr>
+          <w:rFonts w:ascii="Times New Roman" w:eastAsia="Consolas" w:hAnsi="Times New Roman" w:cs="Times New Roman"/>
+          <w:sz w:val="24"/>
+          <w:szCs w:val="24"/>
+        </w:rPr>
+      </w:pPr>
+      <w:r>
+        <w:rPr>
+          <w:rFonts w:ascii="Times New Roman" w:hAnsi="Times New Roman" w:cs="Times New Roman"/>
+          <w:b/>
+          <w:bCs/>
+          <w:sz w:val="24"/>
+          <w:szCs w:val="24"/>
+        </w:rPr>
+        <w:t>Rechercher :</w:t>
+      </w:r>
+      <w:r>
+        <w:rPr>
+          <w:rFonts w:ascii="Times New Roman" w:eastAsia="Consolas" w:hAnsi="Times New Roman" w:cs="Times New Roman"/>
+          <w:sz w:val="24"/>
+          <w:szCs w:val="24"/>
         </w:rPr>
         <w:t xml:space="preserve"> </w:t>
       </w:r>
     </w:p>
     <w:p>
       <w:pPr>
-        <w:spacing w:before="150" w:after="80"/>
-        <w:rPr>
-          <w:b/>
-          <w:bCs/>
-          <w:color w:val="1F3864"/>
-          <w:sz w:val="21"/>
-          <w:szCs w:val="21"/>
-        </w:rPr>
-      </w:pPr>
-      <w:r>
-        <w:rPr>
-          <w:b/>
-          <w:bCs/>
-          <w:color w:val="1F3864"/>
-          <w:sz w:val="21"/>
-          <w:szCs w:val="21"/>
+        <w:spacing w:before="150" w:after="80" w:line="360" w:lineRule="auto"/>
+        <w:ind w:left="360"/>
+        <w:rPr>
+          <w:rFonts w:ascii="Times New Roman" w:eastAsia="Consolas" w:hAnsi="Times New Roman" w:cs="Times New Roman"/>
+          <w:sz w:val="24"/>
+          <w:szCs w:val="24"/>
+        </w:rPr>
+      </w:pPr>
+      <w:r>
+        <w:rPr>
+          <w:rFonts w:ascii="Times New Roman" w:hAnsi="Times New Roman" w:cs="Times New Roman"/>
+          <w:sz w:val="24"/>
+          <w:szCs w:val="24"/>
+        </w:rPr>
+        <w:t xml:space="preserve">Parcours de la liste </w:t>
+      </w:r>
+      <w:r>
+        <w:rPr>
+          <w:rStyle w:val="CodeHTML"/>
+          <w:rFonts w:ascii="Times New Roman" w:eastAsia="Calibri" w:hAnsi="Times New Roman" w:cs="Times New Roman"/>
+          <w:sz w:val="24"/>
+          <w:szCs w:val="24"/>
+        </w:rPr>
+        <w:t>catalogue_data</w:t>
+      </w:r>
+      <w:r>
+        <w:rPr>
+          <w:rFonts w:ascii="Times New Roman" w:hAnsi="Times New Roman" w:cs="Times New Roman"/>
+          <w:sz w:val="24"/>
+          <w:szCs w:val="24"/>
+        </w:rPr>
+        <w:t xml:space="preserve"> à l'aide d'une boucle </w:t>
+      </w:r>
+      <w:r>
+        <w:rPr>
+          <w:rStyle w:val="CodeHTML"/>
+          <w:rFonts w:ascii="Times New Roman" w:eastAsia="Calibri" w:hAnsi="Times New Roman" w:cs="Times New Roman"/>
+          <w:sz w:val="24"/>
+          <w:szCs w:val="24"/>
+        </w:rPr>
+        <w:t>for</w:t>
+      </w:r>
+      <w:r>
+        <w:rPr>
+          <w:rFonts w:ascii="Times New Roman" w:hAnsi="Times New Roman" w:cs="Times New Roman"/>
+          <w:sz w:val="24"/>
+          <w:szCs w:val="24"/>
+        </w:rPr>
+        <w:t xml:space="preserve"> pour trouver un dataset dont le nom correspond à la saisie.</w:t>
+      </w:r>
+    </w:p>
+    <w:p>
+      <w:pPr>
+        <w:spacing w:before="150" w:after="80" w:line="360" w:lineRule="auto"/>
+        <w:rPr>
+          <w:rFonts w:ascii="Times New Roman" w:hAnsi="Times New Roman" w:cs="Times New Roman"/>
+          <w:b/>
+          <w:bCs/>
+          <w:sz w:val="24"/>
+          <w:szCs w:val="24"/>
+        </w:rPr>
+      </w:pPr>
+      <w:r>
+        <w:rPr>
+          <w:rFonts w:ascii="Times New Roman" w:hAnsi="Times New Roman" w:cs="Times New Roman"/>
+          <w:b/>
+          <w:bCs/>
+          <w:sz w:val="24"/>
+          <w:szCs w:val="24"/>
         </w:rPr>
         <w:drawing>
           <wp:inline distT="0" distB="0" distL="0" distR="0" wp14:anchorId="452497EC" wp14:editId="020FDC38">
@@ -3791,45 +3896,72 @@
     </w:p>
     <w:p>
       <w:pPr>
-        <w:spacing w:before="150" w:after="80"/>
-        <w:rPr>
-          <w:b/>
-          <w:bCs/>
-          <w:color w:val="1F3864"/>
-          <w:sz w:val="21"/>
-          <w:szCs w:val="21"/>
-        </w:rPr>
-      </w:pPr>
-      <w:r>
-        <w:rPr>
-          <w:b/>
-          <w:bCs/>
-          <w:color w:val="1F3864"/>
-          <w:sz w:val="21"/>
-          <w:szCs w:val="21"/>
-        </w:rPr>
-        <w:t>b) Modifier :</w:t>
-      </w:r>
-    </w:p>
-    <w:p>
-      <w:pPr>
-        <w:spacing w:before="150" w:after="80"/>
-        <w:rPr>
-          <w:b/>
-          <w:bCs/>
-          <w:color w:val="1F3864"/>
-          <w:sz w:val="21"/>
-          <w:szCs w:val="21"/>
-        </w:rPr>
-      </w:pPr>
-      <w:r>
-        <w:rPr>
-          <w:b/>
-          <w:bCs/>
-          <w:color w:val="1F3864"/>
-          <w:sz w:val="21"/>
-          <w:szCs w:val="21"/>
-        </w:rPr>
+        <w:pStyle w:val="Paragraphedeliste"/>
+        <w:numPr>
+          <w:ilvl w:val="0"/>
+          <w:numId w:val="9"/>
+        </w:numPr>
+        <w:spacing w:before="150" w:after="80" w:line="360" w:lineRule="auto"/>
+        <w:rPr>
+          <w:rFonts w:ascii="Times New Roman" w:hAnsi="Times New Roman" w:cs="Times New Roman"/>
+          <w:b/>
+          <w:bCs/>
+          <w:sz w:val="24"/>
+          <w:szCs w:val="24"/>
+        </w:rPr>
+      </w:pPr>
+      <w:r>
+        <w:rPr>
+          <w:rFonts w:ascii="Times New Roman" w:hAnsi="Times New Roman" w:cs="Times New Roman"/>
+          <w:b/>
+          <w:bCs/>
+          <w:sz w:val="24"/>
+          <w:szCs w:val="24"/>
+        </w:rPr>
+        <w:t>Modifier :</w:t>
+      </w:r>
+    </w:p>
+    <w:p>
+      <w:pPr>
+        <w:spacing w:before="150" w:after="80" w:line="360" w:lineRule="auto"/>
+        <w:ind w:left="360"/>
+        <w:rPr>
+          <w:rFonts w:ascii="Times New Roman" w:hAnsi="Times New Roman" w:cs="Times New Roman"/>
+          <w:b/>
+          <w:bCs/>
+          <w:sz w:val="24"/>
+          <w:szCs w:val="24"/>
+        </w:rPr>
+      </w:pPr>
+      <w:r>
+        <w:rPr>
+          <w:rFonts w:ascii="Times New Roman" w:hAnsi="Times New Roman" w:cs="Times New Roman"/>
+          <w:sz w:val="24"/>
+          <w:szCs w:val="24"/>
+        </w:rPr>
+        <w:t>Recherche du dataset dans la liste, puis mise à jour dynamique de la valeur de la clé sélectionnée.</w:t>
+      </w:r>
+    </w:p>
+    <w:p>
+      <w:pPr>
+        <w:spacing w:before="150" w:after="80" w:line="360" w:lineRule="auto"/>
+        <w:rPr>
+          <w:rFonts w:ascii="Times New Roman" w:hAnsi="Times New Roman" w:cs="Times New Roman"/>
+          <w:b/>
+          <w:bCs/>
+          <w:sz w:val="24"/>
+          <w:szCs w:val="24"/>
+        </w:rPr>
+      </w:pPr>
+      <w:r>
+        <w:rPr>
+          <w:rFonts w:ascii="Times New Roman" w:hAnsi="Times New Roman" w:cs="Times New Roman"/>
+          <w:b/>
+          <w:bCs/>
+          <w:sz w:val="24"/>
+          <w:szCs w:val="24"/>
+        </w:rPr>
+        <w:lastRenderedPageBreak/>
         <w:drawing>
           <wp:inline distT="0" distB="0" distL="0" distR="0" wp14:anchorId="1C337E3E" wp14:editId="26606B70">
             <wp:extent cx="6400800" cy="2947035"/>
@@ -3869,57 +4001,91 @@
     </w:p>
     <w:p>
       <w:pPr>
-        <w:spacing w:before="150" w:after="80"/>
-        <w:rPr>
-          <w:b/>
-          <w:bCs/>
-          <w:color w:val="1F3864"/>
-          <w:sz w:val="21"/>
-          <w:szCs w:val="21"/>
-        </w:rPr>
-      </w:pPr>
-    </w:p>
-    <w:p>
-      <w:pPr>
-        <w:spacing w:before="150" w:after="80"/>
-        <w:rPr>
-          <w:b/>
-          <w:bCs/>
-          <w:color w:val="1F3864"/>
-          <w:sz w:val="21"/>
-          <w:szCs w:val="21"/>
-        </w:rPr>
-      </w:pPr>
-      <w:r>
-        <w:rPr>
-          <w:b/>
-          <w:bCs/>
-          <w:color w:val="1F3864"/>
-          <w:sz w:val="21"/>
-          <w:szCs w:val="21"/>
-        </w:rPr>
-        <w:lastRenderedPageBreak/>
-        <w:t>c) Supprimer :</w:t>
-      </w:r>
-    </w:p>
-    <w:p>
-      <w:pPr>
-        <w:spacing w:before="150" w:after="80"/>
-        <w:rPr>
-          <w:b/>
-          <w:bCs/>
-          <w:color w:val="1F3864"/>
-          <w:sz w:val="21"/>
-          <w:szCs w:val="21"/>
-        </w:rPr>
-      </w:pPr>
-      <w:r>
-        <w:rPr>
-          <w:b/>
-          <w:bCs/>
-          <w:color w:val="1F3864"/>
-          <w:sz w:val="21"/>
-          <w:szCs w:val="21"/>
+        <w:spacing w:before="150" w:after="80" w:line="360" w:lineRule="auto"/>
+        <w:rPr>
+          <w:rFonts w:ascii="Times New Roman" w:hAnsi="Times New Roman" w:cs="Times New Roman"/>
+          <w:b/>
+          <w:bCs/>
+          <w:sz w:val="24"/>
+          <w:szCs w:val="24"/>
+        </w:rPr>
+      </w:pPr>
+    </w:p>
+    <w:p>
+      <w:pPr>
+        <w:pStyle w:val="Paragraphedeliste"/>
+        <w:numPr>
+          <w:ilvl w:val="0"/>
+          <w:numId w:val="9"/>
+        </w:numPr>
+        <w:spacing w:before="150" w:after="80" w:line="360" w:lineRule="auto"/>
+        <w:rPr>
+          <w:rFonts w:ascii="Times New Roman" w:hAnsi="Times New Roman" w:cs="Times New Roman"/>
+          <w:b/>
+          <w:bCs/>
+          <w:sz w:val="24"/>
+          <w:szCs w:val="24"/>
+        </w:rPr>
+      </w:pPr>
+      <w:r>
+        <w:rPr>
+          <w:rFonts w:ascii="Times New Roman" w:hAnsi="Times New Roman" w:cs="Times New Roman"/>
+          <w:b/>
+          <w:bCs/>
+          <w:sz w:val="24"/>
+          <w:szCs w:val="24"/>
+        </w:rPr>
+        <w:t>Supprimer :</w:t>
+      </w:r>
+    </w:p>
+    <w:p>
+      <w:pPr>
+        <w:spacing w:before="150" w:after="80" w:line="360" w:lineRule="auto"/>
+        <w:ind w:left="360"/>
+        <w:rPr>
+          <w:rFonts w:ascii="Times New Roman" w:hAnsi="Times New Roman" w:cs="Times New Roman"/>
+          <w:b/>
+          <w:bCs/>
+          <w:sz w:val="24"/>
+          <w:szCs w:val="24"/>
+        </w:rPr>
+      </w:pPr>
+      <w:r>
+        <w:rPr>
+          <w:rFonts w:ascii="Times New Roman" w:hAnsi="Times New Roman" w:cs="Times New Roman"/>
+          <w:sz w:val="24"/>
+          <w:szCs w:val="24"/>
+        </w:rPr>
+        <w:t xml:space="preserve">Recherche de l'élément dans le catalogue et retrait de la liste grâce à la méthode </w:t>
+      </w:r>
+      <w:r>
+        <w:rPr>
+          <w:rStyle w:val="CodeHTML"/>
+          <w:rFonts w:ascii="Times New Roman" w:eastAsia="Calibri" w:hAnsi="Times New Roman" w:cs="Times New Roman"/>
+          <w:sz w:val="24"/>
+          <w:szCs w:val="24"/>
+        </w:rPr>
+        <w:t>.remove()</w:t>
+      </w:r>
+    </w:p>
+    <w:p>
+      <w:pPr>
+        <w:spacing w:before="150" w:after="80" w:line="360" w:lineRule="auto"/>
+        <w:rPr>
+          <w:rFonts w:ascii="Times New Roman" w:hAnsi="Times New Roman" w:cs="Times New Roman"/>
+          <w:b/>
+          <w:bCs/>
+          <w:sz w:val="24"/>
+          <w:szCs w:val="24"/>
+        </w:rPr>
+      </w:pPr>
+      <w:r>
+        <w:rPr>
+          <w:rFonts w:ascii="Times New Roman" w:hAnsi="Times New Roman" w:cs="Times New Roman"/>
+          <w:b/>
+          <w:bCs/>
+          <w:sz w:val="24"/>
+          <w:szCs w:val="24"/>
         </w:rPr>
         <w:drawing>
           <wp:inline distT="0" distB="0" distL="0" distR="0" wp14:anchorId="3BAA85B6" wp14:editId="33322C97">
@@ -3960,63 +4126,101 @@
     </w:p>
     <w:p>
       <w:pPr>
-        <w:spacing w:before="150" w:after="80"/>
-        <w:rPr>
-          <w:b/>
-          <w:bCs/>
-          <w:color w:val="1F3864"/>
-          <w:sz w:val="21"/>
-          <w:szCs w:val="21"/>
-        </w:rPr>
-      </w:pPr>
-    </w:p>
-    <w:p>
-      <w:pPr>
-        <w:spacing w:before="150" w:after="80"/>
-        <w:rPr>
-          <w:rFonts w:ascii="Consolas" w:eastAsia="Consolas" w:hAnsi="Consolas" w:cs="Consolas"/>
-          <w:color w:val="D4D4D4"/>
-          <w:sz w:val="18"/>
-          <w:szCs w:val="18"/>
-        </w:rPr>
-      </w:pPr>
-      <w:r>
-        <w:rPr>
-          <w:b/>
-          <w:bCs/>
-          <w:color w:val="1F3864"/>
-          <w:sz w:val="21"/>
-          <w:szCs w:val="21"/>
-        </w:rPr>
-        <w:t>d) Trier :</w:t>
-      </w:r>
-      <w:r>
-        <w:rPr>
-          <w:rFonts w:ascii="Consolas" w:eastAsia="Consolas" w:hAnsi="Consolas" w:cs="Consolas"/>
-          <w:color w:val="D4D4D4"/>
-          <w:sz w:val="18"/>
-          <w:szCs w:val="18"/>
+        <w:spacing w:before="150" w:after="80" w:line="360" w:lineRule="auto"/>
+        <w:rPr>
+          <w:rFonts w:ascii="Times New Roman" w:hAnsi="Times New Roman" w:cs="Times New Roman"/>
+          <w:b/>
+          <w:bCs/>
+          <w:sz w:val="24"/>
+          <w:szCs w:val="24"/>
+        </w:rPr>
+      </w:pPr>
+    </w:p>
+    <w:p>
+      <w:pPr>
+        <w:pStyle w:val="Paragraphedeliste"/>
+        <w:numPr>
+          <w:ilvl w:val="0"/>
+          <w:numId w:val="9"/>
+        </w:numPr>
+        <w:spacing w:before="150" w:after="80" w:line="360" w:lineRule="auto"/>
+        <w:rPr>
+          <w:rFonts w:ascii="Times New Roman" w:eastAsia="Consolas" w:hAnsi="Times New Roman" w:cs="Times New Roman"/>
+          <w:sz w:val="24"/>
+          <w:szCs w:val="24"/>
+        </w:rPr>
+      </w:pPr>
+      <w:r>
+        <w:rPr>
+          <w:rFonts w:ascii="Times New Roman" w:hAnsi="Times New Roman" w:cs="Times New Roman"/>
+          <w:b/>
+          <w:bCs/>
+          <w:sz w:val="24"/>
+          <w:szCs w:val="24"/>
+        </w:rPr>
+        <w:t>Trier :</w:t>
+      </w:r>
+      <w:r>
+        <w:rPr>
+          <w:rFonts w:ascii="Times New Roman" w:eastAsia="Consolas" w:hAnsi="Times New Roman" w:cs="Times New Roman"/>
+          <w:sz w:val="24"/>
+          <w:szCs w:val="24"/>
         </w:rPr>
         <w:t xml:space="preserve"> </w:t>
       </w:r>
     </w:p>
     <w:p>
       <w:pPr>
-        <w:spacing w:before="150" w:after="80"/>
-        <w:rPr>
-          <w:rFonts w:ascii="Consolas" w:eastAsia="Consolas" w:hAnsi="Consolas" w:cs="Consolas"/>
-          <w:color w:val="D4D4D4"/>
-          <w:sz w:val="18"/>
-          <w:szCs w:val="18"/>
-        </w:rPr>
-      </w:pPr>
-      <w:r>
-        <w:rPr>
-          <w:rFonts w:ascii="Consolas" w:eastAsia="Consolas" w:hAnsi="Consolas" w:cs="Consolas"/>
-          <w:color w:val="D4D4D4"/>
-          <w:sz w:val="18"/>
-          <w:szCs w:val="18"/>
-        </w:rPr>
+        <w:spacing w:before="150" w:after="80" w:line="360" w:lineRule="auto"/>
+        <w:ind w:left="360"/>
+        <w:rPr>
+          <w:rFonts w:ascii="Times New Roman" w:eastAsia="Consolas" w:hAnsi="Times New Roman" w:cs="Times New Roman"/>
+          <w:sz w:val="24"/>
+          <w:szCs w:val="24"/>
+        </w:rPr>
+      </w:pPr>
+      <w:r>
+        <w:rPr>
+          <w:rFonts w:ascii="Times New Roman" w:hAnsi="Times New Roman" w:cs="Times New Roman"/>
+          <w:sz w:val="24"/>
+          <w:szCs w:val="24"/>
+        </w:rPr>
+        <w:t xml:space="preserve">Réorganisation des éléments de la liste selon l'ordre alphabétique des noms à l'aide d'une fonction </w:t>
+      </w:r>
+      <w:r>
+        <w:rPr>
+          <w:rStyle w:val="CodeHTML"/>
+          <w:rFonts w:ascii="Times New Roman" w:eastAsia="Calibri" w:hAnsi="Times New Roman" w:cs="Times New Roman"/>
+          <w:sz w:val="24"/>
+          <w:szCs w:val="24"/>
+        </w:rPr>
+        <w:t>lambda</w:t>
+      </w:r>
+      <w:r>
+        <w:rPr>
+          <w:rFonts w:ascii="Times New Roman" w:hAnsi="Times New Roman" w:cs="Times New Roman"/>
+          <w:sz w:val="24"/>
+          <w:szCs w:val="24"/>
+        </w:rPr>
+        <w:t>.</w:t>
+      </w:r>
+    </w:p>
+    <w:p>
+      <w:pPr>
+        <w:spacing w:before="150" w:after="80" w:line="360" w:lineRule="auto"/>
+        <w:rPr>
+          <w:rFonts w:ascii="Times New Roman" w:eastAsia="Consolas" w:hAnsi="Times New Roman" w:cs="Times New Roman"/>
+          <w:sz w:val="24"/>
+          <w:szCs w:val="24"/>
+        </w:rPr>
+      </w:pPr>
+      <w:r>
+        <w:rPr>
+          <w:rFonts w:ascii="Times New Roman" w:eastAsia="Consolas" w:hAnsi="Times New Roman" w:cs="Times New Roman"/>
+          <w:sz w:val="24"/>
+          <w:szCs w:val="24"/>
+        </w:rPr>
+        <w:lastRenderedPageBreak/>
         <w:drawing>
           <wp:inline distT="0" distB="0" distL="0" distR="0" wp14:anchorId="751C2E41" wp14:editId="427D616E">
             <wp:extent cx="6400800" cy="1583690"/>
@@ -4056,36 +4260,45 @@
     </w:p>
     <w:p>
       <w:pPr>
-        <w:spacing w:before="150" w:after="80"/>
-        <w:rPr>
-          <w:rFonts w:ascii="Consolas" w:eastAsia="Consolas" w:hAnsi="Consolas" w:cs="Consolas"/>
-          <w:color w:val="D4D4D4"/>
-          <w:sz w:val="18"/>
-          <w:szCs w:val="18"/>
-        </w:rPr>
-      </w:pPr>
-    </w:p>
-    <w:p>
-      <w:pPr>
-        <w:spacing w:before="150" w:after="80"/>
-      </w:pPr>
-      <w:r>
-        <w:rPr>
-          <w:b/>
-          <w:bCs/>
-          <w:color w:val="1F3864"/>
-          <w:sz w:val="21"/>
-          <w:szCs w:val="21"/>
+        <w:spacing w:before="150" w:after="80" w:line="360" w:lineRule="auto"/>
+        <w:rPr>
+          <w:rFonts w:ascii="Times New Roman" w:eastAsia="Consolas" w:hAnsi="Times New Roman" w:cs="Times New Roman"/>
+          <w:sz w:val="24"/>
+          <w:szCs w:val="24"/>
+        </w:rPr>
+      </w:pPr>
+    </w:p>
+    <w:p>
+      <w:pPr>
+        <w:spacing w:before="150" w:after="80" w:line="360" w:lineRule="auto"/>
+        <w:rPr>
+          <w:rFonts w:ascii="Times New Roman" w:hAnsi="Times New Roman" w:cs="Times New Roman"/>
+          <w:sz w:val="24"/>
+          <w:szCs w:val="24"/>
+        </w:rPr>
+      </w:pPr>
+      <w:r>
+        <w:rPr>
+          <w:rFonts w:ascii="Times New Roman" w:hAnsi="Times New Roman" w:cs="Times New Roman"/>
+          <w:b/>
+          <w:bCs/>
+          <w:sz w:val="24"/>
+          <w:szCs w:val="24"/>
         </w:rPr>
         <w:t>Résultat à l'exécution (ajout de 2 datasets, tri, recherche, modification, suppression) :</w:t>
       </w:r>
       <w:r>
+        <w:rPr>
+          <w:rFonts w:ascii="Times New Roman" w:hAnsi="Times New Roman" w:cs="Times New Roman"/>
+          <w:sz w:val="24"/>
+          <w:szCs w:val="24"/>
+        </w:rPr>
         <w:t xml:space="preserve"> </w:t>
       </w:r>
     </w:p>
     <w:p>
       <w:pPr>
-        <w:spacing w:before="150" w:after="80"/>
+        <w:spacing w:before="150" w:after="80" w:line="360" w:lineRule="auto"/>
         <w:rPr>
           <w:rFonts w:ascii="Times New Roman" w:hAnsi="Times New Roman" w:cs="Times New Roman"/>
           <w:sz w:val="24"/>
@@ -4189,6 +4402,1027 @@
     </w:p>
     <w:p>
       <w:pPr>
+        <w:spacing w:before="150" w:after="80" w:line="360" w:lineRule="auto"/>
+        <w:rPr>
+          <w:rFonts w:ascii="Times New Roman" w:hAnsi="Times New Roman" w:cs="Times New Roman"/>
+          <w:sz w:val="24"/>
+          <w:szCs w:val="24"/>
+        </w:rPr>
+      </w:pPr>
+      <w:r>
+        <w:rPr>
+          <w:rFonts w:ascii="Times New Roman" w:hAnsi="Times New Roman" w:cs="Times New Roman"/>
+          <w:sz w:val="24"/>
+          <w:szCs w:val="24"/>
+        </w:rPr>
+        <w:t>Les tests d'exécution dans le terminal confirment le bon fonctionnement de la gestion de la liste</w:t>
+      </w:r>
+    </w:p>
+    <w:p>
+      <w:pPr>
+        <w:spacing w:before="150" w:after="80" w:line="360" w:lineRule="auto"/>
+        <w:rPr>
+          <w:rStyle w:val="CodeHTML"/>
+          <w:rFonts w:ascii="Times New Roman" w:eastAsia="Calibri" w:hAnsi="Times New Roman" w:cs="Times New Roman"/>
+          <w:sz w:val="24"/>
+          <w:szCs w:val="24"/>
+        </w:rPr>
+      </w:pPr>
+      <w:r>
+        <w:rPr>
+          <w:rFonts w:ascii="Times New Roman" w:hAnsi="Times New Roman" w:cs="Times New Roman"/>
+          <w:b/>
+          <w:bCs/>
+          <w:sz w:val="24"/>
+          <w:szCs w:val="24"/>
+        </w:rPr>
+        <w:t>Tri &amp; Modification :</w:t>
+      </w:r>
+      <w:r>
+        <w:rPr>
+          <w:rFonts w:ascii="Times New Roman" w:hAnsi="Times New Roman" w:cs="Times New Roman"/>
+          <w:sz w:val="24"/>
+          <w:szCs w:val="24"/>
+        </w:rPr>
+        <w:t xml:space="preserve"> Après l'ajout de plusieurs datasets (</w:t>
+      </w:r>
+      <w:r>
+        <w:rPr>
+          <w:rStyle w:val="CodeHTML"/>
+          <w:rFonts w:ascii="Times New Roman" w:eastAsia="Calibri" w:hAnsi="Times New Roman" w:cs="Times New Roman"/>
+          <w:sz w:val="24"/>
+          <w:szCs w:val="24"/>
+        </w:rPr>
+        <w:t>Iris</w:t>
+      </w:r>
+      <w:r>
+        <w:rPr>
+          <w:rFonts w:ascii="Times New Roman" w:hAnsi="Times New Roman" w:cs="Times New Roman"/>
+          <w:sz w:val="24"/>
+          <w:szCs w:val="24"/>
+        </w:rPr>
+        <w:t xml:space="preserve"> et </w:t>
+      </w:r>
+      <w:r>
+        <w:rPr>
+          <w:rStyle w:val="CodeHTML"/>
+          <w:rFonts w:ascii="Times New Roman" w:eastAsia="Calibri" w:hAnsi="Times New Roman" w:cs="Times New Roman"/>
+          <w:sz w:val="24"/>
+          <w:szCs w:val="24"/>
+        </w:rPr>
+        <w:t>Titanic</w:t>
+      </w:r>
+      <w:r>
+        <w:rPr>
+          <w:rFonts w:ascii="Times New Roman" w:hAnsi="Times New Roman" w:cs="Times New Roman"/>
+          <w:sz w:val="24"/>
+          <w:szCs w:val="24"/>
+        </w:rPr>
+        <w:t xml:space="preserve">), l'application applique le tri par nom, puis permet de modifier l'attribut </w:t>
+      </w:r>
+      <w:r>
+        <w:rPr>
+          <w:rStyle w:val="CodeHTML"/>
+          <w:rFonts w:ascii="Times New Roman" w:eastAsia="Calibri" w:hAnsi="Times New Roman" w:cs="Times New Roman"/>
+          <w:sz w:val="24"/>
+          <w:szCs w:val="24"/>
+        </w:rPr>
+        <w:t>nom</w:t>
+      </w:r>
+      <w:r>
+        <w:rPr>
+          <w:rFonts w:ascii="Times New Roman" w:hAnsi="Times New Roman" w:cs="Times New Roman"/>
+          <w:sz w:val="24"/>
+          <w:szCs w:val="24"/>
+        </w:rPr>
+        <w:t xml:space="preserve"> du dataset </w:t>
+      </w:r>
+      <w:r>
+        <w:rPr>
+          <w:rStyle w:val="CodeHTML"/>
+          <w:rFonts w:ascii="Times New Roman" w:eastAsia="Calibri" w:hAnsi="Times New Roman" w:cs="Times New Roman"/>
+          <w:sz w:val="24"/>
+          <w:szCs w:val="24"/>
+        </w:rPr>
+        <w:t>Iris</w:t>
+      </w:r>
+      <w:r>
+        <w:rPr>
+          <w:rFonts w:ascii="Times New Roman" w:hAnsi="Times New Roman" w:cs="Times New Roman"/>
+          <w:sz w:val="24"/>
+          <w:szCs w:val="24"/>
+        </w:rPr>
+        <w:t xml:space="preserve"> en </w:t>
+      </w:r>
+      <w:r>
+        <w:rPr>
+          <w:rStyle w:val="CodeHTML"/>
+          <w:rFonts w:ascii="Times New Roman" w:eastAsia="Calibri" w:hAnsi="Times New Roman" w:cs="Times New Roman"/>
+          <w:sz w:val="24"/>
+          <w:szCs w:val="24"/>
+        </w:rPr>
+        <w:t>I-Sante</w:t>
+      </w:r>
+    </w:p>
+    <w:p>
+      <w:pPr>
+        <w:spacing w:line="360" w:lineRule="auto"/>
+        <w:rPr>
+          <w:rFonts w:ascii="Times New Roman" w:eastAsia="Times New Roman" w:hAnsi="Times New Roman" w:cs="Times New Roman"/>
+          <w:sz w:val="24"/>
+          <w:szCs w:val="24"/>
+        </w:rPr>
+      </w:pPr>
+      <w:r>
+        <w:rPr>
+          <w:rFonts w:ascii="Times New Roman" w:eastAsia="Times New Roman" w:hAnsi="Times New Roman" w:cs="Times New Roman"/>
+          <w:b/>
+          <w:bCs/>
+          <w:sz w:val="24"/>
+          <w:szCs w:val="24"/>
+        </w:rPr>
+        <w:t>Suppression :</w:t>
+      </w:r>
+      <w:r>
+        <w:rPr>
+          <w:rFonts w:ascii="Times New Roman" w:eastAsia="Times New Roman" w:hAnsi="Times New Roman" w:cs="Times New Roman"/>
+          <w:sz w:val="24"/>
+          <w:szCs w:val="24"/>
+        </w:rPr>
+        <w:t xml:space="preserve"> Le dataset Titanic est sélectionné et retiré du catalogue. L'affichage récapitulatif confirme qu'il ne reste plus que le dataset I-Sante dans la liste. </w:t>
+      </w:r>
+    </w:p>
+    <w:p>
+      <w:pPr>
+        <w:spacing w:line="360" w:lineRule="auto"/>
+        <w:rPr>
+          <w:rFonts w:ascii="Times New Roman" w:eastAsia="Times New Roman" w:hAnsi="Times New Roman" w:cs="Times New Roman"/>
+          <w:sz w:val="24"/>
+          <w:szCs w:val="24"/>
+        </w:rPr>
+      </w:pPr>
+    </w:p>
+    <w:p>
+      <w:pPr>
+        <w:pStyle w:val="lev1"/>
+        <w:spacing w:line="360" w:lineRule="auto"/>
+        <w:rPr>
+          <w:rFonts w:ascii="Times New Roman" w:hAnsi="Times New Roman" w:cs="Times New Roman"/>
+          <w:sz w:val="24"/>
+          <w:szCs w:val="24"/>
+        </w:rPr>
+      </w:pPr>
+      <w:r>
+        <w:rPr>
+          <w:rFonts w:ascii="Times New Roman" w:hAnsi="Times New Roman" w:cs="Times New Roman"/>
+          <w:sz w:val="24"/>
+          <w:szCs w:val="24"/>
+        </w:rPr>
+        <w:t>Résumé des fonctions et concepts utilisés (Partie 5)</w:t>
+      </w:r>
+    </w:p>
+    <w:p>
+      <w:pPr>
+        <w:pStyle w:val="NormalWeb"/>
+        <w:numPr>
+          <w:ilvl w:val="0"/>
+          <w:numId w:val="10"/>
+        </w:numPr>
+        <w:spacing w:before="0" w:beforeAutospacing="0" w:line="360" w:lineRule="auto"/>
+      </w:pPr>
+      <w:r>
+        <w:rPr>
+          <w:b/>
+          <w:bCs/>
+        </w:rPr>
+        <w:t>Liste (</w:t>
+      </w:r>
+      <w:r>
+        <w:rPr>
+          <w:rStyle w:val="CodeHTML"/>
+          <w:rFonts w:ascii="Times New Roman" w:hAnsi="Times New Roman" w:cs="Times New Roman"/>
+          <w:b/>
+          <w:bCs/>
+          <w:sz w:val="24"/>
+          <w:szCs w:val="24"/>
+        </w:rPr>
+        <w:t>[...]</w:t>
+      </w:r>
+      <w:r>
+        <w:rPr>
+          <w:b/>
+          <w:bCs/>
+        </w:rPr>
+        <w:t>) :</w:t>
+      </w:r>
+      <w:r>
+        <w:t xml:space="preserve"> Structure de données séquentielle et modifiable (mutable) servant à stocker dynamiquement une collection d'objets (ici, les dictionnaires de datasets). </w:t>
+      </w:r>
+    </w:p>
+    <w:p>
+      <w:pPr>
+        <w:pStyle w:val="NormalWeb"/>
+        <w:numPr>
+          <w:ilvl w:val="0"/>
+          <w:numId w:val="10"/>
+        </w:numPr>
+        <w:spacing w:before="0" w:beforeAutospacing="0" w:line="360" w:lineRule="auto"/>
+      </w:pPr>
+      <w:r>
+        <w:rPr>
+          <w:rStyle w:val="CodeHTML"/>
+          <w:rFonts w:ascii="Times New Roman" w:hAnsi="Times New Roman" w:cs="Times New Roman"/>
+          <w:b/>
+          <w:bCs/>
+          <w:sz w:val="24"/>
+          <w:szCs w:val="24"/>
+        </w:rPr>
+        <w:t>.append()</w:t>
+      </w:r>
+      <w:r>
+        <w:rPr>
+          <w:b/>
+          <w:bCs/>
+        </w:rPr>
+        <w:t xml:space="preserve"> :</w:t>
+      </w:r>
+      <w:r>
+        <w:t xml:space="preserve"> Méthode permettant d'ajouter un nouvel élément à la fin de la liste.</w:t>
+      </w:r>
+    </w:p>
+    <w:p>
+      <w:pPr>
+        <w:pStyle w:val="NormalWeb"/>
+        <w:numPr>
+          <w:ilvl w:val="0"/>
+          <w:numId w:val="10"/>
+        </w:numPr>
+        <w:spacing w:before="0" w:beforeAutospacing="0" w:line="360" w:lineRule="auto"/>
+      </w:pPr>
+      <w:r>
+        <w:rPr>
+          <w:rStyle w:val="CodeHTML"/>
+          <w:rFonts w:ascii="Times New Roman" w:hAnsi="Times New Roman" w:cs="Times New Roman"/>
+          <w:b/>
+          <w:bCs/>
+          <w:sz w:val="24"/>
+          <w:szCs w:val="24"/>
+        </w:rPr>
+        <w:t>.remove()</w:t>
+      </w:r>
+      <w:r>
+        <w:rPr>
+          <w:b/>
+          <w:bCs/>
+        </w:rPr>
+        <w:t xml:space="preserve"> :</w:t>
+      </w:r>
+      <w:r>
+        <w:t xml:space="preserve"> Méthode permettant de supprimer la première occurrence d'un objet spécifié dans la liste. </w:t>
+      </w:r>
+    </w:p>
+    <w:p>
+      <w:pPr>
+        <w:pStyle w:val="NormalWeb"/>
+        <w:numPr>
+          <w:ilvl w:val="0"/>
+          <w:numId w:val="10"/>
+        </w:numPr>
+        <w:spacing w:before="0" w:beforeAutospacing="0" w:line="360" w:lineRule="auto"/>
+      </w:pPr>
+      <w:r>
+        <w:rPr>
+          <w:rStyle w:val="CodeHTML"/>
+          <w:rFonts w:ascii="Times New Roman" w:hAnsi="Times New Roman" w:cs="Times New Roman"/>
+          <w:b/>
+          <w:bCs/>
+          <w:sz w:val="24"/>
+          <w:szCs w:val="24"/>
+        </w:rPr>
+        <w:t>.sort(key=lambda ...)</w:t>
+      </w:r>
+      <w:r>
+        <w:rPr>
+          <w:b/>
+          <w:bCs/>
+        </w:rPr>
+        <w:t xml:space="preserve"> :</w:t>
+      </w:r>
+      <w:r>
+        <w:t xml:space="preserve"> Méthode de tri sur place de la liste utilisant une fonction anonyme </w:t>
+      </w:r>
+      <w:r>
+        <w:rPr>
+          <w:rStyle w:val="CodeHTML"/>
+          <w:rFonts w:ascii="Times New Roman" w:hAnsi="Times New Roman" w:cs="Times New Roman"/>
+          <w:sz w:val="24"/>
+          <w:szCs w:val="24"/>
+        </w:rPr>
+        <w:t>lambda</w:t>
+      </w:r>
+      <w:r>
+        <w:t xml:space="preserve"> pour spécifier la clé de comparaison (ex: </w:t>
+      </w:r>
+      <w:r>
+        <w:rPr>
+          <w:rStyle w:val="CodeHTML"/>
+          <w:rFonts w:ascii="Times New Roman" w:hAnsi="Times New Roman" w:cs="Times New Roman"/>
+          <w:sz w:val="24"/>
+          <w:szCs w:val="24"/>
+        </w:rPr>
+        <w:t>x["nom"]</w:t>
+      </w:r>
+      <w:r>
+        <w:t xml:space="preserve">). </w:t>
+      </w:r>
+    </w:p>
+    <w:p>
+      <w:pPr>
+        <w:pStyle w:val="NormalWeb"/>
+        <w:numPr>
+          <w:ilvl w:val="0"/>
+          <w:numId w:val="10"/>
+        </w:numPr>
+        <w:spacing w:before="0" w:beforeAutospacing="0" w:line="360" w:lineRule="auto"/>
+      </w:pPr>
+      <w:r>
+        <w:rPr>
+          <w:b/>
+          <w:bCs/>
+        </w:rPr>
+        <w:lastRenderedPageBreak/>
+        <w:t>Parcours de liste (</w:t>
+      </w:r>
+      <w:r>
+        <w:rPr>
+          <w:rStyle w:val="CodeHTML"/>
+          <w:rFonts w:ascii="Times New Roman" w:hAnsi="Times New Roman" w:cs="Times New Roman"/>
+          <w:b/>
+          <w:bCs/>
+          <w:sz w:val="24"/>
+          <w:szCs w:val="24"/>
+        </w:rPr>
+        <w:t>for item in liste</w:t>
+      </w:r>
+      <w:r>
+        <w:rPr>
+          <w:b/>
+          <w:bCs/>
+        </w:rPr>
+        <w:t>) :</w:t>
+      </w:r>
+      <w:r>
+        <w:t xml:space="preserve"> Boucle d'itération permettant d'examiner chaque dictionnaire un par un pour effectuer des recherches, modifications ou suppressions. </w:t>
+      </w:r>
+    </w:p>
+    <w:p>
+      <w:pPr>
+        <w:pStyle w:val="Titre1"/>
+        <w:spacing w:line="360" w:lineRule="auto"/>
+        <w:rPr>
+          <w:rFonts w:ascii="Times New Roman" w:hAnsi="Times New Roman" w:cs="Times New Roman"/>
+          <w:color w:val="auto"/>
+          <w:sz w:val="24"/>
+          <w:szCs w:val="24"/>
+        </w:rPr>
+      </w:pPr>
+      <w:r>
+        <w:rPr>
+          <w:rFonts w:ascii="Times New Roman" w:hAnsi="Times New Roman" w:cs="Times New Roman"/>
+          <w:color w:val="auto"/>
+          <w:sz w:val="24"/>
+          <w:szCs w:val="24"/>
+        </w:rPr>
+        <w:t>Partie 6 — Compréhensions (Listes et Dictionnaires)</w:t>
+      </w:r>
+    </w:p>
+    <w:p>
+      <w:pPr>
+        <w:pStyle w:val="lev1"/>
+        <w:spacing w:line="360" w:lineRule="auto"/>
+        <w:rPr>
+          <w:rFonts w:ascii="Times New Roman" w:hAnsi="Times New Roman" w:cs="Times New Roman"/>
+          <w:sz w:val="24"/>
+          <w:szCs w:val="24"/>
+        </w:rPr>
+      </w:pPr>
+      <w:r>
+        <w:rPr>
+          <w:rFonts w:ascii="Times New Roman" w:hAnsi="Times New Roman" w:cs="Times New Roman"/>
+          <w:sz w:val="24"/>
+          <w:szCs w:val="24"/>
+        </w:rPr>
+        <w:t>Cette section aborde l'utilisation des compréhensions de listes et de dictionnaires pour agréger et calculer efficacement les statistiques globales du catalogue sans utiliser de bibliothèques externes.</w:t>
+      </w:r>
+    </w:p>
+    <w:p>
+      <w:pPr>
+        <w:pStyle w:val="lev1"/>
+        <w:spacing w:line="360" w:lineRule="auto"/>
+        <w:rPr>
+          <w:rFonts w:ascii="Times New Roman" w:hAnsi="Times New Roman" w:cs="Times New Roman"/>
+          <w:sz w:val="24"/>
+          <w:szCs w:val="24"/>
+        </w:rPr>
+      </w:pPr>
+    </w:p>
+    <w:tbl>
+      <w:tblPr>
+        <w:tblW w:w="5000" w:type="pct"/>
+        <w:tblBorders>
+          <w:top w:val="single" w:sz="4" w:space="0" w:color="2E5395"/>
+          <w:left w:val="single" w:sz="4" w:space="0" w:color="2E5395"/>
+          <w:bottom w:val="single" w:sz="4" w:space="0" w:color="2E5395"/>
+          <w:right w:val="single" w:sz="4" w:space="0" w:color="2E5395"/>
+          <w:insideH w:val="single" w:sz="4" w:space="0" w:color="auto"/>
+          <w:insideV w:val="single" w:sz="4" w:space="0" w:color="auto"/>
+        </w:tblBorders>
+        <w:shd w:val="clear" w:color="auto" w:fill="FFC000" w:themeFill="accent4"/>
+        <w:tblCellMar>
+          <w:left w:w="10" w:type="dxa"/>
+          <w:right w:w="10" w:type="dxa"/>
+        </w:tblCellMar>
+        <w:tblLook w:val="04A0" w:firstRow="1" w:lastRow="0" w:firstColumn="1" w:lastColumn="0" w:noHBand="0" w:noVBand="1"/>
+      </w:tblPr>
+      <w:tblGrid>
+        <w:gridCol w:w="10480"/>
+      </w:tblGrid>
+      <w:tr>
+        <w:tc>
+          <w:tcPr>
+            <w:tcW w:w="0" w:type="auto"/>
+            <w:tcBorders>
+              <w:top w:val="single" w:sz="4" w:space="0" w:color="2E5395"/>
+              <w:left w:val="single" w:sz="4" w:space="0" w:color="2E5395"/>
+              <w:bottom w:val="single" w:sz="4" w:space="0" w:color="2E5395"/>
+              <w:right w:val="single" w:sz="4" w:space="0" w:color="2E5395"/>
+            </w:tcBorders>
+            <w:shd w:val="clear" w:color="auto" w:fill="FFC000" w:themeFill="accent4"/>
+            <w:tcMar>
+              <w:top w:w="150" w:type="dxa"/>
+              <w:left w:w="200" w:type="dxa"/>
+              <w:bottom w:w="150" w:type="dxa"/>
+              <w:right w:w="200" w:type="dxa"/>
+            </w:tcMar>
+            <w:hideMark/>
+          </w:tcPr>
+          <w:p>
+            <w:pPr>
+              <w:spacing w:line="360" w:lineRule="auto"/>
+              <w:rPr>
+                <w:rFonts w:ascii="Times New Roman" w:hAnsi="Times New Roman" w:cs="Times New Roman"/>
+                <w:sz w:val="24"/>
+                <w:szCs w:val="24"/>
+              </w:rPr>
+            </w:pPr>
+            <w:r>
+              <w:rPr>
+                <w:rFonts w:ascii="Times New Roman" w:hAnsi="Times New Roman" w:cs="Times New Roman"/>
+                <w:b/>
+                <w:bCs/>
+                <w:sz w:val="24"/>
+                <w:szCs w:val="24"/>
+              </w:rPr>
+              <w:t xml:space="preserve">Question 11 — </w:t>
+            </w:r>
+            <w:r>
+              <w:rPr>
+                <w:rFonts w:ascii="Times New Roman" w:hAnsi="Times New Roman" w:cs="Times New Roman"/>
+                <w:i/>
+                <w:iCs/>
+                <w:sz w:val="24"/>
+                <w:szCs w:val="24"/>
+              </w:rPr>
+              <w:t>Affich</w:t>
+            </w:r>
+            <w:r>
+              <w:rPr>
+                <w:rFonts w:ascii="Times New Roman" w:hAnsi="Times New Roman" w:cs="Times New Roman"/>
+                <w:i/>
+                <w:iCs/>
+                <w:sz w:val="24"/>
+                <w:szCs w:val="24"/>
+              </w:rPr>
+              <w:t>age</w:t>
+            </w:r>
+            <w:r>
+              <w:rPr>
+                <w:rFonts w:ascii="Times New Roman" w:hAnsi="Times New Roman" w:cs="Times New Roman"/>
+                <w:i/>
+                <w:iCs/>
+                <w:sz w:val="24"/>
+                <w:szCs w:val="24"/>
+              </w:rPr>
+              <w:t xml:space="preserve"> </w:t>
+            </w:r>
+            <w:r>
+              <w:rPr>
+                <w:rFonts w:ascii="Times New Roman" w:hAnsi="Times New Roman" w:cs="Times New Roman"/>
+                <w:i/>
+                <w:iCs/>
+                <w:sz w:val="24"/>
+                <w:szCs w:val="24"/>
+              </w:rPr>
+              <w:t>d</w:t>
+            </w:r>
+            <w:r>
+              <w:rPr>
+                <w:rFonts w:ascii="Times New Roman" w:hAnsi="Times New Roman" w:cs="Times New Roman"/>
+                <w:i/>
+                <w:iCs/>
+                <w:sz w:val="24"/>
+                <w:szCs w:val="24"/>
+              </w:rPr>
+              <w:t>es statistiques : nombre de datasets, nombre total de lignes, nombre moyen de colonnes, datasets publics/privés, répartition par format et par domaine.</w:t>
+            </w:r>
+          </w:p>
+        </w:tc>
+      </w:tr>
+    </w:tbl>
+    <w:p>
+      <w:pPr>
+        <w:spacing w:after="150" w:line="360" w:lineRule="auto"/>
+        <w:rPr>
+          <w:rFonts w:ascii="Times New Roman" w:hAnsi="Times New Roman" w:cs="Times New Roman"/>
+          <w:sz w:val="24"/>
+          <w:szCs w:val="24"/>
+        </w:rPr>
+      </w:pPr>
+      <w:r>
+        <w:rPr>
+          <w:rFonts w:ascii="Times New Roman" w:hAnsi="Times New Roman" w:cs="Times New Roman"/>
+          <w:sz w:val="24"/>
+          <w:szCs w:val="24"/>
+        </w:rPr>
+        <w:t xml:space="preserve"> </w:t>
+      </w:r>
+    </w:p>
+    <w:p>
+      <w:pPr>
+        <w:spacing w:after="150" w:line="360" w:lineRule="auto"/>
+        <w:rPr>
+          <w:rFonts w:ascii="Times New Roman" w:hAnsi="Times New Roman" w:cs="Times New Roman"/>
+          <w:sz w:val="24"/>
+          <w:szCs w:val="24"/>
+        </w:rPr>
+      </w:pPr>
+      <w:r>
+        <w:rPr>
+          <w:rFonts w:ascii="Times New Roman" w:hAnsi="Times New Roman" w:cs="Times New Roman"/>
+          <w:sz w:val="24"/>
+          <w:szCs w:val="24"/>
+        </w:rPr>
+        <w:t>Mise en place d'une nouvelle option dans le menu pour calculer et afficher un rapport complet sur le catalogue : nombre total de datasets, nombre total de lignes, nombre moyen de colonnes, datasets publics/privés, ainsi que la répartition par format et par domaine.</w:t>
+      </w:r>
+    </w:p>
+    <w:p>
+      <w:pPr>
+        <w:spacing w:before="150" w:after="80" w:line="360" w:lineRule="auto"/>
+        <w:rPr>
+          <w:rFonts w:ascii="Times New Roman" w:hAnsi="Times New Roman" w:cs="Times New Roman"/>
+          <w:sz w:val="24"/>
+          <w:szCs w:val="24"/>
+        </w:rPr>
+      </w:pPr>
+      <w:r>
+        <w:rPr>
+          <w:rFonts w:ascii="Times New Roman" w:hAnsi="Times New Roman" w:cs="Times New Roman"/>
+          <w:b/>
+          <w:bCs/>
+          <w:sz w:val="24"/>
+          <w:szCs w:val="24"/>
+        </w:rPr>
+        <w:t>Code (main.py) :</w:t>
+      </w:r>
+      <w:r>
+        <w:rPr>
+          <w:rFonts w:ascii="Times New Roman" w:hAnsi="Times New Roman" w:cs="Times New Roman"/>
+          <w:sz w:val="24"/>
+          <w:szCs w:val="24"/>
+        </w:rPr>
+        <w:t xml:space="preserve"> </w:t>
+      </w:r>
+    </w:p>
+    <w:p>
+      <w:pPr>
+        <w:spacing w:before="150" w:after="80" w:line="360" w:lineRule="auto"/>
+        <w:rPr>
+          <w:rFonts w:ascii="Times New Roman" w:hAnsi="Times New Roman" w:cs="Times New Roman"/>
+          <w:b/>
+          <w:bCs/>
+          <w:sz w:val="24"/>
+          <w:szCs w:val="24"/>
+        </w:rPr>
+      </w:pPr>
+      <w:r>
+        <w:rPr>
+          <w:rFonts w:ascii="Times New Roman" w:hAnsi="Times New Roman" w:cs="Times New Roman"/>
+          <w:b/>
+          <w:bCs/>
+          <w:sz w:val="24"/>
+          <w:szCs w:val="24"/>
+        </w:rPr>
+        <w:drawing>
+          <wp:inline distT="0" distB="0" distL="0" distR="0" wp14:anchorId="42FCEB69" wp14:editId="46C45168">
+            <wp:extent cx="6400800" cy="3804920"/>
+            <wp:effectExtent l="0" t="0" r="0" b="0"/>
+            <wp:docPr id="330838109" name="Image 20"/>
+            <wp:cNvGraphicFramePr>
+              <a:graphicFrameLocks xmlns:a="http://schemas.openxmlformats.org/drawingml/2006/main" noChangeAspect="1"/>
+            </wp:cNvGraphicFramePr>
+            <a:graphic xmlns:a="http://schemas.openxmlformats.org/drawingml/2006/main">
+              <a:graphicData uri="http://schemas.openxmlformats.org/drawingml/2006/picture">
+                <pic:pic xmlns:pic="http://schemas.openxmlformats.org/drawingml/2006/picture">
+                  <pic:nvPicPr>
+                    <pic:cNvPr id="330838109" name=""/>
+                    <pic:cNvPicPr/>
+                  </pic:nvPicPr>
+                  <pic:blipFill>
+                    <a:blip r:embed="rId24"/>
+                    <a:stretch>
+                      <a:fillRect/>
+                    </a:stretch>
+                  </pic:blipFill>
+                  <pic:spPr>
+                    <a:xfrm>
+                      <a:off x="0" y="0"/>
+                      <a:ext cx="6400800" cy="3804920"/>
+                    </a:xfrm>
+                    <a:prstGeom prst="rect">
+                      <a:avLst/>
+                    </a:prstGeom>
+                  </pic:spPr>
+                </pic:pic>
+              </a:graphicData>
+            </a:graphic>
+          </wp:inline>
+        </w:drawing>
+      </w:r>
+    </w:p>
+    <w:p>
+      <w:pPr>
+        <w:spacing w:before="150" w:after="80" w:line="360" w:lineRule="auto"/>
+        <w:rPr>
+          <w:rFonts w:ascii="Times New Roman" w:hAnsi="Times New Roman" w:cs="Times New Roman"/>
+          <w:b/>
+          <w:bCs/>
+          <w:sz w:val="24"/>
+          <w:szCs w:val="24"/>
+        </w:rPr>
+      </w:pPr>
+      <w:r>
+        <w:rPr>
+          <w:rFonts w:ascii="Times New Roman" w:hAnsi="Times New Roman" w:cs="Times New Roman"/>
+          <w:sz w:val="24"/>
+          <w:szCs w:val="24"/>
+        </w:rPr>
+        <w:lastRenderedPageBreak/>
+        <w:t>L'extrait montre l'utilisation des compréhensions de listes associées aux fonctions d'agrégation (</w:t>
+      </w:r>
+      <w:r>
+        <w:rPr>
+          <w:rStyle w:val="CodeHTML"/>
+          <w:rFonts w:ascii="Times New Roman" w:eastAsia="Calibri" w:hAnsi="Times New Roman" w:cs="Times New Roman"/>
+          <w:sz w:val="24"/>
+          <w:szCs w:val="24"/>
+        </w:rPr>
+        <w:t>sum()</w:t>
+      </w:r>
+      <w:r>
+        <w:rPr>
+          <w:rFonts w:ascii="Times New Roman" w:hAnsi="Times New Roman" w:cs="Times New Roman"/>
+          <w:sz w:val="24"/>
+          <w:szCs w:val="24"/>
+        </w:rPr>
+        <w:t xml:space="preserve">, </w:t>
+      </w:r>
+      <w:r>
+        <w:rPr>
+          <w:rStyle w:val="CodeHTML"/>
+          <w:rFonts w:ascii="Times New Roman" w:eastAsia="Calibri" w:hAnsi="Times New Roman" w:cs="Times New Roman"/>
+          <w:sz w:val="24"/>
+          <w:szCs w:val="24"/>
+        </w:rPr>
+        <w:t>len()</w:t>
+      </w:r>
+      <w:r>
+        <w:rPr>
+          <w:rFonts w:ascii="Times New Roman" w:hAnsi="Times New Roman" w:cs="Times New Roman"/>
+          <w:sz w:val="24"/>
+          <w:szCs w:val="24"/>
+        </w:rPr>
+        <w:t>) pour calculer le total des lignes, des colonnes, de la taille, ainsi que le décompte des formats (CSV/JSON) et des statuts (public/privé). Il montre également la boucle de comptage de la répartition par domaine et l'affichage formaté du rapport.</w:t>
+      </w:r>
+    </w:p>
+    <w:p>
+      <w:pPr>
+        <w:spacing w:before="150" w:after="80" w:line="360" w:lineRule="auto"/>
+        <w:rPr>
+          <w:rFonts w:ascii="Times New Roman" w:hAnsi="Times New Roman" w:cs="Times New Roman"/>
+          <w:sz w:val="24"/>
+          <w:szCs w:val="24"/>
+        </w:rPr>
+      </w:pPr>
+      <w:r>
+        <w:rPr>
+          <w:rFonts w:ascii="Times New Roman" w:hAnsi="Times New Roman" w:cs="Times New Roman"/>
+          <w:b/>
+          <w:bCs/>
+          <w:sz w:val="24"/>
+          <w:szCs w:val="24"/>
+        </w:rPr>
+        <w:t>Résultat à l'exécution (catalogue de 2 datasets) :</w:t>
+      </w:r>
+      <w:r>
+        <w:rPr>
+          <w:rFonts w:ascii="Times New Roman" w:hAnsi="Times New Roman" w:cs="Times New Roman"/>
+          <w:sz w:val="24"/>
+          <w:szCs w:val="24"/>
+        </w:rPr>
+        <w:t xml:space="preserve"> </w:t>
+      </w:r>
+    </w:p>
+    <w:p>
+      <w:pPr>
+        <w:spacing w:before="150" w:after="80" w:line="360" w:lineRule="auto"/>
+        <w:rPr>
+          <w:rFonts w:ascii="Times New Roman" w:hAnsi="Times New Roman" w:cs="Times New Roman"/>
+          <w:sz w:val="24"/>
+          <w:szCs w:val="24"/>
+        </w:rPr>
+      </w:pPr>
+      <w:r>
+        <w:rPr>
+          <w:rFonts w:ascii="Times New Roman" w:hAnsi="Times New Roman" w:cs="Times New Roman"/>
+          <w:sz w:val="24"/>
+          <w:szCs w:val="24"/>
+        </w:rPr>
+        <w:drawing>
+          <wp:inline distT="0" distB="0" distL="0" distR="0" wp14:anchorId="67DEE9F5" wp14:editId="359B40BA">
+            <wp:extent cx="6400800" cy="3860165"/>
+            <wp:effectExtent l="0" t="0" r="0" b="0"/>
+            <wp:docPr id="1546498992" name="Image 21"/>
+            <wp:cNvGraphicFramePr>
+              <a:graphicFrameLocks xmlns:a="http://schemas.openxmlformats.org/drawingml/2006/main" noChangeAspect="1"/>
+            </wp:cNvGraphicFramePr>
+            <a:graphic xmlns:a="http://schemas.openxmlformats.org/drawingml/2006/main">
+              <a:graphicData uri="http://schemas.openxmlformats.org/drawingml/2006/picture">
+                <pic:pic xmlns:pic="http://schemas.openxmlformats.org/drawingml/2006/picture">
+                  <pic:nvPicPr>
+                    <pic:cNvPr id="1546498992" name=""/>
+                    <pic:cNvPicPr/>
+                  </pic:nvPicPr>
+                  <pic:blipFill>
+                    <a:blip r:embed="rId25"/>
+                    <a:stretch>
+                      <a:fillRect/>
+                    </a:stretch>
+                  </pic:blipFill>
+                  <pic:spPr>
+                    <a:xfrm>
+                      <a:off x="0" y="0"/>
+                      <a:ext cx="6400800" cy="3860165"/>
+                    </a:xfrm>
+                    <a:prstGeom prst="rect">
+                      <a:avLst/>
+                    </a:prstGeom>
+                  </pic:spPr>
+                </pic:pic>
+              </a:graphicData>
+            </a:graphic>
+          </wp:inline>
+        </w:drawing>
+      </w:r>
+    </w:p>
+    <w:p>
+      <w:pPr>
+        <w:spacing w:before="150" w:after="80" w:line="360" w:lineRule="auto"/>
+        <w:rPr>
+          <w:rFonts w:ascii="Times New Roman" w:hAnsi="Times New Roman" w:cs="Times New Roman"/>
+          <w:sz w:val="24"/>
+          <w:szCs w:val="24"/>
+        </w:rPr>
+      </w:pPr>
+      <w:r>
+        <w:rPr>
+          <w:rFonts w:ascii="Times New Roman" w:hAnsi="Times New Roman" w:cs="Times New Roman"/>
+          <w:sz w:val="24"/>
+          <w:szCs w:val="24"/>
+        </w:rPr>
+        <w:t>Le terminal affiche le choix de l'option 7 du menu suivi du rapport statistique détaillé d'un catalogue de 2 datasets (Transport et Agriculture), présentant le nombre total de lignes, la moyenne de colonnes (17.00), la taille totale (120.0 Mo) et la répartition par format et par domaine.</w:t>
+      </w:r>
+    </w:p>
+    <w:p>
+      <w:pPr>
+        <w:pStyle w:val="lev1"/>
+        <w:spacing w:line="360" w:lineRule="auto"/>
+        <w:rPr>
+          <w:rFonts w:ascii="Times New Roman" w:hAnsi="Times New Roman" w:cs="Times New Roman"/>
+          <w:sz w:val="24"/>
+          <w:szCs w:val="24"/>
+        </w:rPr>
+      </w:pPr>
+      <w:r>
+        <w:rPr>
+          <w:rFonts w:ascii="Times New Roman" w:hAnsi="Times New Roman" w:cs="Times New Roman"/>
+          <w:sz w:val="24"/>
+          <w:szCs w:val="24"/>
+        </w:rPr>
+        <w:t>Résumé des fonctions et concepts utilisés (Partie 6)</w:t>
+      </w:r>
+    </w:p>
+    <w:p>
+      <w:pPr>
+        <w:pStyle w:val="NormalWeb"/>
+        <w:numPr>
+          <w:ilvl w:val="0"/>
+          <w:numId w:val="11"/>
+        </w:numPr>
+        <w:spacing w:before="0" w:beforeAutospacing="0" w:line="360" w:lineRule="auto"/>
+      </w:pPr>
+      <w:r>
+        <w:rPr>
+          <w:b/>
+          <w:bCs/>
+        </w:rPr>
+        <w:t>Compréhension de liste (</w:t>
+      </w:r>
+      <w:r>
+        <w:rPr>
+          <w:rStyle w:val="CodeHTML"/>
+          <w:rFonts w:ascii="Times New Roman" w:hAnsi="Times New Roman" w:cs="Times New Roman"/>
+          <w:b/>
+          <w:bCs/>
+          <w:sz w:val="24"/>
+          <w:szCs w:val="24"/>
+        </w:rPr>
+        <w:t>[expr for item in iterable if cond]</w:t>
+      </w:r>
+      <w:r>
+        <w:rPr>
+          <w:b/>
+          <w:bCs/>
+        </w:rPr>
+        <w:t>) :</w:t>
+      </w:r>
+      <w:r>
+        <w:t xml:space="preserve"> Permet de créer, filtrer ou parcourir des collections de données de façon concise et optimisée. </w:t>
+      </w:r>
+    </w:p>
+    <w:p>
+      <w:pPr>
+        <w:pStyle w:val="NormalWeb"/>
+        <w:numPr>
+          <w:ilvl w:val="0"/>
+          <w:numId w:val="11"/>
+        </w:numPr>
+        <w:spacing w:before="0" w:beforeAutospacing="0" w:line="360" w:lineRule="auto"/>
+      </w:pPr>
+      <w:r>
+        <w:rPr>
+          <w:b/>
+          <w:bCs/>
+        </w:rPr>
+        <w:t>Fonctions d'agrégation (</w:t>
+      </w:r>
+      <w:r>
+        <w:rPr>
+          <w:rStyle w:val="CodeHTML"/>
+          <w:rFonts w:ascii="Times New Roman" w:hAnsi="Times New Roman" w:cs="Times New Roman"/>
+          <w:b/>
+          <w:bCs/>
+          <w:sz w:val="24"/>
+          <w:szCs w:val="24"/>
+        </w:rPr>
+        <w:t>sum()</w:t>
+      </w:r>
+      <w:r>
+        <w:rPr>
+          <w:b/>
+          <w:bCs/>
+        </w:rPr>
+        <w:t xml:space="preserve">, </w:t>
+      </w:r>
+      <w:r>
+        <w:rPr>
+          <w:rStyle w:val="CodeHTML"/>
+          <w:rFonts w:ascii="Times New Roman" w:hAnsi="Times New Roman" w:cs="Times New Roman"/>
+          <w:b/>
+          <w:bCs/>
+          <w:sz w:val="24"/>
+          <w:szCs w:val="24"/>
+        </w:rPr>
+        <w:t>len()</w:t>
+      </w:r>
+      <w:r>
+        <w:rPr>
+          <w:b/>
+          <w:bCs/>
+        </w:rPr>
+        <w:t>) :</w:t>
+      </w:r>
+      <w:r>
+        <w:t xml:space="preserve"> Utilisées conjointement avec des compréhensions pour calculer dynamiquement les totaux (lignes, taille Mo) et le nombre d'éléments filtrés. </w:t>
+      </w:r>
+    </w:p>
+    <w:p>
+      <w:pPr>
+        <w:pStyle w:val="NormalWeb"/>
+        <w:numPr>
+          <w:ilvl w:val="0"/>
+          <w:numId w:val="11"/>
+        </w:numPr>
+        <w:spacing w:before="0" w:beforeAutospacing="0" w:line="360" w:lineRule="auto"/>
+      </w:pPr>
+      <w:r>
+        <w:rPr>
+          <w:b/>
+          <w:bCs/>
+        </w:rPr>
+        <w:t>Formatage d'affichage (</w:t>
+      </w:r>
+      <w:r>
+        <w:rPr>
+          <w:rStyle w:val="CodeHTML"/>
+          <w:rFonts w:ascii="Times New Roman" w:hAnsi="Times New Roman" w:cs="Times New Roman"/>
+          <w:b/>
+          <w:bCs/>
+          <w:sz w:val="24"/>
+          <w:szCs w:val="24"/>
+        </w:rPr>
+        <w:t>:.2f</w:t>
+      </w:r>
+      <w:r>
+        <w:rPr>
+          <w:b/>
+          <w:bCs/>
+        </w:rPr>
+        <w:t>) :</w:t>
+      </w:r>
+      <w:r>
+        <w:t xml:space="preserve"> Permet d'arrondir le résultat des calculs flottants (comme la moyenne des colonnes) à deux chiffres après la virgule. </w:t>
+      </w:r>
+    </w:p>
+    <w:p>
+      <w:pPr>
+        <w:pStyle w:val="NormalWeb"/>
+        <w:numPr>
+          <w:ilvl w:val="0"/>
+          <w:numId w:val="11"/>
+        </w:numPr>
+        <w:spacing w:before="0" w:beforeAutospacing="0" w:line="360" w:lineRule="auto"/>
+      </w:pPr>
+      <w:r>
+        <w:rPr>
+          <w:b/>
+          <w:bCs/>
+        </w:rPr>
+        <w:t>Comptage par dictionnaire (</w:t>
+      </w:r>
+      <w:r>
+        <w:rPr>
+          <w:rStyle w:val="CodeHTML"/>
+          <w:rFonts w:ascii="Times New Roman" w:hAnsi="Times New Roman" w:cs="Times New Roman"/>
+          <w:b/>
+          <w:bCs/>
+          <w:sz w:val="24"/>
+          <w:szCs w:val="24"/>
+        </w:rPr>
+        <w:t>dict.items()</w:t>
+      </w:r>
+      <w:r>
+        <w:rPr>
+          <w:b/>
+          <w:bCs/>
+        </w:rPr>
+        <w:t>) :</w:t>
+      </w:r>
+      <w:r>
+        <w:t xml:space="preserve"> Technique pour accumuler la fréquence des domaines et itérer sur les couples clé-valeur lors de l'affichage. </w:t>
+      </w:r>
+    </w:p>
+    <w:p>
+      <w:pPr>
+        <w:spacing w:before="150" w:after="80" w:line="360" w:lineRule="auto"/>
+        <w:rPr>
+          <w:rFonts w:ascii="Times New Roman" w:hAnsi="Times New Roman" w:cs="Times New Roman"/>
+          <w:sz w:val="24"/>
+          <w:szCs w:val="24"/>
+        </w:rPr>
+      </w:pPr>
+    </w:p>
+    <w:p>
+      <w:pPr>
+        <w:spacing w:before="150" w:after="80" w:line="360" w:lineRule="auto"/>
+        <w:rPr>
+          <w:rFonts w:ascii="Times New Roman" w:hAnsi="Times New Roman" w:cs="Times New Roman"/>
+          <w:sz w:val="24"/>
+          <w:szCs w:val="24"/>
+        </w:rPr>
+      </w:pPr>
+    </w:p>
+    <w:p>
+      <w:pPr>
         <w:spacing w:line="360" w:lineRule="auto"/>
         <w:rPr>
           <w:rFonts w:ascii="Times New Roman" w:eastAsia="Times New Roman" w:hAnsi="Times New Roman" w:cs="Times New Roman"/>
@@ -4277,6 +5511,155 @@
 <file path=word/numbering.xml><?xml version="1.0" encoding="utf-8"?>
 <w:numbering xmlns:wpc="http://schemas.microsoft.com/office/word/2010/wordprocessingCanvas" xmlns:cx="http://schemas.microsoft.com/office/drawing/2014/chartex" xmlns:cx1="http://schemas.microsoft.com/office/drawing/2015/9/8/chartex" xmlns:cx2="http://schemas.microsoft.com/office/drawing/2015/10/21/chartex" xmlns:cx3="http://schemas.microsoft.com/office/drawing/2016/5/9/chartex" xmlns:cx4="http://schemas.microsoft.com/office/drawing/2016/5/10/chartex" xmlns:cx5="http://schemas.microsoft.com/office/drawing/2016/5/11/chartex" xmlns:cx6="http://schemas.microsoft.com/office/drawing/2016/5/12/chartex" xmlns:cx7="http://schemas.microsoft.com/office/drawing/2016/5/13/chartex" xmlns:cx8="http://schemas.microsoft.com/office/drawing/2016/5/14/chartex" xmlns:mc="http://schemas.openxmlformats.org/markup-compatibility/2006" xmlns:aink="http://schemas.microsoft.com/office/drawing/2016/ink" xmlns:am3d="http://schemas.microsoft.com/office/drawing/2017/model3d" xmlns:o="urn:schemas-microsoft-com:office:office" xmlns:oel="http://schemas.microsoft.com/office/2019/extlst" xmlns:r="http://schemas.openxmlformats.org/officeDocument/2006/relationships" xmlns:m="http://schemas.openxmlformats.org/officeDocument/2006/math" xmlns:v="urn:schemas-microsoft-com:vml" xmlns:wp14="http://schemas.microsoft.com/office/word/2010/wordprocessingDrawing" xmlns:wp="http://schemas.openxmlformats.org/drawingml/2006/wordprocessingDrawing" xmlns:w10="urn:schemas-microsoft-com:office:word" xmlns:w="http://schemas.openxmlformats.org/wordprocessingml/2006/main" xmlns:w14="http://schemas.microsoft.com/office/word/2010/wordml" xmlns:w15="http://schemas.microsoft.com/office/word/2012/wordml" xmlns:w16cex="http://schemas.microsoft.com/office/word/2018/wordml/cex" xmlns:w16cid="http://schemas.microsoft.com/office/word/2016/wordml/cid" xmlns:w16="http://schemas.microsoft.com/office/word/2018/wordml" xmlns:w16sdtdh="http://schemas.microsoft.com/office/word/2020/wordml/sdtdatahash" xmlns:w16se="http://schemas.microsoft.com/office/word/2015/wordml/symex" xmlns:wpg="http://schemas.microsoft.com/office/word/2010/wordprocessingGroup" xmlns:wpi="http://schemas.microsoft.com/office/word/2010/wordprocessingInk" xmlns:wne="http://schemas.microsoft.com/office/word/2006/wordml" xmlns:wps="http://schemas.microsoft.com/office/word/2010/wordprocessingShape" mc:Ignorable="w14 w15 w16se w16cid w16 w16cex w16sdtdh wp14">
   <w:abstractNum w:abstractNumId="0" w15:restartNumberingAfterBreak="0">
+    <w:nsid w:val="077A0815"/>
+    <w:multiLevelType w:val="multilevel"/>
+    <w:tmpl w:val="94029292"/>
+    <w:lvl w:ilvl="0">
+      <w:start w:val="1"/>
+      <w:numFmt w:val="bullet"/>
+      <w:lvlText w:val=""/>
+      <w:lvlJc w:val="left"/>
+      <w:pPr>
+        <w:tabs>
+          <w:tab w:val="num" w:pos="720"/>
+        </w:tabs>
+        <w:ind w:left="720" w:hanging="360"/>
+      </w:pPr>
+      <w:rPr>
+        <w:rFonts w:ascii="Symbol" w:hAnsi="Symbol" w:hint="default"/>
+        <w:sz w:val="20"/>
+      </w:rPr>
+    </w:lvl>
+    <w:lvl w:ilvl="1" w:tentative="1">
+      <w:start w:val="1"/>
+      <w:numFmt w:val="bullet"/>
+      <w:lvlText w:val="o"/>
+      <w:lvlJc w:val="left"/>
+      <w:pPr>
+        <w:tabs>
+          <w:tab w:val="num" w:pos="1440"/>
+        </w:tabs>
+        <w:ind w:left="1440" w:hanging="360"/>
+      </w:pPr>
+      <w:rPr>
+        <w:rFonts w:ascii="Courier New" w:hAnsi="Courier New" w:hint="default"/>
+        <w:sz w:val="20"/>
+      </w:rPr>
+    </w:lvl>
+    <w:lvl w:ilvl="2" w:tentative="1">
+      <w:start w:val="1"/>
+      <w:numFmt w:val="bullet"/>
+      <w:lvlText w:val=""/>
+      <w:lvlJc w:val="left"/>
+      <w:pPr>
+        <w:tabs>
+          <w:tab w:val="num" w:pos="2160"/>
+        </w:tabs>
+        <w:ind w:left="2160" w:hanging="360"/>
+      </w:pPr>
+      <w:rPr>
+        <w:rFonts w:ascii="Wingdings" w:hAnsi="Wingdings" w:hint="default"/>
+        <w:sz w:val="20"/>
+      </w:rPr>
+    </w:lvl>
+    <w:lvl w:ilvl="3" w:tentative="1">
+      <w:start w:val="1"/>
+      <w:numFmt w:val="bullet"/>
+      <w:lvlText w:val=""/>
+      <w:lvlJc w:val="left"/>
+      <w:pPr>
+        <w:tabs>
+          <w:tab w:val="num" w:pos="2880"/>
+        </w:tabs>
+        <w:ind w:left="2880" w:hanging="360"/>
+      </w:pPr>
+      <w:rPr>
+        <w:rFonts w:ascii="Wingdings" w:hAnsi="Wingdings" w:hint="default"/>
+        <w:sz w:val="20"/>
+      </w:rPr>
+    </w:lvl>
+    <w:lvl w:ilvl="4" w:tentative="1">
+      <w:start w:val="1"/>
+      <w:numFmt w:val="bullet"/>
+      <w:lvlText w:val=""/>
+      <w:lvlJc w:val="left"/>
+      <w:pPr>
+        <w:tabs>
+          <w:tab w:val="num" w:pos="3600"/>
+        </w:tabs>
+        <w:ind w:left="3600" w:hanging="360"/>
+      </w:pPr>
+      <w:rPr>
+        <w:rFonts w:ascii="Wingdings" w:hAnsi="Wingdings" w:hint="default"/>
+        <w:sz w:val="20"/>
+      </w:rPr>
+    </w:lvl>
+    <w:lvl w:ilvl="5" w:tentative="1">
+      <w:start w:val="1"/>
+      <w:numFmt w:val="bullet"/>
+      <w:lvlText w:val=""/>
+      <w:lvlJc w:val="left"/>
+      <w:pPr>
+        <w:tabs>
+          <w:tab w:val="num" w:pos="4320"/>
+        </w:tabs>
+        <w:ind w:left="4320" w:hanging="360"/>
+      </w:pPr>
+      <w:rPr>
+        <w:rFonts w:ascii="Wingdings" w:hAnsi="Wingdings" w:hint="default"/>
+        <w:sz w:val="20"/>
+      </w:rPr>
+    </w:lvl>
+    <w:lvl w:ilvl="6" w:tentative="1">
+      <w:start w:val="1"/>
+      <w:numFmt w:val="bullet"/>
+      <w:lvlText w:val=""/>
+      <w:lvlJc w:val="left"/>
+      <w:pPr>
+        <w:tabs>
+          <w:tab w:val="num" w:pos="5040"/>
+        </w:tabs>
+        <w:ind w:left="5040" w:hanging="360"/>
+      </w:pPr>
+      <w:rPr>
+        <w:rFonts w:ascii="Wingdings" w:hAnsi="Wingdings" w:hint="default"/>
+        <w:sz w:val="20"/>
+      </w:rPr>
+    </w:lvl>
+    <w:lvl w:ilvl="7" w:tentative="1">
+      <w:start w:val="1"/>
+      <w:numFmt w:val="bullet"/>
+      <w:lvlText w:val=""/>
+      <w:lvlJc w:val="left"/>
+      <w:pPr>
+        <w:tabs>
+          <w:tab w:val="num" w:pos="5760"/>
+        </w:tabs>
+        <w:ind w:left="5760" w:hanging="360"/>
+      </w:pPr>
+      <w:rPr>
+        <w:rFonts w:ascii="Wingdings" w:hAnsi="Wingdings" w:hint="default"/>
+        <w:sz w:val="20"/>
+      </w:rPr>
+    </w:lvl>
+    <w:lvl w:ilvl="8" w:tentative="1">
+      <w:start w:val="1"/>
+      <w:numFmt w:val="bullet"/>
+      <w:lvlText w:val=""/>
+      <w:lvlJc w:val="left"/>
+      <w:pPr>
+        <w:tabs>
+          <w:tab w:val="num" w:pos="6480"/>
+        </w:tabs>
+        <w:ind w:left="6480" w:hanging="360"/>
+      </w:pPr>
+      <w:rPr>
+        <w:rFonts w:ascii="Wingdings" w:hAnsi="Wingdings" w:hint="default"/>
+        <w:sz w:val="20"/>
+      </w:rPr>
+    </w:lvl>
+  </w:abstractNum>
+  <w:abstractNum w:abstractNumId="1" w15:restartNumberingAfterBreak="0">
     <w:nsid w:val="0CF250E3"/>
     <w:multiLevelType w:val="hybridMultilevel"/>
     <w:tmpl w:val="C3B69188"/>
@@ -4362,7 +5745,7 @@
       </w:pPr>
     </w:lvl>
   </w:abstractNum>
-  <w:abstractNum w:abstractNumId="1" w15:restartNumberingAfterBreak="0">
+  <w:abstractNum w:abstractNumId="2" w15:restartNumberingAfterBreak="0">
     <w:nsid w:val="0F310CD7"/>
     <w:multiLevelType w:val="hybridMultilevel"/>
     <w:tmpl w:val="ADE8196E"/>
@@ -4475,7 +5858,7 @@
       </w:rPr>
     </w:lvl>
   </w:abstractNum>
-  <w:abstractNum w:abstractNumId="2" w15:restartNumberingAfterBreak="0">
+  <w:abstractNum w:abstractNumId="3" w15:restartNumberingAfterBreak="0">
     <w:nsid w:val="148C7C56"/>
     <w:multiLevelType w:val="hybridMultilevel"/>
     <w:tmpl w:val="A8F8BAE6"/>
@@ -4588,7 +5971,7 @@
       </w:rPr>
     </w:lvl>
   </w:abstractNum>
-  <w:abstractNum w:abstractNumId="3" w15:restartNumberingAfterBreak="0">
+  <w:abstractNum w:abstractNumId="4" w15:restartNumberingAfterBreak="0">
     <w:nsid w:val="3DAC4309"/>
     <w:multiLevelType w:val="hybridMultilevel"/>
     <w:tmpl w:val="C91854D2"/>
@@ -4700,7 +6083,156 @@
       </w:rPr>
     </w:lvl>
   </w:abstractNum>
-  <w:abstractNum w:abstractNumId="4" w15:restartNumberingAfterBreak="0">
+  <w:abstractNum w:abstractNumId="5" w15:restartNumberingAfterBreak="0">
+    <w:nsid w:val="43443FCB"/>
+    <w:multiLevelType w:val="multilevel"/>
+    <w:tmpl w:val="1C30AAFA"/>
+    <w:lvl w:ilvl="0">
+      <w:start w:val="1"/>
+      <w:numFmt w:val="bullet"/>
+      <w:lvlText w:val=""/>
+      <w:lvlJc w:val="left"/>
+      <w:pPr>
+        <w:tabs>
+          <w:tab w:val="num" w:pos="720"/>
+        </w:tabs>
+        <w:ind w:left="720" w:hanging="360"/>
+      </w:pPr>
+      <w:rPr>
+        <w:rFonts w:ascii="Symbol" w:hAnsi="Symbol" w:hint="default"/>
+        <w:sz w:val="20"/>
+      </w:rPr>
+    </w:lvl>
+    <w:lvl w:ilvl="1" w:tentative="1">
+      <w:start w:val="1"/>
+      <w:numFmt w:val="bullet"/>
+      <w:lvlText w:val="o"/>
+      <w:lvlJc w:val="left"/>
+      <w:pPr>
+        <w:tabs>
+          <w:tab w:val="num" w:pos="1440"/>
+        </w:tabs>
+        <w:ind w:left="1440" w:hanging="360"/>
+      </w:pPr>
+      <w:rPr>
+        <w:rFonts w:ascii="Courier New" w:hAnsi="Courier New" w:hint="default"/>
+        <w:sz w:val="20"/>
+      </w:rPr>
+    </w:lvl>
+    <w:lvl w:ilvl="2" w:tentative="1">
+      <w:start w:val="1"/>
+      <w:numFmt w:val="bullet"/>
+      <w:lvlText w:val=""/>
+      <w:lvlJc w:val="left"/>
+      <w:pPr>
+        <w:tabs>
+          <w:tab w:val="num" w:pos="2160"/>
+        </w:tabs>
+        <w:ind w:left="2160" w:hanging="360"/>
+      </w:pPr>
+      <w:rPr>
+        <w:rFonts w:ascii="Wingdings" w:hAnsi="Wingdings" w:hint="default"/>
+        <w:sz w:val="20"/>
+      </w:rPr>
+    </w:lvl>
+    <w:lvl w:ilvl="3" w:tentative="1">
+      <w:start w:val="1"/>
+      <w:numFmt w:val="bullet"/>
+      <w:lvlText w:val=""/>
+      <w:lvlJc w:val="left"/>
+      <w:pPr>
+        <w:tabs>
+          <w:tab w:val="num" w:pos="2880"/>
+        </w:tabs>
+        <w:ind w:left="2880" w:hanging="360"/>
+      </w:pPr>
+      <w:rPr>
+        <w:rFonts w:ascii="Wingdings" w:hAnsi="Wingdings" w:hint="default"/>
+        <w:sz w:val="20"/>
+      </w:rPr>
+    </w:lvl>
+    <w:lvl w:ilvl="4" w:tentative="1">
+      <w:start w:val="1"/>
+      <w:numFmt w:val="bullet"/>
+      <w:lvlText w:val=""/>
+      <w:lvlJc w:val="left"/>
+      <w:pPr>
+        <w:tabs>
+          <w:tab w:val="num" w:pos="3600"/>
+        </w:tabs>
+        <w:ind w:left="3600" w:hanging="360"/>
+      </w:pPr>
+      <w:rPr>
+        <w:rFonts w:ascii="Wingdings" w:hAnsi="Wingdings" w:hint="default"/>
+        <w:sz w:val="20"/>
+      </w:rPr>
+    </w:lvl>
+    <w:lvl w:ilvl="5" w:tentative="1">
+      <w:start w:val="1"/>
+      <w:numFmt w:val="bullet"/>
+      <w:lvlText w:val=""/>
+      <w:lvlJc w:val="left"/>
+      <w:pPr>
+        <w:tabs>
+          <w:tab w:val="num" w:pos="4320"/>
+        </w:tabs>
+        <w:ind w:left="4320" w:hanging="360"/>
+      </w:pPr>
+      <w:rPr>
+        <w:rFonts w:ascii="Wingdings" w:hAnsi="Wingdings" w:hint="default"/>
+        <w:sz w:val="20"/>
+      </w:rPr>
+    </w:lvl>
+    <w:lvl w:ilvl="6" w:tentative="1">
+      <w:start w:val="1"/>
+      <w:numFmt w:val="bullet"/>
+      <w:lvlText w:val=""/>
+      <w:lvlJc w:val="left"/>
+      <w:pPr>
+        <w:tabs>
+          <w:tab w:val="num" w:pos="5040"/>
+        </w:tabs>
+        <w:ind w:left="5040" w:hanging="360"/>
+      </w:pPr>
+      <w:rPr>
+        <w:rFonts w:ascii="Wingdings" w:hAnsi="Wingdings" w:hint="default"/>
+        <w:sz w:val="20"/>
+      </w:rPr>
+    </w:lvl>
+    <w:lvl w:ilvl="7" w:tentative="1">
+      <w:start w:val="1"/>
+      <w:numFmt w:val="bullet"/>
+      <w:lvlText w:val=""/>
+      <w:lvlJc w:val="left"/>
+      <w:pPr>
+        <w:tabs>
+          <w:tab w:val="num" w:pos="5760"/>
+        </w:tabs>
+        <w:ind w:left="5760" w:hanging="360"/>
+      </w:pPr>
+      <w:rPr>
+        <w:rFonts w:ascii="Wingdings" w:hAnsi="Wingdings" w:hint="default"/>
+        <w:sz w:val="20"/>
+      </w:rPr>
+    </w:lvl>
+    <w:lvl w:ilvl="8" w:tentative="1">
+      <w:start w:val="1"/>
+      <w:numFmt w:val="bullet"/>
+      <w:lvlText w:val=""/>
+      <w:lvlJc w:val="left"/>
+      <w:pPr>
+        <w:tabs>
+          <w:tab w:val="num" w:pos="6480"/>
+        </w:tabs>
+        <w:ind w:left="6480" w:hanging="360"/>
+      </w:pPr>
+      <w:rPr>
+        <w:rFonts w:ascii="Wingdings" w:hAnsi="Wingdings" w:hint="default"/>
+        <w:sz w:val="20"/>
+      </w:rPr>
+    </w:lvl>
+  </w:abstractNum>
+  <w:abstractNum w:abstractNumId="6" w15:restartNumberingAfterBreak="0">
     <w:nsid w:val="4B4C5930"/>
     <w:multiLevelType w:val="hybridMultilevel"/>
     <w:tmpl w:val="AF7A8ADC"/>
@@ -4813,7 +6345,99 @@
       </w:rPr>
     </w:lvl>
   </w:abstractNum>
-  <w:abstractNum w:abstractNumId="5" w15:restartNumberingAfterBreak="0">
+  <w:abstractNum w:abstractNumId="7" w15:restartNumberingAfterBreak="0">
+    <w:nsid w:val="58B67D25"/>
+    <w:multiLevelType w:val="hybridMultilevel"/>
+    <w:tmpl w:val="8AB0F4A4"/>
+    <w:lvl w:ilvl="0" w:tplc="779CFB70">
+      <w:start w:val="1"/>
+      <w:numFmt w:val="lowerLetter"/>
+      <w:lvlText w:val="%1)"/>
+      <w:lvlJc w:val="left"/>
+      <w:pPr>
+        <w:ind w:left="720" w:hanging="360"/>
+      </w:pPr>
+      <w:rPr>
+        <w:rFonts w:ascii="Calibri" w:eastAsia="Calibri" w:hAnsi="Calibri" w:cs="Calibri" w:hint="default"/>
+        <w:b/>
+        <w:color w:val="1F3864"/>
+        <w:sz w:val="21"/>
+      </w:rPr>
+    </w:lvl>
+    <w:lvl w:ilvl="1" w:tplc="040C0019" w:tentative="1">
+      <w:start w:val="1"/>
+      <w:numFmt w:val="lowerLetter"/>
+      <w:lvlText w:val="%2."/>
+      <w:lvlJc w:val="left"/>
+      <w:pPr>
+        <w:ind w:left="1440" w:hanging="360"/>
+      </w:pPr>
+    </w:lvl>
+    <w:lvl w:ilvl="2" w:tplc="040C001B" w:tentative="1">
+      <w:start w:val="1"/>
+      <w:numFmt w:val="lowerRoman"/>
+      <w:lvlText w:val="%3."/>
+      <w:lvlJc w:val="right"/>
+      <w:pPr>
+        <w:ind w:left="2160" w:hanging="180"/>
+      </w:pPr>
+    </w:lvl>
+    <w:lvl w:ilvl="3" w:tplc="040C000F" w:tentative="1">
+      <w:start w:val="1"/>
+      <w:numFmt w:val="decimal"/>
+      <w:lvlText w:val="%4."/>
+      <w:lvlJc w:val="left"/>
+      <w:pPr>
+        <w:ind w:left="2880" w:hanging="360"/>
+      </w:pPr>
+    </w:lvl>
+    <w:lvl w:ilvl="4" w:tplc="040C0019" w:tentative="1">
+      <w:start w:val="1"/>
+      <w:numFmt w:val="lowerLetter"/>
+      <w:lvlText w:val="%5."/>
+      <w:lvlJc w:val="left"/>
+      <w:pPr>
+        <w:ind w:left="3600" w:hanging="360"/>
+      </w:pPr>
+    </w:lvl>
+    <w:lvl w:ilvl="5" w:tplc="040C001B" w:tentative="1">
+      <w:start w:val="1"/>
+      <w:numFmt w:val="lowerRoman"/>
+      <w:lvlText w:val="%6."/>
+      <w:lvlJc w:val="right"/>
+      <w:pPr>
+        <w:ind w:left="4320" w:hanging="180"/>
+      </w:pPr>
+    </w:lvl>
+    <w:lvl w:ilvl="6" w:tplc="040C000F" w:tentative="1">
+      <w:start w:val="1"/>
+      <w:numFmt w:val="decimal"/>
+      <w:lvlText w:val="%7."/>
+      <w:lvlJc w:val="left"/>
+      <w:pPr>
+        <w:ind w:left="5040" w:hanging="360"/>
+      </w:pPr>
+    </w:lvl>
+    <w:lvl w:ilvl="7" w:tplc="040C0019" w:tentative="1">
+      <w:start w:val="1"/>
+      <w:numFmt w:val="lowerLetter"/>
+      <w:lvlText w:val="%8."/>
+      <w:lvlJc w:val="left"/>
+      <w:pPr>
+        <w:ind w:left="5760" w:hanging="360"/>
+      </w:pPr>
+    </w:lvl>
+    <w:lvl w:ilvl="8" w:tplc="040C001B" w:tentative="1">
+      <w:start w:val="1"/>
+      <w:numFmt w:val="lowerRoman"/>
+      <w:lvlText w:val="%9."/>
+      <w:lvlJc w:val="right"/>
+      <w:pPr>
+        <w:ind w:left="6480" w:hanging="180"/>
+      </w:pPr>
+    </w:lvl>
+  </w:abstractNum>
+  <w:abstractNum w:abstractNumId="8" w15:restartNumberingAfterBreak="0">
     <w:nsid w:val="653C0C5E"/>
     <w:multiLevelType w:val="multilevel"/>
     <w:tmpl w:val="28D834A2"/>
@@ -4962,7 +6586,7 @@
       </w:rPr>
     </w:lvl>
   </w:abstractNum>
-  <w:abstractNum w:abstractNumId="6" w15:restartNumberingAfterBreak="0">
+  <w:abstractNum w:abstractNumId="9" w15:restartNumberingAfterBreak="0">
     <w:nsid w:val="69FC276B"/>
     <w:multiLevelType w:val="multilevel"/>
     <w:tmpl w:val="C2E0AD14"/>
@@ -5111,7 +6735,7 @@
       </w:rPr>
     </w:lvl>
   </w:abstractNum>
-  <w:abstractNum w:abstractNumId="7" w15:restartNumberingAfterBreak="0">
+  <w:abstractNum w:abstractNumId="10" w15:restartNumberingAfterBreak="0">
     <w:nsid w:val="76A84B46"/>
     <w:multiLevelType w:val="hybridMultilevel"/>
     <w:tmpl w:val="C6A6513A"/>
@@ -5224,30 +6848,39 @@
     </w:lvl>
   </w:abstractNum>
   <w:num w:numId="1" w16cid:durableId="1616332497">
-    <w:abstractNumId w:val="0"/>
+    <w:abstractNumId w:val="1"/>
     <w:lvlOverride w:ilvl="0">
       <w:startOverride w:val="1"/>
     </w:lvlOverride>
   </w:num>
   <w:num w:numId="2" w16cid:durableId="930044323">
-    <w:abstractNumId w:val="1"/>
+    <w:abstractNumId w:val="2"/>
   </w:num>
   <w:num w:numId="3" w16cid:durableId="832062217">
+    <w:abstractNumId w:val="10"/>
+  </w:num>
+  <w:num w:numId="4" w16cid:durableId="1215237999">
+    <w:abstractNumId w:val="4"/>
+  </w:num>
+  <w:num w:numId="5" w16cid:durableId="952397004">
+    <w:abstractNumId w:val="3"/>
+  </w:num>
+  <w:num w:numId="6" w16cid:durableId="1734310147">
+    <w:abstractNumId w:val="6"/>
+  </w:num>
+  <w:num w:numId="7" w16cid:durableId="655379516">
+    <w:abstractNumId w:val="9"/>
+  </w:num>
+  <w:num w:numId="8" w16cid:durableId="1980303912">
+    <w:abstractNumId w:val="8"/>
+  </w:num>
+  <w:num w:numId="9" w16cid:durableId="1230191484">
     <w:abstractNumId w:val="7"/>
   </w:num>
-  <w:num w:numId="4" w16cid:durableId="1215237999">
-    <w:abstractNumId w:val="3"/>
+  <w:num w:numId="10" w16cid:durableId="1816606018">
+    <w:abstractNumId w:val="0"/>
   </w:num>
-  <w:num w:numId="5" w16cid:durableId="952397004">
-    <w:abstractNumId w:val="2"/>
-  </w:num>
-  <w:num w:numId="6" w16cid:durableId="1734310147">
-    <w:abstractNumId w:val="4"/>
-  </w:num>
-  <w:num w:numId="7" w16cid:durableId="655379516">
-    <w:abstractNumId w:val="6"/>
-  </w:num>
-  <w:num w:numId="8" w16cid:durableId="1980303912">
+  <w:num w:numId="11" w16cid:durableId="1369716825">
     <w:abstractNumId w:val="5"/>
   </w:num>
 </w:numbering>
@@ -5886,7 +7519,6 @@
     <w:name w:val="Normal (Web)"/>
     <w:basedOn w:val="Normal"/>
     <w:uiPriority w:val="99"/>
-    <w:semiHidden/>
     <w:unhideWhenUsed/>
     <w:rsid w:val="005D456D"/>
     <w:pPr>

</xml_diff>

<commit_message>
feat: sauvegarde et chargement du catalogue via un fichier CSV (Partie 7)
</commit_message>
<xml_diff>
--- a/pratiquePython.docx
+++ b/pratiquePython.docx
@@ -43,6 +43,7 @@
           <w:szCs w:val="24"/>
         </w:rPr>
       </w:pPr>
+      <w:proofErr w:type="spellStart"/>
       <w:r>
         <w:rPr>
           <w:rFonts w:ascii="Times New Roman" w:hAnsi="Times New Roman" w:cs="Times New Roman"/>
@@ -53,6 +54,7 @@
         </w:rPr>
         <w:t>DatasetManager</w:t>
       </w:r>
+      <w:proofErr w:type="spellEnd"/>
     </w:p>
     <w:p>
       <w:pPr>
@@ -82,15 +84,7 @@
           <w:sz w:val="24"/>
           <w:szCs w:val="24"/>
         </w:rPr>
-        <w:t>t :</w:t>
-      </w:r>
-      <w:r>
-        <w:rPr>
-          <w:rFonts w:ascii="Times New Roman" w:hAnsi="Times New Roman" w:cs="Times New Roman"/>
-          <w:sz w:val="24"/>
-          <w:szCs w:val="24"/>
-        </w:rPr>
-        <w:t xml:space="preserve"> </w:t>
+        <w:t xml:space="preserve">t : </w:t>
       </w:r>
       <w:r>
         <w:rPr>
@@ -179,7 +173,25 @@
           <w:sz w:val="24"/>
           <w:szCs w:val="24"/>
         </w:rPr>
-        <w:t>Une entreprise spécialisée en Intelligence Artificielle souhaite disposer d'une application console permettant à ses Data Scientists de gérer un catalogue de datasets (CSV et JSON) avant leur traitement avec Pandas : enregistrement des caractéristiques, recherche, statistiques, sauvegarde, rechargement automatique et gestion des erreurs.</w:t>
+        <w:t xml:space="preserve">Une entreprise spécialisée en Intelligence Artificielle souhaite disposer d'une application console permettant à ses Data Scientists de gérer un catalogue de </w:t>
+      </w:r>
+      <w:proofErr w:type="spellStart"/>
+      <w:r>
+        <w:rPr>
+          <w:rFonts w:ascii="Times New Roman" w:hAnsi="Times New Roman" w:cs="Times New Roman"/>
+          <w:sz w:val="24"/>
+          <w:szCs w:val="24"/>
+        </w:rPr>
+        <w:t>datasets</w:t>
+      </w:r>
+      <w:proofErr w:type="spellEnd"/>
+      <w:r>
+        <w:rPr>
+          <w:rFonts w:ascii="Times New Roman" w:hAnsi="Times New Roman" w:cs="Times New Roman"/>
+          <w:sz w:val="24"/>
+          <w:szCs w:val="24"/>
+        </w:rPr>
+        <w:t xml:space="preserve"> (CSV et JSON) avant leur traitement avec Pandas : enregistrement des caractéristiques, recherche, statistiques, sauvegarde, rechargement automatique et gestion des erreurs.</w:t>
       </w:r>
     </w:p>
     <w:p>
@@ -197,7 +209,25 @@
           <w:sz w:val="24"/>
           <w:szCs w:val="24"/>
         </w:rPr>
-        <w:t xml:space="preserve">Ce document présente la réalisation de l'application DatasetManager, </w:t>
+        <w:t xml:space="preserve">Ce document présente la réalisation de l'application </w:t>
+      </w:r>
+      <w:proofErr w:type="spellStart"/>
+      <w:r>
+        <w:rPr>
+          <w:rFonts w:ascii="Times New Roman" w:hAnsi="Times New Roman" w:cs="Times New Roman"/>
+          <w:sz w:val="24"/>
+          <w:szCs w:val="24"/>
+        </w:rPr>
+        <w:t>DatasetManager</w:t>
+      </w:r>
+      <w:proofErr w:type="spellEnd"/>
+      <w:r>
+        <w:rPr>
+          <w:rFonts w:ascii="Times New Roman" w:hAnsi="Times New Roman" w:cs="Times New Roman"/>
+          <w:sz w:val="24"/>
+          <w:szCs w:val="24"/>
+        </w:rPr>
+        <w:t xml:space="preserve">, </w:t>
       </w:r>
       <w:r>
         <w:rPr>
@@ -320,7 +350,29 @@
                 <w:sz w:val="24"/>
                 <w:szCs w:val="24"/>
               </w:rPr>
-              <w:t xml:space="preserve"> datasetManager, le dossier racine de l'application, et le fichier main.py, point d'entrée de l'application.</w:t>
+              <w:t xml:space="preserve"> </w:t>
+            </w:r>
+            <w:proofErr w:type="spellStart"/>
+            <w:r>
+              <w:rPr>
+                <w:rFonts w:ascii="Times New Roman" w:hAnsi="Times New Roman" w:cs="Times New Roman"/>
+                <w:i/>
+                <w:iCs/>
+                <w:sz w:val="24"/>
+                <w:szCs w:val="24"/>
+              </w:rPr>
+              <w:t>datasetManager</w:t>
+            </w:r>
+            <w:proofErr w:type="spellEnd"/>
+            <w:r>
+              <w:rPr>
+                <w:rFonts w:ascii="Times New Roman" w:hAnsi="Times New Roman" w:cs="Times New Roman"/>
+                <w:i/>
+                <w:iCs/>
+                <w:sz w:val="24"/>
+                <w:szCs w:val="24"/>
+              </w:rPr>
+              <w:t>, le dossier racine de l'application, et le fichier main.py, point d'entrée de l'application.</w:t>
             </w:r>
           </w:p>
         </w:tc>
@@ -341,7 +393,25 @@
           <w:sz w:val="24"/>
           <w:szCs w:val="24"/>
         </w:rPr>
-        <w:t>Le dossier racine datasetManager a été créé avec, à sa racine, le fichier main.py qui sert de point d'entrée unique à l'application</w:t>
+        <w:t xml:space="preserve">Le dossier racine </w:t>
+      </w:r>
+      <w:proofErr w:type="spellStart"/>
+      <w:r>
+        <w:rPr>
+          <w:rFonts w:ascii="Times New Roman" w:hAnsi="Times New Roman" w:cs="Times New Roman"/>
+          <w:sz w:val="24"/>
+          <w:szCs w:val="24"/>
+        </w:rPr>
+        <w:t>datasetManager</w:t>
+      </w:r>
+      <w:proofErr w:type="spellEnd"/>
+      <w:r>
+        <w:rPr>
+          <w:rFonts w:ascii="Times New Roman" w:hAnsi="Times New Roman" w:cs="Times New Roman"/>
+          <w:sz w:val="24"/>
+          <w:szCs w:val="24"/>
+        </w:rPr>
+        <w:t xml:space="preserve"> a été créé avec, à sa racine, le fichier main.py qui sert de point d'entrée unique à l'application</w:t>
       </w:r>
       <w:r>
         <w:rPr>
@@ -364,6 +434,7 @@
       <w:r>
         <w:rPr>
           <w:rFonts w:ascii="Times New Roman" w:hAnsi="Times New Roman" w:cs="Times New Roman"/>
+          <w:noProof/>
           <w:sz w:val="24"/>
           <w:szCs w:val="24"/>
         </w:rPr>
@@ -555,7 +626,73 @@
                 <w:sz w:val="24"/>
                 <w:szCs w:val="24"/>
               </w:rPr>
-              <w:t>emande à l'utilisateur de saisir les métadonnées d'un dataset : nom, domaine, nombre de lignes, nombre de colonnes, taille en Mo, format (csv ou json), public (true ou false).</w:t>
+              <w:t xml:space="preserve">emande à l'utilisateur de saisir les métadonnées d'un </w:t>
+            </w:r>
+            <w:proofErr w:type="spellStart"/>
+            <w:r>
+              <w:rPr>
+                <w:rFonts w:ascii="Times New Roman" w:hAnsi="Times New Roman" w:cs="Times New Roman"/>
+                <w:i/>
+                <w:iCs/>
+                <w:sz w:val="24"/>
+                <w:szCs w:val="24"/>
+              </w:rPr>
+              <w:t>dataset</w:t>
+            </w:r>
+            <w:proofErr w:type="spellEnd"/>
+            <w:r>
+              <w:rPr>
+                <w:rFonts w:ascii="Times New Roman" w:hAnsi="Times New Roman" w:cs="Times New Roman"/>
+                <w:i/>
+                <w:iCs/>
+                <w:sz w:val="24"/>
+                <w:szCs w:val="24"/>
+              </w:rPr>
+              <w:t xml:space="preserve"> : nom, domaine, nombre de lignes, nombre de colonnes, taille en Mo, format (csv ou </w:t>
+            </w:r>
+            <w:proofErr w:type="spellStart"/>
+            <w:r>
+              <w:rPr>
+                <w:rFonts w:ascii="Times New Roman" w:hAnsi="Times New Roman" w:cs="Times New Roman"/>
+                <w:i/>
+                <w:iCs/>
+                <w:sz w:val="24"/>
+                <w:szCs w:val="24"/>
+              </w:rPr>
+              <w:t>json</w:t>
+            </w:r>
+            <w:proofErr w:type="spellEnd"/>
+            <w:r>
+              <w:rPr>
+                <w:rFonts w:ascii="Times New Roman" w:hAnsi="Times New Roman" w:cs="Times New Roman"/>
+                <w:i/>
+                <w:iCs/>
+                <w:sz w:val="24"/>
+                <w:szCs w:val="24"/>
+              </w:rPr>
+              <w:t>), public (</w:t>
+            </w:r>
+            <w:proofErr w:type="spellStart"/>
+            <w:r>
+              <w:rPr>
+                <w:rFonts w:ascii="Times New Roman" w:hAnsi="Times New Roman" w:cs="Times New Roman"/>
+                <w:i/>
+                <w:iCs/>
+                <w:sz w:val="24"/>
+                <w:szCs w:val="24"/>
+              </w:rPr>
+              <w:t>true</w:t>
+            </w:r>
+            <w:proofErr w:type="spellEnd"/>
+            <w:r>
+              <w:rPr>
+                <w:rFonts w:ascii="Times New Roman" w:hAnsi="Times New Roman" w:cs="Times New Roman"/>
+                <w:i/>
+                <w:iCs/>
+                <w:sz w:val="24"/>
+                <w:szCs w:val="24"/>
+              </w:rPr>
+              <w:t xml:space="preserve"> ou false).</w:t>
             </w:r>
           </w:p>
         </w:tc>
@@ -621,6 +758,7 @@
       <w:r>
         <w:rPr>
           <w:rFonts w:ascii="Times New Roman" w:eastAsia="Consolas" w:hAnsi="Times New Roman" w:cs="Times New Roman"/>
+          <w:noProof/>
           <w:sz w:val="24"/>
           <w:szCs w:val="24"/>
         </w:rPr>
@@ -697,6 +835,7 @@
         </w:rPr>
         <w:t xml:space="preserve">, </w:t>
       </w:r>
+      <w:proofErr w:type="spellStart"/>
       <w:r>
         <w:rPr>
           <w:rStyle w:val="CodeHTML"/>
@@ -706,7 +845,19 @@
           <w:sz w:val="24"/>
           <w:szCs w:val="24"/>
         </w:rPr>
-        <w:t>int()</w:t>
+        <w:t>int</w:t>
+      </w:r>
+      <w:proofErr w:type="spellEnd"/>
+      <w:r>
+        <w:rPr>
+          <w:rStyle w:val="CodeHTML"/>
+          <w:rFonts w:ascii="Times New Roman" w:eastAsia="Calibri" w:hAnsi="Times New Roman" w:cs="Times New Roman"/>
+          <w:b/>
+          <w:bCs/>
+          <w:sz w:val="24"/>
+          <w:szCs w:val="24"/>
+        </w:rPr>
+        <w:t>()</w:t>
       </w:r>
       <w:r>
         <w:rPr>
@@ -716,6 +867,7 @@
         </w:rPr>
         <w:t xml:space="preserve"> et </w:t>
       </w:r>
+      <w:proofErr w:type="spellStart"/>
       <w:r>
         <w:rPr>
           <w:rStyle w:val="CodeHTML"/>
@@ -725,7 +877,19 @@
           <w:sz w:val="24"/>
           <w:szCs w:val="24"/>
         </w:rPr>
-        <w:t>float()</w:t>
+        <w:t>float</w:t>
+      </w:r>
+      <w:proofErr w:type="spellEnd"/>
+      <w:r>
+        <w:rPr>
+          <w:rStyle w:val="CodeHTML"/>
+          <w:rFonts w:ascii="Times New Roman" w:eastAsia="Calibri" w:hAnsi="Times New Roman" w:cs="Times New Roman"/>
+          <w:b/>
+          <w:bCs/>
+          <w:sz w:val="24"/>
+          <w:szCs w:val="24"/>
+        </w:rPr>
+        <w:t>()</w:t>
       </w:r>
       <w:r>
         <w:rPr>
@@ -883,6 +1047,7 @@
           <w:rFonts w:ascii="Times New Roman" w:hAnsi="Times New Roman" w:cs="Times New Roman"/>
           <w:b/>
           <w:bCs/>
+          <w:noProof/>
           <w:sz w:val="24"/>
           <w:szCs w:val="24"/>
         </w:rPr>
@@ -943,6 +1108,7 @@
         </w:rPr>
         <w:t xml:space="preserve">Ce code montre une série d'instructions </w:t>
       </w:r>
+      <w:proofErr w:type="spellStart"/>
       <w:r>
         <w:rPr>
           <w:rStyle w:val="CodeHTML"/>
@@ -952,7 +1118,19 @@
           <w:sz w:val="24"/>
           <w:szCs w:val="24"/>
         </w:rPr>
-        <w:t>print()</w:t>
+        <w:t>print</w:t>
+      </w:r>
+      <w:proofErr w:type="spellEnd"/>
+      <w:r>
+        <w:rPr>
+          <w:rStyle w:val="CodeHTML"/>
+          <w:rFonts w:ascii="Times New Roman" w:eastAsia="Calibri" w:hAnsi="Times New Roman" w:cs="Times New Roman"/>
+          <w:b/>
+          <w:bCs/>
+          <w:sz w:val="24"/>
+          <w:szCs w:val="24"/>
+        </w:rPr>
+        <w:t>()</w:t>
       </w:r>
       <w:r>
         <w:rPr>
@@ -1025,6 +1203,7 @@
       <w:r>
         <w:rPr>
           <w:rFonts w:ascii="Times New Roman" w:hAnsi="Times New Roman" w:cs="Times New Roman"/>
+          <w:noProof/>
           <w:sz w:val="24"/>
           <w:szCs w:val="24"/>
         </w:rPr>
@@ -1082,6 +1261,7 @@
         </w:rPr>
         <w:t>Le terminal affiche la saisie dynamique des métadonnées d'un exemple (</w:t>
       </w:r>
+      <w:proofErr w:type="spellStart"/>
       <w:r>
         <w:rPr>
           <w:rStyle w:val="CodeHTML"/>
@@ -1091,6 +1271,7 @@
         </w:rPr>
         <w:t>droneTrans</w:t>
       </w:r>
+      <w:proofErr w:type="spellEnd"/>
       <w:r>
         <w:rPr>
           <w:rFonts w:ascii="Times New Roman" w:hAnsi="Times New Roman" w:cs="Times New Roman"/>
@@ -1160,6 +1341,7 @@
       <w:r>
         <w:t xml:space="preserve"> Interrompt l'exécution du programme pour demander à l'utilisateur de saisir une valeur au clavier (qui est toujours récupérée sous forme de chaîne de caractères </w:t>
       </w:r>
+      <w:proofErr w:type="spellStart"/>
       <w:r>
         <w:rPr>
           <w:rStyle w:val="CodeHTML"/>
@@ -1169,6 +1351,7 @@
         </w:rPr>
         <w:t>str</w:t>
       </w:r>
+      <w:proofErr w:type="spellEnd"/>
       <w:r>
         <w:t xml:space="preserve">). </w:t>
       </w:r>
@@ -1182,6 +1365,7 @@
         </w:numPr>
         <w:spacing w:before="0" w:beforeAutospacing="0" w:line="360" w:lineRule="auto"/>
       </w:pPr>
+      <w:proofErr w:type="spellStart"/>
       <w:r>
         <w:rPr>
           <w:rStyle w:val="CodeHTML"/>
@@ -1192,7 +1376,19 @@
           <w:szCs w:val="24"/>
         </w:rPr>
         <w:lastRenderedPageBreak/>
-        <w:t>int()</w:t>
+        <w:t>int</w:t>
+      </w:r>
+      <w:proofErr w:type="spellEnd"/>
+      <w:r>
+        <w:rPr>
+          <w:rStyle w:val="CodeHTML"/>
+          <w:rFonts w:ascii="Times New Roman" w:hAnsi="Times New Roman" w:cs="Times New Roman"/>
+          <w:b/>
+          <w:bCs/>
+          <w:sz w:val="24"/>
+          <w:szCs w:val="24"/>
+        </w:rPr>
+        <w:t>()</w:t>
       </w:r>
       <w:r>
         <w:rPr>
@@ -1214,16 +1410,29 @@
         </w:numPr>
         <w:spacing w:before="0" w:beforeAutospacing="0" w:line="360" w:lineRule="auto"/>
       </w:pPr>
-      <w:r>
-        <w:rPr>
-          <w:rStyle w:val="CodeHTML"/>
-          <w:rFonts w:ascii="Times New Roman" w:hAnsi="Times New Roman" w:cs="Times New Roman"/>
-          <w:b/>
-          <w:bCs/>
-          <w:sz w:val="24"/>
-          <w:szCs w:val="24"/>
-        </w:rPr>
-        <w:t>float()</w:t>
+      <w:proofErr w:type="spellStart"/>
+      <w:r>
+        <w:rPr>
+          <w:rStyle w:val="CodeHTML"/>
+          <w:rFonts w:ascii="Times New Roman" w:hAnsi="Times New Roman" w:cs="Times New Roman"/>
+          <w:b/>
+          <w:bCs/>
+          <w:sz w:val="24"/>
+          <w:szCs w:val="24"/>
+        </w:rPr>
+        <w:t>float</w:t>
+      </w:r>
+      <w:proofErr w:type="spellEnd"/>
+      <w:r>
+        <w:rPr>
+          <w:rStyle w:val="CodeHTML"/>
+          <w:rFonts w:ascii="Times New Roman" w:hAnsi="Times New Roman" w:cs="Times New Roman"/>
+          <w:b/>
+          <w:bCs/>
+          <w:sz w:val="24"/>
+          <w:szCs w:val="24"/>
+        </w:rPr>
+        <w:t>()</w:t>
       </w:r>
       <w:r>
         <w:rPr>
@@ -1233,7 +1442,15 @@
         <w:t xml:space="preserve"> :</w:t>
       </w:r>
       <w:r>
-        <w:t xml:space="preserve"> Convertit la saisie utilisateur (ex: taille du dataset) en un nombre à virgule flottante. </w:t>
+        <w:t xml:space="preserve"> Convertit la saisie utilisateur (ex: taille du </w:t>
+      </w:r>
+      <w:proofErr w:type="spellStart"/>
+      <w:r>
+        <w:t>dataset</w:t>
+      </w:r>
+      <w:proofErr w:type="spellEnd"/>
+      <w:r>
+        <w:t xml:space="preserve">) en un nombre à virgule flottante. </w:t>
       </w:r>
     </w:p>
     <w:p>
@@ -1245,16 +1462,29 @@
         </w:numPr>
         <w:spacing w:before="0" w:beforeAutospacing="0" w:line="360" w:lineRule="auto"/>
       </w:pPr>
-      <w:r>
-        <w:rPr>
-          <w:rStyle w:val="CodeHTML"/>
-          <w:rFonts w:ascii="Times New Roman" w:hAnsi="Times New Roman" w:cs="Times New Roman"/>
-          <w:b/>
-          <w:bCs/>
-          <w:sz w:val="24"/>
-          <w:szCs w:val="24"/>
-        </w:rPr>
-        <w:t>print()</w:t>
+      <w:proofErr w:type="spellStart"/>
+      <w:r>
+        <w:rPr>
+          <w:rStyle w:val="CodeHTML"/>
+          <w:rFonts w:ascii="Times New Roman" w:hAnsi="Times New Roman" w:cs="Times New Roman"/>
+          <w:b/>
+          <w:bCs/>
+          <w:sz w:val="24"/>
+          <w:szCs w:val="24"/>
+        </w:rPr>
+        <w:t>print</w:t>
+      </w:r>
+      <w:proofErr w:type="spellEnd"/>
+      <w:r>
+        <w:rPr>
+          <w:rStyle w:val="CodeHTML"/>
+          <w:rFonts w:ascii="Times New Roman" w:hAnsi="Times New Roman" w:cs="Times New Roman"/>
+          <w:b/>
+          <w:bCs/>
+          <w:sz w:val="24"/>
+          <w:szCs w:val="24"/>
+        </w:rPr>
+        <w:t>()</w:t>
       </w:r>
       <w:r>
         <w:rPr>
@@ -1508,6 +1738,7 @@
           <w:rFonts w:ascii="Times New Roman" w:hAnsi="Times New Roman" w:cs="Times New Roman"/>
           <w:b/>
           <w:bCs/>
+          <w:noProof/>
           <w:sz w:val="24"/>
           <w:szCs w:val="24"/>
         </w:rPr>
@@ -1564,6 +1795,7 @@
           <w:rFonts w:ascii="Times New Roman" w:hAnsi="Times New Roman" w:cs="Times New Roman"/>
           <w:b/>
           <w:bCs/>
+          <w:noProof/>
           <w:sz w:val="24"/>
           <w:szCs w:val="24"/>
         </w:rPr>
@@ -1629,8 +1861,19 @@
           <w:sz w:val="24"/>
           <w:szCs w:val="24"/>
         </w:rPr>
-        <w:t>active = True</w:t>
-      </w:r>
+        <w:t xml:space="preserve">active = </w:t>
+      </w:r>
+      <w:proofErr w:type="spellStart"/>
+      <w:r>
+        <w:rPr>
+          <w:rStyle w:val="CodeHTML"/>
+          <w:rFonts w:ascii="Times New Roman" w:eastAsia="Calibri" w:hAnsi="Times New Roman" w:cs="Times New Roman"/>
+          <w:sz w:val="24"/>
+          <w:szCs w:val="24"/>
+        </w:rPr>
+        <w:t>True</w:t>
+      </w:r>
+      <w:proofErr w:type="spellEnd"/>
       <w:r>
         <w:rPr>
           <w:rFonts w:ascii="Times New Roman" w:hAnsi="Times New Roman" w:cs="Times New Roman"/>
@@ -1639,6 +1882,7 @@
         </w:rPr>
         <w:t xml:space="preserve"> et le début de la boucle </w:t>
       </w:r>
+      <w:proofErr w:type="spellStart"/>
       <w:r>
         <w:rPr>
           <w:rStyle w:val="CodeHTML"/>
@@ -1648,6 +1892,7 @@
         </w:rPr>
         <w:t>while</w:t>
       </w:r>
+      <w:proofErr w:type="spellEnd"/>
       <w:r>
         <w:rPr>
           <w:rFonts w:ascii="Times New Roman" w:hAnsi="Times New Roman" w:cs="Times New Roman"/>
@@ -1656,6 +1901,7 @@
         </w:rPr>
         <w:t xml:space="preserve"> affichant les options du menu et la saisie de l'option 1. Ce code illustre la suite du bloc d'affichage de l'option 1, ainsi que les blocs </w:t>
       </w:r>
+      <w:proofErr w:type="spellStart"/>
       <w:r>
         <w:rPr>
           <w:rStyle w:val="CodeHTML"/>
@@ -1665,6 +1911,7 @@
         </w:rPr>
         <w:t>elif</w:t>
       </w:r>
+      <w:proofErr w:type="spellEnd"/>
       <w:r>
         <w:rPr>
           <w:rFonts w:ascii="Times New Roman" w:hAnsi="Times New Roman" w:cs="Times New Roman"/>
@@ -1673,6 +1920,7 @@
         </w:rPr>
         <w:t xml:space="preserve"> pour les options 2, 3, 4 et la gestion des choix invalides avec </w:t>
       </w:r>
+      <w:proofErr w:type="spellStart"/>
       <w:r>
         <w:rPr>
           <w:rStyle w:val="CodeHTML"/>
@@ -1682,6 +1930,7 @@
         </w:rPr>
         <w:t>else</w:t>
       </w:r>
+      <w:proofErr w:type="spellEnd"/>
       <w:r>
         <w:rPr>
           <w:rFonts w:ascii="Times New Roman" w:hAnsi="Times New Roman" w:cs="Times New Roman"/>
@@ -1745,6 +1994,7 @@
       <w:r>
         <w:rPr>
           <w:rFonts w:ascii="Times New Roman" w:hAnsi="Times New Roman" w:cs="Times New Roman"/>
+          <w:noProof/>
           <w:sz w:val="24"/>
           <w:szCs w:val="24"/>
         </w:rPr>
@@ -1801,7 +2051,25 @@
           <w:sz w:val="24"/>
           <w:szCs w:val="24"/>
         </w:rPr>
-        <w:t>Le terminal montre l'enchaînement des interactions : l'ajout d'un dataset (</w:t>
+        <w:t xml:space="preserve">Le terminal montre l'enchaînement des interactions : l'ajout d'un </w:t>
+      </w:r>
+      <w:proofErr w:type="spellStart"/>
+      <w:r>
+        <w:rPr>
+          <w:rFonts w:ascii="Times New Roman" w:hAnsi="Times New Roman" w:cs="Times New Roman"/>
+          <w:sz w:val="24"/>
+          <w:szCs w:val="24"/>
+        </w:rPr>
+        <w:t>dataset</w:t>
+      </w:r>
+      <w:proofErr w:type="spellEnd"/>
+      <w:r>
+        <w:rPr>
+          <w:rFonts w:ascii="Times New Roman" w:hAnsi="Times New Roman" w:cs="Times New Roman"/>
+          <w:sz w:val="24"/>
+          <w:szCs w:val="24"/>
+        </w:rPr>
+        <w:t xml:space="preserve"> (</w:t>
       </w:r>
       <w:r>
         <w:rPr>
@@ -1852,16 +2120,29 @@
         </w:numPr>
         <w:spacing w:before="0" w:beforeAutospacing="0" w:line="360" w:lineRule="auto"/>
       </w:pPr>
-      <w:r>
-        <w:rPr>
-          <w:rStyle w:val="CodeHTML"/>
-          <w:rFonts w:ascii="Times New Roman" w:hAnsi="Times New Roman" w:cs="Times New Roman"/>
-          <w:b/>
-          <w:bCs/>
-          <w:sz w:val="24"/>
-          <w:szCs w:val="24"/>
-        </w:rPr>
-        <w:t>while active:</w:t>
+      <w:proofErr w:type="spellStart"/>
+      <w:r>
+        <w:rPr>
+          <w:rStyle w:val="CodeHTML"/>
+          <w:rFonts w:ascii="Times New Roman" w:hAnsi="Times New Roman" w:cs="Times New Roman"/>
+          <w:b/>
+          <w:bCs/>
+          <w:sz w:val="24"/>
+          <w:szCs w:val="24"/>
+        </w:rPr>
+        <w:t>while</w:t>
+      </w:r>
+      <w:proofErr w:type="spellEnd"/>
+      <w:r>
+        <w:rPr>
+          <w:rStyle w:val="CodeHTML"/>
+          <w:rFonts w:ascii="Times New Roman" w:hAnsi="Times New Roman" w:cs="Times New Roman"/>
+          <w:b/>
+          <w:bCs/>
+          <w:sz w:val="24"/>
+          <w:szCs w:val="24"/>
+        </w:rPr>
+        <w:t xml:space="preserve"> active:</w:t>
       </w:r>
       <w:r>
         <w:rPr>
@@ -1885,6 +2166,7 @@
       <w:r>
         <w:t xml:space="preserve"> reste égale à </w:t>
       </w:r>
+      <w:proofErr w:type="spellStart"/>
       <w:r>
         <w:rPr>
           <w:rStyle w:val="CodeHTML"/>
@@ -1894,6 +2176,7 @@
         </w:rPr>
         <w:t>True</w:t>
       </w:r>
+      <w:proofErr w:type="spellEnd"/>
       <w:r>
         <w:t xml:space="preserve">. </w:t>
       </w:r>
@@ -1916,8 +2199,45 @@
           <w:sz w:val="24"/>
           <w:szCs w:val="24"/>
         </w:rPr>
-        <w:t>if / elif / else</w:t>
-      </w:r>
+        <w:t xml:space="preserve">if / </w:t>
+      </w:r>
+      <w:proofErr w:type="spellStart"/>
+      <w:r>
+        <w:rPr>
+          <w:rStyle w:val="CodeHTML"/>
+          <w:rFonts w:ascii="Times New Roman" w:hAnsi="Times New Roman" w:cs="Times New Roman"/>
+          <w:b/>
+          <w:bCs/>
+          <w:sz w:val="24"/>
+          <w:szCs w:val="24"/>
+        </w:rPr>
+        <w:t>elif</w:t>
+      </w:r>
+      <w:proofErr w:type="spellEnd"/>
+      <w:r>
+        <w:rPr>
+          <w:rStyle w:val="CodeHTML"/>
+          <w:rFonts w:ascii="Times New Roman" w:hAnsi="Times New Roman" w:cs="Times New Roman"/>
+          <w:b/>
+          <w:bCs/>
+          <w:sz w:val="24"/>
+          <w:szCs w:val="24"/>
+        </w:rPr>
+        <w:t xml:space="preserve"> / </w:t>
+      </w:r>
+      <w:proofErr w:type="spellStart"/>
+      <w:r>
+        <w:rPr>
+          <w:rStyle w:val="CodeHTML"/>
+          <w:rFonts w:ascii="Times New Roman" w:hAnsi="Times New Roman" w:cs="Times New Roman"/>
+          <w:b/>
+          <w:bCs/>
+          <w:sz w:val="24"/>
+          <w:szCs w:val="24"/>
+        </w:rPr>
+        <w:t>else</w:t>
+      </w:r>
+      <w:proofErr w:type="spellEnd"/>
       <w:r>
         <w:rPr>
           <w:b/>
@@ -1959,6 +2279,7 @@
       <w:r>
         <w:t xml:space="preserve"> La modification de la variable d'état qui permet de rompre la condition de la boucle </w:t>
       </w:r>
+      <w:proofErr w:type="spellStart"/>
       <w:r>
         <w:rPr>
           <w:rStyle w:val="CodeHTML"/>
@@ -1968,6 +2289,7 @@
         </w:rPr>
         <w:t>while</w:t>
       </w:r>
+      <w:proofErr w:type="spellEnd"/>
       <w:r>
         <w:t xml:space="preserve"> et de quitter proprement le programme. </w:t>
       </w:r>
@@ -2065,7 +2387,25 @@
           <w:szCs w:val="24"/>
         </w:rPr>
         <w:lastRenderedPageBreak/>
-        <w:t xml:space="preserve">Cette section introduit l'utilisation des dictionnaires Python pour regrouper les métadonnées d'un dataset sous forme de couples clé-valeur structurés. </w:t>
+        <w:t xml:space="preserve">Cette section introduit l'utilisation des dictionnaires Python pour regrouper les métadonnées d'un </w:t>
+      </w:r>
+      <w:proofErr w:type="spellStart"/>
+      <w:r>
+        <w:rPr>
+          <w:rFonts w:ascii="Times New Roman" w:eastAsia="Times New Roman" w:hAnsi="Times New Roman" w:cs="Times New Roman"/>
+          <w:sz w:val="24"/>
+          <w:szCs w:val="24"/>
+        </w:rPr>
+        <w:t>dataset</w:t>
+      </w:r>
+      <w:proofErr w:type="spellEnd"/>
+      <w:r>
+        <w:rPr>
+          <w:rFonts w:ascii="Times New Roman" w:eastAsia="Times New Roman" w:hAnsi="Times New Roman" w:cs="Times New Roman"/>
+          <w:sz w:val="24"/>
+          <w:szCs w:val="24"/>
+        </w:rPr>
+        <w:t xml:space="preserve"> sous forme de couples clé-valeur structurés. </w:t>
       </w:r>
     </w:p>
     <w:tbl>
@@ -2155,7 +2495,29 @@
                 <w:sz w:val="24"/>
                 <w:szCs w:val="24"/>
               </w:rPr>
-              <w:t xml:space="preserve"> un dictionnaire pour stocker les métadonnées de chaque dataset.</w:t>
+              <w:t xml:space="preserve"> un dictionnaire pour stocker les métadonnées de chaque </w:t>
+            </w:r>
+            <w:proofErr w:type="spellStart"/>
+            <w:r>
+              <w:rPr>
+                <w:rFonts w:ascii="Times New Roman" w:hAnsi="Times New Roman" w:cs="Times New Roman"/>
+                <w:i/>
+                <w:iCs/>
+                <w:sz w:val="24"/>
+                <w:szCs w:val="24"/>
+              </w:rPr>
+              <w:t>dataset</w:t>
+            </w:r>
+            <w:proofErr w:type="spellEnd"/>
+            <w:r>
+              <w:rPr>
+                <w:rFonts w:ascii="Times New Roman" w:hAnsi="Times New Roman" w:cs="Times New Roman"/>
+                <w:i/>
+                <w:iCs/>
+                <w:sz w:val="24"/>
+                <w:szCs w:val="24"/>
+              </w:rPr>
+              <w:t>.</w:t>
             </w:r>
           </w:p>
         </w:tc>
@@ -2244,6 +2606,7 @@
       <w:r>
         <w:rPr>
           <w:rFonts w:ascii="Times New Roman" w:eastAsia="Consolas" w:hAnsi="Times New Roman" w:cs="Times New Roman"/>
+          <w:noProof/>
           <w:sz w:val="24"/>
           <w:szCs w:val="24"/>
         </w:rPr>
@@ -2292,6 +2655,7 @@
       <w:r>
         <w:t xml:space="preserve">L'extrait montre la déclaration du dictionnaire </w:t>
       </w:r>
+      <w:proofErr w:type="spellStart"/>
       <w:r>
         <w:rPr>
           <w:rStyle w:val="CodeHTML"/>
@@ -2301,17 +2665,29 @@
         </w:rPr>
         <w:t>dataset</w:t>
       </w:r>
+      <w:proofErr w:type="spellEnd"/>
       <w:r>
         <w:t xml:space="preserve"> associant chaque clé à sa variable, suivie de l'accès aux données via la syntaxe </w:t>
       </w:r>
-      <w:r>
-        <w:rPr>
-          <w:rStyle w:val="CodeHTML"/>
-          <w:rFonts w:ascii="Times New Roman" w:hAnsi="Times New Roman" w:cs="Times New Roman"/>
-          <w:sz w:val="24"/>
-          <w:szCs w:val="24"/>
-        </w:rPr>
-        <w:t>dataset['clé']</w:t>
+      <w:proofErr w:type="spellStart"/>
+      <w:r>
+        <w:rPr>
+          <w:rStyle w:val="CodeHTML"/>
+          <w:rFonts w:ascii="Times New Roman" w:hAnsi="Times New Roman" w:cs="Times New Roman"/>
+          <w:sz w:val="24"/>
+          <w:szCs w:val="24"/>
+        </w:rPr>
+        <w:t>dataset</w:t>
+      </w:r>
+      <w:proofErr w:type="spellEnd"/>
+      <w:r>
+        <w:rPr>
+          <w:rStyle w:val="CodeHTML"/>
+          <w:rFonts w:ascii="Times New Roman" w:hAnsi="Times New Roman" w:cs="Times New Roman"/>
+          <w:sz w:val="24"/>
+          <w:szCs w:val="24"/>
+        </w:rPr>
+        <w:t>['clé']</w:t>
       </w:r>
       <w:r>
         <w:t xml:space="preserve"> dans les f-strings.</w:t>
@@ -2361,6 +2737,7 @@
       <w:r>
         <w:rPr>
           <w:rFonts w:ascii="Times New Roman" w:hAnsi="Times New Roman" w:cs="Times New Roman"/>
+          <w:noProof/>
           <w:sz w:val="24"/>
           <w:szCs w:val="24"/>
         </w:rPr>
@@ -2425,7 +2802,43 @@
           <w:sz w:val="24"/>
           <w:szCs w:val="24"/>
         </w:rPr>
-        <w:t xml:space="preserve">Ce terminal affiche la saisie d'un nouveau dataset (NTCom), confirmant que la restitution des métadonnées fonctionne à l'identique tout en s'appuyant sur le dictionnaire. </w:t>
+        <w:t xml:space="preserve">Ce terminal affiche la saisie d'un nouveau </w:t>
+      </w:r>
+      <w:proofErr w:type="spellStart"/>
+      <w:r>
+        <w:rPr>
+          <w:rFonts w:ascii="Times New Roman" w:eastAsia="Times New Roman" w:hAnsi="Times New Roman" w:cs="Times New Roman"/>
+          <w:sz w:val="24"/>
+          <w:szCs w:val="24"/>
+        </w:rPr>
+        <w:t>dataset</w:t>
+      </w:r>
+      <w:proofErr w:type="spellEnd"/>
+      <w:r>
+        <w:rPr>
+          <w:rFonts w:ascii="Times New Roman" w:eastAsia="Times New Roman" w:hAnsi="Times New Roman" w:cs="Times New Roman"/>
+          <w:sz w:val="24"/>
+          <w:szCs w:val="24"/>
+        </w:rPr>
+        <w:t xml:space="preserve"> (</w:t>
+      </w:r>
+      <w:proofErr w:type="spellStart"/>
+      <w:r>
+        <w:rPr>
+          <w:rFonts w:ascii="Times New Roman" w:eastAsia="Times New Roman" w:hAnsi="Times New Roman" w:cs="Times New Roman"/>
+          <w:sz w:val="24"/>
+          <w:szCs w:val="24"/>
+        </w:rPr>
+        <w:t>NTCom</w:t>
+      </w:r>
+      <w:proofErr w:type="spellEnd"/>
+      <w:r>
+        <w:rPr>
+          <w:rFonts w:ascii="Times New Roman" w:eastAsia="Times New Roman" w:hAnsi="Times New Roman" w:cs="Times New Roman"/>
+          <w:sz w:val="24"/>
+          <w:szCs w:val="24"/>
+        </w:rPr>
+        <w:t xml:space="preserve">), confirmant que la restitution des métadonnées fonctionne à l'identique tout en s'appuyant sur le dictionnaire. </w:t>
       </w:r>
     </w:p>
     <w:p>
@@ -2536,16 +2949,29 @@
         </w:rPr>
         <w:t>Accès par clé (</w:t>
       </w:r>
-      <w:r>
-        <w:rPr>
-          <w:rStyle w:val="CodeHTML"/>
-          <w:rFonts w:ascii="Times New Roman" w:hAnsi="Times New Roman" w:cs="Times New Roman"/>
-          <w:b/>
-          <w:bCs/>
-          <w:sz w:val="24"/>
-          <w:szCs w:val="24"/>
-        </w:rPr>
-        <w:t>dataset['clé']</w:t>
+      <w:proofErr w:type="spellStart"/>
+      <w:r>
+        <w:rPr>
+          <w:rStyle w:val="CodeHTML"/>
+          <w:rFonts w:ascii="Times New Roman" w:hAnsi="Times New Roman" w:cs="Times New Roman"/>
+          <w:b/>
+          <w:bCs/>
+          <w:sz w:val="24"/>
+          <w:szCs w:val="24"/>
+        </w:rPr>
+        <w:t>dataset</w:t>
+      </w:r>
+      <w:proofErr w:type="spellEnd"/>
+      <w:r>
+        <w:rPr>
+          <w:rStyle w:val="CodeHTML"/>
+          <w:rFonts w:ascii="Times New Roman" w:hAnsi="Times New Roman" w:cs="Times New Roman"/>
+          <w:b/>
+          <w:bCs/>
+          <w:sz w:val="24"/>
+          <w:szCs w:val="24"/>
+        </w:rPr>
+        <w:t>['clé']</w:t>
       </w:r>
       <w:r>
         <w:rPr>
@@ -2575,17 +3001,27 @@
         <w:t>Encapsulation de données :</w:t>
       </w:r>
       <w:r>
-        <w:t xml:space="preserve"> Concept consistant à regrouper toutes les variables éparpillées d'un dataset au sein d'un seul objet structuré (</w:t>
-      </w:r>
-      <w:r>
-        <w:rPr>
-          <w:rStyle w:val="CodeHTML"/>
-          <w:rFonts w:ascii="Times New Roman" w:hAnsi="Times New Roman" w:cs="Times New Roman"/>
-          <w:sz w:val="24"/>
-          <w:szCs w:val="24"/>
-        </w:rPr>
+        <w:t xml:space="preserve"> Concept consistant à regrouper toutes les variables éparpillées d'un </w:t>
+      </w:r>
+      <w:proofErr w:type="spellStart"/>
+      <w:r>
         <w:t>dataset</w:t>
       </w:r>
+      <w:proofErr w:type="spellEnd"/>
+      <w:r>
+        <w:t xml:space="preserve"> au sein d'un seul objet structuré (</w:t>
+      </w:r>
+      <w:proofErr w:type="spellStart"/>
+      <w:r>
+        <w:rPr>
+          <w:rStyle w:val="CodeHTML"/>
+          <w:rFonts w:ascii="Times New Roman" w:hAnsi="Times New Roman" w:cs="Times New Roman"/>
+          <w:sz w:val="24"/>
+          <w:szCs w:val="24"/>
+        </w:rPr>
+        <w:t>dataset</w:t>
+      </w:r>
+      <w:proofErr w:type="spellEnd"/>
       <w:r>
         <w:t xml:space="preserve">). </w:t>
       </w:r>
@@ -2703,7 +3139,29 @@
                 <w:sz w:val="24"/>
                 <w:szCs w:val="24"/>
               </w:rPr>
-              <w:t>Création d’un tuple contenant les domaines autorisés : ("Santé","Finance","Agriculture","Transport","Education").</w:t>
+              <w:t>Création d’un tuple contenant les domaines autorisés : ("</w:t>
+            </w:r>
+            <w:proofErr w:type="spellStart"/>
+            <w:r>
+              <w:rPr>
+                <w:rFonts w:ascii="Times New Roman" w:hAnsi="Times New Roman" w:cs="Times New Roman"/>
+                <w:i/>
+                <w:iCs/>
+                <w:sz w:val="24"/>
+                <w:szCs w:val="24"/>
+              </w:rPr>
+              <w:t>Santé","Finance","Agriculture","Transport","Education</w:t>
+            </w:r>
+            <w:proofErr w:type="spellEnd"/>
+            <w:r>
+              <w:rPr>
+                <w:rFonts w:ascii="Times New Roman" w:hAnsi="Times New Roman" w:cs="Times New Roman"/>
+                <w:i/>
+                <w:iCs/>
+                <w:sz w:val="24"/>
+                <w:szCs w:val="24"/>
+              </w:rPr>
+              <w:t>").</w:t>
             </w:r>
           </w:p>
         </w:tc>
@@ -2767,6 +3225,7 @@
           <w:rFonts w:ascii="Times New Roman" w:hAnsi="Times New Roman" w:cs="Times New Roman"/>
           <w:b/>
           <w:bCs/>
+          <w:noProof/>
           <w:sz w:val="24"/>
           <w:szCs w:val="24"/>
         </w:rPr>
@@ -2826,6 +3285,7 @@
         </w:rPr>
         <w:t xml:space="preserve">L'extrait montre l'initialisation de la variable </w:t>
       </w:r>
+      <w:proofErr w:type="spellStart"/>
       <w:r>
         <w:rPr>
           <w:rStyle w:val="CodeHTML"/>
@@ -2835,6 +3295,7 @@
         </w:rPr>
         <w:t>domaine_auto</w:t>
       </w:r>
+      <w:proofErr w:type="spellEnd"/>
       <w:r>
         <w:rPr>
           <w:rFonts w:ascii="Times New Roman" w:hAnsi="Times New Roman" w:cs="Times New Roman"/>
@@ -2985,6 +3446,7 @@
       <w:r>
         <w:rPr>
           <w:rFonts w:ascii="Times New Roman" w:eastAsia="Consolas" w:hAnsi="Times New Roman" w:cs="Times New Roman"/>
+          <w:noProof/>
           <w:sz w:val="24"/>
           <w:szCs w:val="24"/>
         </w:rPr>
@@ -3042,6 +3504,7 @@
         </w:rPr>
         <w:t xml:space="preserve">Ce code illustre une boucle </w:t>
       </w:r>
+      <w:proofErr w:type="spellStart"/>
       <w:r>
         <w:rPr>
           <w:rStyle w:val="CodeHTML"/>
@@ -3049,7 +3512,37 @@
           <w:sz w:val="24"/>
           <w:szCs w:val="24"/>
         </w:rPr>
-        <w:t>while domaine not in domaine_auto:</w:t>
+        <w:t>while</w:t>
+      </w:r>
+      <w:proofErr w:type="spellEnd"/>
+      <w:r>
+        <w:rPr>
+          <w:rStyle w:val="CodeHTML"/>
+          <w:rFonts w:ascii="Times New Roman" w:eastAsia="Calibri" w:hAnsi="Times New Roman" w:cs="Times New Roman"/>
+          <w:sz w:val="24"/>
+          <w:szCs w:val="24"/>
+        </w:rPr>
+        <w:t xml:space="preserve"> domaine not in </w:t>
+      </w:r>
+      <w:proofErr w:type="spellStart"/>
+      <w:r>
+        <w:rPr>
+          <w:rStyle w:val="CodeHTML"/>
+          <w:rFonts w:ascii="Times New Roman" w:eastAsia="Calibri" w:hAnsi="Times New Roman" w:cs="Times New Roman"/>
+          <w:sz w:val="24"/>
+          <w:szCs w:val="24"/>
+        </w:rPr>
+        <w:t>domaine_auto</w:t>
+      </w:r>
+      <w:proofErr w:type="spellEnd"/>
+      <w:r>
+        <w:rPr>
+          <w:rStyle w:val="CodeHTML"/>
+          <w:rFonts w:ascii="Times New Roman" w:eastAsia="Calibri" w:hAnsi="Times New Roman" w:cs="Times New Roman"/>
+          <w:sz w:val="24"/>
+          <w:szCs w:val="24"/>
+        </w:rPr>
+        <w:t>:</w:t>
       </w:r>
       <w:r>
         <w:rPr>
@@ -3104,6 +3597,7 @@
       <w:r>
         <w:rPr>
           <w:rFonts w:ascii="Times New Roman" w:hAnsi="Times New Roman" w:cs="Times New Roman"/>
+          <w:noProof/>
           <w:sz w:val="24"/>
           <w:szCs w:val="24"/>
         </w:rPr>
@@ -3178,7 +3672,43 @@
           <w:sz w:val="24"/>
           <w:szCs w:val="24"/>
         </w:rPr>
-        <w:t xml:space="preserve">Le terminal affiche le rejet d'une saisie non autorisée (Sport), suivi de la validation de la saisie conforme (Finance) et de l'enregistrement du dataset (Fifaworld). </w:t>
+        <w:t xml:space="preserve">Le terminal affiche le rejet d'une saisie non autorisée (Sport), suivi de la validation de la saisie conforme (Finance) et de l'enregistrement du </w:t>
+      </w:r>
+      <w:proofErr w:type="spellStart"/>
+      <w:r>
+        <w:rPr>
+          <w:rFonts w:ascii="Times New Roman" w:eastAsia="Times New Roman" w:hAnsi="Times New Roman" w:cs="Times New Roman"/>
+          <w:sz w:val="24"/>
+          <w:szCs w:val="24"/>
+        </w:rPr>
+        <w:t>dataset</w:t>
+      </w:r>
+      <w:proofErr w:type="spellEnd"/>
+      <w:r>
+        <w:rPr>
+          <w:rFonts w:ascii="Times New Roman" w:eastAsia="Times New Roman" w:hAnsi="Times New Roman" w:cs="Times New Roman"/>
+          <w:sz w:val="24"/>
+          <w:szCs w:val="24"/>
+        </w:rPr>
+        <w:t xml:space="preserve"> (</w:t>
+      </w:r>
+      <w:proofErr w:type="spellStart"/>
+      <w:r>
+        <w:rPr>
+          <w:rFonts w:ascii="Times New Roman" w:eastAsia="Times New Roman" w:hAnsi="Times New Roman" w:cs="Times New Roman"/>
+          <w:sz w:val="24"/>
+          <w:szCs w:val="24"/>
+        </w:rPr>
+        <w:t>Fifaworld</w:t>
+      </w:r>
+      <w:proofErr w:type="spellEnd"/>
+      <w:r>
+        <w:rPr>
+          <w:rFonts w:ascii="Times New Roman" w:eastAsia="Times New Roman" w:hAnsi="Times New Roman" w:cs="Times New Roman"/>
+          <w:sz w:val="24"/>
+          <w:szCs w:val="24"/>
+        </w:rPr>
+        <w:t xml:space="preserve">). </w:t>
       </w:r>
     </w:p>
     <w:p>
@@ -3320,16 +3850,29 @@
         </w:rPr>
         <w:t>Boucle de validation (</w:t>
       </w:r>
-      <w:r>
-        <w:rPr>
-          <w:rStyle w:val="CodeHTML"/>
-          <w:rFonts w:ascii="Times New Roman" w:hAnsi="Times New Roman" w:cs="Times New Roman"/>
-          <w:b/>
-          <w:bCs/>
-          <w:sz w:val="24"/>
-          <w:szCs w:val="24"/>
-        </w:rPr>
-        <w:t>while ... not in ...</w:t>
+      <w:proofErr w:type="spellStart"/>
+      <w:r>
+        <w:rPr>
+          <w:rStyle w:val="CodeHTML"/>
+          <w:rFonts w:ascii="Times New Roman" w:hAnsi="Times New Roman" w:cs="Times New Roman"/>
+          <w:b/>
+          <w:bCs/>
+          <w:sz w:val="24"/>
+          <w:szCs w:val="24"/>
+        </w:rPr>
+        <w:t>while</w:t>
+      </w:r>
+      <w:proofErr w:type="spellEnd"/>
+      <w:r>
+        <w:rPr>
+          <w:rStyle w:val="CodeHTML"/>
+          <w:rFonts w:ascii="Times New Roman" w:hAnsi="Times New Roman" w:cs="Times New Roman"/>
+          <w:b/>
+          <w:bCs/>
+          <w:sz w:val="24"/>
+          <w:szCs w:val="24"/>
+        </w:rPr>
+        <w:t xml:space="preserve"> ... not in ...</w:t>
       </w:r>
       <w:r>
         <w:rPr>
@@ -3385,8 +3928,27 @@
           <w:sz w:val="24"/>
           <w:szCs w:val="24"/>
         </w:rPr>
-        <w:t>Cette section aborde la gestion dynamique d'une collection de datasets à l'aide d'une liste Python. Elle permet de stocker l'ensemble des dictionnaires créés et d'effectuer des opérations CRUD (</w:t>
-      </w:r>
+        <w:t xml:space="preserve">Cette section aborde la gestion dynamique d'une collection de </w:t>
+      </w:r>
+      <w:proofErr w:type="spellStart"/>
+      <w:r>
+        <w:rPr>
+          <w:rFonts w:ascii="Times New Roman" w:hAnsi="Times New Roman" w:cs="Times New Roman"/>
+          <w:sz w:val="24"/>
+          <w:szCs w:val="24"/>
+        </w:rPr>
+        <w:t>datasets</w:t>
+      </w:r>
+      <w:proofErr w:type="spellEnd"/>
+      <w:r>
+        <w:rPr>
+          <w:rFonts w:ascii="Times New Roman" w:hAnsi="Times New Roman" w:cs="Times New Roman"/>
+          <w:sz w:val="24"/>
+          <w:szCs w:val="24"/>
+        </w:rPr>
+        <w:t xml:space="preserve"> à l'aide d'une liste Python. Elle permet de stocker l'ensemble des dictionnaires créés et d'effectuer des opérations CRUD (</w:t>
+      </w:r>
+      <w:proofErr w:type="spellStart"/>
       <w:r>
         <w:rPr>
           <w:rFonts w:ascii="Times New Roman" w:hAnsi="Times New Roman" w:cs="Times New Roman"/>
@@ -3395,8 +3957,31 @@
           <w:sz w:val="24"/>
           <w:szCs w:val="24"/>
         </w:rPr>
-        <w:t>Create, Read, Update, Delete</w:t>
-      </w:r>
+        <w:t>Create</w:t>
+      </w:r>
+      <w:proofErr w:type="spellEnd"/>
+      <w:r>
+        <w:rPr>
+          <w:rFonts w:ascii="Times New Roman" w:hAnsi="Times New Roman" w:cs="Times New Roman"/>
+          <w:i/>
+          <w:iCs/>
+          <w:sz w:val="24"/>
+          <w:szCs w:val="24"/>
+        </w:rPr>
+        <w:t xml:space="preserve">, Read, Update, </w:t>
+      </w:r>
+      <w:proofErr w:type="spellStart"/>
+      <w:r>
+        <w:rPr>
+          <w:rFonts w:ascii="Times New Roman" w:hAnsi="Times New Roman" w:cs="Times New Roman"/>
+          <w:i/>
+          <w:iCs/>
+          <w:sz w:val="24"/>
+          <w:szCs w:val="24"/>
+        </w:rPr>
+        <w:t>Delete</w:t>
+      </w:r>
+      <w:proofErr w:type="spellEnd"/>
       <w:r>
         <w:rPr>
           <w:rFonts w:ascii="Times New Roman" w:hAnsi="Times New Roman" w:cs="Times New Roman"/>
@@ -3466,6 +4051,7 @@
               <w:lastRenderedPageBreak/>
               <w:t xml:space="preserve">Question 9 — </w:t>
             </w:r>
+            <w:proofErr w:type="spellStart"/>
             <w:r>
               <w:rPr>
                 <w:rFonts w:ascii="Times New Roman" w:hAnsi="Times New Roman" w:cs="Times New Roman"/>
@@ -3486,6 +4072,7 @@
               </w:rPr>
               <w:t>ation</w:t>
             </w:r>
+            <w:proofErr w:type="spellEnd"/>
             <w:r>
               <w:rPr>
                 <w:rFonts w:ascii="Times New Roman" w:hAnsi="Times New Roman" w:cs="Times New Roman"/>
@@ -3514,7 +4101,29 @@
                 <w:sz w:val="24"/>
                 <w:szCs w:val="24"/>
               </w:rPr>
-              <w:t>une liste contenant les datasets. Chaque ajout est enregistré dans la liste.</w:t>
+              <w:t xml:space="preserve">une liste contenant les </w:t>
+            </w:r>
+            <w:proofErr w:type="spellStart"/>
+            <w:r>
+              <w:rPr>
+                <w:rFonts w:ascii="Times New Roman" w:hAnsi="Times New Roman" w:cs="Times New Roman"/>
+                <w:i/>
+                <w:iCs/>
+                <w:sz w:val="24"/>
+                <w:szCs w:val="24"/>
+              </w:rPr>
+              <w:t>datasets</w:t>
+            </w:r>
+            <w:proofErr w:type="spellEnd"/>
+            <w:r>
+              <w:rPr>
+                <w:rFonts w:ascii="Times New Roman" w:hAnsi="Times New Roman" w:cs="Times New Roman"/>
+                <w:i/>
+                <w:iCs/>
+                <w:sz w:val="24"/>
+                <w:szCs w:val="24"/>
+              </w:rPr>
+              <w:t>. Chaque ajout est enregistré dans la liste.</w:t>
             </w:r>
           </w:p>
         </w:tc>
@@ -3537,6 +4146,7 @@
         </w:rPr>
         <w:t xml:space="preserve">Création d'une liste vide </w:t>
       </w:r>
+      <w:proofErr w:type="spellStart"/>
       <w:r>
         <w:rPr>
           <w:rStyle w:val="CodeHTML"/>
@@ -3546,13 +4156,32 @@
         </w:rPr>
         <w:t>catalogue_data</w:t>
       </w:r>
-      <w:r>
-        <w:rPr>
-          <w:rFonts w:ascii="Times New Roman" w:hAnsi="Times New Roman" w:cs="Times New Roman"/>
-          <w:sz w:val="24"/>
-          <w:szCs w:val="24"/>
-        </w:rPr>
-        <w:t xml:space="preserve"> en en-tête de programme pour centraliser tous les datasets ajoutés par l'utilisateur.</w:t>
+      <w:proofErr w:type="spellEnd"/>
+      <w:r>
+        <w:rPr>
+          <w:rFonts w:ascii="Times New Roman" w:hAnsi="Times New Roman" w:cs="Times New Roman"/>
+          <w:sz w:val="24"/>
+          <w:szCs w:val="24"/>
+        </w:rPr>
+        <w:t xml:space="preserve"> en en-tête de programme pour centraliser tous les </w:t>
+      </w:r>
+      <w:proofErr w:type="spellStart"/>
+      <w:r>
+        <w:rPr>
+          <w:rFonts w:ascii="Times New Roman" w:hAnsi="Times New Roman" w:cs="Times New Roman"/>
+          <w:sz w:val="24"/>
+          <w:szCs w:val="24"/>
+        </w:rPr>
+        <w:t>datasets</w:t>
+      </w:r>
+      <w:proofErr w:type="spellEnd"/>
+      <w:r>
+        <w:rPr>
+          <w:rFonts w:ascii="Times New Roman" w:hAnsi="Times New Roman" w:cs="Times New Roman"/>
+          <w:sz w:val="24"/>
+          <w:szCs w:val="24"/>
+        </w:rPr>
+        <w:t xml:space="preserve"> ajoutés par l'utilisateur.</w:t>
       </w:r>
     </w:p>
     <w:p>
@@ -3567,6 +4196,7 @@
       <w:r>
         <w:rPr>
           <w:rFonts w:ascii="Times New Roman" w:hAnsi="Times New Roman" w:cs="Times New Roman"/>
+          <w:noProof/>
           <w:sz w:val="24"/>
           <w:szCs w:val="24"/>
         </w:rPr>
@@ -3622,8 +4252,27 @@
           <w:sz w:val="24"/>
           <w:szCs w:val="24"/>
         </w:rPr>
-        <w:t xml:space="preserve">Chaque nouveau dataset saisi dans l'option 1 est ensuite inséré dans cette liste via l'instruction </w:t>
-      </w:r>
+        <w:t xml:space="preserve">Chaque nouveau </w:t>
+      </w:r>
+      <w:proofErr w:type="spellStart"/>
+      <w:r>
+        <w:rPr>
+          <w:rFonts w:ascii="Times New Roman" w:hAnsi="Times New Roman" w:cs="Times New Roman"/>
+          <w:sz w:val="24"/>
+          <w:szCs w:val="24"/>
+        </w:rPr>
+        <w:t>dataset</w:t>
+      </w:r>
+      <w:proofErr w:type="spellEnd"/>
+      <w:r>
+        <w:rPr>
+          <w:rFonts w:ascii="Times New Roman" w:hAnsi="Times New Roman" w:cs="Times New Roman"/>
+          <w:sz w:val="24"/>
+          <w:szCs w:val="24"/>
+        </w:rPr>
+        <w:t xml:space="preserve"> saisi dans l'option 1 est ensuite inséré dans cette liste via l'instruction </w:t>
+      </w:r>
+      <w:proofErr w:type="spellStart"/>
       <w:r>
         <w:rPr>
           <w:rStyle w:val="CodeHTML"/>
@@ -3631,7 +4280,37 @@
           <w:sz w:val="24"/>
           <w:szCs w:val="24"/>
         </w:rPr>
-        <w:t>catalogue_data.append(dataset)</w:t>
+        <w:t>catalogue_data.append</w:t>
+      </w:r>
+      <w:proofErr w:type="spellEnd"/>
+      <w:r>
+        <w:rPr>
+          <w:rStyle w:val="CodeHTML"/>
+          <w:rFonts w:ascii="Times New Roman" w:eastAsia="Calibri" w:hAnsi="Times New Roman" w:cs="Times New Roman"/>
+          <w:sz w:val="24"/>
+          <w:szCs w:val="24"/>
+        </w:rPr>
+        <w:t>(</w:t>
+      </w:r>
+      <w:proofErr w:type="spellStart"/>
+      <w:r>
+        <w:rPr>
+          <w:rStyle w:val="CodeHTML"/>
+          <w:rFonts w:ascii="Times New Roman" w:eastAsia="Calibri" w:hAnsi="Times New Roman" w:cs="Times New Roman"/>
+          <w:sz w:val="24"/>
+          <w:szCs w:val="24"/>
+        </w:rPr>
+        <w:t>dataset</w:t>
+      </w:r>
+      <w:proofErr w:type="spellEnd"/>
+      <w:r>
+        <w:rPr>
+          <w:rStyle w:val="CodeHTML"/>
+          <w:rFonts w:ascii="Times New Roman" w:eastAsia="Calibri" w:hAnsi="Times New Roman" w:cs="Times New Roman"/>
+          <w:sz w:val="24"/>
+          <w:szCs w:val="24"/>
+        </w:rPr>
+        <w:t>)</w:t>
       </w:r>
     </w:p>
     <w:p>
@@ -3741,8 +4420,19 @@
           <w:sz w:val="24"/>
           <w:szCs w:val="24"/>
         </w:rPr>
-        <w:t>if / elif</w:t>
-      </w:r>
+        <w:t xml:space="preserve">if / </w:t>
+      </w:r>
+      <w:proofErr w:type="spellStart"/>
+      <w:r>
+        <w:rPr>
+          <w:rStyle w:val="CodeHTML"/>
+          <w:rFonts w:ascii="Times New Roman" w:eastAsia="Calibri" w:hAnsi="Times New Roman" w:cs="Times New Roman"/>
+          <w:sz w:val="24"/>
+          <w:szCs w:val="24"/>
+        </w:rPr>
+        <w:t>elif</w:t>
+      </w:r>
+      <w:proofErr w:type="spellEnd"/>
       <w:r>
         <w:rPr>
           <w:rFonts w:ascii="Times New Roman" w:hAnsi="Times New Roman" w:cs="Times New Roman"/>
@@ -3803,6 +4493,7 @@
         </w:rPr>
         <w:t xml:space="preserve">Parcours de la liste </w:t>
       </w:r>
+      <w:proofErr w:type="spellStart"/>
       <w:r>
         <w:rPr>
           <w:rStyle w:val="CodeHTML"/>
@@ -3812,6 +4503,7 @@
         </w:rPr>
         <w:t>catalogue_data</w:t>
       </w:r>
+      <w:proofErr w:type="spellEnd"/>
       <w:r>
         <w:rPr>
           <w:rFonts w:ascii="Times New Roman" w:hAnsi="Times New Roman" w:cs="Times New Roman"/>
@@ -3835,7 +4527,25 @@
           <w:sz w:val="24"/>
           <w:szCs w:val="24"/>
         </w:rPr>
-        <w:t xml:space="preserve"> pour trouver un dataset dont le nom correspond à la saisie.</w:t>
+        <w:t xml:space="preserve"> pour trouver un </w:t>
+      </w:r>
+      <w:proofErr w:type="spellStart"/>
+      <w:r>
+        <w:rPr>
+          <w:rFonts w:ascii="Times New Roman" w:hAnsi="Times New Roman" w:cs="Times New Roman"/>
+          <w:sz w:val="24"/>
+          <w:szCs w:val="24"/>
+        </w:rPr>
+        <w:t>dataset</w:t>
+      </w:r>
+      <w:proofErr w:type="spellEnd"/>
+      <w:r>
+        <w:rPr>
+          <w:rFonts w:ascii="Times New Roman" w:hAnsi="Times New Roman" w:cs="Times New Roman"/>
+          <w:sz w:val="24"/>
+          <w:szCs w:val="24"/>
+        </w:rPr>
+        <w:t xml:space="preserve"> dont le nom correspond à la saisie.</w:t>
       </w:r>
     </w:p>
     <w:p>
@@ -3854,6 +4564,7 @@
           <w:rFonts w:ascii="Times New Roman" w:hAnsi="Times New Roman" w:cs="Times New Roman"/>
           <w:b/>
           <w:bCs/>
+          <w:noProof/>
           <w:sz w:val="24"/>
           <w:szCs w:val="24"/>
         </w:rPr>
@@ -3939,7 +4650,25 @@
           <w:sz w:val="24"/>
           <w:szCs w:val="24"/>
         </w:rPr>
-        <w:t>Recherche du dataset dans la liste, puis mise à jour dynamique de la valeur de la clé sélectionnée.</w:t>
+        <w:t xml:space="preserve">Recherche du </w:t>
+      </w:r>
+      <w:proofErr w:type="spellStart"/>
+      <w:r>
+        <w:rPr>
+          <w:rFonts w:ascii="Times New Roman" w:hAnsi="Times New Roman" w:cs="Times New Roman"/>
+          <w:sz w:val="24"/>
+          <w:szCs w:val="24"/>
+        </w:rPr>
+        <w:t>dataset</w:t>
+      </w:r>
+      <w:proofErr w:type="spellEnd"/>
+      <w:r>
+        <w:rPr>
+          <w:rFonts w:ascii="Times New Roman" w:hAnsi="Times New Roman" w:cs="Times New Roman"/>
+          <w:sz w:val="24"/>
+          <w:szCs w:val="24"/>
+        </w:rPr>
+        <w:t xml:space="preserve"> dans la liste, puis mise à jour dynamique de la valeur de la clé sélectionnée.</w:t>
       </w:r>
     </w:p>
     <w:p>
@@ -3958,6 +4687,7 @@
           <w:rFonts w:ascii="Times New Roman" w:hAnsi="Times New Roman" w:cs="Times New Roman"/>
           <w:b/>
           <w:bCs/>
+          <w:noProof/>
           <w:sz w:val="24"/>
           <w:szCs w:val="24"/>
         </w:rPr>
@@ -4065,7 +4795,27 @@
           <w:sz w:val="24"/>
           <w:szCs w:val="24"/>
         </w:rPr>
-        <w:t>.remove()</w:t>
+        <w:t>.</w:t>
+      </w:r>
+      <w:proofErr w:type="spellStart"/>
+      <w:r>
+        <w:rPr>
+          <w:rStyle w:val="CodeHTML"/>
+          <w:rFonts w:ascii="Times New Roman" w:eastAsia="Calibri" w:hAnsi="Times New Roman" w:cs="Times New Roman"/>
+          <w:sz w:val="24"/>
+          <w:szCs w:val="24"/>
+        </w:rPr>
+        <w:t>remove</w:t>
+      </w:r>
+      <w:proofErr w:type="spellEnd"/>
+      <w:r>
+        <w:rPr>
+          <w:rStyle w:val="CodeHTML"/>
+          <w:rFonts w:ascii="Times New Roman" w:eastAsia="Calibri" w:hAnsi="Times New Roman" w:cs="Times New Roman"/>
+          <w:sz w:val="24"/>
+          <w:szCs w:val="24"/>
+        </w:rPr>
+        <w:t>()</w:t>
       </w:r>
     </w:p>
     <w:p>
@@ -4084,6 +4834,7 @@
           <w:rFonts w:ascii="Times New Roman" w:hAnsi="Times New Roman" w:cs="Times New Roman"/>
           <w:b/>
           <w:bCs/>
+          <w:noProof/>
           <w:sz w:val="24"/>
           <w:szCs w:val="24"/>
         </w:rPr>
@@ -4217,6 +4968,7 @@
       <w:r>
         <w:rPr>
           <w:rFonts w:ascii="Times New Roman" w:eastAsia="Consolas" w:hAnsi="Times New Roman" w:cs="Times New Roman"/>
+          <w:noProof/>
           <w:sz w:val="24"/>
           <w:szCs w:val="24"/>
         </w:rPr>
@@ -4285,7 +5037,29 @@
           <w:sz w:val="24"/>
           <w:szCs w:val="24"/>
         </w:rPr>
-        <w:t>Résultat à l'exécution (ajout de 2 datasets, tri, recherche, modification, suppression) :</w:t>
+        <w:t xml:space="preserve">Résultat à l'exécution (ajout de 2 </w:t>
+      </w:r>
+      <w:proofErr w:type="spellStart"/>
+      <w:r>
+        <w:rPr>
+          <w:rFonts w:ascii="Times New Roman" w:hAnsi="Times New Roman" w:cs="Times New Roman"/>
+          <w:b/>
+          <w:bCs/>
+          <w:sz w:val="24"/>
+          <w:szCs w:val="24"/>
+        </w:rPr>
+        <w:t>datasets</w:t>
+      </w:r>
+      <w:proofErr w:type="spellEnd"/>
+      <w:r>
+        <w:rPr>
+          <w:rFonts w:ascii="Times New Roman" w:hAnsi="Times New Roman" w:cs="Times New Roman"/>
+          <w:b/>
+          <w:bCs/>
+          <w:sz w:val="24"/>
+          <w:szCs w:val="24"/>
+        </w:rPr>
+        <w:t>, tri, recherche, modification, suppression) :</w:t>
       </w:r>
       <w:r>
         <w:rPr>
@@ -4308,6 +5082,7 @@
       <w:r>
         <w:rPr>
           <w:rFonts w:ascii="Times New Roman" w:hAnsi="Times New Roman" w:cs="Times New Roman"/>
+          <w:noProof/>
           <w:sz w:val="24"/>
           <w:szCs w:val="24"/>
         </w:rPr>
@@ -4359,6 +5134,7 @@
       <w:r>
         <w:rPr>
           <w:rFonts w:ascii="Times New Roman" w:hAnsi="Times New Roman" w:cs="Times New Roman"/>
+          <w:noProof/>
           <w:sz w:val="24"/>
           <w:szCs w:val="24"/>
         </w:rPr>
@@ -4444,7 +5220,25 @@
           <w:sz w:val="24"/>
           <w:szCs w:val="24"/>
         </w:rPr>
-        <w:t xml:space="preserve"> Après l'ajout de plusieurs datasets (</w:t>
+        <w:t xml:space="preserve"> Après l'ajout de plusieurs </w:t>
+      </w:r>
+      <w:proofErr w:type="spellStart"/>
+      <w:r>
+        <w:rPr>
+          <w:rFonts w:ascii="Times New Roman" w:hAnsi="Times New Roman" w:cs="Times New Roman"/>
+          <w:sz w:val="24"/>
+          <w:szCs w:val="24"/>
+        </w:rPr>
+        <w:t>datasets</w:t>
+      </w:r>
+      <w:proofErr w:type="spellEnd"/>
+      <w:r>
+        <w:rPr>
+          <w:rFonts w:ascii="Times New Roman" w:hAnsi="Times New Roman" w:cs="Times New Roman"/>
+          <w:sz w:val="24"/>
+          <w:szCs w:val="24"/>
+        </w:rPr>
+        <w:t xml:space="preserve"> (</w:t>
       </w:r>
       <w:r>
         <w:rPr>
@@ -4495,7 +5289,25 @@
           <w:sz w:val="24"/>
           <w:szCs w:val="24"/>
         </w:rPr>
-        <w:t xml:space="preserve"> du dataset </w:t>
+        <w:t xml:space="preserve"> du </w:t>
+      </w:r>
+      <w:proofErr w:type="spellStart"/>
+      <w:r>
+        <w:rPr>
+          <w:rFonts w:ascii="Times New Roman" w:hAnsi="Times New Roman" w:cs="Times New Roman"/>
+          <w:sz w:val="24"/>
+          <w:szCs w:val="24"/>
+        </w:rPr>
+        <w:t>dataset</w:t>
+      </w:r>
+      <w:proofErr w:type="spellEnd"/>
+      <w:r>
+        <w:rPr>
+          <w:rFonts w:ascii="Times New Roman" w:hAnsi="Times New Roman" w:cs="Times New Roman"/>
+          <w:sz w:val="24"/>
+          <w:szCs w:val="24"/>
+        </w:rPr>
+        <w:t xml:space="preserve"> </w:t>
       </w:r>
       <w:r>
         <w:rPr>
@@ -4549,7 +5361,43 @@
           <w:sz w:val="24"/>
           <w:szCs w:val="24"/>
         </w:rPr>
-        <w:t xml:space="preserve"> Le dataset Titanic est sélectionné et retiré du catalogue. L'affichage récapitulatif confirme qu'il ne reste plus que le dataset I-Sante dans la liste. </w:t>
+        <w:t xml:space="preserve"> Le </w:t>
+      </w:r>
+      <w:proofErr w:type="spellStart"/>
+      <w:r>
+        <w:rPr>
+          <w:rFonts w:ascii="Times New Roman" w:eastAsia="Times New Roman" w:hAnsi="Times New Roman" w:cs="Times New Roman"/>
+          <w:sz w:val="24"/>
+          <w:szCs w:val="24"/>
+        </w:rPr>
+        <w:t>dataset</w:t>
+      </w:r>
+      <w:proofErr w:type="spellEnd"/>
+      <w:r>
+        <w:rPr>
+          <w:rFonts w:ascii="Times New Roman" w:eastAsia="Times New Roman" w:hAnsi="Times New Roman" w:cs="Times New Roman"/>
+          <w:sz w:val="24"/>
+          <w:szCs w:val="24"/>
+        </w:rPr>
+        <w:t xml:space="preserve"> Titanic est sélectionné et retiré du catalogue. L'affichage récapitulatif confirme qu'il ne reste plus que le </w:t>
+      </w:r>
+      <w:proofErr w:type="spellStart"/>
+      <w:r>
+        <w:rPr>
+          <w:rFonts w:ascii="Times New Roman" w:eastAsia="Times New Roman" w:hAnsi="Times New Roman" w:cs="Times New Roman"/>
+          <w:sz w:val="24"/>
+          <w:szCs w:val="24"/>
+        </w:rPr>
+        <w:t>dataset</w:t>
+      </w:r>
+      <w:proofErr w:type="spellEnd"/>
+      <w:r>
+        <w:rPr>
+          <w:rFonts w:ascii="Times New Roman" w:eastAsia="Times New Roman" w:hAnsi="Times New Roman" w:cs="Times New Roman"/>
+          <w:sz w:val="24"/>
+          <w:szCs w:val="24"/>
+        </w:rPr>
+        <w:t xml:space="preserve"> I-Sante dans la liste. </w:t>
       </w:r>
     </w:p>
     <w:p>
@@ -4616,7 +5464,15 @@
         <w:t>) :</w:t>
       </w:r>
       <w:r>
-        <w:t xml:space="preserve"> Structure de données séquentielle et modifiable (mutable) servant à stocker dynamiquement une collection d'objets (ici, les dictionnaires de datasets). </w:t>
+        <w:t xml:space="preserve"> Structure de données séquentielle et modifiable (mutable) servant à stocker dynamiquement une collection d'objets (ici, les dictionnaires de </w:t>
+      </w:r>
+      <w:proofErr w:type="spellStart"/>
+      <w:r>
+        <w:t>datasets</w:t>
+      </w:r>
+      <w:proofErr w:type="spellEnd"/>
+      <w:r>
+        <w:t xml:space="preserve">). </w:t>
       </w:r>
     </w:p>
     <w:p>
@@ -4668,7 +5524,31 @@
           <w:sz w:val="24"/>
           <w:szCs w:val="24"/>
         </w:rPr>
-        <w:t>.remove()</w:t>
+        <w:t>.</w:t>
+      </w:r>
+      <w:proofErr w:type="spellStart"/>
+      <w:r>
+        <w:rPr>
+          <w:rStyle w:val="CodeHTML"/>
+          <w:rFonts w:ascii="Times New Roman" w:hAnsi="Times New Roman" w:cs="Times New Roman"/>
+          <w:b/>
+          <w:bCs/>
+          <w:sz w:val="24"/>
+          <w:szCs w:val="24"/>
+        </w:rPr>
+        <w:t>remove</w:t>
+      </w:r>
+      <w:proofErr w:type="spellEnd"/>
+      <w:r>
+        <w:rPr>
+          <w:rStyle w:val="CodeHTML"/>
+          <w:rFonts w:ascii="Times New Roman" w:hAnsi="Times New Roman" w:cs="Times New Roman"/>
+          <w:b/>
+          <w:bCs/>
+          <w:sz w:val="24"/>
+          <w:szCs w:val="24"/>
+        </w:rPr>
+        <w:t>()</w:t>
       </w:r>
       <w:r>
         <w:rPr>
@@ -4933,7 +5813,51 @@
                 <w:sz w:val="24"/>
                 <w:szCs w:val="24"/>
               </w:rPr>
-              <w:t>es statistiques : nombre de datasets, nombre total de lignes, nombre moyen de colonnes, datasets publics/privés, répartition par format et par domaine.</w:t>
+              <w:t xml:space="preserve">es statistiques : nombre de </w:t>
+            </w:r>
+            <w:proofErr w:type="spellStart"/>
+            <w:r>
+              <w:rPr>
+                <w:rFonts w:ascii="Times New Roman" w:hAnsi="Times New Roman" w:cs="Times New Roman"/>
+                <w:i/>
+                <w:iCs/>
+                <w:sz w:val="24"/>
+                <w:szCs w:val="24"/>
+              </w:rPr>
+              <w:t>datasets</w:t>
+            </w:r>
+            <w:proofErr w:type="spellEnd"/>
+            <w:r>
+              <w:rPr>
+                <w:rFonts w:ascii="Times New Roman" w:hAnsi="Times New Roman" w:cs="Times New Roman"/>
+                <w:i/>
+                <w:iCs/>
+                <w:sz w:val="24"/>
+                <w:szCs w:val="24"/>
+              </w:rPr>
+              <w:t xml:space="preserve">, nombre total de lignes, nombre moyen de colonnes, </w:t>
+            </w:r>
+            <w:proofErr w:type="spellStart"/>
+            <w:r>
+              <w:rPr>
+                <w:rFonts w:ascii="Times New Roman" w:hAnsi="Times New Roman" w:cs="Times New Roman"/>
+                <w:i/>
+                <w:iCs/>
+                <w:sz w:val="24"/>
+                <w:szCs w:val="24"/>
+              </w:rPr>
+              <w:t>datasets</w:t>
+            </w:r>
+            <w:proofErr w:type="spellEnd"/>
+            <w:r>
+              <w:rPr>
+                <w:rFonts w:ascii="Times New Roman" w:hAnsi="Times New Roman" w:cs="Times New Roman"/>
+                <w:i/>
+                <w:iCs/>
+                <w:sz w:val="24"/>
+                <w:szCs w:val="24"/>
+              </w:rPr>
+              <w:t xml:space="preserve"> publics/privés, répartition par format et par domaine.</w:t>
             </w:r>
           </w:p>
         </w:tc>
@@ -4972,7 +5896,43 @@
           <w:sz w:val="24"/>
           <w:szCs w:val="24"/>
         </w:rPr>
-        <w:t>Mise en place d'une nouvelle option dans le menu pour calculer et afficher un rapport complet sur le catalogue : nombre total de datasets, nombre total de lignes, nombre moyen de colonnes, datasets publics/privés, ainsi que la répartition par format et par domaine.</w:t>
+        <w:t xml:space="preserve">Mise en place d'une nouvelle option dans le menu pour calculer et afficher un rapport complet sur le catalogue : nombre total de </w:t>
+      </w:r>
+      <w:proofErr w:type="spellStart"/>
+      <w:r>
+        <w:rPr>
+          <w:rFonts w:ascii="Times New Roman" w:hAnsi="Times New Roman" w:cs="Times New Roman"/>
+          <w:sz w:val="24"/>
+          <w:szCs w:val="24"/>
+        </w:rPr>
+        <w:t>datasets</w:t>
+      </w:r>
+      <w:proofErr w:type="spellEnd"/>
+      <w:r>
+        <w:rPr>
+          <w:rFonts w:ascii="Times New Roman" w:hAnsi="Times New Roman" w:cs="Times New Roman"/>
+          <w:sz w:val="24"/>
+          <w:szCs w:val="24"/>
+        </w:rPr>
+        <w:t xml:space="preserve">, nombre total de lignes, nombre moyen de colonnes, </w:t>
+      </w:r>
+      <w:proofErr w:type="spellStart"/>
+      <w:r>
+        <w:rPr>
+          <w:rFonts w:ascii="Times New Roman" w:hAnsi="Times New Roman" w:cs="Times New Roman"/>
+          <w:sz w:val="24"/>
+          <w:szCs w:val="24"/>
+        </w:rPr>
+        <w:t>datasets</w:t>
+      </w:r>
+      <w:proofErr w:type="spellEnd"/>
+      <w:r>
+        <w:rPr>
+          <w:rFonts w:ascii="Times New Roman" w:hAnsi="Times New Roman" w:cs="Times New Roman"/>
+          <w:sz w:val="24"/>
+          <w:szCs w:val="24"/>
+        </w:rPr>
+        <w:t xml:space="preserve"> publics/privés, ainsi que la répartition par format et par domaine.</w:t>
       </w:r>
     </w:p>
     <w:p>
@@ -5019,6 +5979,7 @@
           <w:rFonts w:ascii="Times New Roman" w:hAnsi="Times New Roman" w:cs="Times New Roman"/>
           <w:b/>
           <w:bCs/>
+          <w:noProof/>
           <w:sz w:val="24"/>
           <w:szCs w:val="24"/>
         </w:rPr>
@@ -5079,6 +6040,7 @@
         <w:lastRenderedPageBreak/>
         <w:t>L'extrait montre l'utilisation des compréhensions de listes associées aux fonctions d'agrégation (</w:t>
       </w:r>
+      <w:proofErr w:type="spellStart"/>
       <w:r>
         <w:rPr>
           <w:rStyle w:val="CodeHTML"/>
@@ -5086,7 +6048,17 @@
           <w:sz w:val="24"/>
           <w:szCs w:val="24"/>
         </w:rPr>
-        <w:t>sum()</w:t>
+        <w:t>sum</w:t>
+      </w:r>
+      <w:proofErr w:type="spellEnd"/>
+      <w:r>
+        <w:rPr>
+          <w:rStyle w:val="CodeHTML"/>
+          <w:rFonts w:ascii="Times New Roman" w:eastAsia="Calibri" w:hAnsi="Times New Roman" w:cs="Times New Roman"/>
+          <w:sz w:val="24"/>
+          <w:szCs w:val="24"/>
+        </w:rPr>
+        <w:t>()</w:t>
       </w:r>
       <w:r>
         <w:rPr>
@@ -5096,6 +6068,7 @@
         </w:rPr>
         <w:t xml:space="preserve">, </w:t>
       </w:r>
+      <w:proofErr w:type="spellStart"/>
       <w:r>
         <w:rPr>
           <w:rStyle w:val="CodeHTML"/>
@@ -5103,7 +6076,17 @@
           <w:sz w:val="24"/>
           <w:szCs w:val="24"/>
         </w:rPr>
-        <w:t>len()</w:t>
+        <w:t>len</w:t>
+      </w:r>
+      <w:proofErr w:type="spellEnd"/>
+      <w:r>
+        <w:rPr>
+          <w:rStyle w:val="CodeHTML"/>
+          <w:rFonts w:ascii="Times New Roman" w:eastAsia="Calibri" w:hAnsi="Times New Roman" w:cs="Times New Roman"/>
+          <w:sz w:val="24"/>
+          <w:szCs w:val="24"/>
+        </w:rPr>
+        <w:t>()</w:t>
       </w:r>
       <w:r>
         <w:rPr>
@@ -5131,7 +6114,29 @@
           <w:sz w:val="24"/>
           <w:szCs w:val="24"/>
         </w:rPr>
-        <w:t>Résultat à l'exécution (catalogue de 2 datasets) :</w:t>
+        <w:t xml:space="preserve">Résultat à l'exécution (catalogue de 2 </w:t>
+      </w:r>
+      <w:proofErr w:type="spellStart"/>
+      <w:r>
+        <w:rPr>
+          <w:rFonts w:ascii="Times New Roman" w:hAnsi="Times New Roman" w:cs="Times New Roman"/>
+          <w:b/>
+          <w:bCs/>
+          <w:sz w:val="24"/>
+          <w:szCs w:val="24"/>
+        </w:rPr>
+        <w:t>datasets</w:t>
+      </w:r>
+      <w:proofErr w:type="spellEnd"/>
+      <w:r>
+        <w:rPr>
+          <w:rFonts w:ascii="Times New Roman" w:hAnsi="Times New Roman" w:cs="Times New Roman"/>
+          <w:b/>
+          <w:bCs/>
+          <w:sz w:val="24"/>
+          <w:szCs w:val="24"/>
+        </w:rPr>
+        <w:t>) :</w:t>
       </w:r>
       <w:r>
         <w:rPr>
@@ -5154,6 +6159,7 @@
       <w:r>
         <w:rPr>
           <w:rFonts w:ascii="Times New Roman" w:hAnsi="Times New Roman" w:cs="Times New Roman"/>
+          <w:noProof/>
           <w:sz w:val="24"/>
           <w:szCs w:val="24"/>
         </w:rPr>
@@ -5209,7 +6215,25 @@
           <w:sz w:val="24"/>
           <w:szCs w:val="24"/>
         </w:rPr>
-        <w:t>Le terminal affiche le choix de l'option 7 du menu suivi du rapport statistique détaillé d'un catalogue de 2 datasets (Transport et Agriculture), présentant le nombre total de lignes, la moyenne de colonnes (17.00), la taille totale (120.0 Mo) et la répartition par format et par domaine.</w:t>
+        <w:t xml:space="preserve">Le terminal affiche le choix de l'option 7 du menu suivi du rapport statistique détaillé d'un catalogue de 2 </w:t>
+      </w:r>
+      <w:proofErr w:type="spellStart"/>
+      <w:r>
+        <w:rPr>
+          <w:rFonts w:ascii="Times New Roman" w:hAnsi="Times New Roman" w:cs="Times New Roman"/>
+          <w:sz w:val="24"/>
+          <w:szCs w:val="24"/>
+        </w:rPr>
+        <w:t>datasets</w:t>
+      </w:r>
+      <w:proofErr w:type="spellEnd"/>
+      <w:r>
+        <w:rPr>
+          <w:rFonts w:ascii="Times New Roman" w:hAnsi="Times New Roman" w:cs="Times New Roman"/>
+          <w:sz w:val="24"/>
+          <w:szCs w:val="24"/>
+        </w:rPr>
+        <w:t xml:space="preserve"> (Transport et Agriculture), présentant le nombre total de lignes, la moyenne de colonnes (17.00), la taille totale (120.0 Mo) et la répartition par format et par domaine.</w:t>
       </w:r>
     </w:p>
     <w:p>
@@ -5256,7 +6280,79 @@
           <w:sz w:val="24"/>
           <w:szCs w:val="24"/>
         </w:rPr>
-        <w:t>[expr for item in iterable if cond]</w:t>
+        <w:t>[</w:t>
+      </w:r>
+      <w:proofErr w:type="spellStart"/>
+      <w:r>
+        <w:rPr>
+          <w:rStyle w:val="CodeHTML"/>
+          <w:rFonts w:ascii="Times New Roman" w:hAnsi="Times New Roman" w:cs="Times New Roman"/>
+          <w:b/>
+          <w:bCs/>
+          <w:sz w:val="24"/>
+          <w:szCs w:val="24"/>
+        </w:rPr>
+        <w:t>expr</w:t>
+      </w:r>
+      <w:proofErr w:type="spellEnd"/>
+      <w:r>
+        <w:rPr>
+          <w:rStyle w:val="CodeHTML"/>
+          <w:rFonts w:ascii="Times New Roman" w:hAnsi="Times New Roman" w:cs="Times New Roman"/>
+          <w:b/>
+          <w:bCs/>
+          <w:sz w:val="24"/>
+          <w:szCs w:val="24"/>
+        </w:rPr>
+        <w:t xml:space="preserve"> for item in </w:t>
+      </w:r>
+      <w:proofErr w:type="spellStart"/>
+      <w:r>
+        <w:rPr>
+          <w:rStyle w:val="CodeHTML"/>
+          <w:rFonts w:ascii="Times New Roman" w:hAnsi="Times New Roman" w:cs="Times New Roman"/>
+          <w:b/>
+          <w:bCs/>
+          <w:sz w:val="24"/>
+          <w:szCs w:val="24"/>
+        </w:rPr>
+        <w:t>iterable</w:t>
+      </w:r>
+      <w:proofErr w:type="spellEnd"/>
+      <w:r>
+        <w:rPr>
+          <w:rStyle w:val="CodeHTML"/>
+          <w:rFonts w:ascii="Times New Roman" w:hAnsi="Times New Roman" w:cs="Times New Roman"/>
+          <w:b/>
+          <w:bCs/>
+          <w:sz w:val="24"/>
+          <w:szCs w:val="24"/>
+        </w:rPr>
+        <w:t xml:space="preserve"> if </w:t>
+      </w:r>
+      <w:proofErr w:type="spellStart"/>
+      <w:r>
+        <w:rPr>
+          <w:rStyle w:val="CodeHTML"/>
+          <w:rFonts w:ascii="Times New Roman" w:hAnsi="Times New Roman" w:cs="Times New Roman"/>
+          <w:b/>
+          <w:bCs/>
+          <w:sz w:val="24"/>
+          <w:szCs w:val="24"/>
+        </w:rPr>
+        <w:t>cond</w:t>
+      </w:r>
+      <w:proofErr w:type="spellEnd"/>
+      <w:r>
+        <w:rPr>
+          <w:rStyle w:val="CodeHTML"/>
+          <w:rFonts w:ascii="Times New Roman" w:hAnsi="Times New Roman" w:cs="Times New Roman"/>
+          <w:b/>
+          <w:bCs/>
+          <w:sz w:val="24"/>
+          <w:szCs w:val="24"/>
+        </w:rPr>
+        <w:t>]</w:t>
       </w:r>
       <w:r>
         <w:rPr>
@@ -5285,16 +6381,29 @@
         </w:rPr>
         <w:t>Fonctions d'agrégation (</w:t>
       </w:r>
-      <w:r>
-        <w:rPr>
-          <w:rStyle w:val="CodeHTML"/>
-          <w:rFonts w:ascii="Times New Roman" w:hAnsi="Times New Roman" w:cs="Times New Roman"/>
-          <w:b/>
-          <w:bCs/>
-          <w:sz w:val="24"/>
-          <w:szCs w:val="24"/>
-        </w:rPr>
-        <w:t>sum()</w:t>
+      <w:proofErr w:type="spellStart"/>
+      <w:r>
+        <w:rPr>
+          <w:rStyle w:val="CodeHTML"/>
+          <w:rFonts w:ascii="Times New Roman" w:hAnsi="Times New Roman" w:cs="Times New Roman"/>
+          <w:b/>
+          <w:bCs/>
+          <w:sz w:val="24"/>
+          <w:szCs w:val="24"/>
+        </w:rPr>
+        <w:t>sum</w:t>
+      </w:r>
+      <w:proofErr w:type="spellEnd"/>
+      <w:r>
+        <w:rPr>
+          <w:rStyle w:val="CodeHTML"/>
+          <w:rFonts w:ascii="Times New Roman" w:hAnsi="Times New Roman" w:cs="Times New Roman"/>
+          <w:b/>
+          <w:bCs/>
+          <w:sz w:val="24"/>
+          <w:szCs w:val="24"/>
+        </w:rPr>
+        <w:t>()</w:t>
       </w:r>
       <w:r>
         <w:rPr>
@@ -5303,16 +6412,29 @@
         </w:rPr>
         <w:t xml:space="preserve">, </w:t>
       </w:r>
-      <w:r>
-        <w:rPr>
-          <w:rStyle w:val="CodeHTML"/>
-          <w:rFonts w:ascii="Times New Roman" w:hAnsi="Times New Roman" w:cs="Times New Roman"/>
-          <w:b/>
-          <w:bCs/>
-          <w:sz w:val="24"/>
-          <w:szCs w:val="24"/>
-        </w:rPr>
-        <w:t>len()</w:t>
+      <w:proofErr w:type="spellStart"/>
+      <w:r>
+        <w:rPr>
+          <w:rStyle w:val="CodeHTML"/>
+          <w:rFonts w:ascii="Times New Roman" w:hAnsi="Times New Roman" w:cs="Times New Roman"/>
+          <w:b/>
+          <w:bCs/>
+          <w:sz w:val="24"/>
+          <w:szCs w:val="24"/>
+        </w:rPr>
+        <w:t>len</w:t>
+      </w:r>
+      <w:proofErr w:type="spellEnd"/>
+      <w:r>
+        <w:rPr>
+          <w:rStyle w:val="CodeHTML"/>
+          <w:rFonts w:ascii="Times New Roman" w:hAnsi="Times New Roman" w:cs="Times New Roman"/>
+          <w:b/>
+          <w:bCs/>
+          <w:sz w:val="24"/>
+          <w:szCs w:val="24"/>
+        </w:rPr>
+        <w:t>()</w:t>
       </w:r>
       <w:r>
         <w:rPr>
@@ -5379,16 +6501,29 @@
         </w:rPr>
         <w:t>Comptage par dictionnaire (</w:t>
       </w:r>
-      <w:r>
-        <w:rPr>
-          <w:rStyle w:val="CodeHTML"/>
-          <w:rFonts w:ascii="Times New Roman" w:hAnsi="Times New Roman" w:cs="Times New Roman"/>
-          <w:b/>
-          <w:bCs/>
-          <w:sz w:val="24"/>
-          <w:szCs w:val="24"/>
-        </w:rPr>
-        <w:t>dict.items()</w:t>
+      <w:proofErr w:type="spellStart"/>
+      <w:r>
+        <w:rPr>
+          <w:rStyle w:val="CodeHTML"/>
+          <w:rFonts w:ascii="Times New Roman" w:hAnsi="Times New Roman" w:cs="Times New Roman"/>
+          <w:b/>
+          <w:bCs/>
+          <w:sz w:val="24"/>
+          <w:szCs w:val="24"/>
+        </w:rPr>
+        <w:t>dict.items</w:t>
+      </w:r>
+      <w:proofErr w:type="spellEnd"/>
+      <w:r>
+        <w:rPr>
+          <w:rStyle w:val="CodeHTML"/>
+          <w:rFonts w:ascii="Times New Roman" w:hAnsi="Times New Roman" w:cs="Times New Roman"/>
+          <w:b/>
+          <w:bCs/>
+          <w:sz w:val="24"/>
+          <w:szCs w:val="24"/>
+        </w:rPr>
+        <w:t>()</w:t>
       </w:r>
       <w:r>
         <w:rPr>
@@ -5400,6 +6535,1233 @@
       <w:r>
         <w:t xml:space="preserve"> Technique pour accumuler la fréquence des domaines et itérer sur les couples clé-valeur lors de l'affichage. </w:t>
       </w:r>
+    </w:p>
+    <w:p>
+      <w:pPr>
+        <w:pStyle w:val="NormalWeb"/>
+        <w:spacing w:before="0" w:beforeAutospacing="0" w:line="360" w:lineRule="auto"/>
+      </w:pPr>
+    </w:p>
+    <w:p>
+      <w:pPr>
+        <w:pStyle w:val="Titre1"/>
+        <w:spacing w:line="360" w:lineRule="auto"/>
+        <w:rPr>
+          <w:rFonts w:ascii="Times New Roman" w:hAnsi="Times New Roman" w:cs="Times New Roman"/>
+          <w:color w:val="auto"/>
+          <w:sz w:val="24"/>
+          <w:szCs w:val="24"/>
+        </w:rPr>
+      </w:pPr>
+      <w:r>
+        <w:rPr>
+          <w:rFonts w:ascii="Times New Roman" w:hAnsi="Times New Roman" w:cs="Times New Roman"/>
+          <w:color w:val="auto"/>
+          <w:sz w:val="24"/>
+          <w:szCs w:val="24"/>
+        </w:rPr>
+        <w:t>Partie 7 — Fichiers</w:t>
+      </w:r>
+    </w:p>
+    <w:p>
+      <w:pPr>
+        <w:pStyle w:val="lev1"/>
+        <w:spacing w:line="360" w:lineRule="auto"/>
+        <w:rPr>
+          <w:rFonts w:ascii="Times New Roman" w:hAnsi="Times New Roman" w:cs="Times New Roman"/>
+          <w:sz w:val="24"/>
+          <w:szCs w:val="24"/>
+        </w:rPr>
+      </w:pPr>
+      <w:r>
+        <w:rPr>
+          <w:rFonts w:ascii="Times New Roman" w:hAnsi="Times New Roman" w:cs="Times New Roman"/>
+          <w:sz w:val="24"/>
+          <w:szCs w:val="24"/>
+        </w:rPr>
+        <w:t xml:space="preserve">Cette section aborde la persistance des données du catalogue en sauvegardant les </w:t>
+      </w:r>
+      <w:proofErr w:type="spellStart"/>
+      <w:r>
+        <w:rPr>
+          <w:rFonts w:ascii="Times New Roman" w:hAnsi="Times New Roman" w:cs="Times New Roman"/>
+          <w:sz w:val="24"/>
+          <w:szCs w:val="24"/>
+        </w:rPr>
+        <w:t>datasets</w:t>
+      </w:r>
+      <w:proofErr w:type="spellEnd"/>
+      <w:r>
+        <w:rPr>
+          <w:rFonts w:ascii="Times New Roman" w:hAnsi="Times New Roman" w:cs="Times New Roman"/>
+          <w:sz w:val="24"/>
+          <w:szCs w:val="24"/>
+        </w:rPr>
+        <w:t xml:space="preserve"> dans un fichier CSV externe, puis en permettant leur rechargement automatique au sein de l'application.</w:t>
+      </w:r>
+    </w:p>
+    <w:tbl>
+      <w:tblPr>
+        <w:tblW w:w="5000" w:type="pct"/>
+        <w:tblBorders>
+          <w:top w:val="single" w:sz="4" w:space="0" w:color="2E5395"/>
+          <w:left w:val="single" w:sz="4" w:space="0" w:color="2E5395"/>
+          <w:bottom w:val="single" w:sz="4" w:space="0" w:color="2E5395"/>
+          <w:right w:val="single" w:sz="4" w:space="0" w:color="2E5395"/>
+          <w:insideH w:val="single" w:sz="4" w:space="0" w:color="auto"/>
+          <w:insideV w:val="single" w:sz="4" w:space="0" w:color="auto"/>
+        </w:tblBorders>
+        <w:shd w:val="clear" w:color="auto" w:fill="FFC000" w:themeFill="accent4"/>
+        <w:tblCellMar>
+          <w:left w:w="10" w:type="dxa"/>
+          <w:right w:w="10" w:type="dxa"/>
+        </w:tblCellMar>
+        <w:tblLook w:val="04A0" w:firstRow="1" w:lastRow="0" w:firstColumn="1" w:lastColumn="0" w:noHBand="0" w:noVBand="1"/>
+      </w:tblPr>
+      <w:tblGrid>
+        <w:gridCol w:w="10480"/>
+      </w:tblGrid>
+      <w:tr>
+        <w:tc>
+          <w:tcPr>
+            <w:tcW w:w="0" w:type="auto"/>
+            <w:tcBorders>
+              <w:top w:val="single" w:sz="4" w:space="0" w:color="2E5395"/>
+              <w:left w:val="single" w:sz="4" w:space="0" w:color="2E5395"/>
+              <w:bottom w:val="single" w:sz="4" w:space="0" w:color="2E5395"/>
+              <w:right w:val="single" w:sz="4" w:space="0" w:color="2E5395"/>
+            </w:tcBorders>
+            <w:shd w:val="clear" w:color="auto" w:fill="FFC000" w:themeFill="accent4"/>
+            <w:tcMar>
+              <w:top w:w="150" w:type="dxa"/>
+              <w:left w:w="200" w:type="dxa"/>
+              <w:bottom w:w="150" w:type="dxa"/>
+              <w:right w:w="200" w:type="dxa"/>
+            </w:tcMar>
+            <w:hideMark/>
+          </w:tcPr>
+          <w:p>
+            <w:pPr>
+              <w:spacing w:line="360" w:lineRule="auto"/>
+              <w:rPr>
+                <w:rFonts w:ascii="Times New Roman" w:hAnsi="Times New Roman" w:cs="Times New Roman"/>
+                <w:sz w:val="24"/>
+                <w:szCs w:val="24"/>
+              </w:rPr>
+            </w:pPr>
+            <w:r>
+              <w:rPr>
+                <w:rFonts w:ascii="Times New Roman" w:hAnsi="Times New Roman" w:cs="Times New Roman"/>
+                <w:b/>
+                <w:bCs/>
+                <w:sz w:val="24"/>
+                <w:szCs w:val="24"/>
+              </w:rPr>
+              <w:t xml:space="preserve">Question 12 — </w:t>
+            </w:r>
+            <w:r>
+              <w:rPr>
+                <w:rFonts w:ascii="Times New Roman" w:hAnsi="Times New Roman" w:cs="Times New Roman"/>
+                <w:i/>
+                <w:iCs/>
+                <w:sz w:val="24"/>
+                <w:szCs w:val="24"/>
+              </w:rPr>
+              <w:t>Cré</w:t>
+            </w:r>
+            <w:r>
+              <w:rPr>
+                <w:rFonts w:ascii="Times New Roman" w:hAnsi="Times New Roman" w:cs="Times New Roman"/>
+                <w:i/>
+                <w:iCs/>
+                <w:sz w:val="24"/>
+                <w:szCs w:val="24"/>
+              </w:rPr>
+              <w:t>ation</w:t>
+            </w:r>
+            <w:r>
+              <w:rPr>
+                <w:rFonts w:ascii="Times New Roman" w:hAnsi="Times New Roman" w:cs="Times New Roman"/>
+                <w:i/>
+                <w:iCs/>
+                <w:sz w:val="24"/>
+                <w:szCs w:val="24"/>
+              </w:rPr>
+              <w:t xml:space="preserve"> le fichier datasets.csv pour sauvegarder les données, puis recharger et afficher les données.</w:t>
+            </w:r>
+          </w:p>
+        </w:tc>
+      </w:tr>
+    </w:tbl>
+    <w:p>
+      <w:pPr>
+        <w:spacing w:after="150" w:line="360" w:lineRule="auto"/>
+        <w:rPr>
+          <w:rFonts w:ascii="Times New Roman" w:hAnsi="Times New Roman" w:cs="Times New Roman"/>
+          <w:sz w:val="24"/>
+          <w:szCs w:val="24"/>
+        </w:rPr>
+      </w:pPr>
+      <w:r>
+        <w:rPr>
+          <w:rFonts w:ascii="Times New Roman" w:hAnsi="Times New Roman" w:cs="Times New Roman"/>
+          <w:sz w:val="24"/>
+          <w:szCs w:val="24"/>
+        </w:rPr>
+        <w:t xml:space="preserve">Mise en place de deux nouvelles options dans le menu (options 8 et 9) pour exporter l'ensemble des métadonnées contenues dans le catalogue vers un fichier </w:t>
+      </w:r>
+      <w:r>
+        <w:rPr>
+          <w:rStyle w:val="CodeHTML"/>
+          <w:rFonts w:ascii="Times New Roman" w:eastAsia="Calibri" w:hAnsi="Times New Roman" w:cs="Times New Roman"/>
+          <w:sz w:val="24"/>
+          <w:szCs w:val="24"/>
+        </w:rPr>
+        <w:t>datasets.csv</w:t>
+      </w:r>
+      <w:r>
+        <w:rPr>
+          <w:rFonts w:ascii="Times New Roman" w:hAnsi="Times New Roman" w:cs="Times New Roman"/>
+          <w:sz w:val="24"/>
+          <w:szCs w:val="24"/>
+        </w:rPr>
+        <w:t>, puis restaurer ces informations directement depuis ce fichier.</w:t>
+      </w:r>
+      <w:r>
+        <w:rPr>
+          <w:rFonts w:ascii="Times New Roman" w:hAnsi="Times New Roman" w:cs="Times New Roman"/>
+          <w:sz w:val="24"/>
+          <w:szCs w:val="24"/>
+        </w:rPr>
+        <w:t xml:space="preserve"> </w:t>
+      </w:r>
+    </w:p>
+    <w:p>
+      <w:pPr>
+        <w:spacing w:before="150" w:after="80" w:line="360" w:lineRule="auto"/>
+        <w:rPr>
+          <w:rFonts w:ascii="Times New Roman" w:hAnsi="Times New Roman" w:cs="Times New Roman"/>
+          <w:b/>
+          <w:bCs/>
+          <w:sz w:val="24"/>
+          <w:szCs w:val="24"/>
+        </w:rPr>
+      </w:pPr>
+      <w:r>
+        <w:rPr>
+          <w:rFonts w:ascii="Times New Roman" w:hAnsi="Times New Roman" w:cs="Times New Roman"/>
+          <w:b/>
+          <w:bCs/>
+          <w:sz w:val="24"/>
+          <w:szCs w:val="24"/>
+        </w:rPr>
+        <w:t>Code (main.py) :</w:t>
+      </w:r>
+    </w:p>
+    <w:p>
+      <w:pPr>
+        <w:spacing w:before="150" w:after="80" w:line="360" w:lineRule="auto"/>
+        <w:rPr>
+          <w:rFonts w:ascii="Times New Roman" w:hAnsi="Times New Roman" w:cs="Times New Roman"/>
+          <w:b/>
+          <w:bCs/>
+          <w:sz w:val="24"/>
+          <w:szCs w:val="24"/>
+        </w:rPr>
+      </w:pPr>
+      <w:r>
+        <w:rPr>
+          <w:rFonts w:ascii="Times New Roman" w:hAnsi="Times New Roman" w:cs="Times New Roman"/>
+          <w:b/>
+          <w:bCs/>
+          <w:sz w:val="24"/>
+          <w:szCs w:val="24"/>
+        </w:rPr>
+        <w:drawing>
+          <wp:inline distT="0" distB="0" distL="0" distR="0" wp14:anchorId="16193B0B" wp14:editId="6BC573A3">
+            <wp:extent cx="6400800" cy="706755"/>
+            <wp:effectExtent l="0" t="0" r="0" b="0"/>
+            <wp:docPr id="1316801283" name="Image 22"/>
+            <wp:cNvGraphicFramePr>
+              <a:graphicFrameLocks xmlns:a="http://schemas.openxmlformats.org/drawingml/2006/main" noChangeAspect="1"/>
+            </wp:cNvGraphicFramePr>
+            <a:graphic xmlns:a="http://schemas.openxmlformats.org/drawingml/2006/main">
+              <a:graphicData uri="http://schemas.openxmlformats.org/drawingml/2006/picture">
+                <pic:pic xmlns:pic="http://schemas.openxmlformats.org/drawingml/2006/picture">
+                  <pic:nvPicPr>
+                    <pic:cNvPr id="1316801283" name=""/>
+                    <pic:cNvPicPr/>
+                  </pic:nvPicPr>
+                  <pic:blipFill>
+                    <a:blip r:embed="rId26"/>
+                    <a:stretch>
+                      <a:fillRect/>
+                    </a:stretch>
+                  </pic:blipFill>
+                  <pic:spPr>
+                    <a:xfrm>
+                      <a:off x="0" y="0"/>
+                      <a:ext cx="6400800" cy="706755"/>
+                    </a:xfrm>
+                    <a:prstGeom prst="rect">
+                      <a:avLst/>
+                    </a:prstGeom>
+                  </pic:spPr>
+                </pic:pic>
+              </a:graphicData>
+            </a:graphic>
+          </wp:inline>
+        </w:drawing>
+      </w:r>
+    </w:p>
+    <w:p>
+      <w:pPr>
+        <w:spacing w:before="150" w:after="80" w:line="360" w:lineRule="auto"/>
+        <w:rPr>
+          <w:rFonts w:ascii="Times New Roman" w:hAnsi="Times New Roman" w:cs="Times New Roman"/>
+          <w:b/>
+          <w:bCs/>
+          <w:sz w:val="24"/>
+          <w:szCs w:val="24"/>
+        </w:rPr>
+      </w:pPr>
+      <w:r>
+        <w:rPr>
+          <w:rFonts w:ascii="Times New Roman" w:hAnsi="Times New Roman" w:cs="Times New Roman"/>
+          <w:b/>
+          <w:bCs/>
+          <w:sz w:val="24"/>
+          <w:szCs w:val="24"/>
+        </w:rPr>
+        <w:drawing>
+          <wp:inline distT="0" distB="0" distL="0" distR="0" wp14:anchorId="6689A38D" wp14:editId="7535811C">
+            <wp:extent cx="6400800" cy="3425190"/>
+            <wp:effectExtent l="0" t="0" r="0" b="0"/>
+            <wp:docPr id="810441882" name="Image 23"/>
+            <wp:cNvGraphicFramePr>
+              <a:graphicFrameLocks xmlns:a="http://schemas.openxmlformats.org/drawingml/2006/main" noChangeAspect="1"/>
+            </wp:cNvGraphicFramePr>
+            <a:graphic xmlns:a="http://schemas.openxmlformats.org/drawingml/2006/main">
+              <a:graphicData uri="http://schemas.openxmlformats.org/drawingml/2006/picture">
+                <pic:pic xmlns:pic="http://schemas.openxmlformats.org/drawingml/2006/picture">
+                  <pic:nvPicPr>
+                    <pic:cNvPr id="810441882" name=""/>
+                    <pic:cNvPicPr/>
+                  </pic:nvPicPr>
+                  <pic:blipFill>
+                    <a:blip r:embed="rId27"/>
+                    <a:stretch>
+                      <a:fillRect/>
+                    </a:stretch>
+                  </pic:blipFill>
+                  <pic:spPr>
+                    <a:xfrm>
+                      <a:off x="0" y="0"/>
+                      <a:ext cx="6400800" cy="3425190"/>
+                    </a:xfrm>
+                    <a:prstGeom prst="rect">
+                      <a:avLst/>
+                    </a:prstGeom>
+                  </pic:spPr>
+                </pic:pic>
+              </a:graphicData>
+            </a:graphic>
+          </wp:inline>
+        </w:drawing>
+      </w:r>
+    </w:p>
+    <w:p>
+      <w:pPr>
+        <w:spacing w:before="150" w:after="80" w:line="360" w:lineRule="auto"/>
+        <w:rPr>
+          <w:rStyle w:val="CodeHTML"/>
+          <w:rFonts w:ascii="Times New Roman" w:eastAsia="Calibri" w:hAnsi="Times New Roman" w:cs="Times New Roman"/>
+          <w:sz w:val="24"/>
+          <w:szCs w:val="24"/>
+        </w:rPr>
+      </w:pPr>
+      <w:r>
+        <w:rPr>
+          <w:rFonts w:ascii="Times New Roman" w:hAnsi="Times New Roman" w:cs="Times New Roman"/>
+          <w:sz w:val="24"/>
+          <w:szCs w:val="24"/>
+        </w:rPr>
+        <w:t xml:space="preserve">L'extrait montre l'importation du module natif </w:t>
+      </w:r>
+      <w:r>
+        <w:rPr>
+          <w:rStyle w:val="CodeHTML"/>
+          <w:rFonts w:ascii="Times New Roman" w:eastAsia="Calibri" w:hAnsi="Times New Roman" w:cs="Times New Roman"/>
+          <w:sz w:val="24"/>
+          <w:szCs w:val="24"/>
+        </w:rPr>
+        <w:t>csv</w:t>
+      </w:r>
+      <w:r>
+        <w:rPr>
+          <w:rFonts w:ascii="Times New Roman" w:hAnsi="Times New Roman" w:cs="Times New Roman"/>
+          <w:sz w:val="24"/>
+          <w:szCs w:val="24"/>
+        </w:rPr>
+        <w:t xml:space="preserve"> et la déclaration de la variable </w:t>
+      </w:r>
+      <w:proofErr w:type="spellStart"/>
+      <w:r>
+        <w:rPr>
+          <w:rStyle w:val="CodeHTML"/>
+          <w:rFonts w:ascii="Times New Roman" w:eastAsia="Calibri" w:hAnsi="Times New Roman" w:cs="Times New Roman"/>
+          <w:sz w:val="24"/>
+          <w:szCs w:val="24"/>
+        </w:rPr>
+        <w:t>chemin_csv</w:t>
+      </w:r>
+      <w:proofErr w:type="spellEnd"/>
+      <w:r>
+        <w:rPr>
+          <w:rFonts w:ascii="Times New Roman" w:hAnsi="Times New Roman" w:cs="Times New Roman"/>
+          <w:sz w:val="24"/>
+          <w:szCs w:val="24"/>
+        </w:rPr>
+        <w:t xml:space="preserve"> définissant le chemin d'accès absolu vers le fichier de sauvegarde </w:t>
+      </w:r>
+      <w:r>
+        <w:rPr>
+          <w:rStyle w:val="CodeHTML"/>
+          <w:rFonts w:ascii="Times New Roman" w:eastAsia="Calibri" w:hAnsi="Times New Roman" w:cs="Times New Roman"/>
+          <w:sz w:val="24"/>
+          <w:szCs w:val="24"/>
+        </w:rPr>
+        <w:t>datasets.csv</w:t>
+      </w:r>
+    </w:p>
+    <w:p>
+      <w:pPr>
+        <w:pStyle w:val="NormalWeb"/>
+        <w:spacing w:before="0" w:beforeAutospacing="0" w:line="360" w:lineRule="auto"/>
+      </w:pPr>
+      <w:r>
+        <w:t xml:space="preserve">Cette </w:t>
+      </w:r>
+      <w:r>
+        <w:t>extra</w:t>
+      </w:r>
+      <w:r>
+        <w:t>ction</w:t>
+      </w:r>
+      <w:r>
+        <w:t xml:space="preserve"> présente le code des options 8 et 9 :</w:t>
+      </w:r>
+    </w:p>
+    <w:p>
+      <w:pPr>
+        <w:pStyle w:val="NormalWeb"/>
+        <w:numPr>
+          <w:ilvl w:val="0"/>
+          <w:numId w:val="13"/>
+        </w:numPr>
+        <w:spacing w:before="0" w:beforeAutospacing="0" w:line="360" w:lineRule="auto"/>
+      </w:pPr>
+      <w:r>
+        <w:rPr>
+          <w:b/>
+          <w:bCs/>
+        </w:rPr>
+        <w:lastRenderedPageBreak/>
+        <w:t>Option 8 (Sauvegarde) :</w:t>
+      </w:r>
+      <w:r>
+        <w:t xml:space="preserve"> Utilisation du gestionnaire de contexte </w:t>
+      </w:r>
+      <w:proofErr w:type="spellStart"/>
+      <w:r>
+        <w:rPr>
+          <w:rStyle w:val="CodeHTML"/>
+          <w:rFonts w:ascii="Times New Roman" w:hAnsi="Times New Roman" w:cs="Times New Roman"/>
+          <w:sz w:val="24"/>
+          <w:szCs w:val="24"/>
+        </w:rPr>
+        <w:t>with</w:t>
+      </w:r>
+      <w:proofErr w:type="spellEnd"/>
+      <w:r>
+        <w:rPr>
+          <w:rStyle w:val="CodeHTML"/>
+          <w:rFonts w:ascii="Times New Roman" w:hAnsi="Times New Roman" w:cs="Times New Roman"/>
+          <w:sz w:val="24"/>
+          <w:szCs w:val="24"/>
+        </w:rPr>
+        <w:t xml:space="preserve"> open(...)</w:t>
+      </w:r>
+      <w:r>
+        <w:t xml:space="preserve"> en mode écriture (</w:t>
+      </w:r>
+      <w:r>
+        <w:rPr>
+          <w:rStyle w:val="CodeHTML"/>
+          <w:rFonts w:ascii="Times New Roman" w:hAnsi="Times New Roman" w:cs="Times New Roman"/>
+          <w:sz w:val="24"/>
+          <w:szCs w:val="24"/>
+        </w:rPr>
+        <w:t>'w'</w:t>
+      </w:r>
+      <w:r>
+        <w:t xml:space="preserve">) couplé à </w:t>
+      </w:r>
+      <w:proofErr w:type="spellStart"/>
+      <w:r>
+        <w:rPr>
+          <w:rStyle w:val="CodeHTML"/>
+          <w:rFonts w:ascii="Times New Roman" w:hAnsi="Times New Roman" w:cs="Times New Roman"/>
+          <w:sz w:val="24"/>
+          <w:szCs w:val="24"/>
+        </w:rPr>
+        <w:t>csv.DictWriter</w:t>
+      </w:r>
+      <w:proofErr w:type="spellEnd"/>
+      <w:r>
+        <w:t xml:space="preserve"> pour écrire l'en-tête (</w:t>
+      </w:r>
+      <w:proofErr w:type="spellStart"/>
+      <w:r>
+        <w:rPr>
+          <w:rStyle w:val="CodeHTML"/>
+          <w:rFonts w:ascii="Times New Roman" w:hAnsi="Times New Roman" w:cs="Times New Roman"/>
+          <w:sz w:val="24"/>
+          <w:szCs w:val="24"/>
+        </w:rPr>
+        <w:t>writeheader</w:t>
+      </w:r>
+      <w:proofErr w:type="spellEnd"/>
+      <w:r>
+        <w:rPr>
+          <w:rStyle w:val="CodeHTML"/>
+          <w:rFonts w:ascii="Times New Roman" w:hAnsi="Times New Roman" w:cs="Times New Roman"/>
+          <w:sz w:val="24"/>
+          <w:szCs w:val="24"/>
+        </w:rPr>
+        <w:t>()</w:t>
+      </w:r>
+      <w:r>
+        <w:t>) et l'ensemble des données (</w:t>
+      </w:r>
+      <w:proofErr w:type="spellStart"/>
+      <w:r>
+        <w:rPr>
+          <w:rStyle w:val="CodeHTML"/>
+          <w:rFonts w:ascii="Times New Roman" w:hAnsi="Times New Roman" w:cs="Times New Roman"/>
+          <w:sz w:val="24"/>
+          <w:szCs w:val="24"/>
+        </w:rPr>
+        <w:t>writerows</w:t>
+      </w:r>
+      <w:proofErr w:type="spellEnd"/>
+      <w:r>
+        <w:rPr>
+          <w:rStyle w:val="CodeHTML"/>
+          <w:rFonts w:ascii="Times New Roman" w:hAnsi="Times New Roman" w:cs="Times New Roman"/>
+          <w:sz w:val="24"/>
+          <w:szCs w:val="24"/>
+        </w:rPr>
+        <w:t>()</w:t>
+      </w:r>
+      <w:r>
+        <w:t xml:space="preserve">). </w:t>
+      </w:r>
+    </w:p>
+    <w:p>
+      <w:pPr>
+        <w:pStyle w:val="NormalWeb"/>
+        <w:numPr>
+          <w:ilvl w:val="0"/>
+          <w:numId w:val="13"/>
+        </w:numPr>
+        <w:spacing w:before="0" w:beforeAutospacing="0" w:line="360" w:lineRule="auto"/>
+      </w:pPr>
+      <w:r>
+        <w:rPr>
+          <w:b/>
+          <w:bCs/>
+        </w:rPr>
+        <w:t>Option 9 (Rechargement) :</w:t>
+      </w:r>
+      <w:r>
+        <w:t xml:space="preserve"> Ouverture du fichier en mode lecture (</w:t>
+      </w:r>
+      <w:r>
+        <w:rPr>
+          <w:rStyle w:val="CodeHTML"/>
+          <w:rFonts w:ascii="Times New Roman" w:hAnsi="Times New Roman" w:cs="Times New Roman"/>
+          <w:sz w:val="24"/>
+          <w:szCs w:val="24"/>
+        </w:rPr>
+        <w:t>'r'</w:t>
+      </w:r>
+      <w:r>
+        <w:t xml:space="preserve">) à l'aide de </w:t>
+      </w:r>
+      <w:proofErr w:type="spellStart"/>
+      <w:r>
+        <w:rPr>
+          <w:rStyle w:val="CodeHTML"/>
+          <w:rFonts w:ascii="Times New Roman" w:hAnsi="Times New Roman" w:cs="Times New Roman"/>
+          <w:sz w:val="24"/>
+          <w:szCs w:val="24"/>
+        </w:rPr>
+        <w:t>csv.DictReader</w:t>
+      </w:r>
+      <w:proofErr w:type="spellEnd"/>
+      <w:r>
+        <w:t xml:space="preserve"> et reconstruction de la liste </w:t>
+      </w:r>
+      <w:proofErr w:type="spellStart"/>
+      <w:r>
+        <w:rPr>
+          <w:rStyle w:val="CodeHTML"/>
+          <w:rFonts w:ascii="Times New Roman" w:hAnsi="Times New Roman" w:cs="Times New Roman"/>
+          <w:sz w:val="24"/>
+          <w:szCs w:val="24"/>
+        </w:rPr>
+        <w:t>catalogue_data</w:t>
+      </w:r>
+      <w:proofErr w:type="spellEnd"/>
+      <w:r>
+        <w:t xml:space="preserve"> via une compréhension de liste, suivie du parcours et de l'affichage récapitulatif des </w:t>
+      </w:r>
+      <w:proofErr w:type="spellStart"/>
+      <w:r>
+        <w:t>datasets</w:t>
+      </w:r>
+      <w:proofErr w:type="spellEnd"/>
+      <w:r>
+        <w:t xml:space="preserve"> rechargés. </w:t>
+      </w:r>
+    </w:p>
+    <w:p>
+      <w:pPr>
+        <w:spacing w:before="150" w:after="80" w:line="360" w:lineRule="auto"/>
+        <w:rPr>
+          <w:rFonts w:ascii="Times New Roman" w:hAnsi="Times New Roman" w:cs="Times New Roman"/>
+          <w:b/>
+          <w:bCs/>
+          <w:sz w:val="24"/>
+          <w:szCs w:val="24"/>
+        </w:rPr>
+      </w:pPr>
+    </w:p>
+    <w:p>
+      <w:pPr>
+        <w:spacing w:before="150" w:after="80" w:line="360" w:lineRule="auto"/>
+        <w:rPr>
+          <w:rFonts w:ascii="Times New Roman" w:hAnsi="Times New Roman" w:cs="Times New Roman"/>
+          <w:b/>
+          <w:bCs/>
+          <w:sz w:val="24"/>
+          <w:szCs w:val="24"/>
+        </w:rPr>
+      </w:pPr>
+    </w:p>
+    <w:p>
+      <w:pPr>
+        <w:spacing w:before="150" w:after="80" w:line="360" w:lineRule="auto"/>
+        <w:rPr>
+          <w:rFonts w:ascii="Times New Roman" w:eastAsia="Consolas" w:hAnsi="Times New Roman" w:cs="Times New Roman"/>
+          <w:sz w:val="24"/>
+          <w:szCs w:val="24"/>
+        </w:rPr>
+      </w:pPr>
+      <w:r>
+        <w:rPr>
+          <w:rFonts w:ascii="Times New Roman" w:hAnsi="Times New Roman" w:cs="Times New Roman"/>
+          <w:b/>
+          <w:bCs/>
+          <w:sz w:val="24"/>
+          <w:szCs w:val="24"/>
+        </w:rPr>
+        <w:t>Résultat à l'exécution :</w:t>
+      </w:r>
+      <w:r>
+        <w:rPr>
+          <w:rFonts w:ascii="Times New Roman" w:eastAsia="Consolas" w:hAnsi="Times New Roman" w:cs="Times New Roman"/>
+          <w:sz w:val="24"/>
+          <w:szCs w:val="24"/>
+        </w:rPr>
+        <w:t xml:space="preserve"> </w:t>
+      </w:r>
+    </w:p>
+    <w:p>
+      <w:pPr>
+        <w:spacing w:before="150" w:after="80" w:line="360" w:lineRule="auto"/>
+        <w:rPr>
+          <w:rFonts w:ascii="Times New Roman" w:eastAsia="Consolas" w:hAnsi="Times New Roman" w:cs="Times New Roman"/>
+          <w:sz w:val="24"/>
+          <w:szCs w:val="24"/>
+        </w:rPr>
+      </w:pPr>
+      <w:r>
+        <w:rPr>
+          <w:rFonts w:ascii="Times New Roman" w:eastAsia="Consolas" w:hAnsi="Times New Roman" w:cs="Times New Roman"/>
+          <w:sz w:val="24"/>
+          <w:szCs w:val="24"/>
+        </w:rPr>
+        <w:drawing>
+          <wp:inline distT="0" distB="0" distL="0" distR="0" wp14:anchorId="701CDBBE" wp14:editId="49725A41">
+            <wp:extent cx="6400800" cy="5007610"/>
+            <wp:effectExtent l="0" t="0" r="0" b="0"/>
+            <wp:docPr id="1660226593" name="Image 24"/>
+            <wp:cNvGraphicFramePr>
+              <a:graphicFrameLocks xmlns:a="http://schemas.openxmlformats.org/drawingml/2006/main" noChangeAspect="1"/>
+            </wp:cNvGraphicFramePr>
+            <a:graphic xmlns:a="http://schemas.openxmlformats.org/drawingml/2006/main">
+              <a:graphicData uri="http://schemas.openxmlformats.org/drawingml/2006/picture">
+                <pic:pic xmlns:pic="http://schemas.openxmlformats.org/drawingml/2006/picture">
+                  <pic:nvPicPr>
+                    <pic:cNvPr id="1660226593" name=""/>
+                    <pic:cNvPicPr/>
+                  </pic:nvPicPr>
+                  <pic:blipFill>
+                    <a:blip r:embed="rId28"/>
+                    <a:stretch>
+                      <a:fillRect/>
+                    </a:stretch>
+                  </pic:blipFill>
+                  <pic:spPr>
+                    <a:xfrm>
+                      <a:off x="0" y="0"/>
+                      <a:ext cx="6400800" cy="5007610"/>
+                    </a:xfrm>
+                    <a:prstGeom prst="rect">
+                      <a:avLst/>
+                    </a:prstGeom>
+                  </pic:spPr>
+                </pic:pic>
+              </a:graphicData>
+            </a:graphic>
+          </wp:inline>
+        </w:drawing>
+      </w:r>
+    </w:p>
+    <w:p>
+      <w:pPr>
+        <w:spacing w:line="360" w:lineRule="auto"/>
+        <w:rPr>
+          <w:rFonts w:ascii="Times New Roman" w:eastAsia="Times New Roman" w:hAnsi="Times New Roman" w:cs="Times New Roman"/>
+          <w:sz w:val="24"/>
+          <w:szCs w:val="24"/>
+        </w:rPr>
+      </w:pPr>
+      <w:r>
+        <w:rPr>
+          <w:rFonts w:ascii="Times New Roman" w:eastAsia="Times New Roman" w:hAnsi="Times New Roman" w:cs="Times New Roman"/>
+          <w:sz w:val="24"/>
+          <w:szCs w:val="24"/>
+        </w:rPr>
+        <w:t xml:space="preserve">Le terminal montre l'ajout du </w:t>
+      </w:r>
+      <w:proofErr w:type="spellStart"/>
+      <w:r>
+        <w:rPr>
+          <w:rFonts w:ascii="Times New Roman" w:eastAsia="Times New Roman" w:hAnsi="Times New Roman" w:cs="Times New Roman"/>
+          <w:sz w:val="24"/>
+          <w:szCs w:val="24"/>
+        </w:rPr>
+        <w:t>dataset</w:t>
+      </w:r>
+      <w:proofErr w:type="spellEnd"/>
+      <w:r>
+        <w:rPr>
+          <w:rFonts w:ascii="Times New Roman" w:eastAsia="Times New Roman" w:hAnsi="Times New Roman" w:cs="Times New Roman"/>
+          <w:sz w:val="24"/>
+          <w:szCs w:val="24"/>
+        </w:rPr>
+        <w:t xml:space="preserve"> Titanic (option 1), suivi du choix de l'option 8 confirmant la sauvegarde réussie des données dans le fichier CSV. Ensuite, le choix de l'option 9 confirme le </w:t>
+      </w:r>
+      <w:r>
+        <w:rPr>
+          <w:rFonts w:ascii="Times New Roman" w:eastAsia="Times New Roman" w:hAnsi="Times New Roman" w:cs="Times New Roman"/>
+          <w:sz w:val="24"/>
+          <w:szCs w:val="24"/>
+        </w:rPr>
+        <w:lastRenderedPageBreak/>
+        <w:t xml:space="preserve">rechargement depuis le fichier et affiche la liste reconstituée (nom : Titanic, domaine : Transport, lignes : 100, format : CSV). </w:t>
+      </w:r>
+    </w:p>
+    <w:p>
+      <w:pPr>
+        <w:spacing w:before="150" w:after="80" w:line="360" w:lineRule="auto"/>
+        <w:rPr>
+          <w:rFonts w:ascii="Times New Roman" w:eastAsia="Consolas" w:hAnsi="Times New Roman" w:cs="Times New Roman"/>
+          <w:sz w:val="24"/>
+          <w:szCs w:val="24"/>
+        </w:rPr>
+      </w:pPr>
+    </w:p>
+    <w:p>
+      <w:pPr>
+        <w:spacing w:before="150" w:after="80" w:line="360" w:lineRule="auto"/>
+        <w:rPr>
+          <w:rFonts w:ascii="Times New Roman" w:hAnsi="Times New Roman" w:cs="Times New Roman"/>
+          <w:sz w:val="24"/>
+          <w:szCs w:val="24"/>
+        </w:rPr>
+      </w:pPr>
+      <w:r>
+        <w:rPr>
+          <w:rFonts w:ascii="Times New Roman" w:hAnsi="Times New Roman" w:cs="Times New Roman"/>
+          <w:b/>
+          <w:bCs/>
+          <w:sz w:val="24"/>
+          <w:szCs w:val="24"/>
+        </w:rPr>
+        <w:t>Contenu généré du fichier datasets.csv</w:t>
+      </w:r>
+      <w:r>
+        <w:rPr>
+          <w:rFonts w:ascii="Times New Roman" w:hAnsi="Times New Roman" w:cs="Times New Roman"/>
+          <w:b/>
+          <w:bCs/>
+          <w:sz w:val="24"/>
+          <w:szCs w:val="24"/>
+        </w:rPr>
+        <w:t> </w:t>
+      </w:r>
+      <w:r>
+        <w:rPr>
+          <w:rFonts w:ascii="Times New Roman" w:hAnsi="Times New Roman" w:cs="Times New Roman"/>
+          <w:b/>
+          <w:bCs/>
+          <w:sz w:val="24"/>
+          <w:szCs w:val="24"/>
+        </w:rPr>
+        <w:t>:</w:t>
+      </w:r>
+      <w:r>
+        <w:rPr>
+          <w:rFonts w:ascii="Times New Roman" w:hAnsi="Times New Roman" w:cs="Times New Roman"/>
+          <w:sz w:val="24"/>
+          <w:szCs w:val="24"/>
+        </w:rPr>
+        <w:t xml:space="preserve"> </w:t>
+      </w:r>
+    </w:p>
+    <w:p>
+      <w:pPr>
+        <w:spacing w:before="150" w:after="80" w:line="360" w:lineRule="auto"/>
+        <w:rPr>
+          <w:rFonts w:ascii="Times New Roman" w:hAnsi="Times New Roman" w:cs="Times New Roman"/>
+          <w:sz w:val="24"/>
+          <w:szCs w:val="24"/>
+        </w:rPr>
+      </w:pPr>
+      <w:r>
+        <w:rPr>
+          <w:rFonts w:ascii="Times New Roman" w:hAnsi="Times New Roman" w:cs="Times New Roman"/>
+          <w:sz w:val="24"/>
+          <w:szCs w:val="24"/>
+        </w:rPr>
+        <w:drawing>
+          <wp:inline distT="0" distB="0" distL="0" distR="0" wp14:anchorId="30B3AE3B" wp14:editId="6BC5C27D">
+            <wp:extent cx="6400800" cy="1882140"/>
+            <wp:effectExtent l="0" t="0" r="0" b="0"/>
+            <wp:docPr id="693987640" name="Image 25"/>
+            <wp:cNvGraphicFramePr>
+              <a:graphicFrameLocks xmlns:a="http://schemas.openxmlformats.org/drawingml/2006/main" noChangeAspect="1"/>
+            </wp:cNvGraphicFramePr>
+            <a:graphic xmlns:a="http://schemas.openxmlformats.org/drawingml/2006/main">
+              <a:graphicData uri="http://schemas.openxmlformats.org/drawingml/2006/picture">
+                <pic:pic xmlns:pic="http://schemas.openxmlformats.org/drawingml/2006/picture">
+                  <pic:nvPicPr>
+                    <pic:cNvPr id="693987640" name=""/>
+                    <pic:cNvPicPr/>
+                  </pic:nvPicPr>
+                  <pic:blipFill>
+                    <a:blip r:embed="rId29"/>
+                    <a:stretch>
+                      <a:fillRect/>
+                    </a:stretch>
+                  </pic:blipFill>
+                  <pic:spPr>
+                    <a:xfrm>
+                      <a:off x="0" y="0"/>
+                      <a:ext cx="6400800" cy="1882140"/>
+                    </a:xfrm>
+                    <a:prstGeom prst="rect">
+                      <a:avLst/>
+                    </a:prstGeom>
+                  </pic:spPr>
+                </pic:pic>
+              </a:graphicData>
+            </a:graphic>
+          </wp:inline>
+        </w:drawing>
+      </w:r>
+    </w:p>
+    <w:p>
+      <w:pPr>
+        <w:spacing w:line="360" w:lineRule="auto"/>
+        <w:rPr>
+          <w:rFonts w:ascii="Times New Roman" w:eastAsia="Times New Roman" w:hAnsi="Times New Roman" w:cs="Times New Roman"/>
+          <w:sz w:val="24"/>
+          <w:szCs w:val="24"/>
+        </w:rPr>
+      </w:pPr>
+      <w:r>
+        <w:rPr>
+          <w:rFonts w:ascii="Times New Roman" w:eastAsia="Times New Roman" w:hAnsi="Times New Roman" w:cs="Times New Roman"/>
+          <w:sz w:val="24"/>
+          <w:szCs w:val="24"/>
+        </w:rPr>
+        <w:t>L'éditeur affiche le contenu du fichier datasets.csv généré à la racine du projet, comportant la ligne d'en-tête (</w:t>
+      </w:r>
+      <w:proofErr w:type="spellStart"/>
+      <w:r>
+        <w:rPr>
+          <w:rFonts w:ascii="Times New Roman" w:eastAsia="Times New Roman" w:hAnsi="Times New Roman" w:cs="Times New Roman"/>
+          <w:sz w:val="24"/>
+          <w:szCs w:val="24"/>
+        </w:rPr>
+        <w:t>nom,domaine,nbr_lignes,nbr_colonnes,taille,format,public</w:t>
+      </w:r>
+      <w:proofErr w:type="spellEnd"/>
+      <w:r>
+        <w:rPr>
+          <w:rFonts w:ascii="Times New Roman" w:eastAsia="Times New Roman" w:hAnsi="Times New Roman" w:cs="Times New Roman"/>
+          <w:sz w:val="24"/>
+          <w:szCs w:val="24"/>
+        </w:rPr>
+        <w:t xml:space="preserve">) suivie de la ligne de données correspondant au </w:t>
+      </w:r>
+      <w:proofErr w:type="spellStart"/>
+      <w:r>
+        <w:rPr>
+          <w:rFonts w:ascii="Times New Roman" w:eastAsia="Times New Roman" w:hAnsi="Times New Roman" w:cs="Times New Roman"/>
+          <w:sz w:val="24"/>
+          <w:szCs w:val="24"/>
+        </w:rPr>
+        <w:t>dataset</w:t>
+      </w:r>
+      <w:proofErr w:type="spellEnd"/>
+      <w:r>
+        <w:rPr>
+          <w:rFonts w:ascii="Times New Roman" w:eastAsia="Times New Roman" w:hAnsi="Times New Roman" w:cs="Times New Roman"/>
+          <w:sz w:val="24"/>
+          <w:szCs w:val="24"/>
+        </w:rPr>
+        <w:t xml:space="preserve"> Titanic. </w:t>
+      </w:r>
+    </w:p>
+    <w:p>
+      <w:pPr>
+        <w:spacing w:line="360" w:lineRule="auto"/>
+        <w:rPr>
+          <w:rFonts w:ascii="Times New Roman" w:eastAsia="Times New Roman" w:hAnsi="Times New Roman" w:cs="Times New Roman"/>
+          <w:sz w:val="24"/>
+          <w:szCs w:val="24"/>
+        </w:rPr>
+      </w:pPr>
+    </w:p>
+    <w:p>
+      <w:pPr>
+        <w:pStyle w:val="lev1"/>
+        <w:spacing w:line="360" w:lineRule="auto"/>
+        <w:rPr>
+          <w:rFonts w:ascii="Times New Roman" w:hAnsi="Times New Roman" w:cs="Times New Roman"/>
+          <w:sz w:val="24"/>
+          <w:szCs w:val="24"/>
+        </w:rPr>
+      </w:pPr>
+      <w:r>
+        <w:rPr>
+          <w:rFonts w:ascii="Times New Roman" w:hAnsi="Times New Roman" w:cs="Times New Roman"/>
+          <w:sz w:val="24"/>
+          <w:szCs w:val="24"/>
+        </w:rPr>
+        <w:t>Résumé des fonctions et concepts utilisés (Partie 7)</w:t>
+      </w:r>
+    </w:p>
+    <w:p>
+      <w:pPr>
+        <w:pStyle w:val="NormalWeb"/>
+        <w:numPr>
+          <w:ilvl w:val="0"/>
+          <w:numId w:val="14"/>
+        </w:numPr>
+        <w:spacing w:before="0" w:beforeAutospacing="0" w:line="360" w:lineRule="auto"/>
+      </w:pPr>
+      <w:r>
+        <w:rPr>
+          <w:b/>
+          <w:bCs/>
+        </w:rPr>
+        <w:t xml:space="preserve">Module </w:t>
+      </w:r>
+      <w:r>
+        <w:rPr>
+          <w:rStyle w:val="CodeHTML"/>
+          <w:rFonts w:ascii="Times New Roman" w:hAnsi="Times New Roman" w:cs="Times New Roman"/>
+          <w:b/>
+          <w:bCs/>
+          <w:sz w:val="24"/>
+          <w:szCs w:val="24"/>
+        </w:rPr>
+        <w:t>csv</w:t>
+      </w:r>
+      <w:r>
+        <w:rPr>
+          <w:b/>
+          <w:bCs/>
+        </w:rPr>
+        <w:t xml:space="preserve"> :</w:t>
+      </w:r>
+      <w:r>
+        <w:t xml:space="preserve"> Module standard de Python permettant de manipuler facilement des fichiers au format CSV sans bibliothèques tierces. </w:t>
+      </w:r>
+    </w:p>
+    <w:p>
+      <w:pPr>
+        <w:pStyle w:val="NormalWeb"/>
+        <w:numPr>
+          <w:ilvl w:val="0"/>
+          <w:numId w:val="14"/>
+        </w:numPr>
+        <w:spacing w:before="0" w:beforeAutospacing="0" w:line="360" w:lineRule="auto"/>
+      </w:pPr>
+      <w:r>
+        <w:rPr>
+          <w:b/>
+          <w:bCs/>
+        </w:rPr>
+        <w:t xml:space="preserve">Gestionnaire de contexte </w:t>
+      </w:r>
+      <w:proofErr w:type="spellStart"/>
+      <w:r>
+        <w:rPr>
+          <w:rStyle w:val="CodeHTML"/>
+          <w:rFonts w:ascii="Times New Roman" w:hAnsi="Times New Roman" w:cs="Times New Roman"/>
+          <w:b/>
+          <w:bCs/>
+          <w:sz w:val="24"/>
+          <w:szCs w:val="24"/>
+        </w:rPr>
+        <w:t>with</w:t>
+      </w:r>
+      <w:proofErr w:type="spellEnd"/>
+      <w:r>
+        <w:rPr>
+          <w:rStyle w:val="CodeHTML"/>
+          <w:rFonts w:ascii="Times New Roman" w:hAnsi="Times New Roman" w:cs="Times New Roman"/>
+          <w:b/>
+          <w:bCs/>
+          <w:sz w:val="24"/>
+          <w:szCs w:val="24"/>
+        </w:rPr>
+        <w:t xml:space="preserve"> open(...)</w:t>
+      </w:r>
+      <w:r>
+        <w:rPr>
+          <w:b/>
+          <w:bCs/>
+        </w:rPr>
+        <w:t xml:space="preserve"> :</w:t>
+      </w:r>
+      <w:r>
+        <w:t xml:space="preserve"> Garantit la fermeture automatique du fichier une fois les opérations d'écriture ou de lecture terminées, évitant la fuite de ressources. </w:t>
+      </w:r>
+    </w:p>
+    <w:p>
+      <w:pPr>
+        <w:pStyle w:val="NormalWeb"/>
+        <w:numPr>
+          <w:ilvl w:val="0"/>
+          <w:numId w:val="14"/>
+        </w:numPr>
+        <w:spacing w:before="0" w:beforeAutospacing="0" w:line="360" w:lineRule="auto"/>
+      </w:pPr>
+      <w:proofErr w:type="spellStart"/>
+      <w:r>
+        <w:rPr>
+          <w:rStyle w:val="CodeHTML"/>
+          <w:rFonts w:ascii="Times New Roman" w:hAnsi="Times New Roman" w:cs="Times New Roman"/>
+          <w:b/>
+          <w:bCs/>
+          <w:sz w:val="24"/>
+          <w:szCs w:val="24"/>
+        </w:rPr>
+        <w:t>csv.DictWriter</w:t>
+      </w:r>
+      <w:proofErr w:type="spellEnd"/>
+      <w:r>
+        <w:rPr>
+          <w:b/>
+          <w:bCs/>
+        </w:rPr>
+        <w:t xml:space="preserve"> / </w:t>
+      </w:r>
+      <w:r>
+        <w:rPr>
+          <w:rStyle w:val="CodeHTML"/>
+          <w:rFonts w:ascii="Times New Roman" w:hAnsi="Times New Roman" w:cs="Times New Roman"/>
+          <w:b/>
+          <w:bCs/>
+          <w:sz w:val="24"/>
+          <w:szCs w:val="24"/>
+        </w:rPr>
+        <w:t>.</w:t>
+      </w:r>
+      <w:proofErr w:type="spellStart"/>
+      <w:r>
+        <w:rPr>
+          <w:rStyle w:val="CodeHTML"/>
+          <w:rFonts w:ascii="Times New Roman" w:hAnsi="Times New Roman" w:cs="Times New Roman"/>
+          <w:b/>
+          <w:bCs/>
+          <w:sz w:val="24"/>
+          <w:szCs w:val="24"/>
+        </w:rPr>
+        <w:t>writeheader</w:t>
+      </w:r>
+      <w:proofErr w:type="spellEnd"/>
+      <w:r>
+        <w:rPr>
+          <w:rStyle w:val="CodeHTML"/>
+          <w:rFonts w:ascii="Times New Roman" w:hAnsi="Times New Roman" w:cs="Times New Roman"/>
+          <w:b/>
+          <w:bCs/>
+          <w:sz w:val="24"/>
+          <w:szCs w:val="24"/>
+        </w:rPr>
+        <w:t>()</w:t>
+      </w:r>
+      <w:r>
+        <w:rPr>
+          <w:b/>
+          <w:bCs/>
+        </w:rPr>
+        <w:t xml:space="preserve"> / </w:t>
+      </w:r>
+      <w:r>
+        <w:rPr>
+          <w:rStyle w:val="CodeHTML"/>
+          <w:rFonts w:ascii="Times New Roman" w:hAnsi="Times New Roman" w:cs="Times New Roman"/>
+          <w:b/>
+          <w:bCs/>
+          <w:sz w:val="24"/>
+          <w:szCs w:val="24"/>
+        </w:rPr>
+        <w:t>.</w:t>
+      </w:r>
+      <w:proofErr w:type="spellStart"/>
+      <w:r>
+        <w:rPr>
+          <w:rStyle w:val="CodeHTML"/>
+          <w:rFonts w:ascii="Times New Roman" w:hAnsi="Times New Roman" w:cs="Times New Roman"/>
+          <w:b/>
+          <w:bCs/>
+          <w:sz w:val="24"/>
+          <w:szCs w:val="24"/>
+        </w:rPr>
+        <w:t>writerows</w:t>
+      </w:r>
+      <w:proofErr w:type="spellEnd"/>
+      <w:r>
+        <w:rPr>
+          <w:rStyle w:val="CodeHTML"/>
+          <w:rFonts w:ascii="Times New Roman" w:hAnsi="Times New Roman" w:cs="Times New Roman"/>
+          <w:b/>
+          <w:bCs/>
+          <w:sz w:val="24"/>
+          <w:szCs w:val="24"/>
+        </w:rPr>
+        <w:t>()</w:t>
+      </w:r>
+      <w:r>
+        <w:rPr>
+          <w:b/>
+          <w:bCs/>
+        </w:rPr>
+        <w:t xml:space="preserve"> :</w:t>
+      </w:r>
+      <w:r>
+        <w:t xml:space="preserve"> Outils permettant de convertir une liste de dictionnaires en lignes CSV en écrivant automatiquement les noms des clés comme en-têtes. </w:t>
+      </w:r>
+    </w:p>
+    <w:p>
+      <w:pPr>
+        <w:pStyle w:val="NormalWeb"/>
+        <w:numPr>
+          <w:ilvl w:val="0"/>
+          <w:numId w:val="14"/>
+        </w:numPr>
+        <w:spacing w:before="0" w:beforeAutospacing="0" w:line="360" w:lineRule="auto"/>
+      </w:pPr>
+      <w:proofErr w:type="spellStart"/>
+      <w:r>
+        <w:rPr>
+          <w:rStyle w:val="CodeHTML"/>
+          <w:rFonts w:ascii="Times New Roman" w:hAnsi="Times New Roman" w:cs="Times New Roman"/>
+          <w:b/>
+          <w:bCs/>
+          <w:sz w:val="24"/>
+          <w:szCs w:val="24"/>
+        </w:rPr>
+        <w:t>csv.DictReader</w:t>
+      </w:r>
+      <w:proofErr w:type="spellEnd"/>
+      <w:r>
+        <w:rPr>
+          <w:b/>
+          <w:bCs/>
+        </w:rPr>
+        <w:t xml:space="preserve"> :</w:t>
+      </w:r>
+      <w:r>
+        <w:t xml:space="preserve"> Lit les lignes d'un fichier CSV et les transforme automatiquement en dictionnaires dont les clés correspondent aux en-têtes du fichier. </w:t>
+      </w:r>
+    </w:p>
+    <w:p>
+      <w:pPr>
+        <w:pStyle w:val="NormalWeb"/>
+        <w:numPr>
+          <w:ilvl w:val="0"/>
+          <w:numId w:val="14"/>
+        </w:numPr>
+        <w:spacing w:before="0" w:beforeAutospacing="0" w:line="360" w:lineRule="auto"/>
+      </w:pPr>
+      <w:r>
+        <w:rPr>
+          <w:b/>
+          <w:bCs/>
+        </w:rPr>
+        <w:t>Persistance de données :</w:t>
+      </w:r>
+      <w:r>
+        <w:t xml:space="preserve"> Concept permettant de conserver l'état des données d'une application sur un support de stockage permanent (fichier) même après l'arrêt du programme. </w:t>
+      </w:r>
+    </w:p>
+    <w:p>
+      <w:pPr>
+        <w:pStyle w:val="NormalWeb"/>
+        <w:spacing w:before="0" w:beforeAutospacing="0" w:line="360" w:lineRule="auto"/>
+      </w:pPr>
+    </w:p>
+    <w:p>
+      <w:pPr>
+        <w:spacing w:line="360" w:lineRule="auto"/>
+        <w:rPr>
+          <w:rFonts w:ascii="Times New Roman" w:eastAsia="Times New Roman" w:hAnsi="Times New Roman" w:cs="Times New Roman"/>
+          <w:sz w:val="24"/>
+          <w:szCs w:val="24"/>
+        </w:rPr>
+      </w:pPr>
+    </w:p>
+    <w:p>
+      <w:pPr>
+        <w:spacing w:before="150" w:after="80" w:line="360" w:lineRule="auto"/>
+        <w:rPr>
+          <w:rFonts w:ascii="Times New Roman" w:hAnsi="Times New Roman" w:cs="Times New Roman"/>
+          <w:sz w:val="24"/>
+          <w:szCs w:val="24"/>
+        </w:rPr>
+      </w:pPr>
     </w:p>
     <w:p>
       <w:pPr>
@@ -5972,6 +8334,155 @@
     </w:lvl>
   </w:abstractNum>
   <w:abstractNum w:abstractNumId="4" w15:restartNumberingAfterBreak="0">
+    <w:nsid w:val="3D3E3E8C"/>
+    <w:multiLevelType w:val="multilevel"/>
+    <w:tmpl w:val="A3B03F2C"/>
+    <w:lvl w:ilvl="0">
+      <w:start w:val="1"/>
+      <w:numFmt w:val="bullet"/>
+      <w:lvlText w:val=""/>
+      <w:lvlJc w:val="left"/>
+      <w:pPr>
+        <w:tabs>
+          <w:tab w:val="num" w:pos="720"/>
+        </w:tabs>
+        <w:ind w:left="720" w:hanging="360"/>
+      </w:pPr>
+      <w:rPr>
+        <w:rFonts w:ascii="Symbol" w:hAnsi="Symbol" w:hint="default"/>
+        <w:sz w:val="20"/>
+      </w:rPr>
+    </w:lvl>
+    <w:lvl w:ilvl="1" w:tentative="1">
+      <w:start w:val="1"/>
+      <w:numFmt w:val="bullet"/>
+      <w:lvlText w:val="o"/>
+      <w:lvlJc w:val="left"/>
+      <w:pPr>
+        <w:tabs>
+          <w:tab w:val="num" w:pos="1440"/>
+        </w:tabs>
+        <w:ind w:left="1440" w:hanging="360"/>
+      </w:pPr>
+      <w:rPr>
+        <w:rFonts w:ascii="Courier New" w:hAnsi="Courier New" w:hint="default"/>
+        <w:sz w:val="20"/>
+      </w:rPr>
+    </w:lvl>
+    <w:lvl w:ilvl="2" w:tentative="1">
+      <w:start w:val="1"/>
+      <w:numFmt w:val="bullet"/>
+      <w:lvlText w:val=""/>
+      <w:lvlJc w:val="left"/>
+      <w:pPr>
+        <w:tabs>
+          <w:tab w:val="num" w:pos="2160"/>
+        </w:tabs>
+        <w:ind w:left="2160" w:hanging="360"/>
+      </w:pPr>
+      <w:rPr>
+        <w:rFonts w:ascii="Wingdings" w:hAnsi="Wingdings" w:hint="default"/>
+        <w:sz w:val="20"/>
+      </w:rPr>
+    </w:lvl>
+    <w:lvl w:ilvl="3" w:tentative="1">
+      <w:start w:val="1"/>
+      <w:numFmt w:val="bullet"/>
+      <w:lvlText w:val=""/>
+      <w:lvlJc w:val="left"/>
+      <w:pPr>
+        <w:tabs>
+          <w:tab w:val="num" w:pos="2880"/>
+        </w:tabs>
+        <w:ind w:left="2880" w:hanging="360"/>
+      </w:pPr>
+      <w:rPr>
+        <w:rFonts w:ascii="Wingdings" w:hAnsi="Wingdings" w:hint="default"/>
+        <w:sz w:val="20"/>
+      </w:rPr>
+    </w:lvl>
+    <w:lvl w:ilvl="4" w:tentative="1">
+      <w:start w:val="1"/>
+      <w:numFmt w:val="bullet"/>
+      <w:lvlText w:val=""/>
+      <w:lvlJc w:val="left"/>
+      <w:pPr>
+        <w:tabs>
+          <w:tab w:val="num" w:pos="3600"/>
+        </w:tabs>
+        <w:ind w:left="3600" w:hanging="360"/>
+      </w:pPr>
+      <w:rPr>
+        <w:rFonts w:ascii="Wingdings" w:hAnsi="Wingdings" w:hint="default"/>
+        <w:sz w:val="20"/>
+      </w:rPr>
+    </w:lvl>
+    <w:lvl w:ilvl="5" w:tentative="1">
+      <w:start w:val="1"/>
+      <w:numFmt w:val="bullet"/>
+      <w:lvlText w:val=""/>
+      <w:lvlJc w:val="left"/>
+      <w:pPr>
+        <w:tabs>
+          <w:tab w:val="num" w:pos="4320"/>
+        </w:tabs>
+        <w:ind w:left="4320" w:hanging="360"/>
+      </w:pPr>
+      <w:rPr>
+        <w:rFonts w:ascii="Wingdings" w:hAnsi="Wingdings" w:hint="default"/>
+        <w:sz w:val="20"/>
+      </w:rPr>
+    </w:lvl>
+    <w:lvl w:ilvl="6" w:tentative="1">
+      <w:start w:val="1"/>
+      <w:numFmt w:val="bullet"/>
+      <w:lvlText w:val=""/>
+      <w:lvlJc w:val="left"/>
+      <w:pPr>
+        <w:tabs>
+          <w:tab w:val="num" w:pos="5040"/>
+        </w:tabs>
+        <w:ind w:left="5040" w:hanging="360"/>
+      </w:pPr>
+      <w:rPr>
+        <w:rFonts w:ascii="Wingdings" w:hAnsi="Wingdings" w:hint="default"/>
+        <w:sz w:val="20"/>
+      </w:rPr>
+    </w:lvl>
+    <w:lvl w:ilvl="7" w:tentative="1">
+      <w:start w:val="1"/>
+      <w:numFmt w:val="bullet"/>
+      <w:lvlText w:val=""/>
+      <w:lvlJc w:val="left"/>
+      <w:pPr>
+        <w:tabs>
+          <w:tab w:val="num" w:pos="5760"/>
+        </w:tabs>
+        <w:ind w:left="5760" w:hanging="360"/>
+      </w:pPr>
+      <w:rPr>
+        <w:rFonts w:ascii="Wingdings" w:hAnsi="Wingdings" w:hint="default"/>
+        <w:sz w:val="20"/>
+      </w:rPr>
+    </w:lvl>
+    <w:lvl w:ilvl="8" w:tentative="1">
+      <w:start w:val="1"/>
+      <w:numFmt w:val="bullet"/>
+      <w:lvlText w:val=""/>
+      <w:lvlJc w:val="left"/>
+      <w:pPr>
+        <w:tabs>
+          <w:tab w:val="num" w:pos="6480"/>
+        </w:tabs>
+        <w:ind w:left="6480" w:hanging="360"/>
+      </w:pPr>
+      <w:rPr>
+        <w:rFonts w:ascii="Wingdings" w:hAnsi="Wingdings" w:hint="default"/>
+        <w:sz w:val="20"/>
+      </w:rPr>
+    </w:lvl>
+  </w:abstractNum>
+  <w:abstractNum w:abstractNumId="5" w15:restartNumberingAfterBreak="0">
     <w:nsid w:val="3DAC4309"/>
     <w:multiLevelType w:val="hybridMultilevel"/>
     <w:tmpl w:val="C91854D2"/>
@@ -6083,7 +8594,7 @@
       </w:rPr>
     </w:lvl>
   </w:abstractNum>
-  <w:abstractNum w:abstractNumId="5" w15:restartNumberingAfterBreak="0">
+  <w:abstractNum w:abstractNumId="6" w15:restartNumberingAfterBreak="0">
     <w:nsid w:val="43443FCB"/>
     <w:multiLevelType w:val="multilevel"/>
     <w:tmpl w:val="1C30AAFA"/>
@@ -6232,7 +8743,7 @@
       </w:rPr>
     </w:lvl>
   </w:abstractNum>
-  <w:abstractNum w:abstractNumId="6" w15:restartNumberingAfterBreak="0">
+  <w:abstractNum w:abstractNumId="7" w15:restartNumberingAfterBreak="0">
     <w:nsid w:val="4B4C5930"/>
     <w:multiLevelType w:val="hybridMultilevel"/>
     <w:tmpl w:val="AF7A8ADC"/>
@@ -6345,7 +8856,120 @@
       </w:rPr>
     </w:lvl>
   </w:abstractNum>
-  <w:abstractNum w:abstractNumId="7" w15:restartNumberingAfterBreak="0">
+  <w:abstractNum w:abstractNumId="8" w15:restartNumberingAfterBreak="0">
+    <w:nsid w:val="4FC34243"/>
+    <w:multiLevelType w:val="hybridMultilevel"/>
+    <w:tmpl w:val="97087B9C"/>
+    <w:lvl w:ilvl="0" w:tplc="040C0001">
+      <w:start w:val="1"/>
+      <w:numFmt w:val="bullet"/>
+      <w:lvlText w:val=""/>
+      <w:lvlJc w:val="left"/>
+      <w:pPr>
+        <w:ind w:left="1440" w:hanging="360"/>
+      </w:pPr>
+      <w:rPr>
+        <w:rFonts w:ascii="Symbol" w:hAnsi="Symbol" w:hint="default"/>
+      </w:rPr>
+    </w:lvl>
+    <w:lvl w:ilvl="1" w:tplc="040C0003" w:tentative="1">
+      <w:start w:val="1"/>
+      <w:numFmt w:val="bullet"/>
+      <w:lvlText w:val="o"/>
+      <w:lvlJc w:val="left"/>
+      <w:pPr>
+        <w:ind w:left="2160" w:hanging="360"/>
+      </w:pPr>
+      <w:rPr>
+        <w:rFonts w:ascii="Courier New" w:hAnsi="Courier New" w:cs="Courier New" w:hint="default"/>
+      </w:rPr>
+    </w:lvl>
+    <w:lvl w:ilvl="2" w:tplc="040C0005" w:tentative="1">
+      <w:start w:val="1"/>
+      <w:numFmt w:val="bullet"/>
+      <w:lvlText w:val=""/>
+      <w:lvlJc w:val="left"/>
+      <w:pPr>
+        <w:ind w:left="2880" w:hanging="360"/>
+      </w:pPr>
+      <w:rPr>
+        <w:rFonts w:ascii="Wingdings" w:hAnsi="Wingdings" w:hint="default"/>
+      </w:rPr>
+    </w:lvl>
+    <w:lvl w:ilvl="3" w:tplc="040C0001" w:tentative="1">
+      <w:start w:val="1"/>
+      <w:numFmt w:val="bullet"/>
+      <w:lvlText w:val=""/>
+      <w:lvlJc w:val="left"/>
+      <w:pPr>
+        <w:ind w:left="3600" w:hanging="360"/>
+      </w:pPr>
+      <w:rPr>
+        <w:rFonts w:ascii="Symbol" w:hAnsi="Symbol" w:hint="default"/>
+      </w:rPr>
+    </w:lvl>
+    <w:lvl w:ilvl="4" w:tplc="040C0003" w:tentative="1">
+      <w:start w:val="1"/>
+      <w:numFmt w:val="bullet"/>
+      <w:lvlText w:val="o"/>
+      <w:lvlJc w:val="left"/>
+      <w:pPr>
+        <w:ind w:left="4320" w:hanging="360"/>
+      </w:pPr>
+      <w:rPr>
+        <w:rFonts w:ascii="Courier New" w:hAnsi="Courier New" w:cs="Courier New" w:hint="default"/>
+      </w:rPr>
+    </w:lvl>
+    <w:lvl w:ilvl="5" w:tplc="040C0005" w:tentative="1">
+      <w:start w:val="1"/>
+      <w:numFmt w:val="bullet"/>
+      <w:lvlText w:val=""/>
+      <w:lvlJc w:val="left"/>
+      <w:pPr>
+        <w:ind w:left="5040" w:hanging="360"/>
+      </w:pPr>
+      <w:rPr>
+        <w:rFonts w:ascii="Wingdings" w:hAnsi="Wingdings" w:hint="default"/>
+      </w:rPr>
+    </w:lvl>
+    <w:lvl w:ilvl="6" w:tplc="040C0001" w:tentative="1">
+      <w:start w:val="1"/>
+      <w:numFmt w:val="bullet"/>
+      <w:lvlText w:val=""/>
+      <w:lvlJc w:val="left"/>
+      <w:pPr>
+        <w:ind w:left="5760" w:hanging="360"/>
+      </w:pPr>
+      <w:rPr>
+        <w:rFonts w:ascii="Symbol" w:hAnsi="Symbol" w:hint="default"/>
+      </w:rPr>
+    </w:lvl>
+    <w:lvl w:ilvl="7" w:tplc="040C0003" w:tentative="1">
+      <w:start w:val="1"/>
+      <w:numFmt w:val="bullet"/>
+      <w:lvlText w:val="o"/>
+      <w:lvlJc w:val="left"/>
+      <w:pPr>
+        <w:ind w:left="6480" w:hanging="360"/>
+      </w:pPr>
+      <w:rPr>
+        <w:rFonts w:ascii="Courier New" w:hAnsi="Courier New" w:cs="Courier New" w:hint="default"/>
+      </w:rPr>
+    </w:lvl>
+    <w:lvl w:ilvl="8" w:tplc="040C0005" w:tentative="1">
+      <w:start w:val="1"/>
+      <w:numFmt w:val="bullet"/>
+      <w:lvlText w:val=""/>
+      <w:lvlJc w:val="left"/>
+      <w:pPr>
+        <w:ind w:left="7200" w:hanging="360"/>
+      </w:pPr>
+      <w:rPr>
+        <w:rFonts w:ascii="Wingdings" w:hAnsi="Wingdings" w:hint="default"/>
+      </w:rPr>
+    </w:lvl>
+  </w:abstractNum>
+  <w:abstractNum w:abstractNumId="9" w15:restartNumberingAfterBreak="0">
     <w:nsid w:val="58B67D25"/>
     <w:multiLevelType w:val="hybridMultilevel"/>
     <w:tmpl w:val="8AB0F4A4"/>
@@ -6437,7 +9061,7 @@
       </w:pPr>
     </w:lvl>
   </w:abstractNum>
-  <w:abstractNum w:abstractNumId="8" w15:restartNumberingAfterBreak="0">
+  <w:abstractNum w:abstractNumId="10" w15:restartNumberingAfterBreak="0">
     <w:nsid w:val="653C0C5E"/>
     <w:multiLevelType w:val="multilevel"/>
     <w:tmpl w:val="28D834A2"/>
@@ -6586,7 +9210,156 @@
       </w:rPr>
     </w:lvl>
   </w:abstractNum>
-  <w:abstractNum w:abstractNumId="9" w15:restartNumberingAfterBreak="0">
+  <w:abstractNum w:abstractNumId="11" w15:restartNumberingAfterBreak="0">
+    <w:nsid w:val="6774185F"/>
+    <w:multiLevelType w:val="multilevel"/>
+    <w:tmpl w:val="70EEC7E6"/>
+    <w:lvl w:ilvl="0">
+      <w:start w:val="1"/>
+      <w:numFmt w:val="bullet"/>
+      <w:lvlText w:val=""/>
+      <w:lvlJc w:val="left"/>
+      <w:pPr>
+        <w:tabs>
+          <w:tab w:val="num" w:pos="720"/>
+        </w:tabs>
+        <w:ind w:left="720" w:hanging="360"/>
+      </w:pPr>
+      <w:rPr>
+        <w:rFonts w:ascii="Symbol" w:hAnsi="Symbol" w:hint="default"/>
+        <w:sz w:val="20"/>
+      </w:rPr>
+    </w:lvl>
+    <w:lvl w:ilvl="1" w:tentative="1">
+      <w:start w:val="1"/>
+      <w:numFmt w:val="bullet"/>
+      <w:lvlText w:val="o"/>
+      <w:lvlJc w:val="left"/>
+      <w:pPr>
+        <w:tabs>
+          <w:tab w:val="num" w:pos="1440"/>
+        </w:tabs>
+        <w:ind w:left="1440" w:hanging="360"/>
+      </w:pPr>
+      <w:rPr>
+        <w:rFonts w:ascii="Courier New" w:hAnsi="Courier New" w:hint="default"/>
+        <w:sz w:val="20"/>
+      </w:rPr>
+    </w:lvl>
+    <w:lvl w:ilvl="2" w:tentative="1">
+      <w:start w:val="1"/>
+      <w:numFmt w:val="bullet"/>
+      <w:lvlText w:val=""/>
+      <w:lvlJc w:val="left"/>
+      <w:pPr>
+        <w:tabs>
+          <w:tab w:val="num" w:pos="2160"/>
+        </w:tabs>
+        <w:ind w:left="2160" w:hanging="360"/>
+      </w:pPr>
+      <w:rPr>
+        <w:rFonts w:ascii="Wingdings" w:hAnsi="Wingdings" w:hint="default"/>
+        <w:sz w:val="20"/>
+      </w:rPr>
+    </w:lvl>
+    <w:lvl w:ilvl="3" w:tentative="1">
+      <w:start w:val="1"/>
+      <w:numFmt w:val="bullet"/>
+      <w:lvlText w:val=""/>
+      <w:lvlJc w:val="left"/>
+      <w:pPr>
+        <w:tabs>
+          <w:tab w:val="num" w:pos="2880"/>
+        </w:tabs>
+        <w:ind w:left="2880" w:hanging="360"/>
+      </w:pPr>
+      <w:rPr>
+        <w:rFonts w:ascii="Wingdings" w:hAnsi="Wingdings" w:hint="default"/>
+        <w:sz w:val="20"/>
+      </w:rPr>
+    </w:lvl>
+    <w:lvl w:ilvl="4" w:tentative="1">
+      <w:start w:val="1"/>
+      <w:numFmt w:val="bullet"/>
+      <w:lvlText w:val=""/>
+      <w:lvlJc w:val="left"/>
+      <w:pPr>
+        <w:tabs>
+          <w:tab w:val="num" w:pos="3600"/>
+        </w:tabs>
+        <w:ind w:left="3600" w:hanging="360"/>
+      </w:pPr>
+      <w:rPr>
+        <w:rFonts w:ascii="Wingdings" w:hAnsi="Wingdings" w:hint="default"/>
+        <w:sz w:val="20"/>
+      </w:rPr>
+    </w:lvl>
+    <w:lvl w:ilvl="5" w:tentative="1">
+      <w:start w:val="1"/>
+      <w:numFmt w:val="bullet"/>
+      <w:lvlText w:val=""/>
+      <w:lvlJc w:val="left"/>
+      <w:pPr>
+        <w:tabs>
+          <w:tab w:val="num" w:pos="4320"/>
+        </w:tabs>
+        <w:ind w:left="4320" w:hanging="360"/>
+      </w:pPr>
+      <w:rPr>
+        <w:rFonts w:ascii="Wingdings" w:hAnsi="Wingdings" w:hint="default"/>
+        <w:sz w:val="20"/>
+      </w:rPr>
+    </w:lvl>
+    <w:lvl w:ilvl="6" w:tentative="1">
+      <w:start w:val="1"/>
+      <w:numFmt w:val="bullet"/>
+      <w:lvlText w:val=""/>
+      <w:lvlJc w:val="left"/>
+      <w:pPr>
+        <w:tabs>
+          <w:tab w:val="num" w:pos="5040"/>
+        </w:tabs>
+        <w:ind w:left="5040" w:hanging="360"/>
+      </w:pPr>
+      <w:rPr>
+        <w:rFonts w:ascii="Wingdings" w:hAnsi="Wingdings" w:hint="default"/>
+        <w:sz w:val="20"/>
+      </w:rPr>
+    </w:lvl>
+    <w:lvl w:ilvl="7" w:tentative="1">
+      <w:start w:val="1"/>
+      <w:numFmt w:val="bullet"/>
+      <w:lvlText w:val=""/>
+      <w:lvlJc w:val="left"/>
+      <w:pPr>
+        <w:tabs>
+          <w:tab w:val="num" w:pos="5760"/>
+        </w:tabs>
+        <w:ind w:left="5760" w:hanging="360"/>
+      </w:pPr>
+      <w:rPr>
+        <w:rFonts w:ascii="Wingdings" w:hAnsi="Wingdings" w:hint="default"/>
+        <w:sz w:val="20"/>
+      </w:rPr>
+    </w:lvl>
+    <w:lvl w:ilvl="8" w:tentative="1">
+      <w:start w:val="1"/>
+      <w:numFmt w:val="bullet"/>
+      <w:lvlText w:val=""/>
+      <w:lvlJc w:val="left"/>
+      <w:pPr>
+        <w:tabs>
+          <w:tab w:val="num" w:pos="6480"/>
+        </w:tabs>
+        <w:ind w:left="6480" w:hanging="360"/>
+      </w:pPr>
+      <w:rPr>
+        <w:rFonts w:ascii="Wingdings" w:hAnsi="Wingdings" w:hint="default"/>
+        <w:sz w:val="20"/>
+      </w:rPr>
+    </w:lvl>
+  </w:abstractNum>
+  <w:abstractNum w:abstractNumId="12" w15:restartNumberingAfterBreak="0">
     <w:nsid w:val="69FC276B"/>
     <w:multiLevelType w:val="multilevel"/>
     <w:tmpl w:val="C2E0AD14"/>
@@ -6735,7 +9508,7 @@
       </w:rPr>
     </w:lvl>
   </w:abstractNum>
-  <w:abstractNum w:abstractNumId="10" w15:restartNumberingAfterBreak="0">
+  <w:abstractNum w:abstractNumId="13" w15:restartNumberingAfterBreak="0">
     <w:nsid w:val="76A84B46"/>
     <w:multiLevelType w:val="hybridMultilevel"/>
     <w:tmpl w:val="C6A6513A"/>
@@ -6857,31 +9630,40 @@
     <w:abstractNumId w:val="2"/>
   </w:num>
   <w:num w:numId="3" w16cid:durableId="832062217">
-    <w:abstractNumId w:val="10"/>
+    <w:abstractNumId w:val="13"/>
   </w:num>
   <w:num w:numId="4" w16cid:durableId="1215237999">
-    <w:abstractNumId w:val="4"/>
+    <w:abstractNumId w:val="5"/>
   </w:num>
   <w:num w:numId="5" w16cid:durableId="952397004">
     <w:abstractNumId w:val="3"/>
   </w:num>
   <w:num w:numId="6" w16cid:durableId="1734310147">
-    <w:abstractNumId w:val="6"/>
+    <w:abstractNumId w:val="7"/>
   </w:num>
   <w:num w:numId="7" w16cid:durableId="655379516">
-    <w:abstractNumId w:val="9"/>
+    <w:abstractNumId w:val="12"/>
   </w:num>
   <w:num w:numId="8" w16cid:durableId="1980303912">
-    <w:abstractNumId w:val="8"/>
+    <w:abstractNumId w:val="10"/>
   </w:num>
   <w:num w:numId="9" w16cid:durableId="1230191484">
-    <w:abstractNumId w:val="7"/>
+    <w:abstractNumId w:val="9"/>
   </w:num>
   <w:num w:numId="10" w16cid:durableId="1816606018">
     <w:abstractNumId w:val="0"/>
   </w:num>
   <w:num w:numId="11" w16cid:durableId="1369716825">
-    <w:abstractNumId w:val="5"/>
+    <w:abstractNumId w:val="6"/>
+  </w:num>
+  <w:num w:numId="12" w16cid:durableId="132413389">
+    <w:abstractNumId w:val="11"/>
+  </w:num>
+  <w:num w:numId="13" w16cid:durableId="483476165">
+    <w:abstractNumId w:val="8"/>
+  </w:num>
+  <w:num w:numId="14" w16cid:durableId="214657024">
+    <w:abstractNumId w:val="4"/>
   </w:num>
 </w:numbering>
 </file>

</xml_diff>

<commit_message>
feat: gestion des exceptions et sécurisation des saisies (Partie 8)
</commit_message>
<xml_diff>
--- a/pratiquePython.docx
+++ b/pratiquePython.docx
@@ -836,6 +836,7 @@
         <w:t xml:space="preserve">, </w:t>
       </w:r>
       <w:proofErr w:type="spellStart"/>
+      <w:proofErr w:type="gramStart"/>
       <w:r>
         <w:rPr>
           <w:rStyle w:val="CodeHTML"/>
@@ -857,7 +858,19 @@
           <w:sz w:val="24"/>
           <w:szCs w:val="24"/>
         </w:rPr>
-        <w:t>()</w:t>
+        <w:t>(</w:t>
+      </w:r>
+      <w:proofErr w:type="gramEnd"/>
+      <w:r>
+        <w:rPr>
+          <w:rStyle w:val="CodeHTML"/>
+          <w:rFonts w:ascii="Times New Roman" w:eastAsia="Calibri" w:hAnsi="Times New Roman" w:cs="Times New Roman"/>
+          <w:b/>
+          <w:bCs/>
+          <w:sz w:val="24"/>
+          <w:szCs w:val="24"/>
+        </w:rPr>
+        <w:t>)</w:t>
       </w:r>
       <w:r>
         <w:rPr>
@@ -1109,6 +1122,7 @@
         <w:t xml:space="preserve">Ce code montre une série d'instructions </w:t>
       </w:r>
       <w:proofErr w:type="spellStart"/>
+      <w:proofErr w:type="gramStart"/>
       <w:r>
         <w:rPr>
           <w:rStyle w:val="CodeHTML"/>
@@ -1130,7 +1144,19 @@
           <w:sz w:val="24"/>
           <w:szCs w:val="24"/>
         </w:rPr>
-        <w:t>()</w:t>
+        <w:t>(</w:t>
+      </w:r>
+      <w:proofErr w:type="gramEnd"/>
+      <w:r>
+        <w:rPr>
+          <w:rStyle w:val="CodeHTML"/>
+          <w:rFonts w:ascii="Times New Roman" w:eastAsia="Calibri" w:hAnsi="Times New Roman" w:cs="Times New Roman"/>
+          <w:b/>
+          <w:bCs/>
+          <w:sz w:val="24"/>
+          <w:szCs w:val="24"/>
+        </w:rPr>
+        <w:t>)</w:t>
       </w:r>
       <w:r>
         <w:rPr>
@@ -1320,16 +1346,29 @@
         </w:numPr>
         <w:spacing w:before="0" w:beforeAutospacing="0" w:line="360" w:lineRule="auto"/>
       </w:pPr>
-      <w:r>
-        <w:rPr>
-          <w:rStyle w:val="CodeHTML"/>
-          <w:rFonts w:ascii="Times New Roman" w:hAnsi="Times New Roman" w:cs="Times New Roman"/>
-          <w:b/>
-          <w:bCs/>
-          <w:sz w:val="24"/>
-          <w:szCs w:val="24"/>
-        </w:rPr>
-        <w:t>input()</w:t>
+      <w:proofErr w:type="gramStart"/>
+      <w:r>
+        <w:rPr>
+          <w:rStyle w:val="CodeHTML"/>
+          <w:rFonts w:ascii="Times New Roman" w:hAnsi="Times New Roman" w:cs="Times New Roman"/>
+          <w:b/>
+          <w:bCs/>
+          <w:sz w:val="24"/>
+          <w:szCs w:val="24"/>
+        </w:rPr>
+        <w:t>input(</w:t>
+      </w:r>
+      <w:proofErr w:type="gramEnd"/>
+      <w:r>
+        <w:rPr>
+          <w:rStyle w:val="CodeHTML"/>
+          <w:rFonts w:ascii="Times New Roman" w:hAnsi="Times New Roman" w:cs="Times New Roman"/>
+          <w:b/>
+          <w:bCs/>
+          <w:sz w:val="24"/>
+          <w:szCs w:val="24"/>
+        </w:rPr>
+        <w:t>)</w:t>
       </w:r>
       <w:r>
         <w:rPr>
@@ -1366,6 +1405,7 @@
         <w:spacing w:before="0" w:beforeAutospacing="0" w:line="360" w:lineRule="auto"/>
       </w:pPr>
       <w:proofErr w:type="spellStart"/>
+      <w:proofErr w:type="gramStart"/>
       <w:r>
         <w:rPr>
           <w:rStyle w:val="CodeHTML"/>
@@ -1388,7 +1428,19 @@
           <w:sz w:val="24"/>
           <w:szCs w:val="24"/>
         </w:rPr>
-        <w:t>()</w:t>
+        <w:t>(</w:t>
+      </w:r>
+      <w:proofErr w:type="gramEnd"/>
+      <w:r>
+        <w:rPr>
+          <w:rStyle w:val="CodeHTML"/>
+          <w:rFonts w:ascii="Times New Roman" w:hAnsi="Times New Roman" w:cs="Times New Roman"/>
+          <w:b/>
+          <w:bCs/>
+          <w:sz w:val="24"/>
+          <w:szCs w:val="24"/>
+        </w:rPr>
+        <w:t>)</w:t>
       </w:r>
       <w:r>
         <w:rPr>
@@ -1411,6 +1463,7 @@
         <w:spacing w:before="0" w:beforeAutospacing="0" w:line="360" w:lineRule="auto"/>
       </w:pPr>
       <w:proofErr w:type="spellStart"/>
+      <w:proofErr w:type="gramStart"/>
       <w:r>
         <w:rPr>
           <w:rStyle w:val="CodeHTML"/>
@@ -1432,7 +1485,19 @@
           <w:sz w:val="24"/>
           <w:szCs w:val="24"/>
         </w:rPr>
-        <w:t>()</w:t>
+        <w:t>(</w:t>
+      </w:r>
+      <w:proofErr w:type="gramEnd"/>
+      <w:r>
+        <w:rPr>
+          <w:rStyle w:val="CodeHTML"/>
+          <w:rFonts w:ascii="Times New Roman" w:hAnsi="Times New Roman" w:cs="Times New Roman"/>
+          <w:b/>
+          <w:bCs/>
+          <w:sz w:val="24"/>
+          <w:szCs w:val="24"/>
+        </w:rPr>
+        <w:t>)</w:t>
       </w:r>
       <w:r>
         <w:rPr>
@@ -1463,6 +1528,7 @@
         <w:spacing w:before="0" w:beforeAutospacing="0" w:line="360" w:lineRule="auto"/>
       </w:pPr>
       <w:proofErr w:type="spellStart"/>
+      <w:proofErr w:type="gramStart"/>
       <w:r>
         <w:rPr>
           <w:rStyle w:val="CodeHTML"/>
@@ -1484,7 +1550,19 @@
           <w:sz w:val="24"/>
           <w:szCs w:val="24"/>
         </w:rPr>
-        <w:t>()</w:t>
+        <w:t>(</w:t>
+      </w:r>
+      <w:proofErr w:type="gramEnd"/>
+      <w:r>
+        <w:rPr>
+          <w:rStyle w:val="CodeHTML"/>
+          <w:rFonts w:ascii="Times New Roman" w:hAnsi="Times New Roman" w:cs="Times New Roman"/>
+          <w:b/>
+          <w:bCs/>
+          <w:sz w:val="24"/>
+          <w:szCs w:val="24"/>
+        </w:rPr>
+        <w:t>)</w:t>
       </w:r>
       <w:r>
         <w:rPr>
@@ -2121,6 +2199,7 @@
         <w:spacing w:before="0" w:beforeAutospacing="0" w:line="360" w:lineRule="auto"/>
       </w:pPr>
       <w:proofErr w:type="spellStart"/>
+      <w:proofErr w:type="gramStart"/>
       <w:r>
         <w:rPr>
           <w:rStyle w:val="CodeHTML"/>
@@ -2133,6 +2212,7 @@
         <w:t>while</w:t>
       </w:r>
       <w:proofErr w:type="spellEnd"/>
+      <w:proofErr w:type="gramEnd"/>
       <w:r>
         <w:rPr>
           <w:rStyle w:val="CodeHTML"/>
@@ -2190,16 +2270,29 @@
         </w:numPr>
         <w:spacing w:before="0" w:beforeAutospacing="0" w:line="360" w:lineRule="auto"/>
       </w:pPr>
-      <w:r>
-        <w:rPr>
-          <w:rStyle w:val="CodeHTML"/>
-          <w:rFonts w:ascii="Times New Roman" w:hAnsi="Times New Roman" w:cs="Times New Roman"/>
-          <w:b/>
-          <w:bCs/>
-          <w:sz w:val="24"/>
-          <w:szCs w:val="24"/>
-        </w:rPr>
-        <w:t xml:space="preserve">if / </w:t>
+      <w:proofErr w:type="gramStart"/>
+      <w:r>
+        <w:rPr>
+          <w:rStyle w:val="CodeHTML"/>
+          <w:rFonts w:ascii="Times New Roman" w:hAnsi="Times New Roman" w:cs="Times New Roman"/>
+          <w:b/>
+          <w:bCs/>
+          <w:sz w:val="24"/>
+          <w:szCs w:val="24"/>
+        </w:rPr>
+        <w:t>if</w:t>
+      </w:r>
+      <w:proofErr w:type="gramEnd"/>
+      <w:r>
+        <w:rPr>
+          <w:rStyle w:val="CodeHTML"/>
+          <w:rFonts w:ascii="Times New Roman" w:hAnsi="Times New Roman" w:cs="Times New Roman"/>
+          <w:b/>
+          <w:bCs/>
+          <w:sz w:val="24"/>
+          <w:szCs w:val="24"/>
+        </w:rPr>
+        <w:t xml:space="preserve"> / </w:t>
       </w:r>
       <w:proofErr w:type="spellStart"/>
       <w:r>
@@ -2258,16 +2351,29 @@
         </w:numPr>
         <w:spacing w:before="0" w:beforeAutospacing="0" w:line="360" w:lineRule="auto"/>
       </w:pPr>
-      <w:r>
-        <w:rPr>
-          <w:rStyle w:val="CodeHTML"/>
-          <w:rFonts w:ascii="Times New Roman" w:hAnsi="Times New Roman" w:cs="Times New Roman"/>
-          <w:b/>
-          <w:bCs/>
-          <w:sz w:val="24"/>
-          <w:szCs w:val="24"/>
-        </w:rPr>
-        <w:t>active = False</w:t>
+      <w:proofErr w:type="gramStart"/>
+      <w:r>
+        <w:rPr>
+          <w:rStyle w:val="CodeHTML"/>
+          <w:rFonts w:ascii="Times New Roman" w:hAnsi="Times New Roman" w:cs="Times New Roman"/>
+          <w:b/>
+          <w:bCs/>
+          <w:sz w:val="24"/>
+          <w:szCs w:val="24"/>
+        </w:rPr>
+        <w:t>active</w:t>
+      </w:r>
+      <w:proofErr w:type="gramEnd"/>
+      <w:r>
+        <w:rPr>
+          <w:rStyle w:val="CodeHTML"/>
+          <w:rFonts w:ascii="Times New Roman" w:hAnsi="Times New Roman" w:cs="Times New Roman"/>
+          <w:b/>
+          <w:bCs/>
+          <w:sz w:val="24"/>
+          <w:szCs w:val="24"/>
+        </w:rPr>
+        <w:t xml:space="preserve"> = False</w:t>
       </w:r>
       <w:r>
         <w:rPr>
@@ -2329,7 +2435,15 @@
         <w:t>) :</w:t>
       </w:r>
       <w:r>
-        <w:t xml:space="preserve"> Opérateur logique utilisé pour vérifier si la chaîne saisie par l'utilisateur correspond aux options proposées (ex: </w:t>
+        <w:t xml:space="preserve"> Opérateur logique utilisé pour vérifier si la chaîne saisie par l'utilisateur correspond aux options proposées (</w:t>
+      </w:r>
+      <w:proofErr w:type="gramStart"/>
+      <w:r>
+        <w:t>ex:</w:t>
+      </w:r>
+      <w:proofErr w:type="gramEnd"/>
+      <w:r>
+        <w:t xml:space="preserve"> </w:t>
       </w:r>
       <w:r>
         <w:rPr>
@@ -2910,12 +3024,21 @@
       <w:r>
         <w:t xml:space="preserve"> Permet de regrouper plusieurs informations associées à une même entité sous forme de paires </w:t>
       </w:r>
-      <w:r>
-        <w:rPr>
-          <w:b/>
-          <w:bCs/>
-        </w:rPr>
-        <w:t>clé: valeur</w:t>
+      <w:proofErr w:type="gramStart"/>
+      <w:r>
+        <w:rPr>
+          <w:b/>
+          <w:bCs/>
+        </w:rPr>
+        <w:t>clé:</w:t>
+      </w:r>
+      <w:proofErr w:type="gramEnd"/>
+      <w:r>
+        <w:rPr>
+          <w:b/>
+          <w:bCs/>
+        </w:rPr>
+        <w:t xml:space="preserve"> valeur</w:t>
       </w:r>
       <w:r>
         <w:t xml:space="preserve"> (ex: </w:t>
@@ -3532,7 +3655,17 @@
           <w:sz w:val="24"/>
           <w:szCs w:val="24"/>
         </w:rPr>
-        <w:t>domaine_auto</w:t>
+        <w:t>domaine_</w:t>
+      </w:r>
+      <w:proofErr w:type="gramStart"/>
+      <w:r>
+        <w:rPr>
+          <w:rStyle w:val="CodeHTML"/>
+          <w:rFonts w:ascii="Times New Roman" w:eastAsia="Calibri" w:hAnsi="Times New Roman" w:cs="Times New Roman"/>
+          <w:sz w:val="24"/>
+          <w:szCs w:val="24"/>
+        </w:rPr>
+        <w:t>auto</w:t>
       </w:r>
       <w:proofErr w:type="spellEnd"/>
       <w:r>
@@ -3544,6 +3677,7 @@
         </w:rPr>
         <w:t>:</w:t>
       </w:r>
+      <w:proofErr w:type="gramEnd"/>
       <w:r>
         <w:rPr>
           <w:rFonts w:ascii="Times New Roman" w:hAnsi="Times New Roman" w:cs="Times New Roman"/>
@@ -4280,9 +4414,20 @@
           <w:sz w:val="24"/>
           <w:szCs w:val="24"/>
         </w:rPr>
-        <w:t>catalogue_data.append</w:t>
+        <w:t>catalogue_</w:t>
+      </w:r>
+      <w:proofErr w:type="gramStart"/>
+      <w:r>
+        <w:rPr>
+          <w:rStyle w:val="CodeHTML"/>
+          <w:rFonts w:ascii="Times New Roman" w:eastAsia="Calibri" w:hAnsi="Times New Roman" w:cs="Times New Roman"/>
+          <w:sz w:val="24"/>
+          <w:szCs w:val="24"/>
+        </w:rPr>
+        <w:t>data.append</w:t>
       </w:r>
       <w:proofErr w:type="spellEnd"/>
+      <w:proofErr w:type="gramEnd"/>
       <w:r>
         <w:rPr>
           <w:rStyle w:val="CodeHTML"/>
@@ -4411,7 +4556,25 @@
           <w:sz w:val="24"/>
           <w:szCs w:val="24"/>
         </w:rPr>
-        <w:t xml:space="preserve">Le menu principal est enrichi avec de nouvelles options interactives. À ce stade, la logique métier est intégrée directement sous forme de structures conditionnelles </w:t>
+        <w:t xml:space="preserve">Le menu principal est enrichi avec de nouvelles options interactives. À ce stade, la logique métier est </w:t>
+      </w:r>
+      <w:proofErr w:type="gramStart"/>
+      <w:r>
+        <w:rPr>
+          <w:rFonts w:ascii="Times New Roman" w:hAnsi="Times New Roman" w:cs="Times New Roman"/>
+          <w:sz w:val="24"/>
+          <w:szCs w:val="24"/>
+        </w:rPr>
+        <w:t>intégrée</w:t>
+      </w:r>
+      <w:proofErr w:type="gramEnd"/>
+      <w:r>
+        <w:rPr>
+          <w:rFonts w:ascii="Times New Roman" w:hAnsi="Times New Roman" w:cs="Times New Roman"/>
+          <w:sz w:val="24"/>
+          <w:szCs w:val="24"/>
+        </w:rPr>
+        <w:t xml:space="preserve"> directement sous forme de structures conditionnelles </w:t>
       </w:r>
       <w:r>
         <w:rPr>
@@ -4786,7 +4949,16 @@
           <w:sz w:val="24"/>
           <w:szCs w:val="24"/>
         </w:rPr>
-        <w:t xml:space="preserve">Recherche de l'élément dans le catalogue et retrait de la liste grâce à la méthode </w:t>
+        <w:t xml:space="preserve">Recherche de l'élément dans le catalogue et retrait de la liste grâce à la </w:t>
+      </w:r>
+      <w:proofErr w:type="gramStart"/>
+      <w:r>
+        <w:rPr>
+          <w:rFonts w:ascii="Times New Roman" w:hAnsi="Times New Roman" w:cs="Times New Roman"/>
+          <w:sz w:val="24"/>
+          <w:szCs w:val="24"/>
+        </w:rPr>
+        <w:t xml:space="preserve">méthode </w:t>
       </w:r>
       <w:r>
         <w:rPr>
@@ -4808,6 +4980,7 @@
         <w:t>remove</w:t>
       </w:r>
       <w:proofErr w:type="spellEnd"/>
+      <w:proofErr w:type="gramEnd"/>
       <w:r>
         <w:rPr>
           <w:rStyle w:val="CodeHTML"/>
@@ -5484,16 +5657,29 @@
         </w:numPr>
         <w:spacing w:before="0" w:beforeAutospacing="0" w:line="360" w:lineRule="auto"/>
       </w:pPr>
-      <w:r>
-        <w:rPr>
-          <w:rStyle w:val="CodeHTML"/>
-          <w:rFonts w:ascii="Times New Roman" w:hAnsi="Times New Roman" w:cs="Times New Roman"/>
-          <w:b/>
-          <w:bCs/>
-          <w:sz w:val="24"/>
-          <w:szCs w:val="24"/>
-        </w:rPr>
-        <w:t>.append()</w:t>
+      <w:proofErr w:type="gramStart"/>
+      <w:r>
+        <w:rPr>
+          <w:rStyle w:val="CodeHTML"/>
+          <w:rFonts w:ascii="Times New Roman" w:hAnsi="Times New Roman" w:cs="Times New Roman"/>
+          <w:b/>
+          <w:bCs/>
+          <w:sz w:val="24"/>
+          <w:szCs w:val="24"/>
+        </w:rPr>
+        <w:t>.append</w:t>
+      </w:r>
+      <w:proofErr w:type="gramEnd"/>
+      <w:r>
+        <w:rPr>
+          <w:rStyle w:val="CodeHTML"/>
+          <w:rFonts w:ascii="Times New Roman" w:hAnsi="Times New Roman" w:cs="Times New Roman"/>
+          <w:b/>
+          <w:bCs/>
+          <w:sz w:val="24"/>
+          <w:szCs w:val="24"/>
+        </w:rPr>
+        <w:t>()</w:t>
       </w:r>
       <w:r>
         <w:rPr>
@@ -5515,6 +5701,7 @@
         </w:numPr>
         <w:spacing w:before="0" w:beforeAutospacing="0" w:line="360" w:lineRule="auto"/>
       </w:pPr>
+      <w:proofErr w:type="gramStart"/>
       <w:r>
         <w:rPr>
           <w:rStyle w:val="CodeHTML"/>
@@ -5539,6 +5726,7 @@
         <w:t>remove</w:t>
       </w:r>
       <w:proofErr w:type="spellEnd"/>
+      <w:proofErr w:type="gramEnd"/>
       <w:r>
         <w:rPr>
           <w:rStyle w:val="CodeHTML"/>
@@ -5570,16 +5758,29 @@
         </w:numPr>
         <w:spacing w:before="0" w:beforeAutospacing="0" w:line="360" w:lineRule="auto"/>
       </w:pPr>
-      <w:r>
-        <w:rPr>
-          <w:rStyle w:val="CodeHTML"/>
-          <w:rFonts w:ascii="Times New Roman" w:hAnsi="Times New Roman" w:cs="Times New Roman"/>
-          <w:b/>
-          <w:bCs/>
-          <w:sz w:val="24"/>
-          <w:szCs w:val="24"/>
-        </w:rPr>
-        <w:t>.sort(key=lambda ...)</w:t>
+      <w:proofErr w:type="gramStart"/>
+      <w:r>
+        <w:rPr>
+          <w:rStyle w:val="CodeHTML"/>
+          <w:rFonts w:ascii="Times New Roman" w:hAnsi="Times New Roman" w:cs="Times New Roman"/>
+          <w:b/>
+          <w:bCs/>
+          <w:sz w:val="24"/>
+          <w:szCs w:val="24"/>
+        </w:rPr>
+        <w:t>.sort</w:t>
+      </w:r>
+      <w:proofErr w:type="gramEnd"/>
+      <w:r>
+        <w:rPr>
+          <w:rStyle w:val="CodeHTML"/>
+          <w:rFonts w:ascii="Times New Roman" w:hAnsi="Times New Roman" w:cs="Times New Roman"/>
+          <w:b/>
+          <w:bCs/>
+          <w:sz w:val="24"/>
+          <w:szCs w:val="24"/>
+        </w:rPr>
+        <w:t>(key=lambda ...)</w:t>
       </w:r>
       <w:r>
         <w:rPr>
@@ -6041,6 +6242,7 @@
         <w:t>L'extrait montre l'utilisation des compréhensions de listes associées aux fonctions d'agrégation (</w:t>
       </w:r>
       <w:proofErr w:type="spellStart"/>
+      <w:proofErr w:type="gramStart"/>
       <w:r>
         <w:rPr>
           <w:rStyle w:val="CodeHTML"/>
@@ -6058,7 +6260,17 @@
           <w:sz w:val="24"/>
           <w:szCs w:val="24"/>
         </w:rPr>
-        <w:t>()</w:t>
+        <w:t>(</w:t>
+      </w:r>
+      <w:proofErr w:type="gramEnd"/>
+      <w:r>
+        <w:rPr>
+          <w:rStyle w:val="CodeHTML"/>
+          <w:rFonts w:ascii="Times New Roman" w:eastAsia="Calibri" w:hAnsi="Times New Roman" w:cs="Times New Roman"/>
+          <w:sz w:val="24"/>
+          <w:szCs w:val="24"/>
+        </w:rPr>
+        <w:t>)</w:t>
       </w:r>
       <w:r>
         <w:rPr>
@@ -6382,6 +6594,7 @@
         <w:t>Fonctions d'agrégation (</w:t>
       </w:r>
       <w:proofErr w:type="spellStart"/>
+      <w:proofErr w:type="gramStart"/>
       <w:r>
         <w:rPr>
           <w:rStyle w:val="CodeHTML"/>
@@ -6403,7 +6616,19 @@
           <w:sz w:val="24"/>
           <w:szCs w:val="24"/>
         </w:rPr>
-        <w:t>()</w:t>
+        <w:t>(</w:t>
+      </w:r>
+      <w:proofErr w:type="gramEnd"/>
+      <w:r>
+        <w:rPr>
+          <w:rStyle w:val="CodeHTML"/>
+          <w:rFonts w:ascii="Times New Roman" w:hAnsi="Times New Roman" w:cs="Times New Roman"/>
+          <w:b/>
+          <w:bCs/>
+          <w:sz w:val="24"/>
+          <w:szCs w:val="24"/>
+        </w:rPr>
+        <w:t>)</w:t>
       </w:r>
       <w:r>
         <w:rPr>
@@ -6461,18 +6686,38 @@
           <w:b/>
           <w:bCs/>
         </w:rPr>
-        <w:t>Formatage d'affichage (</w:t>
-      </w:r>
-      <w:r>
-        <w:rPr>
-          <w:rStyle w:val="CodeHTML"/>
-          <w:rFonts w:ascii="Times New Roman" w:hAnsi="Times New Roman" w:cs="Times New Roman"/>
-          <w:b/>
-          <w:bCs/>
-          <w:sz w:val="24"/>
-          <w:szCs w:val="24"/>
-        </w:rPr>
-        <w:t>:.2f</w:t>
+        <w:t xml:space="preserve">Formatage d'affichage </w:t>
+      </w:r>
+      <w:proofErr w:type="gramStart"/>
+      <w:r>
+        <w:rPr>
+          <w:b/>
+          <w:bCs/>
+        </w:rPr>
+        <w:t>(</w:t>
+      </w:r>
+      <w:r>
+        <w:rPr>
+          <w:rStyle w:val="CodeHTML"/>
+          <w:rFonts w:ascii="Times New Roman" w:hAnsi="Times New Roman" w:cs="Times New Roman"/>
+          <w:b/>
+          <w:bCs/>
+          <w:sz w:val="24"/>
+          <w:szCs w:val="24"/>
+        </w:rPr>
+        <w:t>:.</w:t>
+      </w:r>
+      <w:proofErr w:type="gramEnd"/>
+      <w:r>
+        <w:rPr>
+          <w:rStyle w:val="CodeHTML"/>
+          <w:rFonts w:ascii="Times New Roman" w:hAnsi="Times New Roman" w:cs="Times New Roman"/>
+          <w:b/>
+          <w:bCs/>
+          <w:sz w:val="24"/>
+          <w:szCs w:val="24"/>
+        </w:rPr>
+        <w:t>2f</w:t>
       </w:r>
       <w:r>
         <w:rPr>
@@ -6502,6 +6747,7 @@
         <w:t>Comptage par dictionnaire (</w:t>
       </w:r>
       <w:proofErr w:type="spellStart"/>
+      <w:proofErr w:type="gramStart"/>
       <w:r>
         <w:rPr>
           <w:rStyle w:val="CodeHTML"/>
@@ -6514,6 +6760,7 @@
         <w:t>dict.items</w:t>
       </w:r>
       <w:proofErr w:type="spellEnd"/>
+      <w:proofErr w:type="gramEnd"/>
       <w:r>
         <w:rPr>
           <w:rStyle w:val="CodeHTML"/>
@@ -6774,6 +7021,7 @@
           <w:rFonts w:ascii="Times New Roman" w:hAnsi="Times New Roman" w:cs="Times New Roman"/>
           <w:b/>
           <w:bCs/>
+          <w:noProof/>
           <w:sz w:val="24"/>
           <w:szCs w:val="24"/>
         </w:rPr>
@@ -6830,6 +7078,7 @@
           <w:rFonts w:ascii="Times New Roman" w:hAnsi="Times New Roman" w:cs="Times New Roman"/>
           <w:b/>
           <w:bCs/>
+          <w:noProof/>
           <w:sz w:val="24"/>
           <w:szCs w:val="24"/>
         </w:rPr>
@@ -6940,16 +7189,7 @@
         <w:spacing w:before="0" w:beforeAutospacing="0" w:line="360" w:lineRule="auto"/>
       </w:pPr>
       <w:r>
-        <w:t xml:space="preserve">Cette </w:t>
-      </w:r>
-      <w:r>
-        <w:t>extra</w:t>
-      </w:r>
-      <w:r>
-        <w:t>ction</w:t>
-      </w:r>
-      <w:r>
-        <w:t xml:space="preserve"> présente le code des options 8 et 9 :</w:t>
+        <w:t>Cette extraction présente le code des options 8 et 9 :</w:t>
       </w:r>
     </w:p>
     <w:p>
@@ -7008,6 +7248,7 @@
         <w:t xml:space="preserve">) couplé à </w:t>
       </w:r>
       <w:proofErr w:type="spellStart"/>
+      <w:proofErr w:type="gramStart"/>
       <w:r>
         <w:rPr>
           <w:rStyle w:val="CodeHTML"/>
@@ -7018,6 +7259,7 @@
         <w:t>csv.DictWriter</w:t>
       </w:r>
       <w:proofErr w:type="spellEnd"/>
+      <w:proofErr w:type="gramEnd"/>
       <w:r>
         <w:t xml:space="preserve"> pour écrire l'en-tête (</w:t>
       </w:r>
@@ -7100,6 +7342,7 @@
         <w:t xml:space="preserve">) à l'aide de </w:t>
       </w:r>
       <w:proofErr w:type="spellStart"/>
+      <w:proofErr w:type="gramStart"/>
       <w:r>
         <w:rPr>
           <w:rStyle w:val="CodeHTML"/>
@@ -7110,6 +7353,7 @@
         <w:t>csv.DictReader</w:t>
       </w:r>
       <w:proofErr w:type="spellEnd"/>
+      <w:proofErr w:type="gramEnd"/>
       <w:r>
         <w:t xml:space="preserve"> et reconstruction de la liste </w:t>
       </w:r>
@@ -7200,6 +7444,7 @@
       <w:r>
         <w:rPr>
           <w:rFonts w:ascii="Times New Roman" w:eastAsia="Consolas" w:hAnsi="Times New Roman" w:cs="Times New Roman"/>
+          <w:noProof/>
           <w:sz w:val="24"/>
           <w:szCs w:val="24"/>
         </w:rPr>
@@ -7355,6 +7600,7 @@
       <w:r>
         <w:rPr>
           <w:rFonts w:ascii="Times New Roman" w:hAnsi="Times New Roman" w:cs="Times New Roman"/>
+          <w:noProof/>
           <w:sz w:val="24"/>
           <w:szCs w:val="24"/>
         </w:rPr>
@@ -7413,13 +7659,23 @@
         <w:t>L'éditeur affiche le contenu du fichier datasets.csv généré à la racine du projet, comportant la ligne d'en-tête (</w:t>
       </w:r>
       <w:proofErr w:type="spellStart"/>
+      <w:proofErr w:type="gramStart"/>
       <w:r>
         <w:rPr>
           <w:rFonts w:ascii="Times New Roman" w:eastAsia="Times New Roman" w:hAnsi="Times New Roman" w:cs="Times New Roman"/>
           <w:sz w:val="24"/>
           <w:szCs w:val="24"/>
         </w:rPr>
-        <w:t>nom,domaine,nbr_lignes,nbr_colonnes,taille,format,public</w:t>
+        <w:t>nom,domaine</w:t>
+      </w:r>
+      <w:proofErr w:type="gramEnd"/>
+      <w:r>
+        <w:rPr>
+          <w:rFonts w:ascii="Times New Roman" w:eastAsia="Times New Roman" w:hAnsi="Times New Roman" w:cs="Times New Roman"/>
+          <w:sz w:val="24"/>
+          <w:szCs w:val="24"/>
+        </w:rPr>
+        <w:t>,nbr_lignes,nbr_colonnes,taille,format,public</w:t>
       </w:r>
       <w:proofErr w:type="spellEnd"/>
       <w:r>
@@ -7577,6 +7833,7 @@
         <w:spacing w:before="0" w:beforeAutospacing="0" w:line="360" w:lineRule="auto"/>
       </w:pPr>
       <w:proofErr w:type="spellStart"/>
+      <w:proofErr w:type="gramStart"/>
       <w:r>
         <w:rPr>
           <w:rStyle w:val="CodeHTML"/>
@@ -7589,6 +7846,7 @@
         <w:t>csv.DictWriter</w:t>
       </w:r>
       <w:proofErr w:type="spellEnd"/>
+      <w:proofErr w:type="gramEnd"/>
       <w:r>
         <w:rPr>
           <w:b/>
@@ -7694,6 +7952,7 @@
         <w:spacing w:before="0" w:beforeAutospacing="0" w:line="360" w:lineRule="auto"/>
       </w:pPr>
       <w:proofErr w:type="spellStart"/>
+      <w:proofErr w:type="gramStart"/>
       <w:r>
         <w:rPr>
           <w:rStyle w:val="CodeHTML"/>
@@ -7706,6 +7965,7 @@
         <w:t>csv.DictReader</w:t>
       </w:r>
       <w:proofErr w:type="spellEnd"/>
+      <w:proofErr w:type="gramEnd"/>
       <w:r>
         <w:rPr>
           <w:b/>
@@ -7735,6 +7995,1694 @@
       </w:r>
       <w:r>
         <w:t xml:space="preserve"> Concept permettant de conserver l'état des données d'une application sur un support de stockage permanent (fichier) même après l'arrêt du programme. </w:t>
+      </w:r>
+    </w:p>
+    <w:p>
+      <w:pPr>
+        <w:pStyle w:val="NormalWeb"/>
+        <w:spacing w:before="0" w:beforeAutospacing="0" w:line="360" w:lineRule="auto"/>
+      </w:pPr>
+    </w:p>
+    <w:p>
+      <w:pPr>
+        <w:pStyle w:val="Titre1"/>
+        <w:spacing w:line="360" w:lineRule="auto"/>
+        <w:rPr>
+          <w:rFonts w:ascii="Times New Roman" w:hAnsi="Times New Roman" w:cs="Times New Roman"/>
+          <w:color w:val="auto"/>
+          <w:sz w:val="24"/>
+          <w:szCs w:val="24"/>
+        </w:rPr>
+      </w:pPr>
+      <w:r>
+        <w:rPr>
+          <w:rFonts w:ascii="Times New Roman" w:hAnsi="Times New Roman" w:cs="Times New Roman"/>
+          <w:color w:val="auto"/>
+          <w:sz w:val="24"/>
+          <w:szCs w:val="24"/>
+        </w:rPr>
+        <w:t>Partie 8 — Exceptions</w:t>
+      </w:r>
+    </w:p>
+    <w:p>
+      <w:pPr>
+        <w:pStyle w:val="lev1"/>
+        <w:spacing w:line="360" w:lineRule="auto"/>
+        <w:rPr>
+          <w:rFonts w:ascii="Times New Roman" w:hAnsi="Times New Roman" w:cs="Times New Roman"/>
+          <w:sz w:val="24"/>
+          <w:szCs w:val="24"/>
+        </w:rPr>
+      </w:pPr>
+      <w:r>
+        <w:rPr>
+          <w:rFonts w:ascii="Times New Roman" w:hAnsi="Times New Roman" w:cs="Times New Roman"/>
+          <w:sz w:val="24"/>
+          <w:szCs w:val="24"/>
+        </w:rPr>
+        <w:lastRenderedPageBreak/>
+        <w:t xml:space="preserve">Cette section traite de la robustesse du programme. Elle vise à intercepter les erreurs courantes lors de l'exécution (saisies incorrectes, fichiers manquants ou vides, éléments introuvables) à l'aide des blocs </w:t>
+      </w:r>
+      <w:proofErr w:type="spellStart"/>
+      <w:r>
+        <w:rPr>
+          <w:rStyle w:val="CodeHTML"/>
+          <w:rFonts w:ascii="Times New Roman" w:eastAsia="Calibri" w:hAnsi="Times New Roman" w:cs="Times New Roman"/>
+          <w:sz w:val="24"/>
+          <w:szCs w:val="24"/>
+        </w:rPr>
+        <w:t>try</w:t>
+      </w:r>
+      <w:proofErr w:type="spellEnd"/>
+      <w:r>
+        <w:rPr>
+          <w:rStyle w:val="CodeHTML"/>
+          <w:rFonts w:ascii="Times New Roman" w:eastAsia="Calibri" w:hAnsi="Times New Roman" w:cs="Times New Roman"/>
+          <w:sz w:val="24"/>
+          <w:szCs w:val="24"/>
+        </w:rPr>
+        <w:t xml:space="preserve"> / </w:t>
+      </w:r>
+      <w:proofErr w:type="spellStart"/>
+      <w:r>
+        <w:rPr>
+          <w:rStyle w:val="CodeHTML"/>
+          <w:rFonts w:ascii="Times New Roman" w:eastAsia="Calibri" w:hAnsi="Times New Roman" w:cs="Times New Roman"/>
+          <w:sz w:val="24"/>
+          <w:szCs w:val="24"/>
+        </w:rPr>
+        <w:t>except</w:t>
+      </w:r>
+      <w:proofErr w:type="spellEnd"/>
+      <w:r>
+        <w:rPr>
+          <w:rFonts w:ascii="Times New Roman" w:hAnsi="Times New Roman" w:cs="Times New Roman"/>
+          <w:sz w:val="24"/>
+          <w:szCs w:val="24"/>
+        </w:rPr>
+        <w:t xml:space="preserve"> afin d'éviter tout plantage inopiné.</w:t>
+      </w:r>
+    </w:p>
+    <w:p>
+      <w:pPr>
+        <w:pStyle w:val="lev1"/>
+        <w:spacing w:line="360" w:lineRule="auto"/>
+        <w:rPr>
+          <w:rFonts w:ascii="Times New Roman" w:hAnsi="Times New Roman" w:cs="Times New Roman"/>
+          <w:sz w:val="24"/>
+          <w:szCs w:val="24"/>
+        </w:rPr>
+      </w:pPr>
+    </w:p>
+    <w:tbl>
+      <w:tblPr>
+        <w:tblW w:w="5000" w:type="pct"/>
+        <w:tblBorders>
+          <w:top w:val="single" w:sz="4" w:space="0" w:color="2E5395"/>
+          <w:left w:val="single" w:sz="4" w:space="0" w:color="2E5395"/>
+          <w:bottom w:val="single" w:sz="4" w:space="0" w:color="2E5395"/>
+          <w:right w:val="single" w:sz="4" w:space="0" w:color="2E5395"/>
+          <w:insideH w:val="single" w:sz="4" w:space="0" w:color="auto"/>
+          <w:insideV w:val="single" w:sz="4" w:space="0" w:color="auto"/>
+        </w:tblBorders>
+        <w:shd w:val="clear" w:color="auto" w:fill="FFC000" w:themeFill="accent4"/>
+        <w:tblCellMar>
+          <w:left w:w="10" w:type="dxa"/>
+          <w:right w:w="10" w:type="dxa"/>
+        </w:tblCellMar>
+        <w:tblLook w:val="04A0" w:firstRow="1" w:lastRow="0" w:firstColumn="1" w:lastColumn="0" w:noHBand="0" w:noVBand="1"/>
+      </w:tblPr>
+      <w:tblGrid>
+        <w:gridCol w:w="10480"/>
+      </w:tblGrid>
+      <w:tr>
+        <w:tc>
+          <w:tcPr>
+            <w:tcW w:w="0" w:type="auto"/>
+            <w:tcBorders>
+              <w:top w:val="single" w:sz="4" w:space="0" w:color="2E5395"/>
+              <w:left w:val="single" w:sz="4" w:space="0" w:color="2E5395"/>
+              <w:bottom w:val="single" w:sz="4" w:space="0" w:color="2E5395"/>
+              <w:right w:val="single" w:sz="4" w:space="0" w:color="2E5395"/>
+            </w:tcBorders>
+            <w:shd w:val="clear" w:color="auto" w:fill="FFC000" w:themeFill="accent4"/>
+            <w:tcMar>
+              <w:top w:w="150" w:type="dxa"/>
+              <w:left w:w="200" w:type="dxa"/>
+              <w:bottom w:w="150" w:type="dxa"/>
+              <w:right w:w="200" w:type="dxa"/>
+            </w:tcMar>
+            <w:hideMark/>
+          </w:tcPr>
+          <w:p>
+            <w:pPr>
+              <w:spacing w:line="360" w:lineRule="auto"/>
+              <w:rPr>
+                <w:rFonts w:ascii="Times New Roman" w:hAnsi="Times New Roman" w:cs="Times New Roman"/>
+                <w:sz w:val="24"/>
+                <w:szCs w:val="24"/>
+              </w:rPr>
+            </w:pPr>
+            <w:r>
+              <w:rPr>
+                <w:rFonts w:ascii="Times New Roman" w:hAnsi="Times New Roman" w:cs="Times New Roman"/>
+                <w:b/>
+                <w:bCs/>
+                <w:sz w:val="24"/>
+                <w:szCs w:val="24"/>
+              </w:rPr>
+              <w:t xml:space="preserve">Question 13 — </w:t>
+            </w:r>
+            <w:r>
+              <w:rPr>
+                <w:rFonts w:ascii="Times New Roman" w:hAnsi="Times New Roman" w:cs="Times New Roman"/>
+                <w:i/>
+                <w:iCs/>
+                <w:sz w:val="24"/>
+                <w:szCs w:val="24"/>
+              </w:rPr>
+              <w:t xml:space="preserve">Gérez les erreurs suivantes pour que le programme continue de fonctionner : texte au lieu d'un nombre, fichier inexistant, </w:t>
+            </w:r>
+            <w:proofErr w:type="spellStart"/>
+            <w:r>
+              <w:rPr>
+                <w:rFonts w:ascii="Times New Roman" w:hAnsi="Times New Roman" w:cs="Times New Roman"/>
+                <w:i/>
+                <w:iCs/>
+                <w:sz w:val="24"/>
+                <w:szCs w:val="24"/>
+              </w:rPr>
+              <w:t>dataset</w:t>
+            </w:r>
+            <w:proofErr w:type="spellEnd"/>
+            <w:r>
+              <w:rPr>
+                <w:rFonts w:ascii="Times New Roman" w:hAnsi="Times New Roman" w:cs="Times New Roman"/>
+                <w:i/>
+                <w:iCs/>
+                <w:sz w:val="24"/>
+                <w:szCs w:val="24"/>
+              </w:rPr>
+              <w:t xml:space="preserve"> introuvable, fichier vide.</w:t>
+            </w:r>
+          </w:p>
+        </w:tc>
+      </w:tr>
+    </w:tbl>
+    <w:p>
+      <w:pPr>
+        <w:spacing w:after="150" w:line="360" w:lineRule="auto"/>
+        <w:rPr>
+          <w:rFonts w:ascii="Times New Roman" w:hAnsi="Times New Roman" w:cs="Times New Roman"/>
+          <w:sz w:val="24"/>
+          <w:szCs w:val="24"/>
+        </w:rPr>
+      </w:pPr>
+      <w:r>
+        <w:rPr>
+          <w:rFonts w:ascii="Times New Roman" w:hAnsi="Times New Roman" w:cs="Times New Roman"/>
+          <w:sz w:val="24"/>
+          <w:szCs w:val="24"/>
+        </w:rPr>
+        <w:t xml:space="preserve"> </w:t>
+      </w:r>
+    </w:p>
+    <w:p>
+      <w:pPr>
+        <w:pStyle w:val="NormalWeb"/>
+        <w:spacing w:before="0" w:beforeAutospacing="0" w:line="360" w:lineRule="auto"/>
+      </w:pPr>
+      <w:r>
+        <w:t xml:space="preserve">Pour garantir la continuité de fonctionnement de l'application, plusieurs mécanismes de gestion des exceptions et de vérification des préconditions ont été intégrés : </w:t>
+      </w:r>
+    </w:p>
+    <w:p>
+      <w:pPr>
+        <w:pStyle w:val="NormalWeb"/>
+        <w:numPr>
+          <w:ilvl w:val="0"/>
+          <w:numId w:val="17"/>
+        </w:numPr>
+        <w:spacing w:before="0" w:beforeAutospacing="0" w:line="360" w:lineRule="auto"/>
+      </w:pPr>
+      <w:r>
+        <w:rPr>
+          <w:b/>
+          <w:bCs/>
+        </w:rPr>
+        <w:t>Texte au lieu d'un nombre (</w:t>
+      </w:r>
+      <w:proofErr w:type="spellStart"/>
+      <w:r>
+        <w:rPr>
+          <w:rStyle w:val="CodeHTML"/>
+          <w:rFonts w:ascii="Times New Roman" w:hAnsi="Times New Roman" w:cs="Times New Roman"/>
+          <w:b/>
+          <w:bCs/>
+          <w:sz w:val="24"/>
+          <w:szCs w:val="24"/>
+        </w:rPr>
+        <w:t>ValueError</w:t>
+      </w:r>
+      <w:proofErr w:type="spellEnd"/>
+      <w:r>
+        <w:rPr>
+          <w:b/>
+          <w:bCs/>
+        </w:rPr>
+        <w:t>) :</w:t>
+      </w:r>
+      <w:r>
+        <w:t xml:space="preserve"> Sécurisation des conversions numériques</w:t>
+      </w:r>
+      <w:proofErr w:type="gramStart"/>
+      <w:r>
+        <w:t xml:space="preserve"> </w:t>
+      </w:r>
+      <w:r>
+        <w:t xml:space="preserve">  </w:t>
+      </w:r>
+      <w:r>
+        <w:t>(</w:t>
+      </w:r>
+      <w:proofErr w:type="spellStart"/>
+      <w:proofErr w:type="gramEnd"/>
+      <w:r>
+        <w:rPr>
+          <w:rStyle w:val="CodeHTML"/>
+          <w:rFonts w:ascii="Times New Roman" w:hAnsi="Times New Roman" w:cs="Times New Roman"/>
+          <w:sz w:val="24"/>
+          <w:szCs w:val="24"/>
+        </w:rPr>
+        <w:t>int</w:t>
+      </w:r>
+      <w:proofErr w:type="spellEnd"/>
+      <w:r>
+        <w:rPr>
+          <w:rStyle w:val="CodeHTML"/>
+          <w:rFonts w:ascii="Times New Roman" w:hAnsi="Times New Roman" w:cs="Times New Roman"/>
+          <w:sz w:val="24"/>
+          <w:szCs w:val="24"/>
+        </w:rPr>
+        <w:t>()</w:t>
+      </w:r>
+      <w:r>
+        <w:t xml:space="preserve">, </w:t>
+      </w:r>
+      <w:proofErr w:type="spellStart"/>
+      <w:r>
+        <w:rPr>
+          <w:rStyle w:val="CodeHTML"/>
+          <w:rFonts w:ascii="Times New Roman" w:hAnsi="Times New Roman" w:cs="Times New Roman"/>
+          <w:sz w:val="24"/>
+          <w:szCs w:val="24"/>
+        </w:rPr>
+        <w:t>float</w:t>
+      </w:r>
+      <w:proofErr w:type="spellEnd"/>
+      <w:r>
+        <w:rPr>
+          <w:rStyle w:val="CodeHTML"/>
+          <w:rFonts w:ascii="Times New Roman" w:hAnsi="Times New Roman" w:cs="Times New Roman"/>
+          <w:sz w:val="24"/>
+          <w:szCs w:val="24"/>
+        </w:rPr>
+        <w:t>()</w:t>
+      </w:r>
+      <w:r>
+        <w:t xml:space="preserve">). </w:t>
+      </w:r>
+    </w:p>
+    <w:p>
+      <w:pPr>
+        <w:pStyle w:val="NormalWeb"/>
+        <w:numPr>
+          <w:ilvl w:val="0"/>
+          <w:numId w:val="17"/>
+        </w:numPr>
+        <w:spacing w:before="0" w:beforeAutospacing="0" w:line="360" w:lineRule="auto"/>
+      </w:pPr>
+      <w:r>
+        <w:rPr>
+          <w:b/>
+          <w:bCs/>
+        </w:rPr>
+        <w:t>Fichier inexistant (</w:t>
+      </w:r>
+      <w:proofErr w:type="spellStart"/>
+      <w:r>
+        <w:rPr>
+          <w:rStyle w:val="CodeHTML"/>
+          <w:rFonts w:ascii="Times New Roman" w:hAnsi="Times New Roman" w:cs="Times New Roman"/>
+          <w:b/>
+          <w:bCs/>
+          <w:sz w:val="24"/>
+          <w:szCs w:val="24"/>
+        </w:rPr>
+        <w:t>FileNotFoundError</w:t>
+      </w:r>
+      <w:proofErr w:type="spellEnd"/>
+      <w:r>
+        <w:rPr>
+          <w:b/>
+          <w:bCs/>
+        </w:rPr>
+        <w:t>) :</w:t>
+      </w:r>
+      <w:r>
+        <w:t xml:space="preserve"> Interception de l'absence du fichier </w:t>
+      </w:r>
+      <w:r>
+        <w:rPr>
+          <w:rStyle w:val="CodeHTML"/>
+          <w:rFonts w:ascii="Times New Roman" w:hAnsi="Times New Roman" w:cs="Times New Roman"/>
+          <w:sz w:val="24"/>
+          <w:szCs w:val="24"/>
+        </w:rPr>
+        <w:t>datasets.csv</w:t>
+      </w:r>
+      <w:r>
+        <w:t xml:space="preserve"> lors de la lecture. </w:t>
+      </w:r>
+    </w:p>
+    <w:p>
+      <w:pPr>
+        <w:pStyle w:val="NormalWeb"/>
+        <w:numPr>
+          <w:ilvl w:val="0"/>
+          <w:numId w:val="17"/>
+        </w:numPr>
+        <w:spacing w:before="0" w:beforeAutospacing="0" w:line="360" w:lineRule="auto"/>
+      </w:pPr>
+      <w:r>
+        <w:rPr>
+          <w:b/>
+          <w:bCs/>
+        </w:rPr>
+        <w:t>Fichier vide (</w:t>
+      </w:r>
+      <w:proofErr w:type="spellStart"/>
+      <w:r>
+        <w:rPr>
+          <w:rStyle w:val="CodeHTML"/>
+          <w:rFonts w:ascii="Times New Roman" w:hAnsi="Times New Roman" w:cs="Times New Roman"/>
+          <w:b/>
+          <w:bCs/>
+          <w:sz w:val="24"/>
+          <w:szCs w:val="24"/>
+        </w:rPr>
+        <w:t>EmptyDataError</w:t>
+      </w:r>
+      <w:proofErr w:type="spellEnd"/>
+      <w:r>
+        <w:rPr>
+          <w:b/>
+          <w:bCs/>
+        </w:rPr>
+        <w:t xml:space="preserve"> ou vérification de contenu) :</w:t>
+      </w:r>
+      <w:r>
+        <w:t xml:space="preserve"> Prise en compte du cas où le fichier à recharger ne contient aucune donnée. </w:t>
+      </w:r>
+    </w:p>
+    <w:p>
+      <w:pPr>
+        <w:pStyle w:val="NormalWeb"/>
+        <w:numPr>
+          <w:ilvl w:val="0"/>
+          <w:numId w:val="17"/>
+        </w:numPr>
+        <w:spacing w:before="0" w:beforeAutospacing="0" w:line="360" w:lineRule="auto"/>
+      </w:pPr>
+      <w:proofErr w:type="spellStart"/>
+      <w:r>
+        <w:rPr>
+          <w:b/>
+          <w:bCs/>
+        </w:rPr>
+        <w:t>Dataset</w:t>
+      </w:r>
+      <w:proofErr w:type="spellEnd"/>
+      <w:r>
+        <w:rPr>
+          <w:b/>
+          <w:bCs/>
+        </w:rPr>
+        <w:t xml:space="preserve"> ou attribut introuvable :</w:t>
+      </w:r>
+      <w:r>
+        <w:t xml:space="preserve"> Traitement explicite lorsque la recherche, la modification ou la suppression cible un élément absent du catalogue. </w:t>
+      </w:r>
+    </w:p>
+    <w:p>
+      <w:pPr>
+        <w:spacing w:after="150" w:line="360" w:lineRule="auto"/>
+        <w:rPr>
+          <w:rFonts w:ascii="Times New Roman" w:hAnsi="Times New Roman" w:cs="Times New Roman"/>
+          <w:sz w:val="24"/>
+          <w:szCs w:val="24"/>
+        </w:rPr>
+      </w:pPr>
+    </w:p>
+    <w:p>
+      <w:pPr>
+        <w:spacing w:before="150" w:after="80" w:line="360" w:lineRule="auto"/>
+        <w:rPr>
+          <w:rFonts w:ascii="Times New Roman" w:hAnsi="Times New Roman" w:cs="Times New Roman"/>
+          <w:b/>
+          <w:bCs/>
+          <w:sz w:val="24"/>
+          <w:szCs w:val="24"/>
+        </w:rPr>
+      </w:pPr>
+      <w:r>
+        <w:rPr>
+          <w:rFonts w:ascii="Times New Roman" w:hAnsi="Times New Roman" w:cs="Times New Roman"/>
+          <w:b/>
+          <w:bCs/>
+          <w:sz w:val="24"/>
+          <w:szCs w:val="24"/>
+        </w:rPr>
+        <w:t>Code (main.py) :</w:t>
+      </w:r>
+    </w:p>
+    <w:p>
+      <w:pPr>
+        <w:pStyle w:val="Paragraphedeliste"/>
+        <w:numPr>
+          <w:ilvl w:val="0"/>
+          <w:numId w:val="15"/>
+        </w:numPr>
+        <w:spacing w:before="150" w:after="80" w:line="360" w:lineRule="auto"/>
+        <w:rPr>
+          <w:rFonts w:ascii="Times New Roman" w:hAnsi="Times New Roman" w:cs="Times New Roman"/>
+          <w:b/>
+          <w:bCs/>
+          <w:sz w:val="24"/>
+          <w:szCs w:val="24"/>
+        </w:rPr>
+      </w:pPr>
+      <w:r>
+        <w:rPr>
+          <w:rFonts w:ascii="Times New Roman" w:hAnsi="Times New Roman" w:cs="Times New Roman"/>
+          <w:b/>
+          <w:bCs/>
+          <w:sz w:val="24"/>
+          <w:szCs w:val="24"/>
+        </w:rPr>
+        <w:t>Contrôle saisi</w:t>
+      </w:r>
+    </w:p>
+    <w:p>
+      <w:pPr>
+        <w:spacing w:before="150" w:after="80" w:line="360" w:lineRule="auto"/>
+        <w:rPr>
+          <w:rFonts w:ascii="Times New Roman" w:hAnsi="Times New Roman" w:cs="Times New Roman"/>
+          <w:b/>
+          <w:bCs/>
+          <w:sz w:val="24"/>
+          <w:szCs w:val="24"/>
+        </w:rPr>
+      </w:pPr>
+      <w:r>
+        <w:rPr>
+          <w:rFonts w:ascii="Times New Roman" w:hAnsi="Times New Roman" w:cs="Times New Roman"/>
+          <w:b/>
+          <w:bCs/>
+          <w:sz w:val="24"/>
+          <w:szCs w:val="24"/>
+        </w:rPr>
+        <w:drawing>
+          <wp:inline distT="0" distB="0" distL="0" distR="0" wp14:anchorId="6BD45800" wp14:editId="11B908B7">
+            <wp:extent cx="6400800" cy="2145030"/>
+            <wp:effectExtent l="0" t="0" r="0" b="0"/>
+            <wp:docPr id="382314517" name="Image 26"/>
+            <wp:cNvGraphicFramePr>
+              <a:graphicFrameLocks xmlns:a="http://schemas.openxmlformats.org/drawingml/2006/main" noChangeAspect="1"/>
+            </wp:cNvGraphicFramePr>
+            <a:graphic xmlns:a="http://schemas.openxmlformats.org/drawingml/2006/main">
+              <a:graphicData uri="http://schemas.openxmlformats.org/drawingml/2006/picture">
+                <pic:pic xmlns:pic="http://schemas.openxmlformats.org/drawingml/2006/picture">
+                  <pic:nvPicPr>
+                    <pic:cNvPr id="382314517" name=""/>
+                    <pic:cNvPicPr/>
+                  </pic:nvPicPr>
+                  <pic:blipFill>
+                    <a:blip r:embed="rId30"/>
+                    <a:stretch>
+                      <a:fillRect/>
+                    </a:stretch>
+                  </pic:blipFill>
+                  <pic:spPr>
+                    <a:xfrm>
+                      <a:off x="0" y="0"/>
+                      <a:ext cx="6400800" cy="2145030"/>
+                    </a:xfrm>
+                    <a:prstGeom prst="rect">
+                      <a:avLst/>
+                    </a:prstGeom>
+                  </pic:spPr>
+                </pic:pic>
+              </a:graphicData>
+            </a:graphic>
+          </wp:inline>
+        </w:drawing>
+      </w:r>
+    </w:p>
+    <w:p>
+      <w:pPr>
+        <w:spacing w:before="150" w:after="80" w:line="360" w:lineRule="auto"/>
+        <w:rPr>
+          <w:rFonts w:ascii="Times New Roman" w:hAnsi="Times New Roman" w:cs="Times New Roman"/>
+          <w:b/>
+          <w:bCs/>
+          <w:sz w:val="24"/>
+          <w:szCs w:val="24"/>
+        </w:rPr>
+      </w:pPr>
+      <w:r>
+        <w:rPr>
+          <w:rFonts w:ascii="Times New Roman" w:hAnsi="Times New Roman" w:cs="Times New Roman"/>
+          <w:sz w:val="24"/>
+          <w:szCs w:val="24"/>
+        </w:rPr>
+        <w:lastRenderedPageBreak/>
+        <w:t xml:space="preserve">Le bloc </w:t>
+      </w:r>
+      <w:proofErr w:type="spellStart"/>
+      <w:r>
+        <w:rPr>
+          <w:rStyle w:val="CodeHTML"/>
+          <w:rFonts w:ascii="Times New Roman" w:eastAsia="Calibri" w:hAnsi="Times New Roman" w:cs="Times New Roman"/>
+          <w:sz w:val="24"/>
+          <w:szCs w:val="24"/>
+        </w:rPr>
+        <w:t>try</w:t>
+      </w:r>
+      <w:proofErr w:type="spellEnd"/>
+      <w:r>
+        <w:rPr>
+          <w:rStyle w:val="CodeHTML"/>
+          <w:rFonts w:ascii="Times New Roman" w:eastAsia="Calibri" w:hAnsi="Times New Roman" w:cs="Times New Roman"/>
+          <w:sz w:val="24"/>
+          <w:szCs w:val="24"/>
+        </w:rPr>
+        <w:t>...</w:t>
+      </w:r>
+      <w:proofErr w:type="spellStart"/>
+      <w:r>
+        <w:rPr>
+          <w:rStyle w:val="CodeHTML"/>
+          <w:rFonts w:ascii="Times New Roman" w:eastAsia="Calibri" w:hAnsi="Times New Roman" w:cs="Times New Roman"/>
+          <w:sz w:val="24"/>
+          <w:szCs w:val="24"/>
+        </w:rPr>
+        <w:t>except</w:t>
+      </w:r>
+      <w:proofErr w:type="spellEnd"/>
+      <w:r>
+        <w:rPr>
+          <w:rStyle w:val="CodeHTML"/>
+          <w:rFonts w:ascii="Times New Roman" w:eastAsia="Calibri" w:hAnsi="Times New Roman" w:cs="Times New Roman"/>
+          <w:sz w:val="24"/>
+          <w:szCs w:val="24"/>
+        </w:rPr>
+        <w:t xml:space="preserve"> </w:t>
+      </w:r>
+      <w:proofErr w:type="spellStart"/>
+      <w:r>
+        <w:rPr>
+          <w:rStyle w:val="CodeHTML"/>
+          <w:rFonts w:ascii="Times New Roman" w:eastAsia="Calibri" w:hAnsi="Times New Roman" w:cs="Times New Roman"/>
+          <w:sz w:val="24"/>
+          <w:szCs w:val="24"/>
+        </w:rPr>
+        <w:t>ValueError</w:t>
+      </w:r>
+      <w:proofErr w:type="spellEnd"/>
+      <w:r>
+        <w:rPr>
+          <w:rFonts w:ascii="Times New Roman" w:hAnsi="Times New Roman" w:cs="Times New Roman"/>
+          <w:sz w:val="24"/>
+          <w:szCs w:val="24"/>
+        </w:rPr>
+        <w:t xml:space="preserve"> empêche l'application de s'arrêter brutalement si l'utilisateur saisit des lettres à la place d'un entier ou d'un flottant.</w:t>
+      </w:r>
+    </w:p>
+    <w:p>
+      <w:pPr>
+        <w:pStyle w:val="Paragraphedeliste"/>
+        <w:numPr>
+          <w:ilvl w:val="0"/>
+          <w:numId w:val="15"/>
+        </w:numPr>
+        <w:spacing w:before="150" w:after="80" w:line="360" w:lineRule="auto"/>
+        <w:rPr>
+          <w:rFonts w:ascii="Times New Roman" w:hAnsi="Times New Roman" w:cs="Times New Roman"/>
+          <w:b/>
+          <w:bCs/>
+          <w:sz w:val="24"/>
+          <w:szCs w:val="24"/>
+        </w:rPr>
+      </w:pPr>
+      <w:r>
+        <w:rPr>
+          <w:rFonts w:ascii="Times New Roman" w:hAnsi="Times New Roman" w:cs="Times New Roman"/>
+          <w:b/>
+          <w:bCs/>
+          <w:sz w:val="24"/>
+          <w:szCs w:val="24"/>
+        </w:rPr>
+        <w:t>Contrôle fichier</w:t>
+      </w:r>
+    </w:p>
+    <w:p>
+      <w:pPr>
+        <w:spacing w:before="150" w:after="80" w:line="360" w:lineRule="auto"/>
+        <w:rPr>
+          <w:rFonts w:ascii="Times New Roman" w:hAnsi="Times New Roman" w:cs="Times New Roman"/>
+          <w:b/>
+          <w:bCs/>
+          <w:sz w:val="24"/>
+          <w:szCs w:val="24"/>
+        </w:rPr>
+      </w:pPr>
+      <w:r>
+        <w:rPr>
+          <w:rFonts w:ascii="Times New Roman" w:hAnsi="Times New Roman" w:cs="Times New Roman"/>
+          <w:b/>
+          <w:bCs/>
+          <w:sz w:val="24"/>
+          <w:szCs w:val="24"/>
+        </w:rPr>
+        <w:drawing>
+          <wp:inline distT="0" distB="0" distL="0" distR="0" wp14:anchorId="17A96393" wp14:editId="69885B2B">
+            <wp:extent cx="6400800" cy="2505710"/>
+            <wp:effectExtent l="0" t="0" r="0" b="0"/>
+            <wp:docPr id="1509070301" name="Image 27"/>
+            <wp:cNvGraphicFramePr>
+              <a:graphicFrameLocks xmlns:a="http://schemas.openxmlformats.org/drawingml/2006/main" noChangeAspect="1"/>
+            </wp:cNvGraphicFramePr>
+            <a:graphic xmlns:a="http://schemas.openxmlformats.org/drawingml/2006/main">
+              <a:graphicData uri="http://schemas.openxmlformats.org/drawingml/2006/picture">
+                <pic:pic xmlns:pic="http://schemas.openxmlformats.org/drawingml/2006/picture">
+                  <pic:nvPicPr>
+                    <pic:cNvPr id="1509070301" name=""/>
+                    <pic:cNvPicPr/>
+                  </pic:nvPicPr>
+                  <pic:blipFill>
+                    <a:blip r:embed="rId31"/>
+                    <a:stretch>
+                      <a:fillRect/>
+                    </a:stretch>
+                  </pic:blipFill>
+                  <pic:spPr>
+                    <a:xfrm>
+                      <a:off x="0" y="0"/>
+                      <a:ext cx="6400800" cy="2505710"/>
+                    </a:xfrm>
+                    <a:prstGeom prst="rect">
+                      <a:avLst/>
+                    </a:prstGeom>
+                  </pic:spPr>
+                </pic:pic>
+              </a:graphicData>
+            </a:graphic>
+          </wp:inline>
+        </w:drawing>
+      </w:r>
+    </w:p>
+    <w:p>
+      <w:pPr>
+        <w:spacing w:before="150" w:after="80" w:line="360" w:lineRule="auto"/>
+        <w:rPr>
+          <w:rFonts w:ascii="Times New Roman" w:hAnsi="Times New Roman" w:cs="Times New Roman"/>
+          <w:b/>
+          <w:bCs/>
+          <w:sz w:val="24"/>
+          <w:szCs w:val="24"/>
+        </w:rPr>
+      </w:pPr>
+      <w:r>
+        <w:rPr>
+          <w:rFonts w:ascii="Times New Roman" w:hAnsi="Times New Roman" w:cs="Times New Roman"/>
+          <w:sz w:val="24"/>
+          <w:szCs w:val="24"/>
+        </w:rPr>
+        <w:t xml:space="preserve">Si le fichier n'a pas encore été généré via l'option 8, la tentative de lecture intercepte </w:t>
+      </w:r>
+      <w:proofErr w:type="spellStart"/>
+      <w:r>
+        <w:rPr>
+          <w:rStyle w:val="CodeHTML"/>
+          <w:rFonts w:ascii="Times New Roman" w:eastAsia="Calibri" w:hAnsi="Times New Roman" w:cs="Times New Roman"/>
+          <w:sz w:val="24"/>
+          <w:szCs w:val="24"/>
+        </w:rPr>
+        <w:t>FileNotFoundError</w:t>
+      </w:r>
+      <w:proofErr w:type="spellEnd"/>
+      <w:r>
+        <w:rPr>
+          <w:rFonts w:ascii="Times New Roman" w:hAnsi="Times New Roman" w:cs="Times New Roman"/>
+          <w:sz w:val="24"/>
+          <w:szCs w:val="24"/>
+        </w:rPr>
+        <w:t xml:space="preserve"> et informe l'utilisateur sans faire crasher l'application.</w:t>
+      </w:r>
+    </w:p>
+    <w:p>
+      <w:pPr>
+        <w:pStyle w:val="Paragraphedeliste"/>
+        <w:numPr>
+          <w:ilvl w:val="0"/>
+          <w:numId w:val="15"/>
+        </w:numPr>
+        <w:spacing w:before="150" w:after="80" w:line="360" w:lineRule="auto"/>
+        <w:rPr>
+          <w:rFonts w:ascii="Times New Roman" w:hAnsi="Times New Roman" w:cs="Times New Roman"/>
+          <w:b/>
+          <w:bCs/>
+          <w:sz w:val="24"/>
+          <w:szCs w:val="24"/>
+        </w:rPr>
+      </w:pPr>
+      <w:r>
+        <w:rPr>
+          <w:rFonts w:ascii="Times New Roman" w:hAnsi="Times New Roman" w:cs="Times New Roman"/>
+          <w:b/>
+          <w:bCs/>
+          <w:sz w:val="24"/>
+          <w:szCs w:val="24"/>
+        </w:rPr>
+        <w:t>Contrôle de suppression</w:t>
+      </w:r>
+    </w:p>
+    <w:p>
+      <w:pPr>
+        <w:spacing w:before="150" w:after="80" w:line="360" w:lineRule="auto"/>
+        <w:rPr>
+          <w:rFonts w:ascii="Times New Roman" w:hAnsi="Times New Roman" w:cs="Times New Roman"/>
+          <w:b/>
+          <w:bCs/>
+          <w:sz w:val="24"/>
+          <w:szCs w:val="24"/>
+        </w:rPr>
+      </w:pPr>
+      <w:r>
+        <w:rPr>
+          <w:rFonts w:ascii="Times New Roman" w:hAnsi="Times New Roman" w:cs="Times New Roman"/>
+          <w:b/>
+          <w:bCs/>
+          <w:sz w:val="24"/>
+          <w:szCs w:val="24"/>
+        </w:rPr>
+        <w:drawing>
+          <wp:inline distT="0" distB="0" distL="0" distR="0" wp14:anchorId="7C989046" wp14:editId="637FFFE9">
+            <wp:extent cx="6400800" cy="1671955"/>
+            <wp:effectExtent l="0" t="0" r="0" b="0"/>
+            <wp:docPr id="723025879" name="Image 28"/>
+            <wp:cNvGraphicFramePr>
+              <a:graphicFrameLocks xmlns:a="http://schemas.openxmlformats.org/drawingml/2006/main" noChangeAspect="1"/>
+            </wp:cNvGraphicFramePr>
+            <a:graphic xmlns:a="http://schemas.openxmlformats.org/drawingml/2006/main">
+              <a:graphicData uri="http://schemas.openxmlformats.org/drawingml/2006/picture">
+                <pic:pic xmlns:pic="http://schemas.openxmlformats.org/drawingml/2006/picture">
+                  <pic:nvPicPr>
+                    <pic:cNvPr id="723025879" name=""/>
+                    <pic:cNvPicPr/>
+                  </pic:nvPicPr>
+                  <pic:blipFill>
+                    <a:blip r:embed="rId32"/>
+                    <a:stretch>
+                      <a:fillRect/>
+                    </a:stretch>
+                  </pic:blipFill>
+                  <pic:spPr>
+                    <a:xfrm>
+                      <a:off x="0" y="0"/>
+                      <a:ext cx="6400800" cy="1671955"/>
+                    </a:xfrm>
+                    <a:prstGeom prst="rect">
+                      <a:avLst/>
+                    </a:prstGeom>
+                  </pic:spPr>
+                </pic:pic>
+              </a:graphicData>
+            </a:graphic>
+          </wp:inline>
+        </w:drawing>
+      </w:r>
+    </w:p>
+    <w:p>
+      <w:pPr>
+        <w:spacing w:before="150" w:after="80" w:line="360" w:lineRule="auto"/>
+        <w:rPr>
+          <w:rFonts w:ascii="Times New Roman" w:hAnsi="Times New Roman" w:cs="Times New Roman"/>
+          <w:b/>
+          <w:bCs/>
+          <w:sz w:val="24"/>
+          <w:szCs w:val="24"/>
+        </w:rPr>
+      </w:pPr>
+      <w:r>
+        <w:rPr>
+          <w:rFonts w:ascii="Times New Roman" w:hAnsi="Times New Roman" w:cs="Times New Roman"/>
+          <w:sz w:val="24"/>
+          <w:szCs w:val="24"/>
+        </w:rPr>
+        <w:t xml:space="preserve">Une condition vérifie la présence effective du </w:t>
+      </w:r>
+      <w:proofErr w:type="spellStart"/>
+      <w:r>
+        <w:rPr>
+          <w:rFonts w:ascii="Times New Roman" w:hAnsi="Times New Roman" w:cs="Times New Roman"/>
+          <w:sz w:val="24"/>
+          <w:szCs w:val="24"/>
+        </w:rPr>
+        <w:t>dataset</w:t>
+      </w:r>
+      <w:proofErr w:type="spellEnd"/>
+      <w:r>
+        <w:rPr>
+          <w:rFonts w:ascii="Times New Roman" w:hAnsi="Times New Roman" w:cs="Times New Roman"/>
+          <w:sz w:val="24"/>
+          <w:szCs w:val="24"/>
+        </w:rPr>
+        <w:t xml:space="preserve"> avant de tenter le retrait </w:t>
+      </w:r>
+      <w:proofErr w:type="gramStart"/>
+      <w:r>
+        <w:rPr>
+          <w:rFonts w:ascii="Times New Roman" w:hAnsi="Times New Roman" w:cs="Times New Roman"/>
+          <w:sz w:val="24"/>
+          <w:szCs w:val="24"/>
+        </w:rPr>
+        <w:t>(</w:t>
+      </w:r>
+      <w:r>
+        <w:rPr>
+          <w:rStyle w:val="CodeHTML"/>
+          <w:rFonts w:ascii="Times New Roman" w:eastAsia="Calibri" w:hAnsi="Times New Roman" w:cs="Times New Roman"/>
+          <w:sz w:val="24"/>
+          <w:szCs w:val="24"/>
+        </w:rPr>
+        <w:t>.</w:t>
+      </w:r>
+      <w:proofErr w:type="spellStart"/>
+      <w:r>
+        <w:rPr>
+          <w:rStyle w:val="CodeHTML"/>
+          <w:rFonts w:ascii="Times New Roman" w:eastAsia="Calibri" w:hAnsi="Times New Roman" w:cs="Times New Roman"/>
+          <w:sz w:val="24"/>
+          <w:szCs w:val="24"/>
+        </w:rPr>
+        <w:t>remove</w:t>
+      </w:r>
+      <w:proofErr w:type="spellEnd"/>
+      <w:proofErr w:type="gramEnd"/>
+      <w:r>
+        <w:rPr>
+          <w:rStyle w:val="CodeHTML"/>
+          <w:rFonts w:ascii="Times New Roman" w:eastAsia="Calibri" w:hAnsi="Times New Roman" w:cs="Times New Roman"/>
+          <w:sz w:val="24"/>
+          <w:szCs w:val="24"/>
+        </w:rPr>
+        <w:t>()</w:t>
+      </w:r>
+      <w:r>
+        <w:rPr>
+          <w:rFonts w:ascii="Times New Roman" w:hAnsi="Times New Roman" w:cs="Times New Roman"/>
+          <w:sz w:val="24"/>
+          <w:szCs w:val="24"/>
+        </w:rPr>
+        <w:t>), évitant ainsi des erreurs à l'exécution.</w:t>
+      </w:r>
+    </w:p>
+    <w:p>
+      <w:pPr>
+        <w:pStyle w:val="Paragraphedeliste"/>
+        <w:numPr>
+          <w:ilvl w:val="0"/>
+          <w:numId w:val="15"/>
+        </w:numPr>
+        <w:spacing w:before="150" w:after="80" w:line="360" w:lineRule="auto"/>
+        <w:rPr>
+          <w:rFonts w:ascii="Times New Roman" w:hAnsi="Times New Roman" w:cs="Times New Roman"/>
+          <w:b/>
+          <w:bCs/>
+          <w:sz w:val="24"/>
+          <w:szCs w:val="24"/>
+        </w:rPr>
+      </w:pPr>
+      <w:r>
+        <w:rPr>
+          <w:rFonts w:ascii="Times New Roman" w:hAnsi="Times New Roman" w:cs="Times New Roman"/>
+          <w:b/>
+          <w:bCs/>
+          <w:sz w:val="24"/>
+          <w:szCs w:val="24"/>
+        </w:rPr>
+        <w:t xml:space="preserve">Contrôle recherche </w:t>
+      </w:r>
+      <w:proofErr w:type="spellStart"/>
+      <w:r>
+        <w:rPr>
+          <w:rFonts w:ascii="Times New Roman" w:hAnsi="Times New Roman" w:cs="Times New Roman"/>
+          <w:b/>
+          <w:bCs/>
+          <w:sz w:val="24"/>
+          <w:szCs w:val="24"/>
+        </w:rPr>
+        <w:t>datasets</w:t>
+      </w:r>
+      <w:proofErr w:type="spellEnd"/>
+    </w:p>
+    <w:p>
+      <w:pPr>
+        <w:spacing w:before="150" w:after="80" w:line="360" w:lineRule="auto"/>
+        <w:rPr>
+          <w:rFonts w:ascii="Times New Roman" w:hAnsi="Times New Roman" w:cs="Times New Roman"/>
+          <w:b/>
+          <w:bCs/>
+          <w:sz w:val="24"/>
+          <w:szCs w:val="24"/>
+        </w:rPr>
+      </w:pPr>
+      <w:r>
+        <w:rPr>
+          <w:rFonts w:ascii="Times New Roman" w:hAnsi="Times New Roman" w:cs="Times New Roman"/>
+          <w:b/>
+          <w:bCs/>
+          <w:sz w:val="24"/>
+          <w:szCs w:val="24"/>
+        </w:rPr>
+        <w:lastRenderedPageBreak/>
+        <w:drawing>
+          <wp:inline distT="0" distB="0" distL="0" distR="0" wp14:anchorId="48EBCA3A" wp14:editId="5D7D9E6F">
+            <wp:extent cx="6400800" cy="1513205"/>
+            <wp:effectExtent l="0" t="0" r="0" b="0"/>
+            <wp:docPr id="1599555474" name="Image 29"/>
+            <wp:cNvGraphicFramePr>
+              <a:graphicFrameLocks xmlns:a="http://schemas.openxmlformats.org/drawingml/2006/main" noChangeAspect="1"/>
+            </wp:cNvGraphicFramePr>
+            <a:graphic xmlns:a="http://schemas.openxmlformats.org/drawingml/2006/main">
+              <a:graphicData uri="http://schemas.openxmlformats.org/drawingml/2006/picture">
+                <pic:pic xmlns:pic="http://schemas.openxmlformats.org/drawingml/2006/picture">
+                  <pic:nvPicPr>
+                    <pic:cNvPr id="1599555474" name=""/>
+                    <pic:cNvPicPr/>
+                  </pic:nvPicPr>
+                  <pic:blipFill>
+                    <a:blip r:embed="rId33"/>
+                    <a:stretch>
+                      <a:fillRect/>
+                    </a:stretch>
+                  </pic:blipFill>
+                  <pic:spPr>
+                    <a:xfrm>
+                      <a:off x="0" y="0"/>
+                      <a:ext cx="6400800" cy="1513205"/>
+                    </a:xfrm>
+                    <a:prstGeom prst="rect">
+                      <a:avLst/>
+                    </a:prstGeom>
+                  </pic:spPr>
+                </pic:pic>
+              </a:graphicData>
+            </a:graphic>
+          </wp:inline>
+        </w:drawing>
+      </w:r>
+    </w:p>
+    <w:p>
+      <w:pPr>
+        <w:spacing w:before="150" w:after="80" w:line="360" w:lineRule="auto"/>
+        <w:rPr>
+          <w:rFonts w:ascii="Times New Roman" w:hAnsi="Times New Roman" w:cs="Times New Roman"/>
+          <w:b/>
+          <w:bCs/>
+          <w:sz w:val="24"/>
+          <w:szCs w:val="24"/>
+        </w:rPr>
+      </w:pPr>
+      <w:r>
+        <w:rPr>
+          <w:rFonts w:ascii="Times New Roman" w:hAnsi="Times New Roman" w:cs="Times New Roman"/>
+          <w:sz w:val="24"/>
+          <w:szCs w:val="24"/>
+        </w:rPr>
+        <w:t xml:space="preserve">Une condition vérifie la présence effective du </w:t>
+      </w:r>
+      <w:proofErr w:type="spellStart"/>
+      <w:r>
+        <w:rPr>
+          <w:rFonts w:ascii="Times New Roman" w:hAnsi="Times New Roman" w:cs="Times New Roman"/>
+          <w:sz w:val="24"/>
+          <w:szCs w:val="24"/>
+        </w:rPr>
+        <w:t>dataset</w:t>
+      </w:r>
+      <w:proofErr w:type="spellEnd"/>
+      <w:r>
+        <w:rPr>
+          <w:rFonts w:ascii="Times New Roman" w:hAnsi="Times New Roman" w:cs="Times New Roman"/>
+          <w:sz w:val="24"/>
+          <w:szCs w:val="24"/>
+        </w:rPr>
+        <w:t xml:space="preserve"> avant de tenter le retrait </w:t>
+      </w:r>
+      <w:proofErr w:type="gramStart"/>
+      <w:r>
+        <w:rPr>
+          <w:rFonts w:ascii="Times New Roman" w:hAnsi="Times New Roman" w:cs="Times New Roman"/>
+          <w:sz w:val="24"/>
+          <w:szCs w:val="24"/>
+        </w:rPr>
+        <w:t>(</w:t>
+      </w:r>
+      <w:r>
+        <w:rPr>
+          <w:rStyle w:val="CodeHTML"/>
+          <w:rFonts w:ascii="Times New Roman" w:eastAsia="Calibri" w:hAnsi="Times New Roman" w:cs="Times New Roman"/>
+          <w:sz w:val="24"/>
+          <w:szCs w:val="24"/>
+        </w:rPr>
+        <w:t>.</w:t>
+      </w:r>
+      <w:proofErr w:type="spellStart"/>
+      <w:r>
+        <w:rPr>
+          <w:rStyle w:val="CodeHTML"/>
+          <w:rFonts w:ascii="Times New Roman" w:eastAsia="Calibri" w:hAnsi="Times New Roman" w:cs="Times New Roman"/>
+          <w:sz w:val="24"/>
+          <w:szCs w:val="24"/>
+        </w:rPr>
+        <w:t>remove</w:t>
+      </w:r>
+      <w:proofErr w:type="spellEnd"/>
+      <w:proofErr w:type="gramEnd"/>
+      <w:r>
+        <w:rPr>
+          <w:rStyle w:val="CodeHTML"/>
+          <w:rFonts w:ascii="Times New Roman" w:eastAsia="Calibri" w:hAnsi="Times New Roman" w:cs="Times New Roman"/>
+          <w:sz w:val="24"/>
+          <w:szCs w:val="24"/>
+        </w:rPr>
+        <w:t>()</w:t>
+      </w:r>
+      <w:r>
+        <w:rPr>
+          <w:rFonts w:ascii="Times New Roman" w:hAnsi="Times New Roman" w:cs="Times New Roman"/>
+          <w:sz w:val="24"/>
+          <w:szCs w:val="24"/>
+        </w:rPr>
+        <w:t>), évitant ainsi des erreurs à l'exécution.</w:t>
+      </w:r>
+    </w:p>
+    <w:p>
+      <w:pPr>
+        <w:pStyle w:val="Paragraphedeliste"/>
+        <w:numPr>
+          <w:ilvl w:val="0"/>
+          <w:numId w:val="15"/>
+        </w:numPr>
+        <w:spacing w:before="150" w:after="80" w:line="360" w:lineRule="auto"/>
+        <w:rPr>
+          <w:rFonts w:ascii="Times New Roman" w:hAnsi="Times New Roman" w:cs="Times New Roman"/>
+          <w:b/>
+          <w:bCs/>
+          <w:sz w:val="24"/>
+          <w:szCs w:val="24"/>
+        </w:rPr>
+      </w:pPr>
+      <w:r>
+        <w:rPr>
+          <w:rFonts w:ascii="Times New Roman" w:hAnsi="Times New Roman" w:cs="Times New Roman"/>
+          <w:b/>
+          <w:bCs/>
+          <w:sz w:val="24"/>
+          <w:szCs w:val="24"/>
+        </w:rPr>
+        <w:t>Contrôle de modification</w:t>
+      </w:r>
+    </w:p>
+    <w:p>
+      <w:pPr>
+        <w:spacing w:before="150" w:after="80" w:line="360" w:lineRule="auto"/>
+        <w:rPr>
+          <w:rFonts w:ascii="Times New Roman" w:hAnsi="Times New Roman" w:cs="Times New Roman"/>
+          <w:b/>
+          <w:bCs/>
+          <w:sz w:val="24"/>
+          <w:szCs w:val="24"/>
+        </w:rPr>
+      </w:pPr>
+      <w:r>
+        <w:rPr>
+          <w:rFonts w:ascii="Times New Roman" w:hAnsi="Times New Roman" w:cs="Times New Roman"/>
+          <w:b/>
+          <w:bCs/>
+          <w:sz w:val="24"/>
+          <w:szCs w:val="24"/>
+        </w:rPr>
+        <w:drawing>
+          <wp:inline distT="0" distB="0" distL="0" distR="0" wp14:anchorId="3685BA88" wp14:editId="18FAB905">
+            <wp:extent cx="6400800" cy="2451735"/>
+            <wp:effectExtent l="0" t="0" r="0" b="0"/>
+            <wp:docPr id="1324562451" name="Image 30"/>
+            <wp:cNvGraphicFramePr>
+              <a:graphicFrameLocks xmlns:a="http://schemas.openxmlformats.org/drawingml/2006/main" noChangeAspect="1"/>
+            </wp:cNvGraphicFramePr>
+            <a:graphic xmlns:a="http://schemas.openxmlformats.org/drawingml/2006/main">
+              <a:graphicData uri="http://schemas.openxmlformats.org/drawingml/2006/picture">
+                <pic:pic xmlns:pic="http://schemas.openxmlformats.org/drawingml/2006/picture">
+                  <pic:nvPicPr>
+                    <pic:cNvPr id="1324562451" name=""/>
+                    <pic:cNvPicPr/>
+                  </pic:nvPicPr>
+                  <pic:blipFill>
+                    <a:blip r:embed="rId34"/>
+                    <a:stretch>
+                      <a:fillRect/>
+                    </a:stretch>
+                  </pic:blipFill>
+                  <pic:spPr>
+                    <a:xfrm>
+                      <a:off x="0" y="0"/>
+                      <a:ext cx="6400800" cy="2451735"/>
+                    </a:xfrm>
+                    <a:prstGeom prst="rect">
+                      <a:avLst/>
+                    </a:prstGeom>
+                  </pic:spPr>
+                </pic:pic>
+              </a:graphicData>
+            </a:graphic>
+          </wp:inline>
+        </w:drawing>
+      </w:r>
+    </w:p>
+    <w:p>
+      <w:pPr>
+        <w:spacing w:before="150" w:after="80" w:line="360" w:lineRule="auto"/>
+        <w:rPr>
+          <w:rFonts w:ascii="Times New Roman" w:hAnsi="Times New Roman" w:cs="Times New Roman"/>
+          <w:b/>
+          <w:bCs/>
+          <w:sz w:val="24"/>
+          <w:szCs w:val="24"/>
+        </w:rPr>
+      </w:pPr>
+      <w:r>
+        <w:rPr>
+          <w:rFonts w:ascii="Times New Roman" w:hAnsi="Times New Roman" w:cs="Times New Roman"/>
+          <w:sz w:val="24"/>
+          <w:szCs w:val="24"/>
+        </w:rPr>
+        <w:t xml:space="preserve">Si la clé demandée par l'utilisateur n'existe pas dans le dictionnaire du </w:t>
+      </w:r>
+      <w:proofErr w:type="spellStart"/>
+      <w:r>
+        <w:rPr>
+          <w:rFonts w:ascii="Times New Roman" w:hAnsi="Times New Roman" w:cs="Times New Roman"/>
+          <w:sz w:val="24"/>
+          <w:szCs w:val="24"/>
+        </w:rPr>
+        <w:t>dataset</w:t>
+      </w:r>
+      <w:proofErr w:type="spellEnd"/>
+      <w:r>
+        <w:rPr>
+          <w:rFonts w:ascii="Times New Roman" w:hAnsi="Times New Roman" w:cs="Times New Roman"/>
+          <w:sz w:val="24"/>
+          <w:szCs w:val="24"/>
+        </w:rPr>
+        <w:t>, une erreur explicite est renvoyée sans altérer la structure de la donnée.</w:t>
+      </w:r>
+    </w:p>
+    <w:p>
+      <w:pPr>
+        <w:spacing w:before="150" w:after="80" w:line="360" w:lineRule="auto"/>
+        <w:rPr>
+          <w:rFonts w:ascii="Times New Roman" w:eastAsia="Consolas" w:hAnsi="Times New Roman" w:cs="Times New Roman"/>
+          <w:sz w:val="24"/>
+          <w:szCs w:val="24"/>
+        </w:rPr>
+      </w:pPr>
+      <w:r>
+        <w:rPr>
+          <w:rFonts w:ascii="Times New Roman" w:hAnsi="Times New Roman" w:cs="Times New Roman"/>
+          <w:b/>
+          <w:bCs/>
+          <w:sz w:val="24"/>
+          <w:szCs w:val="24"/>
+        </w:rPr>
+        <w:t xml:space="preserve"> </w:t>
+      </w:r>
+      <w:r>
+        <w:rPr>
+          <w:rFonts w:ascii="Times New Roman" w:hAnsi="Times New Roman" w:cs="Times New Roman"/>
+          <w:b/>
+          <w:bCs/>
+          <w:sz w:val="24"/>
+          <w:szCs w:val="24"/>
+        </w:rPr>
+        <w:t>Résultat à l'exécution — saisie invalide :</w:t>
+      </w:r>
+      <w:r>
+        <w:rPr>
+          <w:rFonts w:ascii="Times New Roman" w:eastAsia="Consolas" w:hAnsi="Times New Roman" w:cs="Times New Roman"/>
+          <w:sz w:val="24"/>
+          <w:szCs w:val="24"/>
+        </w:rPr>
+        <w:t xml:space="preserve"> </w:t>
+      </w:r>
+    </w:p>
+    <w:p>
+      <w:pPr>
+        <w:spacing w:before="150" w:after="80" w:line="360" w:lineRule="auto"/>
+        <w:rPr>
+          <w:rFonts w:ascii="Times New Roman" w:eastAsia="Consolas" w:hAnsi="Times New Roman" w:cs="Times New Roman"/>
+          <w:sz w:val="24"/>
+          <w:szCs w:val="24"/>
+        </w:rPr>
+      </w:pPr>
+      <w:r>
+        <w:rPr>
+          <w:rFonts w:ascii="Times New Roman" w:eastAsia="Consolas" w:hAnsi="Times New Roman" w:cs="Times New Roman"/>
+          <w:sz w:val="24"/>
+          <w:szCs w:val="24"/>
+        </w:rPr>
+        <w:drawing>
+          <wp:inline distT="0" distB="0" distL="0" distR="0" wp14:anchorId="5FA2ACB9" wp14:editId="7F511FA5">
+            <wp:extent cx="6400800" cy="1945640"/>
+            <wp:effectExtent l="0" t="0" r="0" b="0"/>
+            <wp:docPr id="679251154" name="Image 31"/>
+            <wp:cNvGraphicFramePr>
+              <a:graphicFrameLocks xmlns:a="http://schemas.openxmlformats.org/drawingml/2006/main" noChangeAspect="1"/>
+            </wp:cNvGraphicFramePr>
+            <a:graphic xmlns:a="http://schemas.openxmlformats.org/drawingml/2006/main">
+              <a:graphicData uri="http://schemas.openxmlformats.org/drawingml/2006/picture">
+                <pic:pic xmlns:pic="http://schemas.openxmlformats.org/drawingml/2006/picture">
+                  <pic:nvPicPr>
+                    <pic:cNvPr id="679251154" name=""/>
+                    <pic:cNvPicPr/>
+                  </pic:nvPicPr>
+                  <pic:blipFill>
+                    <a:blip r:embed="rId35"/>
+                    <a:stretch>
+                      <a:fillRect/>
+                    </a:stretch>
+                  </pic:blipFill>
+                  <pic:spPr>
+                    <a:xfrm>
+                      <a:off x="0" y="0"/>
+                      <a:ext cx="6400800" cy="1945640"/>
+                    </a:xfrm>
+                    <a:prstGeom prst="rect">
+                      <a:avLst/>
+                    </a:prstGeom>
+                  </pic:spPr>
+                </pic:pic>
+              </a:graphicData>
+            </a:graphic>
+          </wp:inline>
+        </w:drawing>
+      </w:r>
+    </w:p>
+    <w:p>
+      <w:pPr>
+        <w:spacing w:before="150" w:after="80" w:line="360" w:lineRule="auto"/>
+        <w:rPr>
+          <w:rFonts w:ascii="Times New Roman" w:eastAsia="Consolas" w:hAnsi="Times New Roman" w:cs="Times New Roman"/>
+          <w:sz w:val="24"/>
+          <w:szCs w:val="24"/>
+        </w:rPr>
+      </w:pPr>
+      <w:r>
+        <w:rPr>
+          <w:rFonts w:ascii="Times New Roman" w:hAnsi="Times New Roman" w:cs="Times New Roman"/>
+          <w:sz w:val="24"/>
+          <w:szCs w:val="24"/>
+        </w:rPr>
+        <w:lastRenderedPageBreak/>
+        <w:t>Le terminal montre la saisie d'un mot au lieu d'un nombre pour le nombre de lignes, déclenchant le message d'erreur approprié et le retour propre au menu principal.</w:t>
+      </w:r>
+    </w:p>
+    <w:p>
+      <w:pPr>
+        <w:spacing w:before="150" w:after="80" w:line="360" w:lineRule="auto"/>
+        <w:rPr>
+          <w:rFonts w:ascii="Times New Roman" w:hAnsi="Times New Roman" w:cs="Times New Roman"/>
+          <w:sz w:val="24"/>
+          <w:szCs w:val="24"/>
+        </w:rPr>
+      </w:pPr>
+      <w:r>
+        <w:rPr>
+          <w:rFonts w:ascii="Times New Roman" w:hAnsi="Times New Roman" w:cs="Times New Roman"/>
+          <w:b/>
+          <w:bCs/>
+          <w:sz w:val="24"/>
+          <w:szCs w:val="24"/>
+        </w:rPr>
+        <w:t xml:space="preserve">Résultat à l'exécution — </w:t>
+      </w:r>
+      <w:r>
+        <w:rPr>
+          <w:rFonts w:ascii="Times New Roman" w:hAnsi="Times New Roman" w:cs="Times New Roman"/>
+          <w:b/>
+          <w:bCs/>
+          <w:sz w:val="24"/>
+          <w:szCs w:val="24"/>
+        </w:rPr>
+        <w:t xml:space="preserve">option modification </w:t>
+      </w:r>
+      <w:r>
+        <w:rPr>
+          <w:rFonts w:ascii="Times New Roman" w:hAnsi="Times New Roman" w:cs="Times New Roman"/>
+          <w:b/>
+          <w:bCs/>
+          <w:sz w:val="24"/>
+          <w:szCs w:val="24"/>
+        </w:rPr>
+        <w:t>:</w:t>
+      </w:r>
+      <w:r>
+        <w:rPr>
+          <w:rFonts w:ascii="Times New Roman" w:hAnsi="Times New Roman" w:cs="Times New Roman"/>
+          <w:sz w:val="24"/>
+          <w:szCs w:val="24"/>
+        </w:rPr>
+        <w:t xml:space="preserve"> </w:t>
+      </w:r>
+    </w:p>
+    <w:p>
+      <w:pPr>
+        <w:spacing w:before="150" w:after="80" w:line="360" w:lineRule="auto"/>
+        <w:rPr>
+          <w:rFonts w:ascii="Times New Roman" w:hAnsi="Times New Roman" w:cs="Times New Roman"/>
+          <w:sz w:val="24"/>
+          <w:szCs w:val="24"/>
+        </w:rPr>
+      </w:pPr>
+      <w:r>
+        <w:rPr>
+          <w:rFonts w:ascii="Times New Roman" w:hAnsi="Times New Roman" w:cs="Times New Roman"/>
+          <w:sz w:val="24"/>
+          <w:szCs w:val="24"/>
+        </w:rPr>
+        <w:drawing>
+          <wp:inline distT="0" distB="0" distL="0" distR="0" wp14:anchorId="4450B70F" wp14:editId="6784299F">
+            <wp:extent cx="6400800" cy="2206625"/>
+            <wp:effectExtent l="0" t="0" r="0" b="0"/>
+            <wp:docPr id="638607012" name="Image 32"/>
+            <wp:cNvGraphicFramePr>
+              <a:graphicFrameLocks xmlns:a="http://schemas.openxmlformats.org/drawingml/2006/main" noChangeAspect="1"/>
+            </wp:cNvGraphicFramePr>
+            <a:graphic xmlns:a="http://schemas.openxmlformats.org/drawingml/2006/main">
+              <a:graphicData uri="http://schemas.openxmlformats.org/drawingml/2006/picture">
+                <pic:pic xmlns:pic="http://schemas.openxmlformats.org/drawingml/2006/picture">
+                  <pic:nvPicPr>
+                    <pic:cNvPr id="638607012" name=""/>
+                    <pic:cNvPicPr/>
+                  </pic:nvPicPr>
+                  <pic:blipFill>
+                    <a:blip r:embed="rId36"/>
+                    <a:stretch>
+                      <a:fillRect/>
+                    </a:stretch>
+                  </pic:blipFill>
+                  <pic:spPr>
+                    <a:xfrm>
+                      <a:off x="0" y="0"/>
+                      <a:ext cx="6400800" cy="2206625"/>
+                    </a:xfrm>
+                    <a:prstGeom prst="rect">
+                      <a:avLst/>
+                    </a:prstGeom>
+                  </pic:spPr>
+                </pic:pic>
+              </a:graphicData>
+            </a:graphic>
+          </wp:inline>
+        </w:drawing>
+      </w:r>
+    </w:p>
+    <w:p>
+      <w:pPr>
+        <w:pStyle w:val="NormalWeb"/>
+        <w:spacing w:before="0" w:beforeAutospacing="0" w:line="360" w:lineRule="auto"/>
+      </w:pPr>
+      <w:r>
+        <w:t>L'exécution illustre la capture réussie des cas d'erreur lors du rechargement d'un fichier absent et de la tentative de modification d'un élément inexistant.</w:t>
+      </w:r>
+    </w:p>
+    <w:p>
+      <w:pPr>
+        <w:pStyle w:val="lev1"/>
+        <w:spacing w:line="360" w:lineRule="auto"/>
+        <w:rPr>
+          <w:rFonts w:ascii="Times New Roman" w:hAnsi="Times New Roman" w:cs="Times New Roman"/>
+          <w:sz w:val="24"/>
+          <w:szCs w:val="24"/>
+        </w:rPr>
+      </w:pPr>
+      <w:r>
+        <w:rPr>
+          <w:rFonts w:ascii="Times New Roman" w:hAnsi="Times New Roman" w:cs="Times New Roman"/>
+          <w:sz w:val="24"/>
+          <w:szCs w:val="24"/>
+        </w:rPr>
+        <w:t>Résumé des fonctions et concepts utilisés (Partie 8)</w:t>
+      </w:r>
+    </w:p>
+    <w:p>
+      <w:pPr>
+        <w:pStyle w:val="NormalWeb"/>
+        <w:numPr>
+          <w:ilvl w:val="0"/>
+          <w:numId w:val="15"/>
+        </w:numPr>
+        <w:spacing w:before="0" w:beforeAutospacing="0" w:line="360" w:lineRule="auto"/>
+      </w:pPr>
+      <w:proofErr w:type="spellStart"/>
+      <w:proofErr w:type="gramStart"/>
+      <w:r>
+        <w:rPr>
+          <w:rStyle w:val="CodeHTML"/>
+          <w:rFonts w:ascii="Times New Roman" w:hAnsi="Times New Roman" w:cs="Times New Roman"/>
+          <w:b/>
+          <w:bCs/>
+          <w:sz w:val="24"/>
+          <w:szCs w:val="24"/>
+        </w:rPr>
+        <w:t>try</w:t>
+      </w:r>
+      <w:proofErr w:type="spellEnd"/>
+      <w:proofErr w:type="gramEnd"/>
+      <w:r>
+        <w:rPr>
+          <w:rStyle w:val="CodeHTML"/>
+          <w:rFonts w:ascii="Times New Roman" w:hAnsi="Times New Roman" w:cs="Times New Roman"/>
+          <w:b/>
+          <w:bCs/>
+          <w:sz w:val="24"/>
+          <w:szCs w:val="24"/>
+        </w:rPr>
+        <w:t xml:space="preserve"> / </w:t>
+      </w:r>
+      <w:proofErr w:type="spellStart"/>
+      <w:r>
+        <w:rPr>
+          <w:rStyle w:val="CodeHTML"/>
+          <w:rFonts w:ascii="Times New Roman" w:hAnsi="Times New Roman" w:cs="Times New Roman"/>
+          <w:b/>
+          <w:bCs/>
+          <w:sz w:val="24"/>
+          <w:szCs w:val="24"/>
+        </w:rPr>
+        <w:t>except</w:t>
+      </w:r>
+      <w:proofErr w:type="spellEnd"/>
+      <w:r>
+        <w:rPr>
+          <w:b/>
+          <w:bCs/>
+        </w:rPr>
+        <w:t xml:space="preserve"> :</w:t>
+      </w:r>
+      <w:r>
+        <w:t xml:space="preserve"> Bloc de contrôle permettant de capturer et de gérer les exceptions au moment où elles se produisent, évitant un arrêt brutal du programme. </w:t>
+      </w:r>
+    </w:p>
+    <w:p>
+      <w:pPr>
+        <w:pStyle w:val="NormalWeb"/>
+        <w:numPr>
+          <w:ilvl w:val="0"/>
+          <w:numId w:val="15"/>
+        </w:numPr>
+        <w:spacing w:before="0" w:beforeAutospacing="0" w:line="360" w:lineRule="auto"/>
+      </w:pPr>
+      <w:proofErr w:type="spellStart"/>
+      <w:r>
+        <w:rPr>
+          <w:rStyle w:val="CodeHTML"/>
+          <w:rFonts w:ascii="Times New Roman" w:hAnsi="Times New Roman" w:cs="Times New Roman"/>
+          <w:b/>
+          <w:bCs/>
+          <w:sz w:val="24"/>
+          <w:szCs w:val="24"/>
+        </w:rPr>
+        <w:t>ValueError</w:t>
+      </w:r>
+      <w:proofErr w:type="spellEnd"/>
+      <w:r>
+        <w:rPr>
+          <w:b/>
+          <w:bCs/>
+        </w:rPr>
+        <w:t xml:space="preserve"> :</w:t>
+      </w:r>
+      <w:r>
+        <w:t xml:space="preserve"> Exception levée lorsqu'une fonction reçoit un argument du bon type mais avec une valeur inappropriée (</w:t>
+      </w:r>
+      <w:proofErr w:type="gramStart"/>
+      <w:r>
+        <w:t>ex:</w:t>
+      </w:r>
+      <w:proofErr w:type="gramEnd"/>
+      <w:r>
+        <w:t xml:space="preserve"> conversion de la chaîne </w:t>
+      </w:r>
+      <w:r>
+        <w:rPr>
+          <w:rStyle w:val="CodeHTML"/>
+          <w:rFonts w:ascii="Times New Roman" w:hAnsi="Times New Roman" w:cs="Times New Roman"/>
+          <w:sz w:val="24"/>
+          <w:szCs w:val="24"/>
+        </w:rPr>
+        <w:t>"abc"</w:t>
+      </w:r>
+      <w:r>
+        <w:t xml:space="preserve"> via </w:t>
+      </w:r>
+      <w:proofErr w:type="spellStart"/>
+      <w:r>
+        <w:rPr>
+          <w:rStyle w:val="CodeHTML"/>
+          <w:rFonts w:ascii="Times New Roman" w:hAnsi="Times New Roman" w:cs="Times New Roman"/>
+          <w:sz w:val="24"/>
+          <w:szCs w:val="24"/>
+        </w:rPr>
+        <w:t>int</w:t>
+      </w:r>
+      <w:proofErr w:type="spellEnd"/>
+      <w:r>
+        <w:rPr>
+          <w:rStyle w:val="CodeHTML"/>
+          <w:rFonts w:ascii="Times New Roman" w:hAnsi="Times New Roman" w:cs="Times New Roman"/>
+          <w:sz w:val="24"/>
+          <w:szCs w:val="24"/>
+        </w:rPr>
+        <w:t>()</w:t>
+      </w:r>
+      <w:r>
+        <w:t xml:space="preserve">). </w:t>
+      </w:r>
+    </w:p>
+    <w:p>
+      <w:pPr>
+        <w:pStyle w:val="NormalWeb"/>
+        <w:numPr>
+          <w:ilvl w:val="0"/>
+          <w:numId w:val="15"/>
+        </w:numPr>
+        <w:spacing w:before="0" w:beforeAutospacing="0" w:line="360" w:lineRule="auto"/>
+      </w:pPr>
+      <w:proofErr w:type="spellStart"/>
+      <w:r>
+        <w:rPr>
+          <w:rStyle w:val="CodeHTML"/>
+          <w:rFonts w:ascii="Times New Roman" w:hAnsi="Times New Roman" w:cs="Times New Roman"/>
+          <w:b/>
+          <w:bCs/>
+          <w:sz w:val="24"/>
+          <w:szCs w:val="24"/>
+        </w:rPr>
+        <w:t>FileNotFoundError</w:t>
+      </w:r>
+      <w:proofErr w:type="spellEnd"/>
+      <w:r>
+        <w:rPr>
+          <w:b/>
+          <w:bCs/>
+        </w:rPr>
+        <w:t xml:space="preserve"> :</w:t>
+      </w:r>
+      <w:r>
+        <w:t xml:space="preserve"> Exception levée lors d'une tentative d'ouverture d'un fichier qui n'existe pas sur le chemin indiqué. </w:t>
+      </w:r>
+    </w:p>
+    <w:p>
+      <w:pPr>
+        <w:pStyle w:val="NormalWeb"/>
+        <w:numPr>
+          <w:ilvl w:val="0"/>
+          <w:numId w:val="15"/>
+        </w:numPr>
+        <w:spacing w:before="0" w:beforeAutospacing="0" w:line="360" w:lineRule="auto"/>
+      </w:pPr>
+      <w:r>
+        <w:rPr>
+          <w:b/>
+          <w:bCs/>
+        </w:rPr>
+        <w:t xml:space="preserve">Vérification </w:t>
+      </w:r>
+      <w:proofErr w:type="spellStart"/>
+      <w:r>
+        <w:rPr>
+          <w:b/>
+          <w:bCs/>
+        </w:rPr>
+        <w:t>defensive</w:t>
+      </w:r>
+      <w:proofErr w:type="spellEnd"/>
+      <w:r>
+        <w:rPr>
+          <w:b/>
+          <w:bCs/>
+        </w:rPr>
+        <w:t xml:space="preserve"> :</w:t>
+      </w:r>
+      <w:r>
+        <w:t xml:space="preserve"> Approche algorithmique utilisant des conditions (</w:t>
+      </w:r>
+      <w:r>
+        <w:rPr>
+          <w:rStyle w:val="CodeHTML"/>
+          <w:rFonts w:ascii="Times New Roman" w:hAnsi="Times New Roman" w:cs="Times New Roman"/>
+          <w:sz w:val="24"/>
+          <w:szCs w:val="24"/>
+        </w:rPr>
+        <w:t xml:space="preserve">if / </w:t>
+      </w:r>
+      <w:proofErr w:type="spellStart"/>
+      <w:r>
+        <w:rPr>
+          <w:rStyle w:val="CodeHTML"/>
+          <w:rFonts w:ascii="Times New Roman" w:hAnsi="Times New Roman" w:cs="Times New Roman"/>
+          <w:sz w:val="24"/>
+          <w:szCs w:val="24"/>
+        </w:rPr>
+        <w:t>else</w:t>
+      </w:r>
+      <w:proofErr w:type="spellEnd"/>
+      <w:r>
+        <w:t xml:space="preserve">) pour s'assurer qu'une clé, un attribut ou un élément existe avant d'effectuer une opération dessus. </w:t>
       </w:r>
     </w:p>
     <w:p>
@@ -8221,6 +10169,119 @@
     </w:lvl>
   </w:abstractNum>
   <w:abstractNum w:abstractNumId="3" w15:restartNumberingAfterBreak="0">
+    <w:nsid w:val="0FA30648"/>
+    <w:multiLevelType w:val="hybridMultilevel"/>
+    <w:tmpl w:val="CBAC2F0A"/>
+    <w:lvl w:ilvl="0" w:tplc="040C0001">
+      <w:start w:val="1"/>
+      <w:numFmt w:val="bullet"/>
+      <w:lvlText w:val=""/>
+      <w:lvlJc w:val="left"/>
+      <w:pPr>
+        <w:ind w:left="720" w:hanging="360"/>
+      </w:pPr>
+      <w:rPr>
+        <w:rFonts w:ascii="Symbol" w:hAnsi="Symbol" w:hint="default"/>
+      </w:rPr>
+    </w:lvl>
+    <w:lvl w:ilvl="1" w:tplc="040C0003" w:tentative="1">
+      <w:start w:val="1"/>
+      <w:numFmt w:val="bullet"/>
+      <w:lvlText w:val="o"/>
+      <w:lvlJc w:val="left"/>
+      <w:pPr>
+        <w:ind w:left="1440" w:hanging="360"/>
+      </w:pPr>
+      <w:rPr>
+        <w:rFonts w:ascii="Courier New" w:hAnsi="Courier New" w:cs="Courier New" w:hint="default"/>
+      </w:rPr>
+    </w:lvl>
+    <w:lvl w:ilvl="2" w:tplc="040C0005" w:tentative="1">
+      <w:start w:val="1"/>
+      <w:numFmt w:val="bullet"/>
+      <w:lvlText w:val=""/>
+      <w:lvlJc w:val="left"/>
+      <w:pPr>
+        <w:ind w:left="2160" w:hanging="360"/>
+      </w:pPr>
+      <w:rPr>
+        <w:rFonts w:ascii="Wingdings" w:hAnsi="Wingdings" w:hint="default"/>
+      </w:rPr>
+    </w:lvl>
+    <w:lvl w:ilvl="3" w:tplc="040C0001" w:tentative="1">
+      <w:start w:val="1"/>
+      <w:numFmt w:val="bullet"/>
+      <w:lvlText w:val=""/>
+      <w:lvlJc w:val="left"/>
+      <w:pPr>
+        <w:ind w:left="2880" w:hanging="360"/>
+      </w:pPr>
+      <w:rPr>
+        <w:rFonts w:ascii="Symbol" w:hAnsi="Symbol" w:hint="default"/>
+      </w:rPr>
+    </w:lvl>
+    <w:lvl w:ilvl="4" w:tplc="040C0003" w:tentative="1">
+      <w:start w:val="1"/>
+      <w:numFmt w:val="bullet"/>
+      <w:lvlText w:val="o"/>
+      <w:lvlJc w:val="left"/>
+      <w:pPr>
+        <w:ind w:left="3600" w:hanging="360"/>
+      </w:pPr>
+      <w:rPr>
+        <w:rFonts w:ascii="Courier New" w:hAnsi="Courier New" w:cs="Courier New" w:hint="default"/>
+      </w:rPr>
+    </w:lvl>
+    <w:lvl w:ilvl="5" w:tplc="040C0005" w:tentative="1">
+      <w:start w:val="1"/>
+      <w:numFmt w:val="bullet"/>
+      <w:lvlText w:val=""/>
+      <w:lvlJc w:val="left"/>
+      <w:pPr>
+        <w:ind w:left="4320" w:hanging="360"/>
+      </w:pPr>
+      <w:rPr>
+        <w:rFonts w:ascii="Wingdings" w:hAnsi="Wingdings" w:hint="default"/>
+      </w:rPr>
+    </w:lvl>
+    <w:lvl w:ilvl="6" w:tplc="040C0001" w:tentative="1">
+      <w:start w:val="1"/>
+      <w:numFmt w:val="bullet"/>
+      <w:lvlText w:val=""/>
+      <w:lvlJc w:val="left"/>
+      <w:pPr>
+        <w:ind w:left="5040" w:hanging="360"/>
+      </w:pPr>
+      <w:rPr>
+        <w:rFonts w:ascii="Symbol" w:hAnsi="Symbol" w:hint="default"/>
+      </w:rPr>
+    </w:lvl>
+    <w:lvl w:ilvl="7" w:tplc="040C0003" w:tentative="1">
+      <w:start w:val="1"/>
+      <w:numFmt w:val="bullet"/>
+      <w:lvlText w:val="o"/>
+      <w:lvlJc w:val="left"/>
+      <w:pPr>
+        <w:ind w:left="5760" w:hanging="360"/>
+      </w:pPr>
+      <w:rPr>
+        <w:rFonts w:ascii="Courier New" w:hAnsi="Courier New" w:cs="Courier New" w:hint="default"/>
+      </w:rPr>
+    </w:lvl>
+    <w:lvl w:ilvl="8" w:tplc="040C0005" w:tentative="1">
+      <w:start w:val="1"/>
+      <w:numFmt w:val="bullet"/>
+      <w:lvlText w:val=""/>
+      <w:lvlJc w:val="left"/>
+      <w:pPr>
+        <w:ind w:left="6480" w:hanging="360"/>
+      </w:pPr>
+      <w:rPr>
+        <w:rFonts w:ascii="Wingdings" w:hAnsi="Wingdings" w:hint="default"/>
+      </w:rPr>
+    </w:lvl>
+  </w:abstractNum>
+  <w:abstractNum w:abstractNumId="4" w15:restartNumberingAfterBreak="0">
     <w:nsid w:val="148C7C56"/>
     <w:multiLevelType w:val="hybridMultilevel"/>
     <w:tmpl w:val="A8F8BAE6"/>
@@ -8333,7 +10394,120 @@
       </w:rPr>
     </w:lvl>
   </w:abstractNum>
-  <w:abstractNum w:abstractNumId="4" w15:restartNumberingAfterBreak="0">
+  <w:abstractNum w:abstractNumId="5" w15:restartNumberingAfterBreak="0">
+    <w:nsid w:val="16F27898"/>
+    <w:multiLevelType w:val="hybridMultilevel"/>
+    <w:tmpl w:val="6F3484FA"/>
+    <w:lvl w:ilvl="0" w:tplc="040C0001">
+      <w:start w:val="1"/>
+      <w:numFmt w:val="bullet"/>
+      <w:lvlText w:val=""/>
+      <w:lvlJc w:val="left"/>
+      <w:pPr>
+        <w:ind w:left="720" w:hanging="360"/>
+      </w:pPr>
+      <w:rPr>
+        <w:rFonts w:ascii="Symbol" w:hAnsi="Symbol" w:hint="default"/>
+      </w:rPr>
+    </w:lvl>
+    <w:lvl w:ilvl="1" w:tplc="040C0003" w:tentative="1">
+      <w:start w:val="1"/>
+      <w:numFmt w:val="bullet"/>
+      <w:lvlText w:val="o"/>
+      <w:lvlJc w:val="left"/>
+      <w:pPr>
+        <w:ind w:left="1440" w:hanging="360"/>
+      </w:pPr>
+      <w:rPr>
+        <w:rFonts w:ascii="Courier New" w:hAnsi="Courier New" w:cs="Courier New" w:hint="default"/>
+      </w:rPr>
+    </w:lvl>
+    <w:lvl w:ilvl="2" w:tplc="040C0005" w:tentative="1">
+      <w:start w:val="1"/>
+      <w:numFmt w:val="bullet"/>
+      <w:lvlText w:val=""/>
+      <w:lvlJc w:val="left"/>
+      <w:pPr>
+        <w:ind w:left="2160" w:hanging="360"/>
+      </w:pPr>
+      <w:rPr>
+        <w:rFonts w:ascii="Wingdings" w:hAnsi="Wingdings" w:hint="default"/>
+      </w:rPr>
+    </w:lvl>
+    <w:lvl w:ilvl="3" w:tplc="040C0001" w:tentative="1">
+      <w:start w:val="1"/>
+      <w:numFmt w:val="bullet"/>
+      <w:lvlText w:val=""/>
+      <w:lvlJc w:val="left"/>
+      <w:pPr>
+        <w:ind w:left="2880" w:hanging="360"/>
+      </w:pPr>
+      <w:rPr>
+        <w:rFonts w:ascii="Symbol" w:hAnsi="Symbol" w:hint="default"/>
+      </w:rPr>
+    </w:lvl>
+    <w:lvl w:ilvl="4" w:tplc="040C0003" w:tentative="1">
+      <w:start w:val="1"/>
+      <w:numFmt w:val="bullet"/>
+      <w:lvlText w:val="o"/>
+      <w:lvlJc w:val="left"/>
+      <w:pPr>
+        <w:ind w:left="3600" w:hanging="360"/>
+      </w:pPr>
+      <w:rPr>
+        <w:rFonts w:ascii="Courier New" w:hAnsi="Courier New" w:cs="Courier New" w:hint="default"/>
+      </w:rPr>
+    </w:lvl>
+    <w:lvl w:ilvl="5" w:tplc="040C0005" w:tentative="1">
+      <w:start w:val="1"/>
+      <w:numFmt w:val="bullet"/>
+      <w:lvlText w:val=""/>
+      <w:lvlJc w:val="left"/>
+      <w:pPr>
+        <w:ind w:left="4320" w:hanging="360"/>
+      </w:pPr>
+      <w:rPr>
+        <w:rFonts w:ascii="Wingdings" w:hAnsi="Wingdings" w:hint="default"/>
+      </w:rPr>
+    </w:lvl>
+    <w:lvl w:ilvl="6" w:tplc="040C0001" w:tentative="1">
+      <w:start w:val="1"/>
+      <w:numFmt w:val="bullet"/>
+      <w:lvlText w:val=""/>
+      <w:lvlJc w:val="left"/>
+      <w:pPr>
+        <w:ind w:left="5040" w:hanging="360"/>
+      </w:pPr>
+      <w:rPr>
+        <w:rFonts w:ascii="Symbol" w:hAnsi="Symbol" w:hint="default"/>
+      </w:rPr>
+    </w:lvl>
+    <w:lvl w:ilvl="7" w:tplc="040C0003" w:tentative="1">
+      <w:start w:val="1"/>
+      <w:numFmt w:val="bullet"/>
+      <w:lvlText w:val="o"/>
+      <w:lvlJc w:val="left"/>
+      <w:pPr>
+        <w:ind w:left="5760" w:hanging="360"/>
+      </w:pPr>
+      <w:rPr>
+        <w:rFonts w:ascii="Courier New" w:hAnsi="Courier New" w:cs="Courier New" w:hint="default"/>
+      </w:rPr>
+    </w:lvl>
+    <w:lvl w:ilvl="8" w:tplc="040C0005" w:tentative="1">
+      <w:start w:val="1"/>
+      <w:numFmt w:val="bullet"/>
+      <w:lvlText w:val=""/>
+      <w:lvlJc w:val="left"/>
+      <w:pPr>
+        <w:ind w:left="6480" w:hanging="360"/>
+      </w:pPr>
+      <w:rPr>
+        <w:rFonts w:ascii="Wingdings" w:hAnsi="Wingdings" w:hint="default"/>
+      </w:rPr>
+    </w:lvl>
+  </w:abstractNum>
+  <w:abstractNum w:abstractNumId="6" w15:restartNumberingAfterBreak="0">
     <w:nsid w:val="3D3E3E8C"/>
     <w:multiLevelType w:val="multilevel"/>
     <w:tmpl w:val="A3B03F2C"/>
@@ -8482,7 +10656,7 @@
       </w:rPr>
     </w:lvl>
   </w:abstractNum>
-  <w:abstractNum w:abstractNumId="5" w15:restartNumberingAfterBreak="0">
+  <w:abstractNum w:abstractNumId="7" w15:restartNumberingAfterBreak="0">
     <w:nsid w:val="3DAC4309"/>
     <w:multiLevelType w:val="hybridMultilevel"/>
     <w:tmpl w:val="C91854D2"/>
@@ -8594,7 +10768,7 @@
       </w:rPr>
     </w:lvl>
   </w:abstractNum>
-  <w:abstractNum w:abstractNumId="6" w15:restartNumberingAfterBreak="0">
+  <w:abstractNum w:abstractNumId="8" w15:restartNumberingAfterBreak="0">
     <w:nsid w:val="43443FCB"/>
     <w:multiLevelType w:val="multilevel"/>
     <w:tmpl w:val="1C30AAFA"/>
@@ -8743,7 +10917,7 @@
       </w:rPr>
     </w:lvl>
   </w:abstractNum>
-  <w:abstractNum w:abstractNumId="7" w15:restartNumberingAfterBreak="0">
+  <w:abstractNum w:abstractNumId="9" w15:restartNumberingAfterBreak="0">
     <w:nsid w:val="4B4C5930"/>
     <w:multiLevelType w:val="hybridMultilevel"/>
     <w:tmpl w:val="AF7A8ADC"/>
@@ -8856,7 +11030,7 @@
       </w:rPr>
     </w:lvl>
   </w:abstractNum>
-  <w:abstractNum w:abstractNumId="8" w15:restartNumberingAfterBreak="0">
+  <w:abstractNum w:abstractNumId="10" w15:restartNumberingAfterBreak="0">
     <w:nsid w:val="4FC34243"/>
     <w:multiLevelType w:val="hybridMultilevel"/>
     <w:tmpl w:val="97087B9C"/>
@@ -8969,7 +11143,7 @@
       </w:rPr>
     </w:lvl>
   </w:abstractNum>
-  <w:abstractNum w:abstractNumId="9" w15:restartNumberingAfterBreak="0">
+  <w:abstractNum w:abstractNumId="11" w15:restartNumberingAfterBreak="0">
     <w:nsid w:val="58B67D25"/>
     <w:multiLevelType w:val="hybridMultilevel"/>
     <w:tmpl w:val="8AB0F4A4"/>
@@ -9061,7 +11235,156 @@
       </w:pPr>
     </w:lvl>
   </w:abstractNum>
-  <w:abstractNum w:abstractNumId="10" w15:restartNumberingAfterBreak="0">
+  <w:abstractNum w:abstractNumId="12" w15:restartNumberingAfterBreak="0">
+    <w:nsid w:val="64D62A87"/>
+    <w:multiLevelType w:val="multilevel"/>
+    <w:tmpl w:val="653C3C02"/>
+    <w:lvl w:ilvl="0">
+      <w:start w:val="1"/>
+      <w:numFmt w:val="bullet"/>
+      <w:lvlText w:val=""/>
+      <w:lvlJc w:val="left"/>
+      <w:pPr>
+        <w:tabs>
+          <w:tab w:val="num" w:pos="720"/>
+        </w:tabs>
+        <w:ind w:left="720" w:hanging="360"/>
+      </w:pPr>
+      <w:rPr>
+        <w:rFonts w:ascii="Symbol" w:hAnsi="Symbol" w:hint="default"/>
+        <w:sz w:val="20"/>
+      </w:rPr>
+    </w:lvl>
+    <w:lvl w:ilvl="1" w:tentative="1">
+      <w:start w:val="1"/>
+      <w:numFmt w:val="bullet"/>
+      <w:lvlText w:val="o"/>
+      <w:lvlJc w:val="left"/>
+      <w:pPr>
+        <w:tabs>
+          <w:tab w:val="num" w:pos="1440"/>
+        </w:tabs>
+        <w:ind w:left="1440" w:hanging="360"/>
+      </w:pPr>
+      <w:rPr>
+        <w:rFonts w:ascii="Courier New" w:hAnsi="Courier New" w:hint="default"/>
+        <w:sz w:val="20"/>
+      </w:rPr>
+    </w:lvl>
+    <w:lvl w:ilvl="2" w:tentative="1">
+      <w:start w:val="1"/>
+      <w:numFmt w:val="bullet"/>
+      <w:lvlText w:val=""/>
+      <w:lvlJc w:val="left"/>
+      <w:pPr>
+        <w:tabs>
+          <w:tab w:val="num" w:pos="2160"/>
+        </w:tabs>
+        <w:ind w:left="2160" w:hanging="360"/>
+      </w:pPr>
+      <w:rPr>
+        <w:rFonts w:ascii="Wingdings" w:hAnsi="Wingdings" w:hint="default"/>
+        <w:sz w:val="20"/>
+      </w:rPr>
+    </w:lvl>
+    <w:lvl w:ilvl="3" w:tentative="1">
+      <w:start w:val="1"/>
+      <w:numFmt w:val="bullet"/>
+      <w:lvlText w:val=""/>
+      <w:lvlJc w:val="left"/>
+      <w:pPr>
+        <w:tabs>
+          <w:tab w:val="num" w:pos="2880"/>
+        </w:tabs>
+        <w:ind w:left="2880" w:hanging="360"/>
+      </w:pPr>
+      <w:rPr>
+        <w:rFonts w:ascii="Wingdings" w:hAnsi="Wingdings" w:hint="default"/>
+        <w:sz w:val="20"/>
+      </w:rPr>
+    </w:lvl>
+    <w:lvl w:ilvl="4" w:tentative="1">
+      <w:start w:val="1"/>
+      <w:numFmt w:val="bullet"/>
+      <w:lvlText w:val=""/>
+      <w:lvlJc w:val="left"/>
+      <w:pPr>
+        <w:tabs>
+          <w:tab w:val="num" w:pos="3600"/>
+        </w:tabs>
+        <w:ind w:left="3600" w:hanging="360"/>
+      </w:pPr>
+      <w:rPr>
+        <w:rFonts w:ascii="Wingdings" w:hAnsi="Wingdings" w:hint="default"/>
+        <w:sz w:val="20"/>
+      </w:rPr>
+    </w:lvl>
+    <w:lvl w:ilvl="5" w:tentative="1">
+      <w:start w:val="1"/>
+      <w:numFmt w:val="bullet"/>
+      <w:lvlText w:val=""/>
+      <w:lvlJc w:val="left"/>
+      <w:pPr>
+        <w:tabs>
+          <w:tab w:val="num" w:pos="4320"/>
+        </w:tabs>
+        <w:ind w:left="4320" w:hanging="360"/>
+      </w:pPr>
+      <w:rPr>
+        <w:rFonts w:ascii="Wingdings" w:hAnsi="Wingdings" w:hint="default"/>
+        <w:sz w:val="20"/>
+      </w:rPr>
+    </w:lvl>
+    <w:lvl w:ilvl="6" w:tentative="1">
+      <w:start w:val="1"/>
+      <w:numFmt w:val="bullet"/>
+      <w:lvlText w:val=""/>
+      <w:lvlJc w:val="left"/>
+      <w:pPr>
+        <w:tabs>
+          <w:tab w:val="num" w:pos="5040"/>
+        </w:tabs>
+        <w:ind w:left="5040" w:hanging="360"/>
+      </w:pPr>
+      <w:rPr>
+        <w:rFonts w:ascii="Wingdings" w:hAnsi="Wingdings" w:hint="default"/>
+        <w:sz w:val="20"/>
+      </w:rPr>
+    </w:lvl>
+    <w:lvl w:ilvl="7" w:tentative="1">
+      <w:start w:val="1"/>
+      <w:numFmt w:val="bullet"/>
+      <w:lvlText w:val=""/>
+      <w:lvlJc w:val="left"/>
+      <w:pPr>
+        <w:tabs>
+          <w:tab w:val="num" w:pos="5760"/>
+        </w:tabs>
+        <w:ind w:left="5760" w:hanging="360"/>
+      </w:pPr>
+      <w:rPr>
+        <w:rFonts w:ascii="Wingdings" w:hAnsi="Wingdings" w:hint="default"/>
+        <w:sz w:val="20"/>
+      </w:rPr>
+    </w:lvl>
+    <w:lvl w:ilvl="8" w:tentative="1">
+      <w:start w:val="1"/>
+      <w:numFmt w:val="bullet"/>
+      <w:lvlText w:val=""/>
+      <w:lvlJc w:val="left"/>
+      <w:pPr>
+        <w:tabs>
+          <w:tab w:val="num" w:pos="6480"/>
+        </w:tabs>
+        <w:ind w:left="6480" w:hanging="360"/>
+      </w:pPr>
+      <w:rPr>
+        <w:rFonts w:ascii="Wingdings" w:hAnsi="Wingdings" w:hint="default"/>
+        <w:sz w:val="20"/>
+      </w:rPr>
+    </w:lvl>
+  </w:abstractNum>
+  <w:abstractNum w:abstractNumId="13" w15:restartNumberingAfterBreak="0">
     <w:nsid w:val="653C0C5E"/>
     <w:multiLevelType w:val="multilevel"/>
     <w:tmpl w:val="28D834A2"/>
@@ -9210,7 +11533,7 @@
       </w:rPr>
     </w:lvl>
   </w:abstractNum>
-  <w:abstractNum w:abstractNumId="11" w15:restartNumberingAfterBreak="0">
+  <w:abstractNum w:abstractNumId="14" w15:restartNumberingAfterBreak="0">
     <w:nsid w:val="6774185F"/>
     <w:multiLevelType w:val="multilevel"/>
     <w:tmpl w:val="70EEC7E6"/>
@@ -9359,7 +11682,7 @@
       </w:rPr>
     </w:lvl>
   </w:abstractNum>
-  <w:abstractNum w:abstractNumId="12" w15:restartNumberingAfterBreak="0">
+  <w:abstractNum w:abstractNumId="15" w15:restartNumberingAfterBreak="0">
     <w:nsid w:val="69FC276B"/>
     <w:multiLevelType w:val="multilevel"/>
     <w:tmpl w:val="C2E0AD14"/>
@@ -9508,7 +11831,156 @@
       </w:rPr>
     </w:lvl>
   </w:abstractNum>
-  <w:abstractNum w:abstractNumId="13" w15:restartNumberingAfterBreak="0">
+  <w:abstractNum w:abstractNumId="16" w15:restartNumberingAfterBreak="0">
+    <w:nsid w:val="7185592B"/>
+    <w:multiLevelType w:val="multilevel"/>
+    <w:tmpl w:val="08F0360A"/>
+    <w:lvl w:ilvl="0">
+      <w:start w:val="1"/>
+      <w:numFmt w:val="bullet"/>
+      <w:lvlText w:val=""/>
+      <w:lvlJc w:val="left"/>
+      <w:pPr>
+        <w:tabs>
+          <w:tab w:val="num" w:pos="720"/>
+        </w:tabs>
+        <w:ind w:left="720" w:hanging="360"/>
+      </w:pPr>
+      <w:rPr>
+        <w:rFonts w:ascii="Symbol" w:hAnsi="Symbol" w:hint="default"/>
+        <w:sz w:val="20"/>
+      </w:rPr>
+    </w:lvl>
+    <w:lvl w:ilvl="1" w:tentative="1">
+      <w:start w:val="1"/>
+      <w:numFmt w:val="bullet"/>
+      <w:lvlText w:val="o"/>
+      <w:lvlJc w:val="left"/>
+      <w:pPr>
+        <w:tabs>
+          <w:tab w:val="num" w:pos="1440"/>
+        </w:tabs>
+        <w:ind w:left="1440" w:hanging="360"/>
+      </w:pPr>
+      <w:rPr>
+        <w:rFonts w:ascii="Courier New" w:hAnsi="Courier New" w:hint="default"/>
+        <w:sz w:val="20"/>
+      </w:rPr>
+    </w:lvl>
+    <w:lvl w:ilvl="2" w:tentative="1">
+      <w:start w:val="1"/>
+      <w:numFmt w:val="bullet"/>
+      <w:lvlText w:val=""/>
+      <w:lvlJc w:val="left"/>
+      <w:pPr>
+        <w:tabs>
+          <w:tab w:val="num" w:pos="2160"/>
+        </w:tabs>
+        <w:ind w:left="2160" w:hanging="360"/>
+      </w:pPr>
+      <w:rPr>
+        <w:rFonts w:ascii="Wingdings" w:hAnsi="Wingdings" w:hint="default"/>
+        <w:sz w:val="20"/>
+      </w:rPr>
+    </w:lvl>
+    <w:lvl w:ilvl="3" w:tentative="1">
+      <w:start w:val="1"/>
+      <w:numFmt w:val="bullet"/>
+      <w:lvlText w:val=""/>
+      <w:lvlJc w:val="left"/>
+      <w:pPr>
+        <w:tabs>
+          <w:tab w:val="num" w:pos="2880"/>
+        </w:tabs>
+        <w:ind w:left="2880" w:hanging="360"/>
+      </w:pPr>
+      <w:rPr>
+        <w:rFonts w:ascii="Wingdings" w:hAnsi="Wingdings" w:hint="default"/>
+        <w:sz w:val="20"/>
+      </w:rPr>
+    </w:lvl>
+    <w:lvl w:ilvl="4" w:tentative="1">
+      <w:start w:val="1"/>
+      <w:numFmt w:val="bullet"/>
+      <w:lvlText w:val=""/>
+      <w:lvlJc w:val="left"/>
+      <w:pPr>
+        <w:tabs>
+          <w:tab w:val="num" w:pos="3600"/>
+        </w:tabs>
+        <w:ind w:left="3600" w:hanging="360"/>
+      </w:pPr>
+      <w:rPr>
+        <w:rFonts w:ascii="Wingdings" w:hAnsi="Wingdings" w:hint="default"/>
+        <w:sz w:val="20"/>
+      </w:rPr>
+    </w:lvl>
+    <w:lvl w:ilvl="5" w:tentative="1">
+      <w:start w:val="1"/>
+      <w:numFmt w:val="bullet"/>
+      <w:lvlText w:val=""/>
+      <w:lvlJc w:val="left"/>
+      <w:pPr>
+        <w:tabs>
+          <w:tab w:val="num" w:pos="4320"/>
+        </w:tabs>
+        <w:ind w:left="4320" w:hanging="360"/>
+      </w:pPr>
+      <w:rPr>
+        <w:rFonts w:ascii="Wingdings" w:hAnsi="Wingdings" w:hint="default"/>
+        <w:sz w:val="20"/>
+      </w:rPr>
+    </w:lvl>
+    <w:lvl w:ilvl="6" w:tentative="1">
+      <w:start w:val="1"/>
+      <w:numFmt w:val="bullet"/>
+      <w:lvlText w:val=""/>
+      <w:lvlJc w:val="left"/>
+      <w:pPr>
+        <w:tabs>
+          <w:tab w:val="num" w:pos="5040"/>
+        </w:tabs>
+        <w:ind w:left="5040" w:hanging="360"/>
+      </w:pPr>
+      <w:rPr>
+        <w:rFonts w:ascii="Wingdings" w:hAnsi="Wingdings" w:hint="default"/>
+        <w:sz w:val="20"/>
+      </w:rPr>
+    </w:lvl>
+    <w:lvl w:ilvl="7" w:tentative="1">
+      <w:start w:val="1"/>
+      <w:numFmt w:val="bullet"/>
+      <w:lvlText w:val=""/>
+      <w:lvlJc w:val="left"/>
+      <w:pPr>
+        <w:tabs>
+          <w:tab w:val="num" w:pos="5760"/>
+        </w:tabs>
+        <w:ind w:left="5760" w:hanging="360"/>
+      </w:pPr>
+      <w:rPr>
+        <w:rFonts w:ascii="Wingdings" w:hAnsi="Wingdings" w:hint="default"/>
+        <w:sz w:val="20"/>
+      </w:rPr>
+    </w:lvl>
+    <w:lvl w:ilvl="8" w:tentative="1">
+      <w:start w:val="1"/>
+      <w:numFmt w:val="bullet"/>
+      <w:lvlText w:val=""/>
+      <w:lvlJc w:val="left"/>
+      <w:pPr>
+        <w:tabs>
+          <w:tab w:val="num" w:pos="6480"/>
+        </w:tabs>
+        <w:ind w:left="6480" w:hanging="360"/>
+      </w:pPr>
+      <w:rPr>
+        <w:rFonts w:ascii="Wingdings" w:hAnsi="Wingdings" w:hint="default"/>
+        <w:sz w:val="20"/>
+      </w:rPr>
+    </w:lvl>
+  </w:abstractNum>
+  <w:abstractNum w:abstractNumId="17" w15:restartNumberingAfterBreak="0">
     <w:nsid w:val="76A84B46"/>
     <w:multiLevelType w:val="hybridMultilevel"/>
     <w:tmpl w:val="C6A6513A"/>
@@ -9630,40 +12102,52 @@
     <w:abstractNumId w:val="2"/>
   </w:num>
   <w:num w:numId="3" w16cid:durableId="832062217">
+    <w:abstractNumId w:val="17"/>
+  </w:num>
+  <w:num w:numId="4" w16cid:durableId="1215237999">
+    <w:abstractNumId w:val="7"/>
+  </w:num>
+  <w:num w:numId="5" w16cid:durableId="952397004">
+    <w:abstractNumId w:val="4"/>
+  </w:num>
+  <w:num w:numId="6" w16cid:durableId="1734310147">
+    <w:abstractNumId w:val="9"/>
+  </w:num>
+  <w:num w:numId="7" w16cid:durableId="655379516">
+    <w:abstractNumId w:val="15"/>
+  </w:num>
+  <w:num w:numId="8" w16cid:durableId="1980303912">
     <w:abstractNumId w:val="13"/>
   </w:num>
-  <w:num w:numId="4" w16cid:durableId="1215237999">
-    <w:abstractNumId w:val="5"/>
-  </w:num>
-  <w:num w:numId="5" w16cid:durableId="952397004">
-    <w:abstractNumId w:val="3"/>
-  </w:num>
-  <w:num w:numId="6" w16cid:durableId="1734310147">
-    <w:abstractNumId w:val="7"/>
-  </w:num>
-  <w:num w:numId="7" w16cid:durableId="655379516">
-    <w:abstractNumId w:val="12"/>
-  </w:num>
-  <w:num w:numId="8" w16cid:durableId="1980303912">
-    <w:abstractNumId w:val="10"/>
-  </w:num>
   <w:num w:numId="9" w16cid:durableId="1230191484">
-    <w:abstractNumId w:val="9"/>
+    <w:abstractNumId w:val="11"/>
   </w:num>
   <w:num w:numId="10" w16cid:durableId="1816606018">
     <w:abstractNumId w:val="0"/>
   </w:num>
   <w:num w:numId="11" w16cid:durableId="1369716825">
+    <w:abstractNumId w:val="8"/>
+  </w:num>
+  <w:num w:numId="12" w16cid:durableId="132413389">
+    <w:abstractNumId w:val="14"/>
+  </w:num>
+  <w:num w:numId="13" w16cid:durableId="483476165">
+    <w:abstractNumId w:val="10"/>
+  </w:num>
+  <w:num w:numId="14" w16cid:durableId="214657024">
     <w:abstractNumId w:val="6"/>
   </w:num>
-  <w:num w:numId="12" w16cid:durableId="132413389">
-    <w:abstractNumId w:val="11"/>
+  <w:num w:numId="15" w16cid:durableId="410852026">
+    <w:abstractNumId w:val="3"/>
   </w:num>
-  <w:num w:numId="13" w16cid:durableId="483476165">
-    <w:abstractNumId w:val="8"/>
+  <w:num w:numId="16" w16cid:durableId="1022241646">
+    <w:abstractNumId w:val="12"/>
   </w:num>
-  <w:num w:numId="14" w16cid:durableId="214657024">
-    <w:abstractNumId w:val="4"/>
+  <w:num w:numId="17" w16cid:durableId="1465538048">
+    <w:abstractNumId w:val="5"/>
+  </w:num>
+  <w:num w:numId="18" w16cid:durableId="2713027">
+    <w:abstractNumId w:val="16"/>
   </w:num>
 </w:numbering>
 </file>

</xml_diff>

<commit_message>
refactor: structuration du code en fonctions autonomes (Partie 9)
</commit_message>
<xml_diff>
--- a/pratiquePython.docx
+++ b/pratiquePython.docx
@@ -8257,13 +8257,7 @@
       </w:r>
       <w:proofErr w:type="gramStart"/>
       <w:r>
-        <w:t xml:space="preserve"> </w:t>
-      </w:r>
-      <w:r>
-        <w:t xml:space="preserve">  </w:t>
-      </w:r>
-      <w:r>
-        <w:t>(</w:t>
+        <w:t xml:space="preserve">   (</w:t>
       </w:r>
       <w:proofErr w:type="spellStart"/>
       <w:proofErr w:type="gramEnd"/>
@@ -8509,6 +8503,7 @@
           <w:rFonts w:ascii="Times New Roman" w:hAnsi="Times New Roman" w:cs="Times New Roman"/>
           <w:b/>
           <w:bCs/>
+          <w:noProof/>
           <w:sz w:val="24"/>
           <w:szCs w:val="24"/>
         </w:rPr>
@@ -8672,6 +8667,7 @@
           <w:rFonts w:ascii="Times New Roman" w:hAnsi="Times New Roman" w:cs="Times New Roman"/>
           <w:b/>
           <w:bCs/>
+          <w:noProof/>
           <w:sz w:val="24"/>
           <w:szCs w:val="24"/>
         </w:rPr>
@@ -8794,6 +8790,7 @@
           <w:rFonts w:ascii="Times New Roman" w:hAnsi="Times New Roman" w:cs="Times New Roman"/>
           <w:b/>
           <w:bCs/>
+          <w:noProof/>
           <w:sz w:val="24"/>
           <w:szCs w:val="24"/>
         </w:rPr>
@@ -8974,6 +8971,7 @@
           <w:rFonts w:ascii="Times New Roman" w:hAnsi="Times New Roman" w:cs="Times New Roman"/>
           <w:b/>
           <w:bCs/>
+          <w:noProof/>
           <w:sz w:val="24"/>
           <w:szCs w:val="24"/>
         </w:rPr>
@@ -9143,6 +9141,7 @@
           <w:rFonts w:ascii="Times New Roman" w:hAnsi="Times New Roman" w:cs="Times New Roman"/>
           <w:b/>
           <w:bCs/>
+          <w:noProof/>
           <w:sz w:val="24"/>
           <w:szCs w:val="24"/>
         </w:rPr>
@@ -9271,6 +9270,7 @@
       <w:r>
         <w:rPr>
           <w:rFonts w:ascii="Times New Roman" w:eastAsia="Consolas" w:hAnsi="Times New Roman" w:cs="Times New Roman"/>
+          <w:noProof/>
           <w:sz w:val="24"/>
           <w:szCs w:val="24"/>
         </w:rPr>
@@ -9347,27 +9347,7 @@
           <w:sz w:val="24"/>
           <w:szCs w:val="24"/>
         </w:rPr>
-        <w:t xml:space="preserve">Résultat à l'exécution — </w:t>
-      </w:r>
-      <w:r>
-        <w:rPr>
-          <w:rFonts w:ascii="Times New Roman" w:hAnsi="Times New Roman" w:cs="Times New Roman"/>
-          <w:b/>
-          <w:bCs/>
-          <w:sz w:val="24"/>
-          <w:szCs w:val="24"/>
-        </w:rPr>
-        <w:t xml:space="preserve">option modification </w:t>
-      </w:r>
-      <w:r>
-        <w:rPr>
-          <w:rFonts w:ascii="Times New Roman" w:hAnsi="Times New Roman" w:cs="Times New Roman"/>
-          <w:b/>
-          <w:bCs/>
-          <w:sz w:val="24"/>
-          <w:szCs w:val="24"/>
-        </w:rPr>
-        <w:t>:</w:t>
+        <w:t>Résultat à l'exécution — option modification :</w:t>
       </w:r>
       <w:r>
         <w:rPr>
@@ -9390,6 +9370,7 @@
       <w:r>
         <w:rPr>
           <w:rFonts w:ascii="Times New Roman" w:hAnsi="Times New Roman" w:cs="Times New Roman"/>
+          <w:noProof/>
           <w:sz w:val="24"/>
           <w:szCs w:val="24"/>
         </w:rPr>
@@ -9687,6 +9668,1683 @@
     </w:p>
     <w:p>
       <w:pPr>
+        <w:pStyle w:val="Titre1"/>
+      </w:pPr>
+      <w:r>
+        <w:t>Partie 9 — Fonctions</w:t>
+      </w:r>
+    </w:p>
+    <w:p>
+      <w:pPr>
+        <w:pStyle w:val="lev1"/>
+      </w:pPr>
+      <w:r>
+        <w:t>Cette section traite de la modularisation et de la structuration du code. Elle vise à découper la logique métier en fonctions autonomes et réutilisables afin de rendre le programme plus lisible, maintenable et évolutif.</w:t>
+      </w:r>
+    </w:p>
+    <w:tbl>
+      <w:tblPr>
+        <w:tblW w:w="5000" w:type="pct"/>
+        <w:tblBorders>
+          <w:top w:val="single" w:sz="4" w:space="0" w:color="2E5395"/>
+          <w:left w:val="single" w:sz="4" w:space="0" w:color="2E5395"/>
+          <w:bottom w:val="single" w:sz="4" w:space="0" w:color="2E5395"/>
+          <w:right w:val="single" w:sz="4" w:space="0" w:color="2E5395"/>
+          <w:insideH w:val="single" w:sz="4" w:space="0" w:color="auto"/>
+          <w:insideV w:val="single" w:sz="4" w:space="0" w:color="auto"/>
+        </w:tblBorders>
+        <w:shd w:val="clear" w:color="auto" w:fill="FFC000" w:themeFill="accent4"/>
+        <w:tblCellMar>
+          <w:left w:w="10" w:type="dxa"/>
+          <w:right w:w="10" w:type="dxa"/>
+        </w:tblCellMar>
+        <w:tblLook w:val="04A0" w:firstRow="1" w:lastRow="0" w:firstColumn="1" w:lastColumn="0" w:noHBand="0" w:noVBand="1"/>
+      </w:tblPr>
+      <w:tblGrid>
+        <w:gridCol w:w="10480"/>
+      </w:tblGrid>
+      <w:tr>
+        <w:tc>
+          <w:tcPr>
+            <w:tcW w:w="0" w:type="auto"/>
+            <w:tcBorders>
+              <w:top w:val="single" w:sz="4" w:space="0" w:color="2E5395"/>
+              <w:left w:val="single" w:sz="4" w:space="0" w:color="2E5395"/>
+              <w:bottom w:val="single" w:sz="4" w:space="0" w:color="2E5395"/>
+              <w:right w:val="single" w:sz="4" w:space="0" w:color="2E5395"/>
+            </w:tcBorders>
+            <w:shd w:val="clear" w:color="auto" w:fill="FFC000" w:themeFill="accent4"/>
+            <w:tcMar>
+              <w:top w:w="150" w:type="dxa"/>
+              <w:left w:w="200" w:type="dxa"/>
+              <w:bottom w:w="150" w:type="dxa"/>
+              <w:right w:w="200" w:type="dxa"/>
+            </w:tcMar>
+            <w:hideMark/>
+          </w:tcPr>
+          <w:p>
+            <w:r>
+              <w:rPr>
+                <w:b/>
+                <w:bCs/>
+                <w:color w:val="2E5395"/>
+              </w:rPr>
+              <w:t xml:space="preserve">Question 14 — </w:t>
+            </w:r>
+            <w:r>
+              <w:rPr>
+                <w:i/>
+                <w:iCs/>
+              </w:rPr>
+              <w:t xml:space="preserve">Refactorisez le programme en créant les fonctions : </w:t>
+            </w:r>
+            <w:proofErr w:type="spellStart"/>
+            <w:r>
+              <w:rPr>
+                <w:i/>
+                <w:iCs/>
+              </w:rPr>
+              <w:t>afficher_</w:t>
+            </w:r>
+            <w:proofErr w:type="gramStart"/>
+            <w:r>
+              <w:rPr>
+                <w:i/>
+                <w:iCs/>
+              </w:rPr>
+              <w:t>menu</w:t>
+            </w:r>
+            <w:proofErr w:type="spellEnd"/>
+            <w:r>
+              <w:rPr>
+                <w:i/>
+                <w:iCs/>
+              </w:rPr>
+              <w:t>(</w:t>
+            </w:r>
+            <w:proofErr w:type="gramEnd"/>
+            <w:r>
+              <w:rPr>
+                <w:i/>
+                <w:iCs/>
+              </w:rPr>
+              <w:t xml:space="preserve">), </w:t>
+            </w:r>
+            <w:proofErr w:type="spellStart"/>
+            <w:r>
+              <w:rPr>
+                <w:i/>
+                <w:iCs/>
+              </w:rPr>
+              <w:t>ajouter_dataset</w:t>
+            </w:r>
+            <w:proofErr w:type="spellEnd"/>
+            <w:r>
+              <w:rPr>
+                <w:i/>
+                <w:iCs/>
+              </w:rPr>
+              <w:t xml:space="preserve">(), </w:t>
+            </w:r>
+            <w:proofErr w:type="spellStart"/>
+            <w:r>
+              <w:rPr>
+                <w:i/>
+                <w:iCs/>
+              </w:rPr>
+              <w:t>afficher_datasets</w:t>
+            </w:r>
+            <w:proofErr w:type="spellEnd"/>
+            <w:r>
+              <w:rPr>
+                <w:i/>
+                <w:iCs/>
+              </w:rPr>
+              <w:t xml:space="preserve">(), </w:t>
+            </w:r>
+            <w:proofErr w:type="spellStart"/>
+            <w:r>
+              <w:rPr>
+                <w:i/>
+                <w:iCs/>
+              </w:rPr>
+              <w:t>supprimer_dataset</w:t>
+            </w:r>
+            <w:proofErr w:type="spellEnd"/>
+            <w:r>
+              <w:rPr>
+                <w:i/>
+                <w:iCs/>
+              </w:rPr>
+              <w:t xml:space="preserve">(), </w:t>
+            </w:r>
+            <w:proofErr w:type="spellStart"/>
+            <w:r>
+              <w:rPr>
+                <w:i/>
+                <w:iCs/>
+              </w:rPr>
+              <w:t>rechercher_dataset</w:t>
+            </w:r>
+            <w:proofErr w:type="spellEnd"/>
+            <w:r>
+              <w:rPr>
+                <w:i/>
+                <w:iCs/>
+              </w:rPr>
+              <w:t xml:space="preserve">(), </w:t>
+            </w:r>
+            <w:proofErr w:type="spellStart"/>
+            <w:r>
+              <w:rPr>
+                <w:i/>
+                <w:iCs/>
+              </w:rPr>
+              <w:t>trier_dataset</w:t>
+            </w:r>
+            <w:proofErr w:type="spellEnd"/>
+            <w:r>
+              <w:rPr>
+                <w:i/>
+                <w:iCs/>
+              </w:rPr>
+              <w:t xml:space="preserve">(), </w:t>
+            </w:r>
+            <w:proofErr w:type="spellStart"/>
+            <w:r>
+              <w:rPr>
+                <w:i/>
+                <w:iCs/>
+              </w:rPr>
+              <w:t>modifier_dataset</w:t>
+            </w:r>
+            <w:proofErr w:type="spellEnd"/>
+            <w:r>
+              <w:rPr>
+                <w:i/>
+                <w:iCs/>
+              </w:rPr>
+              <w:t>(), sauvegarder(), recharger(), statistiques().</w:t>
+            </w:r>
+          </w:p>
+        </w:tc>
+      </w:tr>
+    </w:tbl>
+    <w:p>
+      <w:pPr>
+        <w:spacing w:before="150" w:after="80"/>
+      </w:pPr>
+      <w:r>
+        <w:lastRenderedPageBreak/>
+        <w:t xml:space="preserve">Refactorisation complète du code écrit depuis le début du projet au sein du fichier unique </w:t>
+      </w:r>
+      <w:r>
+        <w:rPr>
+          <w:rStyle w:val="CodeHTML"/>
+          <w:rFonts w:eastAsia="Calibri"/>
+        </w:rPr>
+        <w:t>main.py</w:t>
+      </w:r>
+      <w:r>
+        <w:t xml:space="preserve">. Chaque bloc d'instructions de la boucle principale est isolé dans une fonction dédiée, et le flux d'exécution global est centralisé dans la fonction principale </w:t>
+      </w:r>
+      <w:proofErr w:type="gramStart"/>
+      <w:r>
+        <w:rPr>
+          <w:rStyle w:val="CodeHTML"/>
+          <w:rFonts w:eastAsia="Calibri"/>
+        </w:rPr>
+        <w:t>main(</w:t>
+      </w:r>
+      <w:proofErr w:type="gramEnd"/>
+      <w:r>
+        <w:rPr>
+          <w:rStyle w:val="CodeHTML"/>
+          <w:rFonts w:eastAsia="Calibri"/>
+        </w:rPr>
+        <w:t>)</w:t>
+      </w:r>
+      <w:r>
+        <w:t xml:space="preserve">. </w:t>
+      </w:r>
+    </w:p>
+    <w:p>
+      <w:pPr>
+        <w:spacing w:before="150" w:after="80"/>
+      </w:pPr>
+      <w:r>
+        <w:rPr>
+          <w:b/>
+          <w:bCs/>
+          <w:color w:val="1F3864"/>
+          <w:sz w:val="21"/>
+          <w:szCs w:val="21"/>
+        </w:rPr>
+        <w:t>Code (main.py) — extrait :</w:t>
+      </w:r>
+      <w:r>
+        <w:t xml:space="preserve"> </w:t>
+      </w:r>
+    </w:p>
+    <w:p>
+      <w:pPr>
+        <w:spacing w:before="150" w:after="80"/>
+      </w:pPr>
+      <w:r>
+        <w:drawing>
+          <wp:inline distT="0" distB="0" distL="0" distR="0" wp14:anchorId="0F002F74" wp14:editId="0BB50672">
+            <wp:extent cx="6400800" cy="4471670"/>
+            <wp:effectExtent l="0" t="0" r="0" b="0"/>
+            <wp:docPr id="1553600032" name="Image 33"/>
+            <wp:cNvGraphicFramePr>
+              <a:graphicFrameLocks xmlns:a="http://schemas.openxmlformats.org/drawingml/2006/main" noChangeAspect="1"/>
+            </wp:cNvGraphicFramePr>
+            <a:graphic xmlns:a="http://schemas.openxmlformats.org/drawingml/2006/main">
+              <a:graphicData uri="http://schemas.openxmlformats.org/drawingml/2006/picture">
+                <pic:pic xmlns:pic="http://schemas.openxmlformats.org/drawingml/2006/picture">
+                  <pic:nvPicPr>
+                    <pic:cNvPr id="1553600032" name=""/>
+                    <pic:cNvPicPr/>
+                  </pic:nvPicPr>
+                  <pic:blipFill>
+                    <a:blip r:embed="rId37"/>
+                    <a:stretch>
+                      <a:fillRect/>
+                    </a:stretch>
+                  </pic:blipFill>
+                  <pic:spPr>
+                    <a:xfrm>
+                      <a:off x="0" y="0"/>
+                      <a:ext cx="6400800" cy="4471670"/>
+                    </a:xfrm>
+                    <a:prstGeom prst="rect">
+                      <a:avLst/>
+                    </a:prstGeom>
+                  </pic:spPr>
+                </pic:pic>
+              </a:graphicData>
+            </a:graphic>
+          </wp:inline>
+        </w:drawing>
+      </w:r>
+    </w:p>
+    <w:p>
+      <w:pPr>
+        <w:spacing w:before="150" w:after="80"/>
+      </w:pPr>
+      <w:r>
+        <w:t xml:space="preserve">L'extrait montre l'organisation modulaire du fichier </w:t>
+      </w:r>
+      <w:r>
+        <w:rPr>
+          <w:rStyle w:val="CodeHTML"/>
+          <w:rFonts w:eastAsia="Calibri"/>
+        </w:rPr>
+        <w:t>main.py</w:t>
+      </w:r>
+      <w:r>
+        <w:t xml:space="preserve"> avec la déclaration des fonctions clés telles que </w:t>
+      </w:r>
+      <w:proofErr w:type="spellStart"/>
+      <w:r>
+        <w:rPr>
+          <w:rStyle w:val="CodeHTML"/>
+          <w:rFonts w:eastAsia="Calibri"/>
+        </w:rPr>
+        <w:t>afficher_</w:t>
+      </w:r>
+      <w:proofErr w:type="gramStart"/>
+      <w:r>
+        <w:rPr>
+          <w:rStyle w:val="CodeHTML"/>
+          <w:rFonts w:eastAsia="Calibri"/>
+        </w:rPr>
+        <w:t>menu</w:t>
+      </w:r>
+      <w:proofErr w:type="spellEnd"/>
+      <w:r>
+        <w:rPr>
+          <w:rStyle w:val="CodeHTML"/>
+          <w:rFonts w:eastAsia="Calibri"/>
+        </w:rPr>
+        <w:t>(</w:t>
+      </w:r>
+      <w:proofErr w:type="gramEnd"/>
+      <w:r>
+        <w:rPr>
+          <w:rStyle w:val="CodeHTML"/>
+          <w:rFonts w:eastAsia="Calibri"/>
+        </w:rPr>
+        <w:t>)</w:t>
+      </w:r>
+      <w:r>
+        <w:t xml:space="preserve">, </w:t>
+      </w:r>
+      <w:proofErr w:type="spellStart"/>
+      <w:r>
+        <w:rPr>
+          <w:rStyle w:val="CodeHTML"/>
+          <w:rFonts w:eastAsia="Calibri"/>
+        </w:rPr>
+        <w:t>ajouter_dataset</w:t>
+      </w:r>
+      <w:proofErr w:type="spellEnd"/>
+      <w:r>
+        <w:rPr>
+          <w:rStyle w:val="CodeHTML"/>
+          <w:rFonts w:eastAsia="Calibri"/>
+        </w:rPr>
+        <w:t>()</w:t>
+      </w:r>
+      <w:r>
+        <w:t xml:space="preserve">, </w:t>
+      </w:r>
+      <w:proofErr w:type="spellStart"/>
+      <w:r>
+        <w:rPr>
+          <w:rStyle w:val="CodeHTML"/>
+          <w:rFonts w:eastAsia="Calibri"/>
+        </w:rPr>
+        <w:t>afficher_datasets</w:t>
+      </w:r>
+      <w:proofErr w:type="spellEnd"/>
+      <w:r>
+        <w:rPr>
+          <w:rStyle w:val="CodeHTML"/>
+          <w:rFonts w:eastAsia="Calibri"/>
+        </w:rPr>
+        <w:t>()</w:t>
+      </w:r>
+      <w:r>
+        <w:t xml:space="preserve"> et </w:t>
+      </w:r>
+      <w:proofErr w:type="spellStart"/>
+      <w:r>
+        <w:rPr>
+          <w:rStyle w:val="CodeHTML"/>
+          <w:rFonts w:eastAsia="Calibri"/>
+        </w:rPr>
+        <w:t>rechercher_dataset</w:t>
+      </w:r>
+      <w:proofErr w:type="spellEnd"/>
+      <w:r>
+        <w:rPr>
+          <w:rStyle w:val="CodeHTML"/>
+          <w:rFonts w:eastAsia="Calibri"/>
+        </w:rPr>
+        <w:t>()</w:t>
+      </w:r>
+      <w:r>
+        <w:t xml:space="preserve">. Chaque fonction reçoit la liste </w:t>
+      </w:r>
+      <w:proofErr w:type="spellStart"/>
+      <w:r>
+        <w:rPr>
+          <w:rStyle w:val="CodeHTML"/>
+          <w:rFonts w:eastAsia="Calibri"/>
+        </w:rPr>
+        <w:t>catalogue_data</w:t>
+      </w:r>
+      <w:proofErr w:type="spellEnd"/>
+      <w:r>
+        <w:t xml:space="preserve"> en paramètre et dispose d'une </w:t>
+      </w:r>
+      <w:proofErr w:type="spellStart"/>
+      <w:r>
+        <w:t>docstring</w:t>
+      </w:r>
+      <w:proofErr w:type="spellEnd"/>
+      <w:r>
+        <w:t xml:space="preserve"> expliquant son rôle.</w:t>
+      </w:r>
+    </w:p>
+    <w:p>
+      <w:pPr>
+        <w:spacing w:before="150" w:after="80"/>
+      </w:pPr>
+    </w:p>
+    <w:tbl>
+      <w:tblPr>
+        <w:tblW w:w="5000" w:type="pct"/>
+        <w:tblBorders>
+          <w:top w:val="single" w:sz="4" w:space="0" w:color="auto"/>
+          <w:left w:val="single" w:sz="4" w:space="0" w:color="auto"/>
+          <w:bottom w:val="single" w:sz="4" w:space="0" w:color="auto"/>
+          <w:insideH w:val="single" w:sz="4" w:space="0" w:color="auto"/>
+          <w:insideV w:val="single" w:sz="4" w:space="0" w:color="auto"/>
+        </w:tblBorders>
+        <w:tblCellMar>
+          <w:left w:w="10" w:type="dxa"/>
+          <w:right w:w="10" w:type="dxa"/>
+        </w:tblCellMar>
+        <w:tblLook w:val="04A0" w:firstRow="1" w:lastRow="0" w:firstColumn="1" w:lastColumn="0" w:noHBand="0" w:noVBand="1"/>
+      </w:tblPr>
+      <w:tblGrid>
+        <w:gridCol w:w="3329"/>
+        <w:gridCol w:w="6991"/>
+      </w:tblGrid>
+      <w:tr>
+        <w:tc>
+          <w:tcPr>
+            <w:tcW w:w="3000" w:type="dxa"/>
+            <w:shd w:val="clear" w:color="auto" w:fill="FFC000" w:themeFill="accent4"/>
+            <w:tcMar>
+              <w:top w:w="90" w:type="dxa"/>
+              <w:left w:w="120" w:type="dxa"/>
+              <w:bottom w:w="90" w:type="dxa"/>
+              <w:right w:w="120" w:type="dxa"/>
+            </w:tcMar>
+            <w:vAlign w:val="center"/>
+            <w:hideMark/>
+          </w:tcPr>
+          <w:p>
+            <w:r>
+              <w:rPr>
+                <w:b/>
+                <w:bCs/>
+                <w:sz w:val="19"/>
+                <w:szCs w:val="19"/>
+              </w:rPr>
+              <w:t>Fonction demandée</w:t>
+            </w:r>
+          </w:p>
+        </w:tc>
+        <w:tc>
+          <w:tcPr>
+            <w:tcW w:w="6300" w:type="dxa"/>
+            <w:shd w:val="clear" w:color="auto" w:fill="FFC000" w:themeFill="accent4"/>
+            <w:tcMar>
+              <w:top w:w="90" w:type="dxa"/>
+              <w:left w:w="120" w:type="dxa"/>
+              <w:bottom w:w="90" w:type="dxa"/>
+              <w:right w:w="120" w:type="dxa"/>
+            </w:tcMar>
+            <w:vAlign w:val="center"/>
+            <w:hideMark/>
+          </w:tcPr>
+          <w:p>
+            <w:r>
+              <w:rPr>
+                <w:b/>
+                <w:bCs/>
+                <w:sz w:val="19"/>
+                <w:szCs w:val="19"/>
+              </w:rPr>
+              <w:t>Rôle</w:t>
+            </w:r>
+          </w:p>
+        </w:tc>
+      </w:tr>
+      <w:tr>
+        <w:tc>
+          <w:tcPr>
+            <w:tcW w:w="3000" w:type="dxa"/>
+            <w:shd w:val="clear" w:color="auto" w:fill="FFFFFF"/>
+            <w:tcMar>
+              <w:top w:w="90" w:type="dxa"/>
+              <w:left w:w="120" w:type="dxa"/>
+              <w:bottom w:w="90" w:type="dxa"/>
+              <w:right w:w="120" w:type="dxa"/>
+            </w:tcMar>
+            <w:vAlign w:val="center"/>
+            <w:hideMark/>
+          </w:tcPr>
+          <w:p>
+            <w:proofErr w:type="spellStart"/>
+            <w:proofErr w:type="gramStart"/>
+            <w:r>
+              <w:rPr>
+                <w:color w:val="000000"/>
+                <w:sz w:val="19"/>
+                <w:szCs w:val="19"/>
+              </w:rPr>
+              <w:t>afficher</w:t>
+            </w:r>
+            <w:proofErr w:type="gramEnd"/>
+            <w:r>
+              <w:rPr>
+                <w:color w:val="000000"/>
+                <w:sz w:val="19"/>
+                <w:szCs w:val="19"/>
+              </w:rPr>
+              <w:t>_menu</w:t>
+            </w:r>
+            <w:proofErr w:type="spellEnd"/>
+            <w:r>
+              <w:rPr>
+                <w:color w:val="000000"/>
+                <w:sz w:val="19"/>
+                <w:szCs w:val="19"/>
+              </w:rPr>
+              <w:t>()</w:t>
+            </w:r>
+          </w:p>
+        </w:tc>
+        <w:tc>
+          <w:tcPr>
+            <w:tcW w:w="6300" w:type="dxa"/>
+            <w:shd w:val="clear" w:color="auto" w:fill="FFFFFF"/>
+            <w:tcMar>
+              <w:top w:w="90" w:type="dxa"/>
+              <w:left w:w="120" w:type="dxa"/>
+              <w:bottom w:w="90" w:type="dxa"/>
+              <w:right w:w="120" w:type="dxa"/>
+            </w:tcMar>
+            <w:vAlign w:val="center"/>
+            <w:hideMark/>
+          </w:tcPr>
+          <w:p>
+            <w:r>
+              <w:rPr>
+                <w:color w:val="000000"/>
+                <w:sz w:val="19"/>
+                <w:szCs w:val="19"/>
+              </w:rPr>
+              <w:t>Affiche le menu interactif</w:t>
+            </w:r>
+          </w:p>
+        </w:tc>
+      </w:tr>
+      <w:tr>
+        <w:tc>
+          <w:tcPr>
+            <w:tcW w:w="3000" w:type="dxa"/>
+            <w:shd w:val="clear" w:color="auto" w:fill="F2F2F2"/>
+            <w:tcMar>
+              <w:top w:w="90" w:type="dxa"/>
+              <w:left w:w="120" w:type="dxa"/>
+              <w:bottom w:w="90" w:type="dxa"/>
+              <w:right w:w="120" w:type="dxa"/>
+            </w:tcMar>
+            <w:vAlign w:val="center"/>
+            <w:hideMark/>
+          </w:tcPr>
+          <w:p>
+            <w:proofErr w:type="spellStart"/>
+            <w:proofErr w:type="gramStart"/>
+            <w:r>
+              <w:rPr>
+                <w:color w:val="000000"/>
+                <w:sz w:val="19"/>
+                <w:szCs w:val="19"/>
+              </w:rPr>
+              <w:t>ajouter</w:t>
+            </w:r>
+            <w:proofErr w:type="gramEnd"/>
+            <w:r>
+              <w:rPr>
+                <w:color w:val="000000"/>
+                <w:sz w:val="19"/>
+                <w:szCs w:val="19"/>
+              </w:rPr>
+              <w:t>_dataset</w:t>
+            </w:r>
+            <w:proofErr w:type="spellEnd"/>
+            <w:r>
+              <w:rPr>
+                <w:color w:val="000000"/>
+                <w:sz w:val="19"/>
+                <w:szCs w:val="19"/>
+              </w:rPr>
+              <w:t>()</w:t>
+            </w:r>
+          </w:p>
+        </w:tc>
+        <w:tc>
+          <w:tcPr>
+            <w:tcW w:w="6300" w:type="dxa"/>
+            <w:shd w:val="clear" w:color="auto" w:fill="F2F2F2"/>
+            <w:tcMar>
+              <w:top w:w="90" w:type="dxa"/>
+              <w:left w:w="120" w:type="dxa"/>
+              <w:bottom w:w="90" w:type="dxa"/>
+              <w:right w:w="120" w:type="dxa"/>
+            </w:tcMar>
+            <w:vAlign w:val="center"/>
+            <w:hideMark/>
+          </w:tcPr>
+          <w:p>
+            <w:r>
+              <w:rPr>
+                <w:color w:val="000000"/>
+                <w:sz w:val="19"/>
+                <w:szCs w:val="19"/>
+              </w:rPr>
+              <w:t xml:space="preserve">Saisit un </w:t>
+            </w:r>
+            <w:proofErr w:type="spellStart"/>
+            <w:r>
+              <w:rPr>
+                <w:color w:val="000000"/>
+                <w:sz w:val="19"/>
+                <w:szCs w:val="19"/>
+              </w:rPr>
+              <w:t>dataset</w:t>
+            </w:r>
+            <w:proofErr w:type="spellEnd"/>
+            <w:r>
+              <w:rPr>
+                <w:color w:val="000000"/>
+                <w:sz w:val="19"/>
+                <w:szCs w:val="19"/>
+              </w:rPr>
+              <w:t xml:space="preserve"> et l'ajoute au catalogue</w:t>
+            </w:r>
+          </w:p>
+        </w:tc>
+      </w:tr>
+      <w:tr>
+        <w:tc>
+          <w:tcPr>
+            <w:tcW w:w="3000" w:type="dxa"/>
+            <w:shd w:val="clear" w:color="auto" w:fill="FFFFFF"/>
+            <w:tcMar>
+              <w:top w:w="90" w:type="dxa"/>
+              <w:left w:w="120" w:type="dxa"/>
+              <w:bottom w:w="90" w:type="dxa"/>
+              <w:right w:w="120" w:type="dxa"/>
+            </w:tcMar>
+            <w:vAlign w:val="center"/>
+            <w:hideMark/>
+          </w:tcPr>
+          <w:p>
+            <w:proofErr w:type="spellStart"/>
+            <w:proofErr w:type="gramStart"/>
+            <w:r>
+              <w:rPr>
+                <w:color w:val="000000"/>
+                <w:sz w:val="19"/>
+                <w:szCs w:val="19"/>
+              </w:rPr>
+              <w:t>afficher</w:t>
+            </w:r>
+            <w:proofErr w:type="gramEnd"/>
+            <w:r>
+              <w:rPr>
+                <w:color w:val="000000"/>
+                <w:sz w:val="19"/>
+                <w:szCs w:val="19"/>
+              </w:rPr>
+              <w:t>_datasets</w:t>
+            </w:r>
+            <w:proofErr w:type="spellEnd"/>
+            <w:r>
+              <w:rPr>
+                <w:color w:val="000000"/>
+                <w:sz w:val="19"/>
+                <w:szCs w:val="19"/>
+              </w:rPr>
+              <w:t>()</w:t>
+            </w:r>
+          </w:p>
+        </w:tc>
+        <w:tc>
+          <w:tcPr>
+            <w:tcW w:w="6300" w:type="dxa"/>
+            <w:shd w:val="clear" w:color="auto" w:fill="FFFFFF"/>
+            <w:tcMar>
+              <w:top w:w="90" w:type="dxa"/>
+              <w:left w:w="120" w:type="dxa"/>
+              <w:bottom w:w="90" w:type="dxa"/>
+              <w:right w:w="120" w:type="dxa"/>
+            </w:tcMar>
+            <w:vAlign w:val="center"/>
+            <w:hideMark/>
+          </w:tcPr>
+          <w:p>
+            <w:r>
+              <w:rPr>
+                <w:color w:val="000000"/>
+                <w:sz w:val="19"/>
+                <w:szCs w:val="19"/>
+              </w:rPr>
+              <w:t>Affiche le catalogue</w:t>
+            </w:r>
+          </w:p>
+        </w:tc>
+      </w:tr>
+      <w:tr>
+        <w:tc>
+          <w:tcPr>
+            <w:tcW w:w="3000" w:type="dxa"/>
+            <w:shd w:val="clear" w:color="auto" w:fill="F2F2F2"/>
+            <w:tcMar>
+              <w:top w:w="90" w:type="dxa"/>
+              <w:left w:w="120" w:type="dxa"/>
+              <w:bottom w:w="90" w:type="dxa"/>
+              <w:right w:w="120" w:type="dxa"/>
+            </w:tcMar>
+            <w:vAlign w:val="center"/>
+            <w:hideMark/>
+          </w:tcPr>
+          <w:p>
+            <w:proofErr w:type="spellStart"/>
+            <w:proofErr w:type="gramStart"/>
+            <w:r>
+              <w:rPr>
+                <w:color w:val="000000"/>
+                <w:sz w:val="19"/>
+                <w:szCs w:val="19"/>
+              </w:rPr>
+              <w:t>rechercher</w:t>
+            </w:r>
+            <w:proofErr w:type="gramEnd"/>
+            <w:r>
+              <w:rPr>
+                <w:color w:val="000000"/>
+                <w:sz w:val="19"/>
+                <w:szCs w:val="19"/>
+              </w:rPr>
+              <w:t>_dataset</w:t>
+            </w:r>
+            <w:proofErr w:type="spellEnd"/>
+            <w:r>
+              <w:rPr>
+                <w:color w:val="000000"/>
+                <w:sz w:val="19"/>
+                <w:szCs w:val="19"/>
+              </w:rPr>
+              <w:t>()</w:t>
+            </w:r>
+          </w:p>
+        </w:tc>
+        <w:tc>
+          <w:tcPr>
+            <w:tcW w:w="6300" w:type="dxa"/>
+            <w:shd w:val="clear" w:color="auto" w:fill="F2F2F2"/>
+            <w:tcMar>
+              <w:top w:w="90" w:type="dxa"/>
+              <w:left w:w="120" w:type="dxa"/>
+              <w:bottom w:w="90" w:type="dxa"/>
+              <w:right w:w="120" w:type="dxa"/>
+            </w:tcMar>
+            <w:vAlign w:val="center"/>
+            <w:hideMark/>
+          </w:tcPr>
+          <w:p>
+            <w:r>
+              <w:rPr>
+                <w:color w:val="000000"/>
+                <w:sz w:val="19"/>
+                <w:szCs w:val="19"/>
+              </w:rPr>
+              <w:t xml:space="preserve">Recherche un </w:t>
+            </w:r>
+            <w:proofErr w:type="spellStart"/>
+            <w:r>
+              <w:rPr>
+                <w:color w:val="000000"/>
+                <w:sz w:val="19"/>
+                <w:szCs w:val="19"/>
+              </w:rPr>
+              <w:t>dataset</w:t>
+            </w:r>
+            <w:proofErr w:type="spellEnd"/>
+            <w:r>
+              <w:rPr>
+                <w:color w:val="000000"/>
+                <w:sz w:val="19"/>
+                <w:szCs w:val="19"/>
+              </w:rPr>
+              <w:t xml:space="preserve"> par son nom</w:t>
+            </w:r>
+          </w:p>
+        </w:tc>
+      </w:tr>
+      <w:tr>
+        <w:tc>
+          <w:tcPr>
+            <w:tcW w:w="3000" w:type="dxa"/>
+            <w:shd w:val="clear" w:color="auto" w:fill="FFFFFF"/>
+            <w:tcMar>
+              <w:top w:w="90" w:type="dxa"/>
+              <w:left w:w="120" w:type="dxa"/>
+              <w:bottom w:w="90" w:type="dxa"/>
+              <w:right w:w="120" w:type="dxa"/>
+            </w:tcMar>
+            <w:vAlign w:val="center"/>
+            <w:hideMark/>
+          </w:tcPr>
+          <w:p>
+            <w:proofErr w:type="spellStart"/>
+            <w:proofErr w:type="gramStart"/>
+            <w:r>
+              <w:rPr>
+                <w:color w:val="000000"/>
+                <w:sz w:val="19"/>
+                <w:szCs w:val="19"/>
+              </w:rPr>
+              <w:t>modifier</w:t>
+            </w:r>
+            <w:proofErr w:type="gramEnd"/>
+            <w:r>
+              <w:rPr>
+                <w:color w:val="000000"/>
+                <w:sz w:val="19"/>
+                <w:szCs w:val="19"/>
+              </w:rPr>
+              <w:t>_dataset</w:t>
+            </w:r>
+            <w:proofErr w:type="spellEnd"/>
+            <w:r>
+              <w:rPr>
+                <w:color w:val="000000"/>
+                <w:sz w:val="19"/>
+                <w:szCs w:val="19"/>
+              </w:rPr>
+              <w:t>()</w:t>
+            </w:r>
+          </w:p>
+        </w:tc>
+        <w:tc>
+          <w:tcPr>
+            <w:tcW w:w="6300" w:type="dxa"/>
+            <w:shd w:val="clear" w:color="auto" w:fill="FFFFFF"/>
+            <w:tcMar>
+              <w:top w:w="90" w:type="dxa"/>
+              <w:left w:w="120" w:type="dxa"/>
+              <w:bottom w:w="90" w:type="dxa"/>
+              <w:right w:w="120" w:type="dxa"/>
+            </w:tcMar>
+            <w:vAlign w:val="center"/>
+            <w:hideMark/>
+          </w:tcPr>
+          <w:p>
+            <w:r>
+              <w:rPr>
+                <w:color w:val="000000"/>
+                <w:sz w:val="19"/>
+                <w:szCs w:val="19"/>
+              </w:rPr>
+              <w:t xml:space="preserve">Modifie un </w:t>
+            </w:r>
+            <w:proofErr w:type="spellStart"/>
+            <w:r>
+              <w:rPr>
+                <w:color w:val="000000"/>
+                <w:sz w:val="19"/>
+                <w:szCs w:val="19"/>
+              </w:rPr>
+              <w:t>dataset</w:t>
+            </w:r>
+            <w:proofErr w:type="spellEnd"/>
+            <w:r>
+              <w:rPr>
+                <w:color w:val="000000"/>
+                <w:sz w:val="19"/>
+                <w:szCs w:val="19"/>
+              </w:rPr>
+              <w:t xml:space="preserve"> existant</w:t>
+            </w:r>
+          </w:p>
+        </w:tc>
+      </w:tr>
+      <w:tr>
+        <w:tc>
+          <w:tcPr>
+            <w:tcW w:w="3000" w:type="dxa"/>
+            <w:shd w:val="clear" w:color="auto" w:fill="F2F2F2"/>
+            <w:tcMar>
+              <w:top w:w="90" w:type="dxa"/>
+              <w:left w:w="120" w:type="dxa"/>
+              <w:bottom w:w="90" w:type="dxa"/>
+              <w:right w:w="120" w:type="dxa"/>
+            </w:tcMar>
+            <w:vAlign w:val="center"/>
+            <w:hideMark/>
+          </w:tcPr>
+          <w:p>
+            <w:proofErr w:type="spellStart"/>
+            <w:proofErr w:type="gramStart"/>
+            <w:r>
+              <w:rPr>
+                <w:color w:val="000000"/>
+                <w:sz w:val="19"/>
+                <w:szCs w:val="19"/>
+              </w:rPr>
+              <w:t>supprimer</w:t>
+            </w:r>
+            <w:proofErr w:type="gramEnd"/>
+            <w:r>
+              <w:rPr>
+                <w:color w:val="000000"/>
+                <w:sz w:val="19"/>
+                <w:szCs w:val="19"/>
+              </w:rPr>
+              <w:t>_dataset</w:t>
+            </w:r>
+            <w:proofErr w:type="spellEnd"/>
+            <w:r>
+              <w:rPr>
+                <w:color w:val="000000"/>
+                <w:sz w:val="19"/>
+                <w:szCs w:val="19"/>
+              </w:rPr>
+              <w:t>()</w:t>
+            </w:r>
+          </w:p>
+        </w:tc>
+        <w:tc>
+          <w:tcPr>
+            <w:tcW w:w="6300" w:type="dxa"/>
+            <w:shd w:val="clear" w:color="auto" w:fill="F2F2F2"/>
+            <w:tcMar>
+              <w:top w:w="90" w:type="dxa"/>
+              <w:left w:w="120" w:type="dxa"/>
+              <w:bottom w:w="90" w:type="dxa"/>
+              <w:right w:w="120" w:type="dxa"/>
+            </w:tcMar>
+            <w:vAlign w:val="center"/>
+            <w:hideMark/>
+          </w:tcPr>
+          <w:p>
+            <w:r>
+              <w:rPr>
+                <w:color w:val="000000"/>
+                <w:sz w:val="19"/>
+                <w:szCs w:val="19"/>
+              </w:rPr>
+              <w:t xml:space="preserve">Supprime un </w:t>
+            </w:r>
+            <w:proofErr w:type="spellStart"/>
+            <w:r>
+              <w:rPr>
+                <w:color w:val="000000"/>
+                <w:sz w:val="19"/>
+                <w:szCs w:val="19"/>
+              </w:rPr>
+              <w:t>dataset</w:t>
+            </w:r>
+            <w:proofErr w:type="spellEnd"/>
+            <w:r>
+              <w:rPr>
+                <w:color w:val="000000"/>
+                <w:sz w:val="19"/>
+                <w:szCs w:val="19"/>
+              </w:rPr>
+              <w:t xml:space="preserve"> du catalogue</w:t>
+            </w:r>
+          </w:p>
+        </w:tc>
+      </w:tr>
+      <w:tr>
+        <w:tc>
+          <w:tcPr>
+            <w:tcW w:w="3000" w:type="dxa"/>
+            <w:shd w:val="clear" w:color="auto" w:fill="FFFFFF"/>
+            <w:tcMar>
+              <w:top w:w="90" w:type="dxa"/>
+              <w:left w:w="120" w:type="dxa"/>
+              <w:bottom w:w="90" w:type="dxa"/>
+              <w:right w:w="120" w:type="dxa"/>
+            </w:tcMar>
+            <w:vAlign w:val="center"/>
+            <w:hideMark/>
+          </w:tcPr>
+          <w:p>
+            <w:proofErr w:type="spellStart"/>
+            <w:proofErr w:type="gramStart"/>
+            <w:r>
+              <w:rPr>
+                <w:color w:val="000000"/>
+                <w:sz w:val="19"/>
+                <w:szCs w:val="19"/>
+              </w:rPr>
+              <w:t>trier</w:t>
+            </w:r>
+            <w:proofErr w:type="gramEnd"/>
+            <w:r>
+              <w:rPr>
+                <w:color w:val="000000"/>
+                <w:sz w:val="19"/>
+                <w:szCs w:val="19"/>
+              </w:rPr>
+              <w:t>_dataset</w:t>
+            </w:r>
+            <w:proofErr w:type="spellEnd"/>
+            <w:r>
+              <w:rPr>
+                <w:color w:val="000000"/>
+                <w:sz w:val="19"/>
+                <w:szCs w:val="19"/>
+              </w:rPr>
+              <w:t>()</w:t>
+            </w:r>
+          </w:p>
+        </w:tc>
+        <w:tc>
+          <w:tcPr>
+            <w:tcW w:w="6300" w:type="dxa"/>
+            <w:shd w:val="clear" w:color="auto" w:fill="FFFFFF"/>
+            <w:tcMar>
+              <w:top w:w="90" w:type="dxa"/>
+              <w:left w:w="120" w:type="dxa"/>
+              <w:bottom w:w="90" w:type="dxa"/>
+              <w:right w:w="120" w:type="dxa"/>
+            </w:tcMar>
+            <w:vAlign w:val="center"/>
+            <w:hideMark/>
+          </w:tcPr>
+          <w:p>
+            <w:r>
+              <w:rPr>
+                <w:color w:val="000000"/>
+                <w:sz w:val="19"/>
+                <w:szCs w:val="19"/>
+              </w:rPr>
+              <w:t>Trie le catalogue</w:t>
+            </w:r>
+          </w:p>
+        </w:tc>
+      </w:tr>
+      <w:tr>
+        <w:tc>
+          <w:tcPr>
+            <w:tcW w:w="3000" w:type="dxa"/>
+            <w:shd w:val="clear" w:color="auto" w:fill="F2F2F2"/>
+            <w:tcMar>
+              <w:top w:w="90" w:type="dxa"/>
+              <w:left w:w="120" w:type="dxa"/>
+              <w:bottom w:w="90" w:type="dxa"/>
+              <w:right w:w="120" w:type="dxa"/>
+            </w:tcMar>
+            <w:vAlign w:val="center"/>
+            <w:hideMark/>
+          </w:tcPr>
+          <w:p>
+            <w:proofErr w:type="gramStart"/>
+            <w:r>
+              <w:rPr>
+                <w:color w:val="000000"/>
+                <w:sz w:val="19"/>
+                <w:szCs w:val="19"/>
+              </w:rPr>
+              <w:t>statistiques(</w:t>
+            </w:r>
+            <w:proofErr w:type="gramEnd"/>
+            <w:r>
+              <w:rPr>
+                <w:color w:val="000000"/>
+                <w:sz w:val="19"/>
+                <w:szCs w:val="19"/>
+              </w:rPr>
+              <w:t>)</w:t>
+            </w:r>
+          </w:p>
+        </w:tc>
+        <w:tc>
+          <w:tcPr>
+            <w:tcW w:w="6300" w:type="dxa"/>
+            <w:shd w:val="clear" w:color="auto" w:fill="F2F2F2"/>
+            <w:tcMar>
+              <w:top w:w="90" w:type="dxa"/>
+              <w:left w:w="120" w:type="dxa"/>
+              <w:bottom w:w="90" w:type="dxa"/>
+              <w:right w:w="120" w:type="dxa"/>
+            </w:tcMar>
+            <w:vAlign w:val="center"/>
+            <w:hideMark/>
+          </w:tcPr>
+          <w:p>
+            <w:r>
+              <w:rPr>
+                <w:color w:val="000000"/>
+                <w:sz w:val="19"/>
+                <w:szCs w:val="19"/>
+              </w:rPr>
+              <w:t>Calcule et affiche les statistiques</w:t>
+            </w:r>
+          </w:p>
+        </w:tc>
+      </w:tr>
+      <w:tr>
+        <w:tc>
+          <w:tcPr>
+            <w:tcW w:w="3000" w:type="dxa"/>
+            <w:shd w:val="clear" w:color="auto" w:fill="FFFFFF"/>
+            <w:tcMar>
+              <w:top w:w="90" w:type="dxa"/>
+              <w:left w:w="120" w:type="dxa"/>
+              <w:bottom w:w="90" w:type="dxa"/>
+              <w:right w:w="120" w:type="dxa"/>
+            </w:tcMar>
+            <w:vAlign w:val="center"/>
+            <w:hideMark/>
+          </w:tcPr>
+          <w:p>
+            <w:proofErr w:type="gramStart"/>
+            <w:r>
+              <w:rPr>
+                <w:color w:val="000000"/>
+                <w:sz w:val="19"/>
+                <w:szCs w:val="19"/>
+              </w:rPr>
+              <w:lastRenderedPageBreak/>
+              <w:t>sauvegarder(</w:t>
+            </w:r>
+            <w:proofErr w:type="gramEnd"/>
+            <w:r>
+              <w:rPr>
+                <w:color w:val="000000"/>
+                <w:sz w:val="19"/>
+                <w:szCs w:val="19"/>
+              </w:rPr>
+              <w:t>)</w:t>
+            </w:r>
+          </w:p>
+        </w:tc>
+        <w:tc>
+          <w:tcPr>
+            <w:tcW w:w="6300" w:type="dxa"/>
+            <w:shd w:val="clear" w:color="auto" w:fill="FFFFFF"/>
+            <w:tcMar>
+              <w:top w:w="90" w:type="dxa"/>
+              <w:left w:w="120" w:type="dxa"/>
+              <w:bottom w:w="90" w:type="dxa"/>
+              <w:right w:w="120" w:type="dxa"/>
+            </w:tcMar>
+            <w:vAlign w:val="center"/>
+            <w:hideMark/>
+          </w:tcPr>
+          <w:p>
+            <w:r>
+              <w:rPr>
+                <w:color w:val="000000"/>
+                <w:sz w:val="19"/>
+                <w:szCs w:val="19"/>
+              </w:rPr>
+              <w:t>Écrit le catalogue dans datasets.csv</w:t>
+            </w:r>
+          </w:p>
+        </w:tc>
+      </w:tr>
+      <w:tr>
+        <w:tc>
+          <w:tcPr>
+            <w:tcW w:w="3000" w:type="dxa"/>
+            <w:shd w:val="clear" w:color="auto" w:fill="F2F2F2"/>
+            <w:tcMar>
+              <w:top w:w="90" w:type="dxa"/>
+              <w:left w:w="120" w:type="dxa"/>
+              <w:bottom w:w="90" w:type="dxa"/>
+              <w:right w:w="120" w:type="dxa"/>
+            </w:tcMar>
+            <w:vAlign w:val="center"/>
+            <w:hideMark/>
+          </w:tcPr>
+          <w:p>
+            <w:proofErr w:type="gramStart"/>
+            <w:r>
+              <w:rPr>
+                <w:color w:val="000000"/>
+                <w:sz w:val="19"/>
+                <w:szCs w:val="19"/>
+              </w:rPr>
+              <w:t>recharger(</w:t>
+            </w:r>
+            <w:proofErr w:type="gramEnd"/>
+            <w:r>
+              <w:rPr>
+                <w:color w:val="000000"/>
+                <w:sz w:val="19"/>
+                <w:szCs w:val="19"/>
+              </w:rPr>
+              <w:t>)</w:t>
+            </w:r>
+          </w:p>
+        </w:tc>
+        <w:tc>
+          <w:tcPr>
+            <w:tcW w:w="6300" w:type="dxa"/>
+            <w:shd w:val="clear" w:color="auto" w:fill="F2F2F2"/>
+            <w:tcMar>
+              <w:top w:w="90" w:type="dxa"/>
+              <w:left w:w="120" w:type="dxa"/>
+              <w:bottom w:w="90" w:type="dxa"/>
+              <w:right w:w="120" w:type="dxa"/>
+            </w:tcMar>
+            <w:vAlign w:val="center"/>
+            <w:hideMark/>
+          </w:tcPr>
+          <w:p>
+            <w:r>
+              <w:rPr>
+                <w:color w:val="000000"/>
+                <w:sz w:val="19"/>
+                <w:szCs w:val="19"/>
+              </w:rPr>
+              <w:t>Relit le catalogue depuis datasets.csv</w:t>
+            </w:r>
+          </w:p>
+        </w:tc>
+      </w:tr>
+    </w:tbl>
+    <w:p>
+      <w:pPr>
+        <w:spacing w:before="150" w:after="80"/>
+        <w:rPr>
+          <w:b/>
+          <w:bCs/>
+          <w:color w:val="1F3864"/>
+          <w:sz w:val="21"/>
+          <w:szCs w:val="21"/>
+        </w:rPr>
+      </w:pPr>
+      <w:r>
+        <w:rPr>
+          <w:b/>
+          <w:bCs/>
+          <w:color w:val="1F3864"/>
+          <w:sz w:val="21"/>
+          <w:szCs w:val="21"/>
+        </w:rPr>
+        <w:t>Résultat à l'exécution — comportement strictement identique à la Partie 8, obtenu cette fois via les fonctions :</w:t>
+      </w:r>
+    </w:p>
+    <w:p>
+      <w:pPr>
+        <w:spacing w:before="150" w:after="80"/>
+      </w:pPr>
+      <w:r>
+        <w:drawing>
+          <wp:inline distT="0" distB="0" distL="0" distR="0" wp14:anchorId="3EE76430" wp14:editId="3A4536C0">
+            <wp:extent cx="6400800" cy="3406140"/>
+            <wp:effectExtent l="0" t="0" r="0" b="0"/>
+            <wp:docPr id="346315290" name="Image 34"/>
+            <wp:cNvGraphicFramePr>
+              <a:graphicFrameLocks xmlns:a="http://schemas.openxmlformats.org/drawingml/2006/main" noChangeAspect="1"/>
+            </wp:cNvGraphicFramePr>
+            <a:graphic xmlns:a="http://schemas.openxmlformats.org/drawingml/2006/main">
+              <a:graphicData uri="http://schemas.openxmlformats.org/drawingml/2006/picture">
+                <pic:pic xmlns:pic="http://schemas.openxmlformats.org/drawingml/2006/picture">
+                  <pic:nvPicPr>
+                    <pic:cNvPr id="346315290" name=""/>
+                    <pic:cNvPicPr/>
+                  </pic:nvPicPr>
+                  <pic:blipFill>
+                    <a:blip r:embed="rId38"/>
+                    <a:stretch>
+                      <a:fillRect/>
+                    </a:stretch>
+                  </pic:blipFill>
+                  <pic:spPr>
+                    <a:xfrm>
+                      <a:off x="0" y="0"/>
+                      <a:ext cx="6400800" cy="3406140"/>
+                    </a:xfrm>
+                    <a:prstGeom prst="rect">
+                      <a:avLst/>
+                    </a:prstGeom>
+                  </pic:spPr>
+                </pic:pic>
+              </a:graphicData>
+            </a:graphic>
+          </wp:inline>
+        </w:drawing>
+      </w:r>
+    </w:p>
+    <w:p>
+      <w:pPr>
+        <w:spacing w:before="150" w:after="80"/>
+      </w:pPr>
+      <w:r>
+        <w:t>C</w:t>
+      </w:r>
+      <w:r>
+        <w:t>e terminal montre l'exécution des fonctionnalités du menu désormais orchestrées par des appels de fonctions. L'utilisateur tente d'abord de lire la liste (Option 2) lorsque le catalogue est vide, puis effectue un rechargement depuis le fichier CSV via l'Option 9 (</w:t>
+      </w:r>
+      <w:proofErr w:type="gramStart"/>
+      <w:r>
+        <w:rPr>
+          <w:rStyle w:val="CodeHTML"/>
+          <w:rFonts w:eastAsia="Calibri"/>
+        </w:rPr>
+        <w:t>recharger(</w:t>
+      </w:r>
+      <w:proofErr w:type="gramEnd"/>
+      <w:r>
+        <w:rPr>
+          <w:rStyle w:val="CodeHTML"/>
+          <w:rFonts w:eastAsia="Calibri"/>
+        </w:rPr>
+        <w:t>)</w:t>
+      </w:r>
+      <w:r>
+        <w:t>). Enfin, l'Option 2 (</w:t>
+      </w:r>
+      <w:proofErr w:type="spellStart"/>
+      <w:r>
+        <w:rPr>
+          <w:rStyle w:val="CodeHTML"/>
+          <w:rFonts w:eastAsia="Calibri"/>
+        </w:rPr>
+        <w:t>afficher_</w:t>
+      </w:r>
+      <w:proofErr w:type="gramStart"/>
+      <w:r>
+        <w:rPr>
+          <w:rStyle w:val="CodeHTML"/>
+          <w:rFonts w:eastAsia="Calibri"/>
+        </w:rPr>
+        <w:t>datasets</w:t>
+      </w:r>
+      <w:proofErr w:type="spellEnd"/>
+      <w:r>
+        <w:rPr>
+          <w:rStyle w:val="CodeHTML"/>
+          <w:rFonts w:eastAsia="Calibri"/>
+        </w:rPr>
+        <w:t>(</w:t>
+      </w:r>
+      <w:proofErr w:type="gramEnd"/>
+      <w:r>
+        <w:rPr>
+          <w:rStyle w:val="CodeHTML"/>
+          <w:rFonts w:eastAsia="Calibri"/>
+        </w:rPr>
+        <w:t>)</w:t>
+      </w:r>
+      <w:r>
+        <w:t xml:space="preserve">) est appelée à nouveau pour afficher la liste reconstituée des </w:t>
+      </w:r>
+      <w:proofErr w:type="spellStart"/>
+      <w:r>
+        <w:t>datasets</w:t>
+      </w:r>
+      <w:proofErr w:type="spellEnd"/>
+      <w:r>
+        <w:t xml:space="preserve"> (</w:t>
+      </w:r>
+      <w:r>
+        <w:rPr>
+          <w:rStyle w:val="CodeHTML"/>
+          <w:rFonts w:eastAsia="Calibri"/>
+        </w:rPr>
+        <w:t>Titanic</w:t>
+      </w:r>
+      <w:r>
+        <w:t xml:space="preserve">, </w:t>
+      </w:r>
+      <w:proofErr w:type="spellStart"/>
+      <w:r>
+        <w:rPr>
+          <w:rStyle w:val="CodeHTML"/>
+          <w:rFonts w:eastAsia="Calibri"/>
+        </w:rPr>
+        <w:t>Worviw</w:t>
+      </w:r>
+      <w:proofErr w:type="spellEnd"/>
+      <w:r>
+        <w:t xml:space="preserve">, </w:t>
+      </w:r>
+      <w:proofErr w:type="spellStart"/>
+      <w:r>
+        <w:rPr>
+          <w:rStyle w:val="CodeHTML"/>
+          <w:rFonts w:eastAsia="Calibri"/>
+        </w:rPr>
+        <w:t>zoneApi</w:t>
+      </w:r>
+      <w:proofErr w:type="spellEnd"/>
+      <w:r>
+        <w:t>), confirmant un comportement fonctionnel strictement identique à la version précédente tout en s'appuyant sur un code refactorisé.</w:t>
+      </w:r>
+    </w:p>
+    <w:p>
+      <w:pPr>
+        <w:spacing w:before="150" w:after="80"/>
+      </w:pPr>
+    </w:p>
+    <w:p>
+      <w:pPr>
+        <w:pStyle w:val="lev1"/>
+      </w:pPr>
+      <w:r>
+        <w:t>R</w:t>
+      </w:r>
+      <w:r>
+        <w:t>ésumé des fonctions et concepts utilisés (Partie 9)</w:t>
+      </w:r>
+    </w:p>
+    <w:p>
+      <w:pPr>
+        <w:pStyle w:val="NormalWeb"/>
+        <w:numPr>
+          <w:ilvl w:val="0"/>
+          <w:numId w:val="20"/>
+        </w:numPr>
+        <w:spacing w:before="0" w:beforeAutospacing="0"/>
+        <w:rPr>
+          <w:rFonts w:ascii="Arial" w:hAnsi="Arial" w:cs="Arial"/>
+        </w:rPr>
+      </w:pPr>
+      <w:r>
+        <w:rPr>
+          <w:rFonts w:ascii="Arial" w:hAnsi="Arial" w:cs="Arial"/>
+          <w:b/>
+          <w:bCs/>
+        </w:rPr>
+        <w:t>Déclaration de fonction (</w:t>
+      </w:r>
+      <w:proofErr w:type="spellStart"/>
+      <w:r>
+        <w:rPr>
+          <w:rStyle w:val="CodeHTML"/>
+          <w:rFonts w:ascii="Arial" w:hAnsi="Arial" w:cs="Arial"/>
+          <w:b/>
+          <w:bCs/>
+        </w:rPr>
+        <w:t>def</w:t>
+      </w:r>
+      <w:proofErr w:type="spellEnd"/>
+      <w:r>
+        <w:rPr>
+          <w:rStyle w:val="CodeHTML"/>
+          <w:rFonts w:ascii="Arial" w:hAnsi="Arial" w:cs="Arial"/>
+          <w:b/>
+          <w:bCs/>
+        </w:rPr>
+        <w:t xml:space="preserve"> ...:</w:t>
+      </w:r>
+      <w:r>
+        <w:rPr>
+          <w:rFonts w:ascii="Arial" w:hAnsi="Arial" w:cs="Arial"/>
+          <w:b/>
+          <w:bCs/>
+        </w:rPr>
+        <w:t>) :</w:t>
+      </w:r>
+      <w:r>
+        <w:rPr>
+          <w:rFonts w:ascii="Arial" w:hAnsi="Arial" w:cs="Arial"/>
+        </w:rPr>
+        <w:t xml:space="preserve"> Syntaxe Python permettant de définir un bloc de code réutilisable effectuant une tâche bien précise.</w:t>
+      </w:r>
+    </w:p>
+    <w:p>
+      <w:pPr>
+        <w:pStyle w:val="NormalWeb"/>
+        <w:numPr>
+          <w:ilvl w:val="0"/>
+          <w:numId w:val="20"/>
+        </w:numPr>
+        <w:spacing w:before="0" w:beforeAutospacing="0"/>
+        <w:rPr>
+          <w:rFonts w:ascii="Arial" w:hAnsi="Arial" w:cs="Arial"/>
+        </w:rPr>
+      </w:pPr>
+      <w:r>
+        <w:rPr>
+          <w:rFonts w:ascii="Arial" w:hAnsi="Arial" w:cs="Arial"/>
+          <w:b/>
+          <w:bCs/>
+        </w:rPr>
+        <w:t>Passage de paramètres / arguments :</w:t>
+      </w:r>
+      <w:r>
+        <w:rPr>
+          <w:rFonts w:ascii="Arial" w:hAnsi="Arial" w:cs="Arial"/>
+        </w:rPr>
+        <w:t xml:space="preserve"> Mécanisme permettant de transmettre des données (comme la liste </w:t>
+      </w:r>
+      <w:proofErr w:type="spellStart"/>
+      <w:r>
+        <w:rPr>
+          <w:rStyle w:val="CodeHTML"/>
+          <w:rFonts w:ascii="Arial" w:hAnsi="Arial" w:cs="Arial"/>
+        </w:rPr>
+        <w:t>catalogue_data</w:t>
+      </w:r>
+      <w:proofErr w:type="spellEnd"/>
+      <w:r>
+        <w:rPr>
+          <w:rFonts w:ascii="Arial" w:hAnsi="Arial" w:cs="Arial"/>
+        </w:rPr>
+        <w:t>) à une fonction pour qu'elle puisse travailler sur ces objets.</w:t>
+      </w:r>
+    </w:p>
+    <w:p>
+      <w:pPr>
+        <w:pStyle w:val="NormalWeb"/>
+        <w:numPr>
+          <w:ilvl w:val="0"/>
+          <w:numId w:val="20"/>
+        </w:numPr>
+        <w:spacing w:before="0" w:beforeAutospacing="0"/>
+        <w:rPr>
+          <w:rFonts w:ascii="Arial" w:hAnsi="Arial" w:cs="Arial"/>
+        </w:rPr>
+      </w:pPr>
+      <w:proofErr w:type="spellStart"/>
+      <w:r>
+        <w:rPr>
+          <w:rFonts w:ascii="Arial" w:hAnsi="Arial" w:cs="Arial"/>
+          <w:b/>
+          <w:bCs/>
+        </w:rPr>
+        <w:t>Docstrings</w:t>
+      </w:r>
+      <w:proofErr w:type="spellEnd"/>
+      <w:r>
+        <w:rPr>
+          <w:rFonts w:ascii="Arial" w:hAnsi="Arial" w:cs="Arial"/>
+          <w:b/>
+          <w:bCs/>
+        </w:rPr>
+        <w:t xml:space="preserve"> (</w:t>
+      </w:r>
+      <w:r>
+        <w:rPr>
+          <w:rStyle w:val="CodeHTML"/>
+          <w:rFonts w:ascii="Arial" w:hAnsi="Arial" w:cs="Arial"/>
+          <w:b/>
+          <w:bCs/>
+        </w:rPr>
+        <w:t>"""..."""</w:t>
+      </w:r>
+      <w:r>
+        <w:rPr>
+          <w:rFonts w:ascii="Arial" w:hAnsi="Arial" w:cs="Arial"/>
+          <w:b/>
+          <w:bCs/>
+        </w:rPr>
+        <w:t>) :</w:t>
+      </w:r>
+      <w:r>
+        <w:rPr>
+          <w:rFonts w:ascii="Arial" w:hAnsi="Arial" w:cs="Arial"/>
+        </w:rPr>
+        <w:t xml:space="preserve"> Chaînes de caractères placées en début de fonction pour documenter son rôle, ses paramètres et ses valeurs de retour.</w:t>
+      </w:r>
+    </w:p>
+    <w:p>
+      <w:pPr>
+        <w:pStyle w:val="NormalWeb"/>
+        <w:numPr>
+          <w:ilvl w:val="0"/>
+          <w:numId w:val="20"/>
+        </w:numPr>
+        <w:spacing w:before="0" w:beforeAutospacing="0"/>
+        <w:rPr>
+          <w:rFonts w:ascii="Arial" w:hAnsi="Arial" w:cs="Arial"/>
+        </w:rPr>
+      </w:pPr>
+      <w:r>
+        <w:rPr>
+          <w:rFonts w:ascii="Arial" w:hAnsi="Arial" w:cs="Arial"/>
+          <w:b/>
+          <w:bCs/>
+        </w:rPr>
+        <w:t>Refactorisation (</w:t>
+      </w:r>
+      <w:proofErr w:type="spellStart"/>
+      <w:r>
+        <w:rPr>
+          <w:rFonts w:ascii="Arial" w:hAnsi="Arial" w:cs="Arial"/>
+          <w:b/>
+          <w:bCs/>
+        </w:rPr>
+        <w:t>Refactoring</w:t>
+      </w:r>
+      <w:proofErr w:type="spellEnd"/>
+      <w:r>
+        <w:rPr>
+          <w:rFonts w:ascii="Arial" w:hAnsi="Arial" w:cs="Arial"/>
+          <w:b/>
+          <w:bCs/>
+        </w:rPr>
+        <w:t>) :</w:t>
+      </w:r>
+      <w:r>
+        <w:rPr>
+          <w:rFonts w:ascii="Arial" w:hAnsi="Arial" w:cs="Arial"/>
+        </w:rPr>
+        <w:t xml:space="preserve"> Réorganisation de la structure interne d'un programme informatique sans en modifier le comportement externe, visant à en améliorer la lisibilité et la maintenance. </w:t>
+      </w:r>
+    </w:p>
+    <w:p>
+      <w:pPr>
+        <w:pStyle w:val="NormalWeb"/>
+        <w:numPr>
+          <w:ilvl w:val="0"/>
+          <w:numId w:val="20"/>
+        </w:numPr>
+        <w:spacing w:before="0" w:beforeAutospacing="0"/>
+        <w:rPr>
+          <w:rFonts w:ascii="Arial" w:hAnsi="Arial" w:cs="Arial"/>
+        </w:rPr>
+      </w:pPr>
+      <w:r>
+        <w:rPr>
+          <w:rFonts w:ascii="Arial" w:hAnsi="Arial" w:cs="Arial"/>
+          <w:b/>
+          <w:bCs/>
+        </w:rPr>
+        <w:t>Modularité :</w:t>
+      </w:r>
+      <w:r>
+        <w:rPr>
+          <w:rFonts w:ascii="Arial" w:hAnsi="Arial" w:cs="Arial"/>
+        </w:rPr>
+        <w:t xml:space="preserve"> Principe de conception logicielle consistant à diviser un programme en éléments distincts et indépendants (fonctions) pour faciliter le débogage et l'évolution de l'application.</w:t>
+      </w:r>
+    </w:p>
+    <w:p>
+      <w:pPr>
+        <w:spacing w:before="150" w:after="80"/>
+      </w:pPr>
+    </w:p>
+    <w:p>
+      <w:pPr>
+        <w:spacing w:before="150" w:after="80"/>
+      </w:pPr>
+      <w:r>
+        <w:lastRenderedPageBreak/>
+        <w:t xml:space="preserve"> </w:t>
+      </w:r>
+    </w:p>
+    <w:p>
+      <w:pPr>
         <w:pStyle w:val="NormalWeb"/>
         <w:spacing w:before="0" w:beforeAutospacing="0" w:line="360" w:lineRule="auto"/>
       </w:pPr>
@@ -10918,6 +12576,155 @@
     </w:lvl>
   </w:abstractNum>
   <w:abstractNum w:abstractNumId="9" w15:restartNumberingAfterBreak="0">
+    <w:nsid w:val="43902913"/>
+    <w:multiLevelType w:val="multilevel"/>
+    <w:tmpl w:val="E22E87DA"/>
+    <w:lvl w:ilvl="0">
+      <w:start w:val="1"/>
+      <w:numFmt w:val="bullet"/>
+      <w:lvlText w:val=""/>
+      <w:lvlJc w:val="left"/>
+      <w:pPr>
+        <w:tabs>
+          <w:tab w:val="num" w:pos="720"/>
+        </w:tabs>
+        <w:ind w:left="720" w:hanging="360"/>
+      </w:pPr>
+      <w:rPr>
+        <w:rFonts w:ascii="Symbol" w:hAnsi="Symbol" w:hint="default"/>
+        <w:sz w:val="20"/>
+      </w:rPr>
+    </w:lvl>
+    <w:lvl w:ilvl="1" w:tentative="1">
+      <w:start w:val="1"/>
+      <w:numFmt w:val="bullet"/>
+      <w:lvlText w:val="o"/>
+      <w:lvlJc w:val="left"/>
+      <w:pPr>
+        <w:tabs>
+          <w:tab w:val="num" w:pos="1440"/>
+        </w:tabs>
+        <w:ind w:left="1440" w:hanging="360"/>
+      </w:pPr>
+      <w:rPr>
+        <w:rFonts w:ascii="Courier New" w:hAnsi="Courier New" w:hint="default"/>
+        <w:sz w:val="20"/>
+      </w:rPr>
+    </w:lvl>
+    <w:lvl w:ilvl="2" w:tentative="1">
+      <w:start w:val="1"/>
+      <w:numFmt w:val="bullet"/>
+      <w:lvlText w:val=""/>
+      <w:lvlJc w:val="left"/>
+      <w:pPr>
+        <w:tabs>
+          <w:tab w:val="num" w:pos="2160"/>
+        </w:tabs>
+        <w:ind w:left="2160" w:hanging="360"/>
+      </w:pPr>
+      <w:rPr>
+        <w:rFonts w:ascii="Wingdings" w:hAnsi="Wingdings" w:hint="default"/>
+        <w:sz w:val="20"/>
+      </w:rPr>
+    </w:lvl>
+    <w:lvl w:ilvl="3" w:tentative="1">
+      <w:start w:val="1"/>
+      <w:numFmt w:val="bullet"/>
+      <w:lvlText w:val=""/>
+      <w:lvlJc w:val="left"/>
+      <w:pPr>
+        <w:tabs>
+          <w:tab w:val="num" w:pos="2880"/>
+        </w:tabs>
+        <w:ind w:left="2880" w:hanging="360"/>
+      </w:pPr>
+      <w:rPr>
+        <w:rFonts w:ascii="Wingdings" w:hAnsi="Wingdings" w:hint="default"/>
+        <w:sz w:val="20"/>
+      </w:rPr>
+    </w:lvl>
+    <w:lvl w:ilvl="4" w:tentative="1">
+      <w:start w:val="1"/>
+      <w:numFmt w:val="bullet"/>
+      <w:lvlText w:val=""/>
+      <w:lvlJc w:val="left"/>
+      <w:pPr>
+        <w:tabs>
+          <w:tab w:val="num" w:pos="3600"/>
+        </w:tabs>
+        <w:ind w:left="3600" w:hanging="360"/>
+      </w:pPr>
+      <w:rPr>
+        <w:rFonts w:ascii="Wingdings" w:hAnsi="Wingdings" w:hint="default"/>
+        <w:sz w:val="20"/>
+      </w:rPr>
+    </w:lvl>
+    <w:lvl w:ilvl="5" w:tentative="1">
+      <w:start w:val="1"/>
+      <w:numFmt w:val="bullet"/>
+      <w:lvlText w:val=""/>
+      <w:lvlJc w:val="left"/>
+      <w:pPr>
+        <w:tabs>
+          <w:tab w:val="num" w:pos="4320"/>
+        </w:tabs>
+        <w:ind w:left="4320" w:hanging="360"/>
+      </w:pPr>
+      <w:rPr>
+        <w:rFonts w:ascii="Wingdings" w:hAnsi="Wingdings" w:hint="default"/>
+        <w:sz w:val="20"/>
+      </w:rPr>
+    </w:lvl>
+    <w:lvl w:ilvl="6" w:tentative="1">
+      <w:start w:val="1"/>
+      <w:numFmt w:val="bullet"/>
+      <w:lvlText w:val=""/>
+      <w:lvlJc w:val="left"/>
+      <w:pPr>
+        <w:tabs>
+          <w:tab w:val="num" w:pos="5040"/>
+        </w:tabs>
+        <w:ind w:left="5040" w:hanging="360"/>
+      </w:pPr>
+      <w:rPr>
+        <w:rFonts w:ascii="Wingdings" w:hAnsi="Wingdings" w:hint="default"/>
+        <w:sz w:val="20"/>
+      </w:rPr>
+    </w:lvl>
+    <w:lvl w:ilvl="7" w:tentative="1">
+      <w:start w:val="1"/>
+      <w:numFmt w:val="bullet"/>
+      <w:lvlText w:val=""/>
+      <w:lvlJc w:val="left"/>
+      <w:pPr>
+        <w:tabs>
+          <w:tab w:val="num" w:pos="5760"/>
+        </w:tabs>
+        <w:ind w:left="5760" w:hanging="360"/>
+      </w:pPr>
+      <w:rPr>
+        <w:rFonts w:ascii="Wingdings" w:hAnsi="Wingdings" w:hint="default"/>
+        <w:sz w:val="20"/>
+      </w:rPr>
+    </w:lvl>
+    <w:lvl w:ilvl="8" w:tentative="1">
+      <w:start w:val="1"/>
+      <w:numFmt w:val="bullet"/>
+      <w:lvlText w:val=""/>
+      <w:lvlJc w:val="left"/>
+      <w:pPr>
+        <w:tabs>
+          <w:tab w:val="num" w:pos="6480"/>
+        </w:tabs>
+        <w:ind w:left="6480" w:hanging="360"/>
+      </w:pPr>
+      <w:rPr>
+        <w:rFonts w:ascii="Wingdings" w:hAnsi="Wingdings" w:hint="default"/>
+        <w:sz w:val="20"/>
+      </w:rPr>
+    </w:lvl>
+  </w:abstractNum>
+  <w:abstractNum w:abstractNumId="10" w15:restartNumberingAfterBreak="0">
     <w:nsid w:val="4B4C5930"/>
     <w:multiLevelType w:val="hybridMultilevel"/>
     <w:tmpl w:val="AF7A8ADC"/>
@@ -11030,7 +12837,7 @@
       </w:rPr>
     </w:lvl>
   </w:abstractNum>
-  <w:abstractNum w:abstractNumId="10" w15:restartNumberingAfterBreak="0">
+  <w:abstractNum w:abstractNumId="11" w15:restartNumberingAfterBreak="0">
     <w:nsid w:val="4FC34243"/>
     <w:multiLevelType w:val="hybridMultilevel"/>
     <w:tmpl w:val="97087B9C"/>
@@ -11143,7 +12950,120 @@
       </w:rPr>
     </w:lvl>
   </w:abstractNum>
-  <w:abstractNum w:abstractNumId="11" w15:restartNumberingAfterBreak="0">
+  <w:abstractNum w:abstractNumId="12" w15:restartNumberingAfterBreak="0">
+    <w:nsid w:val="57105363"/>
+    <w:multiLevelType w:val="hybridMultilevel"/>
+    <w:tmpl w:val="7DA48E50"/>
+    <w:lvl w:ilvl="0" w:tplc="040C0001">
+      <w:start w:val="1"/>
+      <w:numFmt w:val="bullet"/>
+      <w:lvlText w:val=""/>
+      <w:lvlJc w:val="left"/>
+      <w:pPr>
+        <w:ind w:left="1440" w:hanging="360"/>
+      </w:pPr>
+      <w:rPr>
+        <w:rFonts w:ascii="Symbol" w:hAnsi="Symbol" w:hint="default"/>
+      </w:rPr>
+    </w:lvl>
+    <w:lvl w:ilvl="1" w:tplc="040C0003" w:tentative="1">
+      <w:start w:val="1"/>
+      <w:numFmt w:val="bullet"/>
+      <w:lvlText w:val="o"/>
+      <w:lvlJc w:val="left"/>
+      <w:pPr>
+        <w:ind w:left="2160" w:hanging="360"/>
+      </w:pPr>
+      <w:rPr>
+        <w:rFonts w:ascii="Courier New" w:hAnsi="Courier New" w:cs="Courier New" w:hint="default"/>
+      </w:rPr>
+    </w:lvl>
+    <w:lvl w:ilvl="2" w:tplc="040C0005" w:tentative="1">
+      <w:start w:val="1"/>
+      <w:numFmt w:val="bullet"/>
+      <w:lvlText w:val=""/>
+      <w:lvlJc w:val="left"/>
+      <w:pPr>
+        <w:ind w:left="2880" w:hanging="360"/>
+      </w:pPr>
+      <w:rPr>
+        <w:rFonts w:ascii="Wingdings" w:hAnsi="Wingdings" w:hint="default"/>
+      </w:rPr>
+    </w:lvl>
+    <w:lvl w:ilvl="3" w:tplc="040C0001" w:tentative="1">
+      <w:start w:val="1"/>
+      <w:numFmt w:val="bullet"/>
+      <w:lvlText w:val=""/>
+      <w:lvlJc w:val="left"/>
+      <w:pPr>
+        <w:ind w:left="3600" w:hanging="360"/>
+      </w:pPr>
+      <w:rPr>
+        <w:rFonts w:ascii="Symbol" w:hAnsi="Symbol" w:hint="default"/>
+      </w:rPr>
+    </w:lvl>
+    <w:lvl w:ilvl="4" w:tplc="040C0003" w:tentative="1">
+      <w:start w:val="1"/>
+      <w:numFmt w:val="bullet"/>
+      <w:lvlText w:val="o"/>
+      <w:lvlJc w:val="left"/>
+      <w:pPr>
+        <w:ind w:left="4320" w:hanging="360"/>
+      </w:pPr>
+      <w:rPr>
+        <w:rFonts w:ascii="Courier New" w:hAnsi="Courier New" w:cs="Courier New" w:hint="default"/>
+      </w:rPr>
+    </w:lvl>
+    <w:lvl w:ilvl="5" w:tplc="040C0005" w:tentative="1">
+      <w:start w:val="1"/>
+      <w:numFmt w:val="bullet"/>
+      <w:lvlText w:val=""/>
+      <w:lvlJc w:val="left"/>
+      <w:pPr>
+        <w:ind w:left="5040" w:hanging="360"/>
+      </w:pPr>
+      <w:rPr>
+        <w:rFonts w:ascii="Wingdings" w:hAnsi="Wingdings" w:hint="default"/>
+      </w:rPr>
+    </w:lvl>
+    <w:lvl w:ilvl="6" w:tplc="040C0001" w:tentative="1">
+      <w:start w:val="1"/>
+      <w:numFmt w:val="bullet"/>
+      <w:lvlText w:val=""/>
+      <w:lvlJc w:val="left"/>
+      <w:pPr>
+        <w:ind w:left="5760" w:hanging="360"/>
+      </w:pPr>
+      <w:rPr>
+        <w:rFonts w:ascii="Symbol" w:hAnsi="Symbol" w:hint="default"/>
+      </w:rPr>
+    </w:lvl>
+    <w:lvl w:ilvl="7" w:tplc="040C0003" w:tentative="1">
+      <w:start w:val="1"/>
+      <w:numFmt w:val="bullet"/>
+      <w:lvlText w:val="o"/>
+      <w:lvlJc w:val="left"/>
+      <w:pPr>
+        <w:ind w:left="6480" w:hanging="360"/>
+      </w:pPr>
+      <w:rPr>
+        <w:rFonts w:ascii="Courier New" w:hAnsi="Courier New" w:cs="Courier New" w:hint="default"/>
+      </w:rPr>
+    </w:lvl>
+    <w:lvl w:ilvl="8" w:tplc="040C0005" w:tentative="1">
+      <w:start w:val="1"/>
+      <w:numFmt w:val="bullet"/>
+      <w:lvlText w:val=""/>
+      <w:lvlJc w:val="left"/>
+      <w:pPr>
+        <w:ind w:left="7200" w:hanging="360"/>
+      </w:pPr>
+      <w:rPr>
+        <w:rFonts w:ascii="Wingdings" w:hAnsi="Wingdings" w:hint="default"/>
+      </w:rPr>
+    </w:lvl>
+  </w:abstractNum>
+  <w:abstractNum w:abstractNumId="13" w15:restartNumberingAfterBreak="0">
     <w:nsid w:val="58B67D25"/>
     <w:multiLevelType w:val="hybridMultilevel"/>
     <w:tmpl w:val="8AB0F4A4"/>
@@ -11235,7 +13155,7 @@
       </w:pPr>
     </w:lvl>
   </w:abstractNum>
-  <w:abstractNum w:abstractNumId="12" w15:restartNumberingAfterBreak="0">
+  <w:abstractNum w:abstractNumId="14" w15:restartNumberingAfterBreak="0">
     <w:nsid w:val="64D62A87"/>
     <w:multiLevelType w:val="multilevel"/>
     <w:tmpl w:val="653C3C02"/>
@@ -11384,7 +13304,7 @@
       </w:rPr>
     </w:lvl>
   </w:abstractNum>
-  <w:abstractNum w:abstractNumId="13" w15:restartNumberingAfterBreak="0">
+  <w:abstractNum w:abstractNumId="15" w15:restartNumberingAfterBreak="0">
     <w:nsid w:val="653C0C5E"/>
     <w:multiLevelType w:val="multilevel"/>
     <w:tmpl w:val="28D834A2"/>
@@ -11533,7 +13453,7 @@
       </w:rPr>
     </w:lvl>
   </w:abstractNum>
-  <w:abstractNum w:abstractNumId="14" w15:restartNumberingAfterBreak="0">
+  <w:abstractNum w:abstractNumId="16" w15:restartNumberingAfterBreak="0">
     <w:nsid w:val="6774185F"/>
     <w:multiLevelType w:val="multilevel"/>
     <w:tmpl w:val="70EEC7E6"/>
@@ -11682,7 +13602,7 @@
       </w:rPr>
     </w:lvl>
   </w:abstractNum>
-  <w:abstractNum w:abstractNumId="15" w15:restartNumberingAfterBreak="0">
+  <w:abstractNum w:abstractNumId="17" w15:restartNumberingAfterBreak="0">
     <w:nsid w:val="69FC276B"/>
     <w:multiLevelType w:val="multilevel"/>
     <w:tmpl w:val="C2E0AD14"/>
@@ -11831,7 +13751,7 @@
       </w:rPr>
     </w:lvl>
   </w:abstractNum>
-  <w:abstractNum w:abstractNumId="16" w15:restartNumberingAfterBreak="0">
+  <w:abstractNum w:abstractNumId="18" w15:restartNumberingAfterBreak="0">
     <w:nsid w:val="7185592B"/>
     <w:multiLevelType w:val="multilevel"/>
     <w:tmpl w:val="08F0360A"/>
@@ -11980,7 +13900,7 @@
       </w:rPr>
     </w:lvl>
   </w:abstractNum>
-  <w:abstractNum w:abstractNumId="17" w15:restartNumberingAfterBreak="0">
+  <w:abstractNum w:abstractNumId="19" w15:restartNumberingAfterBreak="0">
     <w:nsid w:val="76A84B46"/>
     <w:multiLevelType w:val="hybridMultilevel"/>
     <w:tmpl w:val="C6A6513A"/>
@@ -12102,7 +14022,7 @@
     <w:abstractNumId w:val="2"/>
   </w:num>
   <w:num w:numId="3" w16cid:durableId="832062217">
-    <w:abstractNumId w:val="17"/>
+    <w:abstractNumId w:val="19"/>
   </w:num>
   <w:num w:numId="4" w16cid:durableId="1215237999">
     <w:abstractNumId w:val="7"/>
@@ -12111,16 +14031,16 @@
     <w:abstractNumId w:val="4"/>
   </w:num>
   <w:num w:numId="6" w16cid:durableId="1734310147">
-    <w:abstractNumId w:val="9"/>
+    <w:abstractNumId w:val="10"/>
   </w:num>
   <w:num w:numId="7" w16cid:durableId="655379516">
+    <w:abstractNumId w:val="17"/>
+  </w:num>
+  <w:num w:numId="8" w16cid:durableId="1980303912">
     <w:abstractNumId w:val="15"/>
   </w:num>
-  <w:num w:numId="8" w16cid:durableId="1980303912">
+  <w:num w:numId="9" w16cid:durableId="1230191484">
     <w:abstractNumId w:val="13"/>
-  </w:num>
-  <w:num w:numId="9" w16cid:durableId="1230191484">
-    <w:abstractNumId w:val="11"/>
   </w:num>
   <w:num w:numId="10" w16cid:durableId="1816606018">
     <w:abstractNumId w:val="0"/>
@@ -12129,10 +14049,10 @@
     <w:abstractNumId w:val="8"/>
   </w:num>
   <w:num w:numId="12" w16cid:durableId="132413389">
-    <w:abstractNumId w:val="14"/>
+    <w:abstractNumId w:val="16"/>
   </w:num>
   <w:num w:numId="13" w16cid:durableId="483476165">
-    <w:abstractNumId w:val="10"/>
+    <w:abstractNumId w:val="11"/>
   </w:num>
   <w:num w:numId="14" w16cid:durableId="214657024">
     <w:abstractNumId w:val="6"/>
@@ -12141,13 +14061,19 @@
     <w:abstractNumId w:val="3"/>
   </w:num>
   <w:num w:numId="16" w16cid:durableId="1022241646">
-    <w:abstractNumId w:val="12"/>
+    <w:abstractNumId w:val="14"/>
   </w:num>
   <w:num w:numId="17" w16cid:durableId="1465538048">
     <w:abstractNumId w:val="5"/>
   </w:num>
   <w:num w:numId="18" w16cid:durableId="2713027">
-    <w:abstractNumId w:val="16"/>
+    <w:abstractNumId w:val="18"/>
+  </w:num>
+  <w:num w:numId="19" w16cid:durableId="955987363">
+    <w:abstractNumId w:val="9"/>
+  </w:num>
+  <w:num w:numId="20" w16cid:durableId="1948732823">
+    <w:abstractNumId w:val="12"/>
   </w:num>
 </w:numbering>
 </file>

</xml_diff>

<commit_message>
refactor: découpage complet de l'application en packages Python (Partie 11)
</commit_message>
<xml_diff>
--- a/pratiquePython.docx
+++ b/pratiquePython.docx
@@ -12161,6 +12161,7 @@
           <w:rFonts w:ascii="Times New Roman" w:hAnsi="Times New Roman" w:cs="Times New Roman"/>
           <w:b/>
           <w:bCs/>
+          <w:noProof/>
           <w:sz w:val="24"/>
           <w:szCs w:val="24"/>
         </w:rPr>
@@ -12217,6 +12218,7 @@
           <w:rFonts w:ascii="Times New Roman" w:hAnsi="Times New Roman" w:cs="Times New Roman"/>
           <w:b/>
           <w:bCs/>
+          <w:noProof/>
           <w:sz w:val="24"/>
           <w:szCs w:val="24"/>
         </w:rPr>
@@ -12421,6 +12423,7 @@
           <w:rFonts w:ascii="Times New Roman" w:hAnsi="Times New Roman" w:cs="Times New Roman"/>
           <w:b/>
           <w:bCs/>
+          <w:noProof/>
           <w:sz w:val="24"/>
           <w:szCs w:val="24"/>
         </w:rPr>
@@ -12628,6 +12631,7 @@
           <w:rFonts w:ascii="Times New Roman" w:hAnsi="Times New Roman" w:cs="Times New Roman"/>
           <w:b/>
           <w:bCs/>
+          <w:noProof/>
           <w:sz w:val="24"/>
           <w:szCs w:val="24"/>
         </w:rPr>
@@ -12814,6 +12818,7 @@
           <w:rFonts w:ascii="Times New Roman" w:hAnsi="Times New Roman" w:cs="Times New Roman"/>
           <w:b/>
           <w:bCs/>
+          <w:noProof/>
           <w:sz w:val="24"/>
           <w:szCs w:val="24"/>
         </w:rPr>
@@ -12984,8 +12989,8 @@
       </w:tblPr>
       <w:tblGrid>
         <w:gridCol w:w="1677"/>
-        <w:gridCol w:w="2913"/>
-        <w:gridCol w:w="5706"/>
+        <w:gridCol w:w="2899"/>
+        <w:gridCol w:w="5720"/>
       </w:tblGrid>
       <w:tr>
         <w:trPr>
@@ -13099,8 +13104,6 @@
               <w:rPr>
                 <w:rStyle w:val="CodeHTML"/>
                 <w:rFonts w:ascii="Times New Roman" w:eastAsia="Calibri" w:hAnsi="Times New Roman" w:cs="Times New Roman"/>
-                <w:b/>
-                <w:bCs/>
                 <w:sz w:val="24"/>
                 <w:szCs w:val="24"/>
               </w:rPr>
@@ -13191,8 +13194,6 @@
               <w:rPr>
                 <w:rStyle w:val="CodeHTML"/>
                 <w:rFonts w:ascii="Times New Roman" w:eastAsia="Calibri" w:hAnsi="Times New Roman" w:cs="Times New Roman"/>
-                <w:b/>
-                <w:bCs/>
                 <w:sz w:val="24"/>
                 <w:szCs w:val="24"/>
               </w:rPr>
@@ -13297,8 +13298,6 @@
               <w:rPr>
                 <w:rStyle w:val="CodeHTML"/>
                 <w:rFonts w:ascii="Times New Roman" w:eastAsia="Calibri" w:hAnsi="Times New Roman" w:cs="Times New Roman"/>
-                <w:b/>
-                <w:bCs/>
                 <w:sz w:val="24"/>
                 <w:szCs w:val="24"/>
               </w:rPr>
@@ -13574,8 +13573,6 @@
               <w:rPr>
                 <w:rStyle w:val="CodeHTML"/>
                 <w:rFonts w:ascii="Times New Roman" w:eastAsia="Calibri" w:hAnsi="Times New Roman" w:cs="Times New Roman"/>
-                <w:b/>
-                <w:bCs/>
                 <w:sz w:val="24"/>
                 <w:szCs w:val="24"/>
               </w:rPr>
@@ -13916,6 +13913,175 @@
       </w:r>
       <w:r>
         <w:t xml:space="preserve"> Principe d'architecture logicielle consistant à diviser un programme en sections distinctes pour que chacune gère un aspect bien spécifique de l'application.</w:t>
+      </w:r>
+    </w:p>
+    <w:p>
+      <w:pPr>
+        <w:pStyle w:val="NormalWeb"/>
+        <w:spacing w:line="360" w:lineRule="auto"/>
+      </w:pPr>
+    </w:p>
+    <w:p>
+      <w:pPr>
+        <w:pStyle w:val="Titre1"/>
+      </w:pPr>
+      <w:r>
+        <w:t>Partie 11 — Packages</w:t>
+      </w:r>
+    </w:p>
+    <w:tbl>
+      <w:tblPr>
+        <w:tblW w:w="5000" w:type="pct"/>
+        <w:tblBorders>
+          <w:top w:val="single" w:sz="4" w:space="0" w:color="2E5395"/>
+          <w:left w:val="single" w:sz="4" w:space="0" w:color="2E5395"/>
+          <w:bottom w:val="single" w:sz="4" w:space="0" w:color="2E5395"/>
+          <w:right w:val="single" w:sz="4" w:space="0" w:color="2E5395"/>
+          <w:insideH w:val="single" w:sz="4" w:space="0" w:color="auto"/>
+          <w:insideV w:val="single" w:sz="4" w:space="0" w:color="auto"/>
+        </w:tblBorders>
+        <w:shd w:val="clear" w:color="auto" w:fill="FFC000" w:themeFill="accent4"/>
+        <w:tblCellMar>
+          <w:left w:w="10" w:type="dxa"/>
+          <w:right w:w="10" w:type="dxa"/>
+        </w:tblCellMar>
+        <w:tblLook w:val="04A0" w:firstRow="1" w:lastRow="0" w:firstColumn="1" w:lastColumn="0" w:noHBand="0" w:noVBand="1"/>
+      </w:tblPr>
+      <w:tblGrid>
+        <w:gridCol w:w="10480"/>
+      </w:tblGrid>
+      <w:tr>
+        <w:tc>
+          <w:tcPr>
+            <w:tcW w:w="0" w:type="auto"/>
+            <w:tcBorders>
+              <w:top w:val="single" w:sz="4" w:space="0" w:color="2E5395"/>
+              <w:left w:val="single" w:sz="4" w:space="0" w:color="2E5395"/>
+              <w:bottom w:val="single" w:sz="4" w:space="0" w:color="2E5395"/>
+              <w:right w:val="single" w:sz="4" w:space="0" w:color="2E5395"/>
+            </w:tcBorders>
+            <w:shd w:val="clear" w:color="auto" w:fill="FFC000" w:themeFill="accent4"/>
+            <w:tcMar>
+              <w:top w:w="150" w:type="dxa"/>
+              <w:left w:w="200" w:type="dxa"/>
+              <w:bottom w:w="150" w:type="dxa"/>
+              <w:right w:w="200" w:type="dxa"/>
+            </w:tcMar>
+            <w:hideMark/>
+          </w:tcPr>
+          <w:p>
+            <w:r>
+              <w:rPr>
+                <w:b/>
+                <w:bCs/>
+                <w:color w:val="2E5395"/>
+              </w:rPr>
+              <w:t xml:space="preserve">Question 16 — </w:t>
+            </w:r>
+            <w:r>
+              <w:rPr>
+                <w:i/>
+                <w:iCs/>
+              </w:rPr>
+              <w:t>Découp</w:t>
+            </w:r>
+            <w:r>
+              <w:rPr>
+                <w:i/>
+                <w:iCs/>
+              </w:rPr>
+              <w:t>age de</w:t>
+            </w:r>
+            <w:r>
+              <w:rPr>
+                <w:i/>
+                <w:iCs/>
+              </w:rPr>
+              <w:t xml:space="preserve"> l'application en packages : </w:t>
+            </w:r>
+            <w:proofErr w:type="spellStart"/>
+            <w:r>
+              <w:rPr>
+                <w:i/>
+                <w:iCs/>
+              </w:rPr>
+              <w:t>datasets</w:t>
+            </w:r>
+            <w:proofErr w:type="spellEnd"/>
+            <w:r>
+              <w:rPr>
+                <w:i/>
+                <w:iCs/>
+              </w:rPr>
+              <w:t>/, interface/, stockage/, data/.</w:t>
+            </w:r>
+          </w:p>
+        </w:tc>
+      </w:tr>
+    </w:tbl>
+    <w:p>
+      <w:pPr>
+        <w:pStyle w:val="NormalWeb"/>
+        <w:numPr>
+          <w:ilvl w:val="0"/>
+          <w:numId w:val="25"/>
+        </w:numPr>
+        <w:spacing w:line="360" w:lineRule="auto"/>
+        <w:rPr>
+          <w:b/>
+          <w:bCs/>
+        </w:rPr>
+      </w:pPr>
+      <w:r>
+        <w:rPr>
+          <w:b/>
+          <w:bCs/>
+        </w:rPr>
+        <w:t>Architecture complète du projet après découpage en packages</w:t>
+      </w:r>
+    </w:p>
+    <w:p>
+      <w:pPr>
+        <w:pStyle w:val="NormalWeb"/>
+        <w:spacing w:line="360" w:lineRule="auto"/>
+      </w:pPr>
+      <w:r>
+        <w:lastRenderedPageBreak/>
+        <w:drawing>
+          <wp:inline distT="0" distB="0" distL="0" distR="0" wp14:anchorId="4234E4C7" wp14:editId="02399138">
+            <wp:extent cx="3025402" cy="6645216"/>
+            <wp:effectExtent l="0" t="0" r="3810" b="3810"/>
+            <wp:docPr id="2075188397" name="Image 40"/>
+            <wp:cNvGraphicFramePr>
+              <a:graphicFrameLocks xmlns:a="http://schemas.openxmlformats.org/drawingml/2006/main" noChangeAspect="1"/>
+            </wp:cNvGraphicFramePr>
+            <a:graphic xmlns:a="http://schemas.openxmlformats.org/drawingml/2006/main">
+              <a:graphicData uri="http://schemas.openxmlformats.org/drawingml/2006/picture">
+                <pic:pic xmlns:pic="http://schemas.openxmlformats.org/drawingml/2006/picture">
+                  <pic:nvPicPr>
+                    <pic:cNvPr id="2075188397" name=""/>
+                    <pic:cNvPicPr/>
+                  </pic:nvPicPr>
+                  <pic:blipFill>
+                    <a:blip r:embed="rId44"/>
+                    <a:stretch>
+                      <a:fillRect/>
+                    </a:stretch>
+                  </pic:blipFill>
+                  <pic:spPr>
+                    <a:xfrm>
+                      <a:off x="0" y="0"/>
+                      <a:ext cx="3025402" cy="6645216"/>
+                    </a:xfrm>
+                    <a:prstGeom prst="rect">
+                      <a:avLst/>
+                    </a:prstGeom>
+                  </pic:spPr>
+                </pic:pic>
+              </a:graphicData>
+            </a:graphic>
+          </wp:inline>
+        </w:drawing>
       </w:r>
     </w:p>
     <w:p>
@@ -16742,6 +16908,119 @@
     </w:lvl>
   </w:abstractNum>
   <w:abstractNum w:abstractNumId="21" w15:restartNumberingAfterBreak="0">
+    <w:nsid w:val="68B64A15"/>
+    <w:multiLevelType w:val="hybridMultilevel"/>
+    <w:tmpl w:val="8D8240E2"/>
+    <w:lvl w:ilvl="0" w:tplc="040C0001">
+      <w:start w:val="1"/>
+      <w:numFmt w:val="bullet"/>
+      <w:lvlText w:val=""/>
+      <w:lvlJc w:val="left"/>
+      <w:pPr>
+        <w:ind w:left="780" w:hanging="360"/>
+      </w:pPr>
+      <w:rPr>
+        <w:rFonts w:ascii="Symbol" w:hAnsi="Symbol" w:hint="default"/>
+      </w:rPr>
+    </w:lvl>
+    <w:lvl w:ilvl="1" w:tplc="040C0003" w:tentative="1">
+      <w:start w:val="1"/>
+      <w:numFmt w:val="bullet"/>
+      <w:lvlText w:val="o"/>
+      <w:lvlJc w:val="left"/>
+      <w:pPr>
+        <w:ind w:left="1500" w:hanging="360"/>
+      </w:pPr>
+      <w:rPr>
+        <w:rFonts w:ascii="Courier New" w:hAnsi="Courier New" w:cs="Courier New" w:hint="default"/>
+      </w:rPr>
+    </w:lvl>
+    <w:lvl w:ilvl="2" w:tplc="040C0005" w:tentative="1">
+      <w:start w:val="1"/>
+      <w:numFmt w:val="bullet"/>
+      <w:lvlText w:val=""/>
+      <w:lvlJc w:val="left"/>
+      <w:pPr>
+        <w:ind w:left="2220" w:hanging="360"/>
+      </w:pPr>
+      <w:rPr>
+        <w:rFonts w:ascii="Wingdings" w:hAnsi="Wingdings" w:hint="default"/>
+      </w:rPr>
+    </w:lvl>
+    <w:lvl w:ilvl="3" w:tplc="040C0001" w:tentative="1">
+      <w:start w:val="1"/>
+      <w:numFmt w:val="bullet"/>
+      <w:lvlText w:val=""/>
+      <w:lvlJc w:val="left"/>
+      <w:pPr>
+        <w:ind w:left="2940" w:hanging="360"/>
+      </w:pPr>
+      <w:rPr>
+        <w:rFonts w:ascii="Symbol" w:hAnsi="Symbol" w:hint="default"/>
+      </w:rPr>
+    </w:lvl>
+    <w:lvl w:ilvl="4" w:tplc="040C0003" w:tentative="1">
+      <w:start w:val="1"/>
+      <w:numFmt w:val="bullet"/>
+      <w:lvlText w:val="o"/>
+      <w:lvlJc w:val="left"/>
+      <w:pPr>
+        <w:ind w:left="3660" w:hanging="360"/>
+      </w:pPr>
+      <w:rPr>
+        <w:rFonts w:ascii="Courier New" w:hAnsi="Courier New" w:cs="Courier New" w:hint="default"/>
+      </w:rPr>
+    </w:lvl>
+    <w:lvl w:ilvl="5" w:tplc="040C0005" w:tentative="1">
+      <w:start w:val="1"/>
+      <w:numFmt w:val="bullet"/>
+      <w:lvlText w:val=""/>
+      <w:lvlJc w:val="left"/>
+      <w:pPr>
+        <w:ind w:left="4380" w:hanging="360"/>
+      </w:pPr>
+      <w:rPr>
+        <w:rFonts w:ascii="Wingdings" w:hAnsi="Wingdings" w:hint="default"/>
+      </w:rPr>
+    </w:lvl>
+    <w:lvl w:ilvl="6" w:tplc="040C0001" w:tentative="1">
+      <w:start w:val="1"/>
+      <w:numFmt w:val="bullet"/>
+      <w:lvlText w:val=""/>
+      <w:lvlJc w:val="left"/>
+      <w:pPr>
+        <w:ind w:left="5100" w:hanging="360"/>
+      </w:pPr>
+      <w:rPr>
+        <w:rFonts w:ascii="Symbol" w:hAnsi="Symbol" w:hint="default"/>
+      </w:rPr>
+    </w:lvl>
+    <w:lvl w:ilvl="7" w:tplc="040C0003" w:tentative="1">
+      <w:start w:val="1"/>
+      <w:numFmt w:val="bullet"/>
+      <w:lvlText w:val="o"/>
+      <w:lvlJc w:val="left"/>
+      <w:pPr>
+        <w:ind w:left="5820" w:hanging="360"/>
+      </w:pPr>
+      <w:rPr>
+        <w:rFonts w:ascii="Courier New" w:hAnsi="Courier New" w:cs="Courier New" w:hint="default"/>
+      </w:rPr>
+    </w:lvl>
+    <w:lvl w:ilvl="8" w:tplc="040C0005" w:tentative="1">
+      <w:start w:val="1"/>
+      <w:numFmt w:val="bullet"/>
+      <w:lvlText w:val=""/>
+      <w:lvlJc w:val="left"/>
+      <w:pPr>
+        <w:ind w:left="6540" w:hanging="360"/>
+      </w:pPr>
+      <w:rPr>
+        <w:rFonts w:ascii="Wingdings" w:hAnsi="Wingdings" w:hint="default"/>
+      </w:rPr>
+    </w:lvl>
+  </w:abstractNum>
+  <w:abstractNum w:abstractNumId="22" w15:restartNumberingAfterBreak="0">
     <w:nsid w:val="69FC276B"/>
     <w:multiLevelType w:val="multilevel"/>
     <w:tmpl w:val="C2E0AD14"/>
@@ -16890,7 +17169,7 @@
       </w:rPr>
     </w:lvl>
   </w:abstractNum>
-  <w:abstractNum w:abstractNumId="22" w15:restartNumberingAfterBreak="0">
+  <w:abstractNum w:abstractNumId="23" w15:restartNumberingAfterBreak="0">
     <w:nsid w:val="7185592B"/>
     <w:multiLevelType w:val="multilevel"/>
     <w:tmpl w:val="08F0360A"/>
@@ -17039,7 +17318,7 @@
       </w:rPr>
     </w:lvl>
   </w:abstractNum>
-  <w:abstractNum w:abstractNumId="23" w15:restartNumberingAfterBreak="0">
+  <w:abstractNum w:abstractNumId="24" w15:restartNumberingAfterBreak="0">
     <w:nsid w:val="76A84B46"/>
     <w:multiLevelType w:val="hybridMultilevel"/>
     <w:tmpl w:val="C6A6513A"/>
@@ -17161,7 +17440,7 @@
     <w:abstractNumId w:val="2"/>
   </w:num>
   <w:num w:numId="3" w16cid:durableId="832062217">
-    <w:abstractNumId w:val="23"/>
+    <w:abstractNumId w:val="24"/>
   </w:num>
   <w:num w:numId="4" w16cid:durableId="1215237999">
     <w:abstractNumId w:val="8"/>
@@ -17173,7 +17452,7 @@
     <w:abstractNumId w:val="12"/>
   </w:num>
   <w:num w:numId="7" w16cid:durableId="655379516">
-    <w:abstractNumId w:val="21"/>
+    <w:abstractNumId w:val="22"/>
   </w:num>
   <w:num w:numId="8" w16cid:durableId="1980303912">
     <w:abstractNumId w:val="19"/>
@@ -17206,7 +17485,7 @@
     <w:abstractNumId w:val="5"/>
   </w:num>
   <w:num w:numId="18" w16cid:durableId="2713027">
-    <w:abstractNumId w:val="22"/>
+    <w:abstractNumId w:val="23"/>
   </w:num>
   <w:num w:numId="19" w16cid:durableId="955987363">
     <w:abstractNumId w:val="11"/>
@@ -17225,6 +17504,9 @@
   </w:num>
   <w:num w:numId="24" w16cid:durableId="403190520">
     <w:abstractNumId w:val="16"/>
+  </w:num>
+  <w:num w:numId="25" w16cid:durableId="1507985804">
+    <w:abstractNumId w:val="21"/>
   </w:num>
 </w:numbering>
 </file>

</xml_diff>